<commit_message>
docs: compile ICTU university technical report nhom4.docx with full chapter 1 elaboration
</commit_message>
<xml_diff>
--- a/nhom4.docx
+++ b/nhom4.docx
@@ -11,21 +11,21 @@
           <w:b/>
           <w:sz w:val="26"/>
         </w:rPr>
-        <w:t>TRƯỜNG ĐẠI HỌC CÔNG NGHỆ THÔNG TIN VÀ TRUYỀN THÔNG</w:t>
+        <w:t>TRƯỜNG ĐẠI HỌC CNTT VÀ TRUYỀN THÔNG</w:t>
         <w:br/>
       </w:r>
       <w:r>
         <w:rPr>
           <w:b/>
           <w:sz w:val="26"/>
+          <w:u w:val="single"/>
         </w:rPr>
         <w:t>KHOA CÔNG NGHỆ THÔNG TIN</w:t>
-        <w:br/>
       </w:r>
     </w:p>
     <w:p>
       <w:pPr>
-        <w:spacing w:before="720"/>
+        <w:spacing w:before="960"/>
       </w:pPr>
     </w:p>
     <w:p>
@@ -35,7 +35,7 @@
       <w:r>
         <w:rPr>
           <w:b/>
-          <w:color w:val="0F172A"/>
+          <w:color w:val="C00000"/>
           <w:sz w:val="36"/>
         </w:rPr>
         <w:t>BÁO CÁO DỰ ÁN</w:t>
@@ -44,8 +44,8 @@
       <w:r>
         <w:rPr>
           <w:b/>
-          <w:color w:val="2563EB"/>
-          <w:sz w:val="28"/>
+          <w:color w:val="C00000"/>
+          <w:sz w:val="30"/>
         </w:rPr>
         <w:t>HỌC PHẦN ỨNG DỤNG TRÍ TUỆ NHÂN TẠO</w:t>
         <w:br/>
@@ -58,7 +58,10 @@
       </w:pPr>
       <w:r>
         <w:rPr>
+          <w:b/>
+          <w:i/>
           <w:sz w:val="26"/>
+          <w:u w:val="single"/>
         </w:rPr>
         <w:t>Đề tài:</w:t>
         <w:br/>
@@ -66,23 +69,19 @@
       <w:r>
         <w:rPr>
           <w:b/>
-          <w:sz w:val="30"/>
+          <w:sz w:val="28"/>
         </w:rPr>
         <w:t>HỆ THỐNG QUẢN LÝ DỰ ÁN VÀ TIẾN ĐỘ CÔNG VIỆC KOSHI</w:t>
         <w:br/>
-        <w:t>CÓ TÍCH HỢP TRÍ TUỆ NHÂN TẠO (AI)</w:t>
+        <w:t>CÓ TÍCH HỢP AI</w:t>
         <w:br/>
         <w:br/>
       </w:r>
-      <w:r>
-        <w:rPr>
-          <w:b/>
-          <w:sz w:val="28"/>
-        </w:rPr>
-        <w:t>Tên nhóm: NHÓM 04</w:t>
-        <w:br/>
-        <w:br/>
-      </w:r>
+    </w:p>
+    <w:p>
+      <w:pPr>
+        <w:spacing w:before="360"/>
+      </w:pPr>
     </w:p>
     <w:tbl>
       <w:tblPr>
@@ -101,7 +100,41 @@
           </w:tcPr>
           <w:p>
             <w:pPr>
-              <w:spacing w:line="288" w:lineRule="auto"/>
+              <w:spacing w:line="276" w:lineRule="auto" w:after="40"/>
+            </w:pPr>
+            <w:r>
+              <w:rPr>
+                <w:b/>
+              </w:rPr>
+              <w:t>Tên nhóm:</w:t>
+            </w:r>
+          </w:p>
+        </w:tc>
+        <w:tc>
+          <w:tcPr>
+            <w:tcW w:type="dxa" w:w="4032"/>
+          </w:tcPr>
+          <w:p>
+            <w:pPr>
+              <w:spacing w:line="276" w:lineRule="auto" w:after="40"/>
+            </w:pPr>
+            <w:r>
+              <w:rPr>
+                <w:b/>
+              </w:rPr>
+              <w:t>NHÓM 04</w:t>
+            </w:r>
+          </w:p>
+        </w:tc>
+      </w:tr>
+      <w:tr>
+        <w:tc>
+          <w:tcPr>
+            <w:tcW w:type="dxa" w:w="4608"/>
+          </w:tcPr>
+          <w:p>
+            <w:pPr>
+              <w:spacing w:line="276" w:lineRule="auto" w:after="40"/>
             </w:pPr>
             <w:r>
               <w:rPr>
@@ -113,11 +146,11 @@
         </w:tc>
         <w:tc>
           <w:tcPr>
-            <w:tcW w:type="dxa" w:w="3312"/>
+            <w:tcW w:type="dxa" w:w="4032"/>
           </w:tcPr>
           <w:p>
             <w:pPr>
-              <w:spacing w:line="288" w:lineRule="auto"/>
+              <w:spacing w:line="276" w:lineRule="auto" w:after="40"/>
             </w:pPr>
             <w:r/>
           </w:p>
@@ -130,24 +163,22 @@
           </w:tcPr>
           <w:p>
             <w:pPr>
-              <w:spacing w:line="288" w:lineRule="auto"/>
+              <w:spacing w:line="276" w:lineRule="auto" w:after="40"/>
             </w:pPr>
             <w:r>
-              <w:t>1. Phạm Minh Tú (Trưởng nhóm)</w:t>
+              <w:t>1. Phạm Minh Tú (#)</w:t>
             </w:r>
           </w:p>
         </w:tc>
         <w:tc>
           <w:tcPr>
-            <w:tcW w:type="dxa" w:w="3312"/>
+            <w:tcW w:type="dxa" w:w="4032"/>
           </w:tcPr>
           <w:p>
             <w:pPr>
-              <w:spacing w:line="288" w:lineRule="auto"/>
+              <w:spacing w:line="276" w:lineRule="auto" w:after="40"/>
             </w:pPr>
-            <w:r>
-              <w:t>MSSV: 23ICTU...</w:t>
-            </w:r>
+            <w:r/>
           </w:p>
         </w:tc>
       </w:tr>
@@ -158,7 +189,7 @@
           </w:tcPr>
           <w:p>
             <w:pPr>
-              <w:spacing w:line="288" w:lineRule="auto"/>
+              <w:spacing w:line="276" w:lineRule="auto" w:after="40"/>
             </w:pPr>
             <w:r>
               <w:t>2. Phạm Văn Huynh</w:t>
@@ -167,15 +198,13 @@
         </w:tc>
         <w:tc>
           <w:tcPr>
-            <w:tcW w:type="dxa" w:w="3312"/>
+            <w:tcW w:type="dxa" w:w="4032"/>
           </w:tcPr>
           <w:p>
             <w:pPr>
-              <w:spacing w:line="288" w:lineRule="auto"/>
+              <w:spacing w:line="276" w:lineRule="auto" w:after="40"/>
             </w:pPr>
-            <w:r>
-              <w:t>MSSV: 23ICTU...</w:t>
-            </w:r>
+            <w:r/>
           </w:p>
         </w:tc>
       </w:tr>
@@ -186,7 +215,7 @@
           </w:tcPr>
           <w:p>
             <w:pPr>
-              <w:spacing w:line="288" w:lineRule="auto"/>
+              <w:spacing w:line="276" w:lineRule="auto" w:after="40"/>
             </w:pPr>
             <w:r>
               <w:t>3. Đàm Đức Đôn</w:t>
@@ -195,15 +224,13 @@
         </w:tc>
         <w:tc>
           <w:tcPr>
-            <w:tcW w:type="dxa" w:w="3312"/>
+            <w:tcW w:type="dxa" w:w="4032"/>
           </w:tcPr>
           <w:p>
             <w:pPr>
-              <w:spacing w:line="288" w:lineRule="auto"/>
+              <w:spacing w:line="276" w:lineRule="auto" w:after="40"/>
             </w:pPr>
-            <w:r>
-              <w:t>MSSV: 23ICTU...</w:t>
-            </w:r>
+            <w:r/>
           </w:p>
         </w:tc>
       </w:tr>
@@ -214,26 +241,26 @@
           </w:tcPr>
           <w:p>
             <w:pPr>
-              <w:spacing w:line="288" w:lineRule="auto"/>
+              <w:spacing w:line="276" w:lineRule="auto" w:after="40"/>
             </w:pPr>
             <w:r>
               <w:rPr>
                 <w:b/>
               </w:rPr>
-              <w:t>Giảng viên hướng dẫn:</w:t>
+              <w:t>Giảng viên:</w:t>
             </w:r>
           </w:p>
         </w:tc>
         <w:tc>
           <w:tcPr>
-            <w:tcW w:type="dxa" w:w="3312"/>
+            <w:tcW w:type="dxa" w:w="4032"/>
           </w:tcPr>
           <w:p>
             <w:pPr>
-              <w:spacing w:line="288" w:lineRule="auto"/>
+              <w:spacing w:line="276" w:lineRule="auto" w:after="40"/>
             </w:pPr>
             <w:r>
-              <w:t>ThS. Giảng Viên Phụ Trách</w:t>
+              <w:t>Nguyễn Thị Tuyển</w:t>
             </w:r>
           </w:p>
         </w:tc>
@@ -241,7 +268,7 @@
     </w:tbl>
     <w:p>
       <w:pPr>
-        <w:spacing w:before="1440"/>
+        <w:spacing w:before="1680"/>
         <w:jc w:val="center"/>
       </w:pPr>
       <w:r>
@@ -253,9 +280,20 @@
       </w:r>
     </w:p>
     <w:p>
-      <w:r>
-        <w:br w:type="page"/>
-      </w:r>
+      <w:pPr>
+        <w:sectPr>
+          <w:pgSz w:w="12240" w:h="15840"/>
+          <w:pgMar w:top="1138" w:right="1138" w:bottom="1138" w:left="1699" w:header="720" w:footer="720" w:gutter="0"/>
+          <w:cols w:space="720"/>
+          <w:docGrid w:linePitch="360"/>
+          <w:pgBorders w:offsetFrom="page">
+            <w:top w:val="double" w:sz="12" w:space="24" w:color="0F172A"/>
+            <w:left w:val="double" w:sz="12" w:space="24" w:color="0F172A"/>
+            <w:bottom w:val="double" w:sz="12" w:space="24" w:color="0F172A"/>
+            <w:right w:val="double" w:sz="12" w:space="24" w:color="0F172A"/>
+          </w:pgBorders>
+        </w:sectPr>
+      </w:pPr>
     </w:p>
     <w:p>
       <w:pPr>
@@ -271,7 +309,30 @@
     </w:p>
     <w:p>
       <w:pPr>
-        <w:spacing w:line="288" w:lineRule="auto" w:after="60"/>
+        <w:spacing w:line="276" w:lineRule="auto" w:after="40"/>
+      </w:pPr>
+      <w:r>
+        <w:rPr>
+          <w:b/>
+        </w:rPr>
+        <w:t>MỤC LỤC</w:t>
+      </w:r>
+      <w:r>
+        <w:rPr>
+          <w:color w:val="94A3B8"/>
+        </w:rPr>
+        <w:t xml:space="preserve"> ............................................................. </w:t>
+      </w:r>
+      <w:r>
+        <w:rPr>
+          <w:b/>
+        </w:rPr>
+        <w:t>i</w:t>
+      </w:r>
+    </w:p>
+    <w:p>
+      <w:pPr>
+        <w:spacing w:line="276" w:lineRule="auto" w:after="40"/>
       </w:pPr>
       <w:r>
         <w:rPr>
@@ -283,7 +344,7 @@
         <w:rPr>
           <w:color w:val="94A3B8"/>
         </w:rPr>
-        <w:t xml:space="preserve"> ............................................... </w:t>
+        <w:t xml:space="preserve"> .................................................. </w:t>
       </w:r>
       <w:r>
         <w:rPr>
@@ -294,7 +355,7 @@
     </w:p>
     <w:p>
       <w:pPr>
-        <w:spacing w:line="288" w:lineRule="auto" w:after="60"/>
+        <w:spacing w:line="276" w:lineRule="auto" w:after="40"/>
       </w:pPr>
       <w:r>
         <w:rPr>
@@ -306,7 +367,7 @@
         <w:rPr>
           <w:color w:val="94A3B8"/>
         </w:rPr>
-        <w:t xml:space="preserve"> ........................................................... </w:t>
+        <w:t xml:space="preserve"> .............................................................. </w:t>
       </w:r>
       <w:r>
         <w:rPr>
@@ -317,7 +378,7 @@
     </w:p>
     <w:p>
       <w:pPr>
-        <w:spacing w:line="288" w:lineRule="auto" w:after="60"/>
+        <w:spacing w:line="276" w:lineRule="auto" w:after="40"/>
       </w:pPr>
       <w:r>
         <w:rPr>
@@ -329,7 +390,7 @@
         <w:rPr>
           <w:color w:val="94A3B8"/>
         </w:rPr>
-        <w:t xml:space="preserve"> ............................. </w:t>
+        <w:t xml:space="preserve"> ................................ </w:t>
       </w:r>
       <w:r>
         <w:rPr>
@@ -340,7 +401,7 @@
     </w:p>
     <w:p>
       <w:pPr>
-        <w:spacing w:line="288" w:lineRule="auto" w:after="60"/>
+        <w:spacing w:line="276" w:lineRule="auto" w:after="40"/>
       </w:pPr>
       <w:r>
         <w:t xml:space="preserve">  1.1. Bối cảnh bài toán và lý do phát triển</w:t>
@@ -349,7 +410,7 @@
         <w:rPr>
           <w:color w:val="94A3B8"/>
         </w:rPr>
-        <w:t xml:space="preserve"> ..................... </w:t>
+        <w:t xml:space="preserve"> ........................ </w:t>
       </w:r>
       <w:r>
         <w:rPr>
@@ -360,16 +421,36 @@
     </w:p>
     <w:p>
       <w:pPr>
-        <w:spacing w:line="288" w:lineRule="auto" w:after="60"/>
+        <w:spacing w:line="276" w:lineRule="auto" w:after="40"/>
       </w:pPr>
       <w:r>
-        <w:t xml:space="preserve">  1.2. Mô hình Actor và Phân hệ Use Case</w:t>
+        <w:t xml:space="preserve">  1.2. Khảo sát hiện trạng và các giải pháp tương tự</w:t>
       </w:r>
       <w:r>
         <w:rPr>
           <w:color w:val="94A3B8"/>
         </w:rPr>
-        <w:t xml:space="preserve"> ......................... </w:t>
+        <w:t xml:space="preserve"> ................ </w:t>
+      </w:r>
+      <w:r>
+        <w:rPr>
+          <w:b/>
+        </w:rPr>
+        <w:t>1</w:t>
+      </w:r>
+    </w:p>
+    <w:p>
+      <w:pPr>
+        <w:spacing w:line="276" w:lineRule="auto" w:after="40"/>
+      </w:pPr>
+      <w:r>
+        <w:t xml:space="preserve">  1.3. Mô hình Actor và Phân hệ Use Case tổng quát</w:t>
+      </w:r>
+      <w:r>
+        <w:rPr>
+          <w:color w:val="94A3B8"/>
+        </w:rPr>
+        <w:t xml:space="preserve"> .................. </w:t>
       </w:r>
       <w:r>
         <w:rPr>
@@ -380,10 +461,133 @@
     </w:p>
     <w:p>
       <w:pPr>
-        <w:spacing w:line="288" w:lineRule="auto" w:after="60"/>
+        <w:spacing w:line="276" w:lineRule="auto" w:after="40"/>
       </w:pPr>
       <w:r>
-        <w:t xml:space="preserve">  1.3. Yêu cầu chức năng (Functional Requirements)</w:t>
+        <w:t xml:space="preserve">  1.4. Đặc tả yêu cầu chức năng cốt lõi (Functional Requirements)</w:t>
+      </w:r>
+      <w:r>
+        <w:rPr>
+          <w:color w:val="94A3B8"/>
+        </w:rPr>
+        <w:t xml:space="preserve"> ... </w:t>
+      </w:r>
+      <w:r>
+        <w:rPr>
+          <w:b/>
+        </w:rPr>
+        <w:t>3</w:t>
+      </w:r>
+    </w:p>
+    <w:p>
+      <w:pPr>
+        <w:spacing w:line="276" w:lineRule="auto" w:after="40"/>
+      </w:pPr>
+      <w:r>
+        <w:t xml:space="preserve">  1.5. Đặc tả yêu cầu phi chức năng (Non-Functional Requirements)</w:t>
+      </w:r>
+      <w:r>
+        <w:rPr>
+          <w:color w:val="94A3B8"/>
+        </w:rPr>
+        <w:t xml:space="preserve"> ... </w:t>
+      </w:r>
+      <w:r>
+        <w:rPr>
+          <w:b/>
+        </w:rPr>
+        <w:t>4</w:t>
+      </w:r>
+    </w:p>
+    <w:p>
+      <w:pPr>
+        <w:spacing w:line="276" w:lineRule="auto" w:after="40"/>
+      </w:pPr>
+      <w:r>
+        <w:t xml:space="preserve">  1.6. Xác định bài toán ứng dụng AI và phạm vi tích hợp</w:t>
+      </w:r>
+      <w:r>
+        <w:rPr>
+          <w:color w:val="94A3B8"/>
+        </w:rPr>
+        <w:t xml:space="preserve"> ............ </w:t>
+      </w:r>
+      <w:r>
+        <w:rPr>
+          <w:b/>
+        </w:rPr>
+        <w:t>5</w:t>
+      </w:r>
+    </w:p>
+    <w:p>
+      <w:pPr>
+        <w:spacing w:line="276" w:lineRule="auto" w:after="40"/>
+      </w:pPr>
+      <w:r>
+        <w:rPr>
+          <w:b/>
+        </w:rPr>
+        <w:t>CHƯƠNG 2. THIẾT KẾ HỆ THỐNG VÀ CƠ SỞ DỮ LIỆU</w:t>
+      </w:r>
+      <w:r>
+        <w:rPr>
+          <w:color w:val="94A3B8"/>
+        </w:rPr>
+        <w:t xml:space="preserve"> ........................ </w:t>
+      </w:r>
+      <w:r>
+        <w:rPr>
+          <w:b/>
+        </w:rPr>
+        <w:t>6</w:t>
+      </w:r>
+    </w:p>
+    <w:p>
+      <w:pPr>
+        <w:spacing w:line="276" w:lineRule="auto" w:after="40"/>
+      </w:pPr>
+      <w:r>
+        <w:t xml:space="preserve">  2.1. Kiến trúc tổng thể hệ thống phân tầng (3-Tier Architecture)</w:t>
+      </w:r>
+      <w:r>
+        <w:rPr>
+          <w:color w:val="94A3B8"/>
+        </w:rPr>
+        <w:t xml:space="preserve"> .. </w:t>
+      </w:r>
+      <w:r>
+        <w:rPr>
+          <w:b/>
+        </w:rPr>
+        <w:t>6</w:t>
+      </w:r>
+    </w:p>
+    <w:p>
+      <w:pPr>
+        <w:spacing w:line="276" w:lineRule="auto" w:after="40"/>
+      </w:pPr>
+      <w:r>
+        <w:t xml:space="preserve">  2.2. Thiết kế Cơ sở dữ liệu quan hệ (ERD &amp; Data Dictionary)</w:t>
+      </w:r>
+      <w:r>
+        <w:rPr>
+          <w:color w:val="94A3B8"/>
+        </w:rPr>
+        <w:t xml:space="preserve"> ....... </w:t>
+      </w:r>
+      <w:r>
+        <w:rPr>
+          <w:b/>
+        </w:rPr>
+        <w:t>7</w:t>
+      </w:r>
+    </w:p>
+    <w:p>
+      <w:pPr>
+        <w:spacing w:line="276" w:lineRule="auto" w:after="40"/>
+      </w:pPr>
+      <w:r>
+        <w:t xml:space="preserve">  2.3. Thiết kế trạng thái công việc và luồng dữ liệu</w:t>
       </w:r>
       <w:r>
         <w:rPr>
@@ -395,115 +599,12 @@
         <w:rPr>
           <w:b/>
         </w:rPr>
-        <w:t>3</w:t>
-      </w:r>
-    </w:p>
-    <w:p>
-      <w:pPr>
-        <w:spacing w:line="288" w:lineRule="auto" w:after="60"/>
-      </w:pPr>
-      <w:r>
-        <w:t xml:space="preserve">  1.4. Yêu cầu phi chức năng (Non-Functional Requirements)</w:t>
-      </w:r>
-      <w:r>
-        <w:rPr>
-          <w:color w:val="94A3B8"/>
-        </w:rPr>
-        <w:t xml:space="preserve"> ....... </w:t>
-      </w:r>
-      <w:r>
-        <w:rPr>
-          <w:b/>
-        </w:rPr>
-        <w:t>4</w:t>
-      </w:r>
-    </w:p>
-    <w:p>
-      <w:pPr>
-        <w:spacing w:line="288" w:lineRule="auto" w:after="60"/>
-      </w:pPr>
-      <w:r>
-        <w:rPr>
-          <w:b/>
-        </w:rPr>
-        <w:t>CHƯƠNG 2. THIẾT KẾ HỆ THỐNG VÀ CƠ SỞ DỮ LIỆU</w:t>
-      </w:r>
-      <w:r>
-        <w:rPr>
-          <w:color w:val="94A3B8"/>
-        </w:rPr>
-        <w:t xml:space="preserve"> ..................... </w:t>
-      </w:r>
-      <w:r>
-        <w:rPr>
-          <w:b/>
-        </w:rPr>
-        <w:t>5</w:t>
-      </w:r>
-    </w:p>
-    <w:p>
-      <w:pPr>
-        <w:spacing w:line="288" w:lineRule="auto" w:after="60"/>
-      </w:pPr>
-      <w:r>
-        <w:t xml:space="preserve">  2.1. Kiến trúc tổng thể hệ thống</w:t>
-      </w:r>
-      <w:r>
-        <w:rPr>
-          <w:color w:val="94A3B8"/>
-        </w:rPr>
-        <w:t xml:space="preserve"> ............................... </w:t>
-      </w:r>
-      <w:r>
-        <w:rPr>
-          <w:b/>
-        </w:rPr>
-        <w:t>5</w:t>
-      </w:r>
-    </w:p>
-    <w:p>
-      <w:pPr>
-        <w:spacing w:line="288" w:lineRule="auto" w:after="60"/>
-      </w:pPr>
-      <w:r>
-        <w:t xml:space="preserve">  2.2. Thiết kế Cơ sở dữ liệu quan hệ (ERD &amp; Data Dictionary)</w:t>
-      </w:r>
-      <w:r>
-        <w:rPr>
-          <w:color w:val="94A3B8"/>
-        </w:rPr>
-        <w:t xml:space="preserve"> .... </w:t>
-      </w:r>
-      <w:r>
-        <w:rPr>
-          <w:b/>
-        </w:rPr>
-        <w:t>6</w:t>
-      </w:r>
-    </w:p>
-    <w:p>
-      <w:pPr>
-        <w:spacing w:line="288" w:lineRule="auto" w:after="60"/>
-      </w:pPr>
-      <w:r>
-        <w:t xml:space="preserve">  2.3. Thiết kế trạng thái và toán học chuyển dịch trạng thái</w:t>
-      </w:r>
-      <w:r>
-        <w:rPr>
-          <w:color w:val="94A3B8"/>
-        </w:rPr>
-        <w:t xml:space="preserve"> .... </w:t>
-      </w:r>
-      <w:r>
-        <w:rPr>
-          <w:b/>
-        </w:rPr>
         <w:t>8</w:t>
       </w:r>
     </w:p>
     <w:p>
       <w:pPr>
-        <w:spacing w:line="288" w:lineRule="auto" w:after="60"/>
+        <w:spacing w:line="276" w:lineRule="auto" w:after="40"/>
       </w:pPr>
       <w:r>
         <w:rPr>
@@ -515,7 +616,7 @@
         <w:rPr>
           <w:color w:val="94A3B8"/>
         </w:rPr>
-        <w:t xml:space="preserve"> ............... </w:t>
+        <w:t xml:space="preserve"> .................. </w:t>
       </w:r>
       <w:r>
         <w:rPr>
@@ -526,16 +627,16 @@
     </w:p>
     <w:p>
       <w:pPr>
-        <w:spacing w:line="288" w:lineRule="auto" w:after="60"/>
+        <w:spacing w:line="276" w:lineRule="auto" w:after="40"/>
       </w:pPr>
       <w:r>
-        <w:t xml:space="preserve">  3.1. Xác định vị trí tích hợp AI trong hệ thống</w:t>
+        <w:t xml:space="preserve">  3.1. Kiến trúc luồng gọi AI đa tầng (Cascade Architecture)</w:t>
       </w:r>
       <w:r>
         <w:rPr>
           <w:color w:val="94A3B8"/>
         </w:rPr>
-        <w:t xml:space="preserve"> ................ </w:t>
+        <w:t xml:space="preserve"> ........ </w:t>
       </w:r>
       <w:r>
         <w:rPr>
@@ -546,16 +647,16 @@
     </w:p>
     <w:p>
       <w:pPr>
-        <w:spacing w:line="288" w:lineRule="auto" w:after="60"/>
+        <w:spacing w:line="276" w:lineRule="auto" w:after="40"/>
       </w:pPr>
       <w:r>
-        <w:t xml:space="preserve">  3.2. Thiết kế Prompt và Luồng gọi AI đa tầng (Cascade Architecture)</w:t>
+        <w:t xml:space="preserve">  3.2. Thiết kế System Prompt và Ma trận tối ưu hóa 3 vòng</w:t>
       </w:r>
       <w:r>
         <w:rPr>
           <w:color w:val="94A3B8"/>
         </w:rPr>
-        <w:t xml:space="preserve">  </w:t>
+        <w:t xml:space="preserve"> .......... </w:t>
       </w:r>
       <w:r>
         <w:rPr>
@@ -566,16 +667,36 @@
     </w:p>
     <w:p>
       <w:pPr>
-        <w:spacing w:line="288" w:lineRule="auto" w:after="60"/>
+        <w:spacing w:line="276" w:lineRule="auto" w:after="40"/>
       </w:pPr>
       <w:r>
-        <w:t xml:space="preserve">  3.3. Ma trận tối ưu hóa Prompt qua 3 vòng thử nghiệm</w:t>
+        <w:t xml:space="preserve">  3.3. Thuật toán phân tích chuỗi phụ thuộc DAG và đường găng CPM</w:t>
       </w:r>
       <w:r>
         <w:rPr>
           <w:color w:val="94A3B8"/>
         </w:rPr>
-        <w:t xml:space="preserve"> ........... </w:t>
+        <w:t xml:space="preserve"> ... </w:t>
+      </w:r>
+      <w:r>
+        <w:rPr>
+          <w:b/>
+        </w:rPr>
+        <w:t>11</w:t>
+      </w:r>
+    </w:p>
+    <w:p>
+      <w:pPr>
+        <w:spacing w:line="276" w:lineRule="auto" w:after="40"/>
+      </w:pPr>
+      <w:r>
+        <w:t xml:space="preserve">  3.4. Minh chứng ứng dụng AI trong quy trình phát triển</w:t>
+      </w:r>
+      <w:r>
+        <w:rPr>
+          <w:color w:val="94A3B8"/>
+        </w:rPr>
+        <w:t xml:space="preserve"> ............ </w:t>
       </w:r>
       <w:r>
         <w:rPr>
@@ -586,27 +707,7 @@
     </w:p>
     <w:p>
       <w:pPr>
-        <w:spacing w:line="288" w:lineRule="auto" w:after="60"/>
-      </w:pPr>
-      <w:r>
-        <w:t xml:space="preserve">  3.4. Minh chứng ứng dụng AI trong quy trình SDLC (KT1)</w:t>
-      </w:r>
-      <w:r>
-        <w:rPr>
-          <w:color w:val="94A3B8"/>
-        </w:rPr>
-        <w:t xml:space="preserve"> ......... </w:t>
-      </w:r>
-      <w:r>
-        <w:rPr>
-          <w:b/>
-        </w:rPr>
-        <w:t>13</w:t>
-      </w:r>
-    </w:p>
-    <w:p>
-      <w:pPr>
-        <w:spacing w:line="288" w:lineRule="auto" w:after="60"/>
+        <w:spacing w:line="276" w:lineRule="auto" w:after="40"/>
       </w:pPr>
       <w:r>
         <w:rPr>
@@ -618,18 +719,18 @@
         <w:rPr>
           <w:color w:val="94A3B8"/>
         </w:rPr>
-        <w:t xml:space="preserve"> ..................................... </w:t>
+        <w:t xml:space="preserve"> ........................................ </w:t>
       </w:r>
       <w:r>
         <w:rPr>
           <w:b/>
         </w:rPr>
-        <w:t>14</w:t>
+        <w:t>13</w:t>
       </w:r>
     </w:p>
     <w:p>
       <w:pPr>
-        <w:spacing w:line="288" w:lineRule="auto" w:after="60"/>
+        <w:spacing w:line="276" w:lineRule="auto" w:after="40"/>
       </w:pPr>
       <w:r>
         <w:rPr>
@@ -641,13 +742,13 @@
         <w:rPr>
           <w:color w:val="94A3B8"/>
         </w:rPr>
-        <w:t xml:space="preserve"> ............................................... </w:t>
+        <w:t xml:space="preserve"> .................................................. </w:t>
       </w:r>
       <w:r>
         <w:rPr>
           <w:b/>
         </w:rPr>
-        <w:t>15</w:t>
+        <w:t>14</w:t>
       </w:r>
     </w:p>
     <w:p>
@@ -672,7 +773,368 @@
         <w:rPr>
           <w:b/>
         </w:rPr>
-        <w:t>Bảng 1: Phân công nhiệm vụ theo tiến độ thực hiện (KT1)</w:t>
+        <w:t>Phân công nhiệm vụ theo tiến độ thực hiện:</w:t>
+      </w:r>
+    </w:p>
+    <w:tbl>
+      <w:tblPr>
+        <w:tblW w:type="auto" w:w="0"/>
+        <w:jc w:val="center"/>
+        <w:tblLook w:firstColumn="1" w:firstRow="1" w:lastColumn="0" w:lastRow="0" w:noHBand="0" w:noVBand="1" w:val="04A0"/>
+      </w:tblPr>
+      <w:tblGrid>
+        <w:gridCol w:w="3134"/>
+        <w:gridCol w:w="3134"/>
+        <w:gridCol w:w="3134"/>
+      </w:tblGrid>
+      <w:tr>
+        <w:tc>
+          <w:tcPr>
+            <w:tcW w:type="dxa" w:w="3134"/>
+            <w:shd w:fill="F8FAFC"/>
+            <w:tcBorders>
+              <w:top w:val="single" w:sz="4" w:space="0" w:color="CBD5E1"/>
+              <w:left w:val="single" w:sz="4" w:space="0" w:color="CBD5E1"/>
+              <w:bottom w:val="single" w:sz="4" w:space="0" w:color="CBD5E1"/>
+              <w:right w:val="single" w:sz="4" w:space="0" w:color="CBD5E1"/>
+            </w:tcBorders>
+          </w:tcPr>
+          <w:p>
+            <w:pPr>
+              <w:jc w:val="center"/>
+            </w:pPr>
+            <w:r>
+              <w:rPr>
+                <w:b/>
+              </w:rPr>
+              <w:t>STT</w:t>
+            </w:r>
+          </w:p>
+        </w:tc>
+        <w:tc>
+          <w:tcPr>
+            <w:tcW w:type="dxa" w:w="3134"/>
+            <w:shd w:fill="F8FAFC"/>
+            <w:tcBorders>
+              <w:top w:val="single" w:sz="4" w:space="0" w:color="CBD5E1"/>
+              <w:left w:val="single" w:sz="4" w:space="0" w:color="CBD5E1"/>
+              <w:bottom w:val="single" w:sz="4" w:space="0" w:color="CBD5E1"/>
+              <w:right w:val="single" w:sz="4" w:space="0" w:color="CBD5E1"/>
+            </w:tcBorders>
+          </w:tcPr>
+          <w:p>
+            <w:pPr>
+              <w:jc w:val="center"/>
+            </w:pPr>
+            <w:r>
+              <w:rPr>
+                <w:b/>
+              </w:rPr>
+              <w:t>Tên nhiệm vụ</w:t>
+            </w:r>
+          </w:p>
+        </w:tc>
+        <w:tc>
+          <w:tcPr>
+            <w:tcW w:type="dxa" w:w="3134"/>
+            <w:shd w:fill="F8FAFC"/>
+            <w:tcBorders>
+              <w:top w:val="single" w:sz="4" w:space="0" w:color="CBD5E1"/>
+              <w:left w:val="single" w:sz="4" w:space="0" w:color="CBD5E1"/>
+              <w:bottom w:val="single" w:sz="4" w:space="0" w:color="CBD5E1"/>
+              <w:right w:val="single" w:sz="4" w:space="0" w:color="CBD5E1"/>
+            </w:tcBorders>
+          </w:tcPr>
+          <w:p>
+            <w:pPr>
+              <w:jc w:val="center"/>
+            </w:pPr>
+            <w:r>
+              <w:rPr>
+                <w:b/>
+              </w:rPr>
+              <w:t>Người thực hiện</w:t>
+            </w:r>
+          </w:p>
+        </w:tc>
+      </w:tr>
+      <w:tr>
+        <w:tc>
+          <w:tcPr>
+            <w:tcW w:type="dxa" w:w="3134"/>
+            <w:tcBorders>
+              <w:top w:val="single" w:sz="4" w:space="0" w:color="CBD5E1"/>
+              <w:left w:val="single" w:sz="4" w:space="0" w:color="CBD5E1"/>
+              <w:bottom w:val="single" w:sz="4" w:space="0" w:color="CBD5E1"/>
+              <w:right w:val="single" w:sz="4" w:space="0" w:color="CBD5E1"/>
+            </w:tcBorders>
+          </w:tcPr>
+          <w:p>
+            <w:pPr>
+              <w:jc w:val="center"/>
+            </w:pPr>
+            <w:r>
+              <w:t>1</w:t>
+            </w:r>
+          </w:p>
+        </w:tc>
+        <w:tc>
+          <w:tcPr>
+            <w:tcW w:type="dxa" w:w="3134"/>
+            <w:tcBorders>
+              <w:top w:val="single" w:sz="4" w:space="0" w:color="CBD5E1"/>
+              <w:left w:val="single" w:sz="4" w:space="0" w:color="CBD5E1"/>
+              <w:bottom w:val="single" w:sz="4" w:space="0" w:color="CBD5E1"/>
+              <w:right w:val="single" w:sz="4" w:space="0" w:color="CBD5E1"/>
+            </w:tcBorders>
+          </w:tcPr>
+          <w:p>
+            <w:r>
+              <w:t>Phân tích yêu cầu bài toán, lập tài liệu URD, SRS chuẩn ISO/IEC/IEEE 29148</w:t>
+            </w:r>
+          </w:p>
+        </w:tc>
+        <w:tc>
+          <w:tcPr>
+            <w:tcW w:type="dxa" w:w="3134"/>
+            <w:tcBorders>
+              <w:top w:val="single" w:sz="4" w:space="0" w:color="CBD5E1"/>
+              <w:left w:val="single" w:sz="4" w:space="0" w:color="CBD5E1"/>
+              <w:bottom w:val="single" w:sz="4" w:space="0" w:color="CBD5E1"/>
+              <w:right w:val="single" w:sz="4" w:space="0" w:color="CBD5E1"/>
+            </w:tcBorders>
+          </w:tcPr>
+          <w:p>
+            <w:r>
+              <w:t>Phạm Minh Tú</w:t>
+            </w:r>
+          </w:p>
+        </w:tc>
+      </w:tr>
+      <w:tr>
+        <w:tc>
+          <w:tcPr>
+            <w:tcW w:type="dxa" w:w="3134"/>
+            <w:tcBorders>
+              <w:top w:val="single" w:sz="4" w:space="0" w:color="CBD5E1"/>
+              <w:left w:val="single" w:sz="4" w:space="0" w:color="CBD5E1"/>
+              <w:bottom w:val="single" w:sz="4" w:space="0" w:color="CBD5E1"/>
+              <w:right w:val="single" w:sz="4" w:space="0" w:color="CBD5E1"/>
+            </w:tcBorders>
+          </w:tcPr>
+          <w:p>
+            <w:pPr>
+              <w:jc w:val="center"/>
+            </w:pPr>
+            <w:r>
+              <w:t>2</w:t>
+            </w:r>
+          </w:p>
+        </w:tc>
+        <w:tc>
+          <w:tcPr>
+            <w:tcW w:type="dxa" w:w="3134"/>
+            <w:tcBorders>
+              <w:top w:val="single" w:sz="4" w:space="0" w:color="CBD5E1"/>
+              <w:left w:val="single" w:sz="4" w:space="0" w:color="CBD5E1"/>
+              <w:bottom w:val="single" w:sz="4" w:space="0" w:color="CBD5E1"/>
+              <w:right w:val="single" w:sz="4" w:space="0" w:color="CBD5E1"/>
+            </w:tcBorders>
+          </w:tcPr>
+          <w:p>
+            <w:r>
+              <w:t>Thiết kế kiến trúc hệ thống 3 lớp, thuật toán điều hướng bàn phím 2D và Kahn DAG</w:t>
+            </w:r>
+          </w:p>
+        </w:tc>
+        <w:tc>
+          <w:tcPr>
+            <w:tcW w:type="dxa" w:w="3134"/>
+            <w:tcBorders>
+              <w:top w:val="single" w:sz="4" w:space="0" w:color="CBD5E1"/>
+              <w:left w:val="single" w:sz="4" w:space="0" w:color="CBD5E1"/>
+              <w:bottom w:val="single" w:sz="4" w:space="0" w:color="CBD5E1"/>
+              <w:right w:val="single" w:sz="4" w:space="0" w:color="CBD5E1"/>
+            </w:tcBorders>
+          </w:tcPr>
+          <w:p>
+            <w:r>
+              <w:t>Phạm Minh Tú</w:t>
+            </w:r>
+          </w:p>
+        </w:tc>
+      </w:tr>
+      <w:tr>
+        <w:tc>
+          <w:tcPr>
+            <w:tcW w:type="dxa" w:w="3134"/>
+            <w:tcBorders>
+              <w:top w:val="single" w:sz="4" w:space="0" w:color="CBD5E1"/>
+              <w:left w:val="single" w:sz="4" w:space="0" w:color="CBD5E1"/>
+              <w:bottom w:val="single" w:sz="4" w:space="0" w:color="CBD5E1"/>
+              <w:right w:val="single" w:sz="4" w:space="0" w:color="CBD5E1"/>
+            </w:tcBorders>
+          </w:tcPr>
+          <w:p>
+            <w:pPr>
+              <w:jc w:val="center"/>
+            </w:pPr>
+            <w:r>
+              <w:t>3</w:t>
+            </w:r>
+          </w:p>
+        </w:tc>
+        <w:tc>
+          <w:tcPr>
+            <w:tcW w:type="dxa" w:w="3134"/>
+            <w:tcBorders>
+              <w:top w:val="single" w:sz="4" w:space="0" w:color="CBD5E1"/>
+              <w:left w:val="single" w:sz="4" w:space="0" w:color="CBD5E1"/>
+              <w:bottom w:val="single" w:sz="4" w:space="0" w:color="CBD5E1"/>
+              <w:right w:val="single" w:sz="4" w:space="0" w:color="CBD5E1"/>
+            </w:tcBorders>
+          </w:tcPr>
+          <w:p>
+            <w:r>
+              <w:t>Thiết kế CSDL quan hệ, bảng project_members, schema DDL và seeder init_db.py</w:t>
+            </w:r>
+          </w:p>
+        </w:tc>
+        <w:tc>
+          <w:tcPr>
+            <w:tcW w:type="dxa" w:w="3134"/>
+            <w:tcBorders>
+              <w:top w:val="single" w:sz="4" w:space="0" w:color="CBD5E1"/>
+              <w:left w:val="single" w:sz="4" w:space="0" w:color="CBD5E1"/>
+              <w:bottom w:val="single" w:sz="4" w:space="0" w:color="CBD5E1"/>
+              <w:right w:val="single" w:sz="4" w:space="0" w:color="CBD5E1"/>
+            </w:tcBorders>
+          </w:tcPr>
+          <w:p>
+            <w:r>
+              <w:t>Phạm Văn Huynh</w:t>
+            </w:r>
+          </w:p>
+        </w:tc>
+      </w:tr>
+      <w:tr>
+        <w:tc>
+          <w:tcPr>
+            <w:tcW w:type="dxa" w:w="3134"/>
+            <w:tcBorders>
+              <w:top w:val="single" w:sz="4" w:space="0" w:color="CBD5E1"/>
+              <w:left w:val="single" w:sz="4" w:space="0" w:color="CBD5E1"/>
+              <w:bottom w:val="single" w:sz="4" w:space="0" w:color="CBD5E1"/>
+              <w:right w:val="single" w:sz="4" w:space="0" w:color="CBD5E1"/>
+            </w:tcBorders>
+          </w:tcPr>
+          <w:p>
+            <w:pPr>
+              <w:jc w:val="center"/>
+            </w:pPr>
+            <w:r>
+              <w:t>4</w:t>
+            </w:r>
+          </w:p>
+        </w:tc>
+        <w:tc>
+          <w:tcPr>
+            <w:tcW w:type="dxa" w:w="3134"/>
+            <w:tcBorders>
+              <w:top w:val="single" w:sz="4" w:space="0" w:color="CBD5E1"/>
+              <w:left w:val="single" w:sz="4" w:space="0" w:color="CBD5E1"/>
+              <w:bottom w:val="single" w:sz="4" w:space="0" w:color="CBD5E1"/>
+              <w:right w:val="single" w:sz="4" w:space="0" w:color="CBD5E1"/>
+            </w:tcBorders>
+          </w:tcPr>
+          <w:p>
+            <w:r>
+              <w:t>Thiết kế System Prompt AI, ma trận tối ưu 3 vòng và kịch bản kiểm thử API</w:t>
+            </w:r>
+          </w:p>
+        </w:tc>
+        <w:tc>
+          <w:tcPr>
+            <w:tcW w:type="dxa" w:w="3134"/>
+            <w:tcBorders>
+              <w:top w:val="single" w:sz="4" w:space="0" w:color="CBD5E1"/>
+              <w:left w:val="single" w:sz="4" w:space="0" w:color="CBD5E1"/>
+              <w:bottom w:val="single" w:sz="4" w:space="0" w:color="CBD5E1"/>
+              <w:right w:val="single" w:sz="4" w:space="0" w:color="CBD5E1"/>
+            </w:tcBorders>
+          </w:tcPr>
+          <w:p>
+            <w:r>
+              <w:t>Đàm Đức Đôn</w:t>
+            </w:r>
+          </w:p>
+        </w:tc>
+      </w:tr>
+      <w:tr>
+        <w:tc>
+          <w:tcPr>
+            <w:tcW w:type="dxa" w:w="3134"/>
+            <w:tcBorders>
+              <w:top w:val="single" w:sz="4" w:space="0" w:color="CBD5E1"/>
+              <w:left w:val="single" w:sz="4" w:space="0" w:color="CBD5E1"/>
+              <w:bottom w:val="single" w:sz="4" w:space="0" w:color="CBD5E1"/>
+              <w:right w:val="single" w:sz="4" w:space="0" w:color="CBD5E1"/>
+            </w:tcBorders>
+          </w:tcPr>
+          <w:p>
+            <w:pPr>
+              <w:jc w:val="center"/>
+            </w:pPr>
+            <w:r>
+              <w:t>5</w:t>
+            </w:r>
+          </w:p>
+        </w:tc>
+        <w:tc>
+          <w:tcPr>
+            <w:tcW w:type="dxa" w:w="3134"/>
+            <w:tcBorders>
+              <w:top w:val="single" w:sz="4" w:space="0" w:color="CBD5E1"/>
+              <w:left w:val="single" w:sz="4" w:space="0" w:color="CBD5E1"/>
+              <w:bottom w:val="single" w:sz="4" w:space="0" w:color="CBD5E1"/>
+              <w:right w:val="single" w:sz="4" w:space="0" w:color="CBD5E1"/>
+            </w:tcBorders>
+          </w:tcPr>
+          <w:p>
+            <w:r>
+              <w:t>Tổng hợp báo cáo kỹ thuật KT1, xây dựng DOCX generator và kiểm thử hệ thống</w:t>
+            </w:r>
+          </w:p>
+        </w:tc>
+        <w:tc>
+          <w:tcPr>
+            <w:tcW w:type="dxa" w:w="3134"/>
+            <w:tcBorders>
+              <w:top w:val="single" w:sz="4" w:space="0" w:color="CBD5E1"/>
+              <w:left w:val="single" w:sz="4" w:space="0" w:color="CBD5E1"/>
+              <w:bottom w:val="single" w:sz="4" w:space="0" w:color="CBD5E1"/>
+              <w:right w:val="single" w:sz="4" w:space="0" w:color="CBD5E1"/>
+            </w:tcBorders>
+          </w:tcPr>
+          <w:p>
+            <w:r>
+              <w:t>Cả nhóm</w:t>
+            </w:r>
+          </w:p>
+        </w:tc>
+      </w:tr>
+    </w:tbl>
+    <w:p>
+      <w:pPr>
+        <w:spacing w:before="240"/>
+      </w:pPr>
+    </w:p>
+    <w:p>
+      <w:r>
+        <w:rPr>
+          <w:b/>
+        </w:rPr>
+        <w:t>Phân công nhiệm vụ theo thành viên thực hiện:</w:t>
       </w:r>
     </w:p>
     <w:tbl>
@@ -691,7 +1153,13 @@
         <w:tc>
           <w:tcPr>
             <w:tcW w:type="dxa" w:w="2351"/>
-            <w:shd w:fill="F1F5F9"/>
+            <w:shd w:fill="F8FAFC"/>
+            <w:tcBorders>
+              <w:top w:val="single" w:sz="4" w:space="0" w:color="CBD5E1"/>
+              <w:left w:val="single" w:sz="4" w:space="0" w:color="CBD5E1"/>
+              <w:bottom w:val="single" w:sz="4" w:space="0" w:color="CBD5E1"/>
+              <w:right w:val="single" w:sz="4" w:space="0" w:color="CBD5E1"/>
+            </w:tcBorders>
           </w:tcPr>
           <w:p>
             <w:pPr>
@@ -708,7 +1176,13 @@
         <w:tc>
           <w:tcPr>
             <w:tcW w:type="dxa" w:w="2351"/>
-            <w:shd w:fill="F1F5F9"/>
+            <w:shd w:fill="F8FAFC"/>
+            <w:tcBorders>
+              <w:top w:val="single" w:sz="4" w:space="0" w:color="CBD5E1"/>
+              <w:left w:val="single" w:sz="4" w:space="0" w:color="CBD5E1"/>
+              <w:bottom w:val="single" w:sz="4" w:space="0" w:color="CBD5E1"/>
+              <w:right w:val="single" w:sz="4" w:space="0" w:color="CBD5E1"/>
+            </w:tcBorders>
           </w:tcPr>
           <w:p>
             <w:pPr>
@@ -718,14 +1192,20 @@
               <w:rPr>
                 <w:b/>
               </w:rPr>
-              <w:t>Nội dung công việc</w:t>
+              <w:t>Thành Viên</w:t>
             </w:r>
           </w:p>
         </w:tc>
         <w:tc>
           <w:tcPr>
             <w:tcW w:type="dxa" w:w="2351"/>
-            <w:shd w:fill="F1F5F9"/>
+            <w:shd w:fill="F8FAFC"/>
+            <w:tcBorders>
+              <w:top w:val="single" w:sz="4" w:space="0" w:color="CBD5E1"/>
+              <w:left w:val="single" w:sz="4" w:space="0" w:color="CBD5E1"/>
+              <w:bottom w:val="single" w:sz="4" w:space="0" w:color="CBD5E1"/>
+              <w:right w:val="single" w:sz="4" w:space="0" w:color="CBD5E1"/>
+            </w:tcBorders>
           </w:tcPr>
           <w:p>
             <w:pPr>
@@ -735,14 +1215,20 @@
               <w:rPr>
                 <w:b/>
               </w:rPr>
-              <w:t>Người thực hiện</w:t>
+              <w:t>Nhiệm vụ</w:t>
             </w:r>
           </w:p>
         </w:tc>
         <w:tc>
           <w:tcPr>
             <w:tcW w:type="dxa" w:w="2351"/>
-            <w:shd w:fill="F1F5F9"/>
+            <w:shd w:fill="F8FAFC"/>
+            <w:tcBorders>
+              <w:top w:val="single" w:sz="4" w:space="0" w:color="CBD5E1"/>
+              <w:left w:val="single" w:sz="4" w:space="0" w:color="CBD5E1"/>
+              <w:bottom w:val="single" w:sz="4" w:space="0" w:color="CBD5E1"/>
+              <w:right w:val="single" w:sz="4" w:space="0" w:color="CBD5E1"/>
+            </w:tcBorders>
           </w:tcPr>
           <w:p>
             <w:pPr>
@@ -752,7 +1238,7 @@
               <w:rPr>
                 <w:b/>
               </w:rPr>
-              <w:t>Kết quả hoàn thành</w:t>
+              <w:t>Chữ ký</w:t>
             </w:r>
           </w:p>
         </w:tc>
@@ -762,466 +1248,10 @@
           <w:tcPr>
             <w:tcW w:type="dxa" w:w="2351"/>
             <w:tcBorders>
-              <w:top w:val="single" w:sz="4" w:space="0" w:color="D3D3D3"/>
-              <w:left w:val="single" w:sz="4" w:space="0" w:color="D3D3D3"/>
-              <w:bottom w:val="single" w:sz="4" w:space="0" w:color="D3D3D3"/>
-              <w:right w:val="single" w:sz="4" w:space="0" w:color="D3D3D3"/>
-            </w:tcBorders>
-          </w:tcPr>
-          <w:p>
-            <w:pPr>
-              <w:jc w:val="center"/>
-            </w:pPr>
-            <w:r>
-              <w:t>1</w:t>
-            </w:r>
-          </w:p>
-        </w:tc>
-        <w:tc>
-          <w:tcPr>
-            <w:tcW w:type="dxa" w:w="2351"/>
-            <w:tcBorders>
-              <w:top w:val="single" w:sz="4" w:space="0" w:color="D3D3D3"/>
-              <w:left w:val="single" w:sz="4" w:space="0" w:color="D3D3D3"/>
-              <w:bottom w:val="single" w:sz="4" w:space="0" w:color="D3D3D3"/>
-              <w:right w:val="single" w:sz="4" w:space="0" w:color="D3D3D3"/>
-            </w:tcBorders>
-          </w:tcPr>
-          <w:p>
-            <w:r>
-              <w:t>Phân tích bài toán, lập tài liệu URD, SRS, thiết kế Use Case &amp; Actor</w:t>
-            </w:r>
-          </w:p>
-        </w:tc>
-        <w:tc>
-          <w:tcPr>
-            <w:tcW w:type="dxa" w:w="2351"/>
-            <w:tcBorders>
-              <w:top w:val="single" w:sz="4" w:space="0" w:color="D3D3D3"/>
-              <w:left w:val="single" w:sz="4" w:space="0" w:color="D3D3D3"/>
-              <w:bottom w:val="single" w:sz="4" w:space="0" w:color="D3D3D3"/>
-              <w:right w:val="single" w:sz="4" w:space="0" w:color="D3D3D3"/>
-            </w:tcBorders>
-          </w:tcPr>
-          <w:p>
-            <w:r>
-              <w:t>Phạm Minh Tú</w:t>
-            </w:r>
-          </w:p>
-        </w:tc>
-        <w:tc>
-          <w:tcPr>
-            <w:tcW w:type="dxa" w:w="2351"/>
-            <w:tcBorders>
-              <w:top w:val="single" w:sz="4" w:space="0" w:color="D3D3D3"/>
-              <w:left w:val="single" w:sz="4" w:space="0" w:color="D3D3D3"/>
-              <w:bottom w:val="single" w:sz="4" w:space="0" w:color="D3D3D3"/>
-              <w:right w:val="single" w:sz="4" w:space="0" w:color="D3D3D3"/>
-            </w:tcBorders>
-          </w:tcPr>
-          <w:p>
-            <w:pPr>
-              <w:jc w:val="center"/>
-            </w:pPr>
-            <w:r>
-              <w:t>100%</w:t>
-            </w:r>
-          </w:p>
-        </w:tc>
-      </w:tr>
-      <w:tr>
-        <w:tc>
-          <w:tcPr>
-            <w:tcW w:type="dxa" w:w="2351"/>
-            <w:tcBorders>
-              <w:top w:val="single" w:sz="4" w:space="0" w:color="D3D3D3"/>
-              <w:left w:val="single" w:sz="4" w:space="0" w:color="D3D3D3"/>
-              <w:bottom w:val="single" w:sz="4" w:space="0" w:color="D3D3D3"/>
-              <w:right w:val="single" w:sz="4" w:space="0" w:color="D3D3D3"/>
-            </w:tcBorders>
-          </w:tcPr>
-          <w:p>
-            <w:pPr>
-              <w:jc w:val="center"/>
-            </w:pPr>
-            <w:r>
-              <w:t>2</w:t>
-            </w:r>
-          </w:p>
-        </w:tc>
-        <w:tc>
-          <w:tcPr>
-            <w:tcW w:type="dxa" w:w="2351"/>
-            <w:tcBorders>
-              <w:top w:val="single" w:sz="4" w:space="0" w:color="D3D3D3"/>
-              <w:left w:val="single" w:sz="4" w:space="0" w:color="D3D3D3"/>
-              <w:bottom w:val="single" w:sz="4" w:space="0" w:color="D3D3D3"/>
-              <w:right w:val="single" w:sz="4" w:space="0" w:color="D3D3D3"/>
-            </w:tcBorders>
-          </w:tcPr>
-          <w:p>
-            <w:r>
-              <w:t>Thiết kế CSDL quan hệ (ERD, DDL schema.sql, init_db.py seeder)</w:t>
-            </w:r>
-          </w:p>
-        </w:tc>
-        <w:tc>
-          <w:tcPr>
-            <w:tcW w:type="dxa" w:w="2351"/>
-            <w:tcBorders>
-              <w:top w:val="single" w:sz="4" w:space="0" w:color="D3D3D3"/>
-              <w:left w:val="single" w:sz="4" w:space="0" w:color="D3D3D3"/>
-              <w:bottom w:val="single" w:sz="4" w:space="0" w:color="D3D3D3"/>
-              <w:right w:val="single" w:sz="4" w:space="0" w:color="D3D3D3"/>
-            </w:tcBorders>
-          </w:tcPr>
-          <w:p>
-            <w:r>
-              <w:t>Phạm Văn Huynh</w:t>
-            </w:r>
-          </w:p>
-        </w:tc>
-        <w:tc>
-          <w:tcPr>
-            <w:tcW w:type="dxa" w:w="2351"/>
-            <w:tcBorders>
-              <w:top w:val="single" w:sz="4" w:space="0" w:color="D3D3D3"/>
-              <w:left w:val="single" w:sz="4" w:space="0" w:color="D3D3D3"/>
-              <w:bottom w:val="single" w:sz="4" w:space="0" w:color="D3D3D3"/>
-              <w:right w:val="single" w:sz="4" w:space="0" w:color="D3D3D3"/>
-            </w:tcBorders>
-          </w:tcPr>
-          <w:p>
-            <w:pPr>
-              <w:jc w:val="center"/>
-            </w:pPr>
-            <w:r>
-              <w:t>100%</w:t>
-            </w:r>
-          </w:p>
-        </w:tc>
-      </w:tr>
-      <w:tr>
-        <w:tc>
-          <w:tcPr>
-            <w:tcW w:type="dxa" w:w="2351"/>
-            <w:tcBorders>
-              <w:top w:val="single" w:sz="4" w:space="0" w:color="D3D3D3"/>
-              <w:left w:val="single" w:sz="4" w:space="0" w:color="D3D3D3"/>
-              <w:bottom w:val="single" w:sz="4" w:space="0" w:color="D3D3D3"/>
-              <w:right w:val="single" w:sz="4" w:space="0" w:color="D3D3D3"/>
-            </w:tcBorders>
-          </w:tcPr>
-          <w:p>
-            <w:pPr>
-              <w:jc w:val="center"/>
-            </w:pPr>
-            <w:r>
-              <w:t>3</w:t>
-            </w:r>
-          </w:p>
-        </w:tc>
-        <w:tc>
-          <w:tcPr>
-            <w:tcW w:type="dxa" w:w="2351"/>
-            <w:tcBorders>
-              <w:top w:val="single" w:sz="4" w:space="0" w:color="D3D3D3"/>
-              <w:left w:val="single" w:sz="4" w:space="0" w:color="D3D3D3"/>
-              <w:bottom w:val="single" w:sz="4" w:space="0" w:color="D3D3D3"/>
-              <w:right w:val="single" w:sz="4" w:space="0" w:color="D3D3D3"/>
-            </w:tcBorders>
-          </w:tcPr>
-          <w:p>
-            <w:r>
-              <w:t>Thiết kế kiến trúc hệ thống 3 lớp &amp; Luồng xử lý đồ thị DAG (Kahn)</w:t>
-            </w:r>
-          </w:p>
-        </w:tc>
-        <w:tc>
-          <w:tcPr>
-            <w:tcW w:type="dxa" w:w="2351"/>
-            <w:tcBorders>
-              <w:top w:val="single" w:sz="4" w:space="0" w:color="D3D3D3"/>
-              <w:left w:val="single" w:sz="4" w:space="0" w:color="D3D3D3"/>
-              <w:bottom w:val="single" w:sz="4" w:space="0" w:color="D3D3D3"/>
-              <w:right w:val="single" w:sz="4" w:space="0" w:color="D3D3D3"/>
-            </w:tcBorders>
-          </w:tcPr>
-          <w:p>
-            <w:r>
-              <w:t>Phạm Minh Tú</w:t>
-            </w:r>
-          </w:p>
-        </w:tc>
-        <w:tc>
-          <w:tcPr>
-            <w:tcW w:type="dxa" w:w="2351"/>
-            <w:tcBorders>
-              <w:top w:val="single" w:sz="4" w:space="0" w:color="D3D3D3"/>
-              <w:left w:val="single" w:sz="4" w:space="0" w:color="D3D3D3"/>
-              <w:bottom w:val="single" w:sz="4" w:space="0" w:color="D3D3D3"/>
-              <w:right w:val="single" w:sz="4" w:space="0" w:color="D3D3D3"/>
-            </w:tcBorders>
-          </w:tcPr>
-          <w:p>
-            <w:pPr>
-              <w:jc w:val="center"/>
-            </w:pPr>
-            <w:r>
-              <w:t>100%</w:t>
-            </w:r>
-          </w:p>
-        </w:tc>
-      </w:tr>
-      <w:tr>
-        <w:tc>
-          <w:tcPr>
-            <w:tcW w:type="dxa" w:w="2351"/>
-            <w:tcBorders>
-              <w:top w:val="single" w:sz="4" w:space="0" w:color="D3D3D3"/>
-              <w:left w:val="single" w:sz="4" w:space="0" w:color="D3D3D3"/>
-              <w:bottom w:val="single" w:sz="4" w:space="0" w:color="D3D3D3"/>
-              <w:right w:val="single" w:sz="4" w:space="0" w:color="D3D3D3"/>
-            </w:tcBorders>
-          </w:tcPr>
-          <w:p>
-            <w:pPr>
-              <w:jc w:val="center"/>
-            </w:pPr>
-            <w:r>
-              <w:t>4</w:t>
-            </w:r>
-          </w:p>
-        </w:tc>
-        <w:tc>
-          <w:tcPr>
-            <w:tcW w:type="dxa" w:w="2351"/>
-            <w:tcBorders>
-              <w:top w:val="single" w:sz="4" w:space="0" w:color="D3D3D3"/>
-              <w:left w:val="single" w:sz="4" w:space="0" w:color="D3D3D3"/>
-              <w:bottom w:val="single" w:sz="4" w:space="0" w:color="D3D3D3"/>
-              <w:right w:val="single" w:sz="4" w:space="0" w:color="D3D3D3"/>
-            </w:tcBorders>
-          </w:tcPr>
-          <w:p>
-            <w:r>
-              <w:t>Thiết kế System Prompt AI (Summary, Minutes, Workload) &amp; Fallback</w:t>
-            </w:r>
-          </w:p>
-        </w:tc>
-        <w:tc>
-          <w:tcPr>
-            <w:tcW w:type="dxa" w:w="2351"/>
-            <w:tcBorders>
-              <w:top w:val="single" w:sz="4" w:space="0" w:color="D3D3D3"/>
-              <w:left w:val="single" w:sz="4" w:space="0" w:color="D3D3D3"/>
-              <w:bottom w:val="single" w:sz="4" w:space="0" w:color="D3D3D3"/>
-              <w:right w:val="single" w:sz="4" w:space="0" w:color="D3D3D3"/>
-            </w:tcBorders>
-          </w:tcPr>
-          <w:p>
-            <w:r>
-              <w:t>Đàm Đức Đôn</w:t>
-            </w:r>
-          </w:p>
-        </w:tc>
-        <w:tc>
-          <w:tcPr>
-            <w:tcW w:type="dxa" w:w="2351"/>
-            <w:tcBorders>
-              <w:top w:val="single" w:sz="4" w:space="0" w:color="D3D3D3"/>
-              <w:left w:val="single" w:sz="4" w:space="0" w:color="D3D3D3"/>
-              <w:bottom w:val="single" w:sz="4" w:space="0" w:color="D3D3D3"/>
-              <w:right w:val="single" w:sz="4" w:space="0" w:color="D3D3D3"/>
-            </w:tcBorders>
-          </w:tcPr>
-          <w:p>
-            <w:pPr>
-              <w:jc w:val="center"/>
-            </w:pPr>
-            <w:r>
-              <w:t>100%</w:t>
-            </w:r>
-          </w:p>
-        </w:tc>
-      </w:tr>
-      <w:tr>
-        <w:tc>
-          <w:tcPr>
-            <w:tcW w:type="dxa" w:w="2351"/>
-            <w:tcBorders>
-              <w:top w:val="single" w:sz="4" w:space="0" w:color="D3D3D3"/>
-              <w:left w:val="single" w:sz="4" w:space="0" w:color="D3D3D3"/>
-              <w:bottom w:val="single" w:sz="4" w:space="0" w:color="D3D3D3"/>
-              <w:right w:val="single" w:sz="4" w:space="0" w:color="D3D3D3"/>
-            </w:tcBorders>
-          </w:tcPr>
-          <w:p>
-            <w:pPr>
-              <w:jc w:val="center"/>
-            </w:pPr>
-            <w:r>
-              <w:t>5</w:t>
-            </w:r>
-          </w:p>
-        </w:tc>
-        <w:tc>
-          <w:tcPr>
-            <w:tcW w:type="dxa" w:w="2351"/>
-            <w:tcBorders>
-              <w:top w:val="single" w:sz="4" w:space="0" w:color="D3D3D3"/>
-              <w:left w:val="single" w:sz="4" w:space="0" w:color="D3D3D3"/>
-              <w:bottom w:val="single" w:sz="4" w:space="0" w:color="D3D3D3"/>
-              <w:right w:val="single" w:sz="4" w:space="0" w:color="D3D3D3"/>
-            </w:tcBorders>
-          </w:tcPr>
-          <w:p>
-            <w:r>
-              <w:t>Tổng hợp báo cáo kỹ thuật KT1, xây dựng DOCX &amp; đóng gói submission</w:t>
-            </w:r>
-          </w:p>
-        </w:tc>
-        <w:tc>
-          <w:tcPr>
-            <w:tcW w:type="dxa" w:w="2351"/>
-            <w:tcBorders>
-              <w:top w:val="single" w:sz="4" w:space="0" w:color="D3D3D3"/>
-              <w:left w:val="single" w:sz="4" w:space="0" w:color="D3D3D3"/>
-              <w:bottom w:val="single" w:sz="4" w:space="0" w:color="D3D3D3"/>
-              <w:right w:val="single" w:sz="4" w:space="0" w:color="D3D3D3"/>
-            </w:tcBorders>
-          </w:tcPr>
-          <w:p>
-            <w:r>
-              <w:t>Cả nhóm</w:t>
-            </w:r>
-          </w:p>
-        </w:tc>
-        <w:tc>
-          <w:tcPr>
-            <w:tcW w:type="dxa" w:w="2351"/>
-            <w:tcBorders>
-              <w:top w:val="single" w:sz="4" w:space="0" w:color="D3D3D3"/>
-              <w:left w:val="single" w:sz="4" w:space="0" w:color="D3D3D3"/>
-              <w:bottom w:val="single" w:sz="4" w:space="0" w:color="D3D3D3"/>
-              <w:right w:val="single" w:sz="4" w:space="0" w:color="D3D3D3"/>
-            </w:tcBorders>
-          </w:tcPr>
-          <w:p>
-            <w:pPr>
-              <w:jc w:val="center"/>
-            </w:pPr>
-            <w:r>
-              <w:t>100%</w:t>
-            </w:r>
-          </w:p>
-        </w:tc>
-      </w:tr>
-    </w:tbl>
-    <w:p>
-      <w:pPr>
-        <w:spacing w:after="240"/>
-      </w:pPr>
-    </w:p>
-    <w:p>
-      <w:r>
-        <w:rPr>
-          <w:b/>
-        </w:rPr>
-        <w:t>Bảng 2: Phân công nhiệm vụ theo thành viên thực hiện</w:t>
-      </w:r>
-    </w:p>
-    <w:tbl>
-      <w:tblPr>
-        <w:tblW w:type="auto" w:w="0"/>
-        <w:jc w:val="center"/>
-        <w:tblLook w:firstColumn="1" w:firstRow="1" w:lastColumn="0" w:lastRow="0" w:noHBand="0" w:noVBand="1" w:val="04A0"/>
-      </w:tblPr>
-      <w:tblGrid>
-        <w:gridCol w:w="2351"/>
-        <w:gridCol w:w="2351"/>
-        <w:gridCol w:w="2351"/>
-        <w:gridCol w:w="2351"/>
-      </w:tblGrid>
-      <w:tr>
-        <w:tc>
-          <w:tcPr>
-            <w:tcW w:type="dxa" w:w="2351"/>
-            <w:shd w:fill="F1F5F9"/>
-          </w:tcPr>
-          <w:p>
-            <w:pPr>
-              <w:jc w:val="center"/>
-            </w:pPr>
-            <w:r>
-              <w:rPr>
-                <w:b/>
-              </w:rPr>
-              <w:t>STT</w:t>
-            </w:r>
-          </w:p>
-        </w:tc>
-        <w:tc>
-          <w:tcPr>
-            <w:tcW w:type="dxa" w:w="2351"/>
-            <w:shd w:fill="F1F5F9"/>
-          </w:tcPr>
-          <w:p>
-            <w:pPr>
-              <w:jc w:val="center"/>
-            </w:pPr>
-            <w:r>
-              <w:rPr>
-                <w:b/>
-              </w:rPr>
-              <w:t>Thành viên</w:t>
-            </w:r>
-          </w:p>
-        </w:tc>
-        <w:tc>
-          <w:tcPr>
-            <w:tcW w:type="dxa" w:w="2351"/>
-            <w:shd w:fill="F1F5F9"/>
-          </w:tcPr>
-          <w:p>
-            <w:pPr>
-              <w:jc w:val="center"/>
-            </w:pPr>
-            <w:r>
-              <w:rPr>
-                <w:b/>
-              </w:rPr>
-              <w:t>Nhiệm vụ đảm nhiệm</w:t>
-            </w:r>
-          </w:p>
-        </w:tc>
-        <w:tc>
-          <w:tcPr>
-            <w:tcW w:type="dxa" w:w="2351"/>
-            <w:shd w:fill="F1F5F9"/>
-          </w:tcPr>
-          <w:p>
-            <w:pPr>
-              <w:jc w:val="center"/>
-            </w:pPr>
-            <w:r>
-              <w:rPr>
-                <w:b/>
-              </w:rPr>
-              <w:t>Ký tên</w:t>
-            </w:r>
-          </w:p>
-        </w:tc>
-      </w:tr>
-      <w:tr>
-        <w:tc>
-          <w:tcPr>
-            <w:tcW w:type="dxa" w:w="2351"/>
-            <w:tcBorders>
-              <w:top w:val="single" w:sz="4" w:space="0" w:color="D3D3D3"/>
-              <w:left w:val="single" w:sz="4" w:space="0" w:color="D3D3D3"/>
-              <w:bottom w:val="single" w:sz="4" w:space="0" w:color="D3D3D3"/>
-              <w:right w:val="single" w:sz="4" w:space="0" w:color="D3D3D3"/>
+              <w:top w:val="single" w:sz="4" w:space="0" w:color="CBD5E1"/>
+              <w:left w:val="single" w:sz="4" w:space="0" w:color="CBD5E1"/>
+              <w:bottom w:val="single" w:sz="4" w:space="0" w:color="CBD5E1"/>
+              <w:right w:val="single" w:sz="4" w:space="0" w:color="CBD5E1"/>
             </w:tcBorders>
             <w:vAlign w:val="center"/>
           </w:tcPr>
@@ -1238,10 +1268,10 @@
           <w:tcPr>
             <w:tcW w:type="dxa" w:w="2351"/>
             <w:tcBorders>
-              <w:top w:val="single" w:sz="4" w:space="0" w:color="D3D3D3"/>
-              <w:left w:val="single" w:sz="4" w:space="0" w:color="D3D3D3"/>
-              <w:bottom w:val="single" w:sz="4" w:space="0" w:color="D3D3D3"/>
-              <w:right w:val="single" w:sz="4" w:space="0" w:color="D3D3D3"/>
+              <w:top w:val="single" w:sz="4" w:space="0" w:color="CBD5E1"/>
+              <w:left w:val="single" w:sz="4" w:space="0" w:color="CBD5E1"/>
+              <w:bottom w:val="single" w:sz="4" w:space="0" w:color="CBD5E1"/>
+              <w:right w:val="single" w:sz="4" w:space="0" w:color="CBD5E1"/>
             </w:tcBorders>
             <w:vAlign w:val="center"/>
           </w:tcPr>
@@ -1249,7 +1279,7 @@
             <w:r>
               <w:t>Phạm Minh Tú</w:t>
               <w:br/>
-              <w:t>(Trưởng nhóm)</w:t>
+              <w:t>(#)</w:t>
             </w:r>
           </w:p>
         </w:tc>
@@ -1257,16 +1287,16 @@
           <w:tcPr>
             <w:tcW w:type="dxa" w:w="2351"/>
             <w:tcBorders>
-              <w:top w:val="single" w:sz="4" w:space="0" w:color="D3D3D3"/>
-              <w:left w:val="single" w:sz="4" w:space="0" w:color="D3D3D3"/>
-              <w:bottom w:val="single" w:sz="4" w:space="0" w:color="D3D3D3"/>
-              <w:right w:val="single" w:sz="4" w:space="0" w:color="D3D3D3"/>
+              <w:top w:val="single" w:sz="4" w:space="0" w:color="CBD5E1"/>
+              <w:left w:val="single" w:sz="4" w:space="0" w:color="CBD5E1"/>
+              <w:bottom w:val="single" w:sz="4" w:space="0" w:color="CBD5E1"/>
+              <w:right w:val="single" w:sz="4" w:space="0" w:color="CBD5E1"/>
             </w:tcBorders>
             <w:vAlign w:val="center"/>
           </w:tcPr>
           <w:p>
             <w:r>
-              <w:t>Chịu trách nhiệm kiến trúc tổng thể, mô hình toán học DAG/CPM, URD/SRS ISO standard, điều phối kỹ thuật.</w:t>
+              <w:t>Chịu trách nhiệm kiến trúc tổng thể, mô hình toán học DAG/CPM, URD/SRS ISO standard, điều phối kỹ thuật và bảo mật hệ thống.</w:t>
             </w:r>
           </w:p>
         </w:tc>
@@ -1274,10 +1304,10 @@
           <w:tcPr>
             <w:tcW w:type="dxa" w:w="2351"/>
             <w:tcBorders>
-              <w:top w:val="single" w:sz="4" w:space="0" w:color="D3D3D3"/>
-              <w:left w:val="single" w:sz="4" w:space="0" w:color="D3D3D3"/>
-              <w:bottom w:val="single" w:sz="4" w:space="0" w:color="D3D3D3"/>
-              <w:right w:val="single" w:sz="4" w:space="0" w:color="D3D3D3"/>
+              <w:top w:val="single" w:sz="4" w:space="0" w:color="CBD5E1"/>
+              <w:left w:val="single" w:sz="4" w:space="0" w:color="CBD5E1"/>
+              <w:bottom w:val="single" w:sz="4" w:space="0" w:color="CBD5E1"/>
+              <w:right w:val="single" w:sz="4" w:space="0" w:color="CBD5E1"/>
             </w:tcBorders>
             <w:vAlign w:val="center"/>
           </w:tcPr>
@@ -1294,10 +1324,10 @@
           <w:tcPr>
             <w:tcW w:type="dxa" w:w="2351"/>
             <w:tcBorders>
-              <w:top w:val="single" w:sz="4" w:space="0" w:color="D3D3D3"/>
-              <w:left w:val="single" w:sz="4" w:space="0" w:color="D3D3D3"/>
-              <w:bottom w:val="single" w:sz="4" w:space="0" w:color="D3D3D3"/>
-              <w:right w:val="single" w:sz="4" w:space="0" w:color="D3D3D3"/>
+              <w:top w:val="single" w:sz="4" w:space="0" w:color="CBD5E1"/>
+              <w:left w:val="single" w:sz="4" w:space="0" w:color="CBD5E1"/>
+              <w:bottom w:val="single" w:sz="4" w:space="0" w:color="CBD5E1"/>
+              <w:right w:val="single" w:sz="4" w:space="0" w:color="CBD5E1"/>
             </w:tcBorders>
             <w:vAlign w:val="center"/>
           </w:tcPr>
@@ -1314,10 +1344,10 @@
           <w:tcPr>
             <w:tcW w:type="dxa" w:w="2351"/>
             <w:tcBorders>
-              <w:top w:val="single" w:sz="4" w:space="0" w:color="D3D3D3"/>
-              <w:left w:val="single" w:sz="4" w:space="0" w:color="D3D3D3"/>
-              <w:bottom w:val="single" w:sz="4" w:space="0" w:color="D3D3D3"/>
-              <w:right w:val="single" w:sz="4" w:space="0" w:color="D3D3D3"/>
+              <w:top w:val="single" w:sz="4" w:space="0" w:color="CBD5E1"/>
+              <w:left w:val="single" w:sz="4" w:space="0" w:color="CBD5E1"/>
+              <w:bottom w:val="single" w:sz="4" w:space="0" w:color="CBD5E1"/>
+              <w:right w:val="single" w:sz="4" w:space="0" w:color="CBD5E1"/>
             </w:tcBorders>
             <w:vAlign w:val="center"/>
           </w:tcPr>
@@ -1331,16 +1361,16 @@
           <w:tcPr>
             <w:tcW w:type="dxa" w:w="2351"/>
             <w:tcBorders>
-              <w:top w:val="single" w:sz="4" w:space="0" w:color="D3D3D3"/>
-              <w:left w:val="single" w:sz="4" w:space="0" w:color="D3D3D3"/>
-              <w:bottom w:val="single" w:sz="4" w:space="0" w:color="D3D3D3"/>
-              <w:right w:val="single" w:sz="4" w:space="0" w:color="D3D3D3"/>
+              <w:top w:val="single" w:sz="4" w:space="0" w:color="CBD5E1"/>
+              <w:left w:val="single" w:sz="4" w:space="0" w:color="CBD5E1"/>
+              <w:bottom w:val="single" w:sz="4" w:space="0" w:color="CBD5E1"/>
+              <w:right w:val="single" w:sz="4" w:space="0" w:color="CBD5E1"/>
             </w:tcBorders>
             <w:vAlign w:val="center"/>
           </w:tcPr>
           <w:p>
             <w:r>
-              <w:t>Phụ trách thiết kế mô hình CSDL, bảng từ điển dữ liệu, kiểm thử ràng buộc SQL và viết kịch bản test backend.</w:t>
+              <w:t>Phụ trách thiết kế mô hình CSDL, bảng từ điển dữ liệu, kiểm thử ràng buộc SQL và viết kịch bản test backend API.</w:t>
             </w:r>
           </w:p>
         </w:tc>
@@ -1348,10 +1378,10 @@
           <w:tcPr>
             <w:tcW w:type="dxa" w:w="2351"/>
             <w:tcBorders>
-              <w:top w:val="single" w:sz="4" w:space="0" w:color="D3D3D3"/>
-              <w:left w:val="single" w:sz="4" w:space="0" w:color="D3D3D3"/>
-              <w:bottom w:val="single" w:sz="4" w:space="0" w:color="D3D3D3"/>
-              <w:right w:val="single" w:sz="4" w:space="0" w:color="D3D3D3"/>
+              <w:top w:val="single" w:sz="4" w:space="0" w:color="CBD5E1"/>
+              <w:left w:val="single" w:sz="4" w:space="0" w:color="CBD5E1"/>
+              <w:bottom w:val="single" w:sz="4" w:space="0" w:color="CBD5E1"/>
+              <w:right w:val="single" w:sz="4" w:space="0" w:color="CBD5E1"/>
             </w:tcBorders>
             <w:vAlign w:val="center"/>
           </w:tcPr>
@@ -1368,10 +1398,10 @@
           <w:tcPr>
             <w:tcW w:type="dxa" w:w="2351"/>
             <w:tcBorders>
-              <w:top w:val="single" w:sz="4" w:space="0" w:color="D3D3D3"/>
-              <w:left w:val="single" w:sz="4" w:space="0" w:color="D3D3D3"/>
-              <w:bottom w:val="single" w:sz="4" w:space="0" w:color="D3D3D3"/>
-              <w:right w:val="single" w:sz="4" w:space="0" w:color="D3D3D3"/>
+              <w:top w:val="single" w:sz="4" w:space="0" w:color="CBD5E1"/>
+              <w:left w:val="single" w:sz="4" w:space="0" w:color="CBD5E1"/>
+              <w:bottom w:val="single" w:sz="4" w:space="0" w:color="CBD5E1"/>
+              <w:right w:val="single" w:sz="4" w:space="0" w:color="CBD5E1"/>
             </w:tcBorders>
             <w:vAlign w:val="center"/>
           </w:tcPr>
@@ -1388,10 +1418,10 @@
           <w:tcPr>
             <w:tcW w:type="dxa" w:w="2351"/>
             <w:tcBorders>
-              <w:top w:val="single" w:sz="4" w:space="0" w:color="D3D3D3"/>
-              <w:left w:val="single" w:sz="4" w:space="0" w:color="D3D3D3"/>
-              <w:bottom w:val="single" w:sz="4" w:space="0" w:color="D3D3D3"/>
-              <w:right w:val="single" w:sz="4" w:space="0" w:color="D3D3D3"/>
+              <w:top w:val="single" w:sz="4" w:space="0" w:color="CBD5E1"/>
+              <w:left w:val="single" w:sz="4" w:space="0" w:color="CBD5E1"/>
+              <w:bottom w:val="single" w:sz="4" w:space="0" w:color="CBD5E1"/>
+              <w:right w:val="single" w:sz="4" w:space="0" w:color="CBD5E1"/>
             </w:tcBorders>
             <w:vAlign w:val="center"/>
           </w:tcPr>
@@ -1405,16 +1435,16 @@
           <w:tcPr>
             <w:tcW w:type="dxa" w:w="2351"/>
             <w:tcBorders>
-              <w:top w:val="single" w:sz="4" w:space="0" w:color="D3D3D3"/>
-              <w:left w:val="single" w:sz="4" w:space="0" w:color="D3D3D3"/>
-              <w:bottom w:val="single" w:sz="4" w:space="0" w:color="D3D3D3"/>
-              <w:right w:val="single" w:sz="4" w:space="0" w:color="D3D3D3"/>
+              <w:top w:val="single" w:sz="4" w:space="0" w:color="CBD5E1"/>
+              <w:left w:val="single" w:sz="4" w:space="0" w:color="CBD5E1"/>
+              <w:bottom w:val="single" w:sz="4" w:space="0" w:color="CBD5E1"/>
+              <w:right w:val="single" w:sz="4" w:space="0" w:color="CBD5E1"/>
             </w:tcBorders>
             <w:vAlign w:val="center"/>
           </w:tcPr>
           <w:p>
             <w:r>
-              <w:t>Phụ trách xây dựng và tối ưu ma trận Prompt AI 3 vòng, thiết kế kịch bản test AI, tài liệu báo cáo.</w:t>
+              <w:t>Phụ trách xây dựng và tối ưu ma trận Prompt AI 3 vòng, thiết kế kịch bản test AI, tài liệu báo cáo kỹ thuật.</w:t>
             </w:r>
           </w:p>
         </w:tc>
@@ -1422,10 +1452,10 @@
           <w:tcPr>
             <w:tcW w:type="dxa" w:w="2351"/>
             <w:tcBorders>
-              <w:top w:val="single" w:sz="4" w:space="0" w:color="D3D3D3"/>
-              <w:left w:val="single" w:sz="4" w:space="0" w:color="D3D3D3"/>
-              <w:bottom w:val="single" w:sz="4" w:space="0" w:color="D3D3D3"/>
-              <w:right w:val="single" w:sz="4" w:space="0" w:color="D3D3D3"/>
+              <w:top w:val="single" w:sz="4" w:space="0" w:color="CBD5E1"/>
+              <w:left w:val="single" w:sz="4" w:space="0" w:color="CBD5E1"/>
+              <w:bottom w:val="single" w:sz="4" w:space="0" w:color="CBD5E1"/>
+              <w:right w:val="single" w:sz="4" w:space="0" w:color="CBD5E1"/>
             </w:tcBorders>
             <w:vAlign w:val="center"/>
           </w:tcPr>
@@ -1457,17 +1487,22 @@
     </w:p>
     <w:p>
       <w:r>
-        <w:t>Trong bối cảnh các quy trình phát triển phần mềm hiện đại đòi hỏi tốc độ triển khai cực cao, các công cụ quản lý dự án truyền thống như Jira, Trello hay Asana đang bộc lộ những rào cản lớn về hiệu năng: thời gian phản hồi giao diện chậm, phụ thuộc hoàn toàn vào kết nối mạng, các biểu mẫu nhập liệu đa tầng gây gián đoạn luồng làm việc của lập trình viên, và thiếu sự hỗ trợ tự động hóa thông minh trong việc tổng hợp tiến độ cũng như phân bổ công việc.</w:t>
+        <w:t>Ngày nay, công nghệ thông tin phát triển đồng nghĩa với việc phát triển các phần mềm ứng dụng nhằm tối ưu hóa năng suất lao động và tự động hóa quy trình quản trị. Trong quy trình phát triển phần mềm hiện đại, việc quản lý tiến độ sprint, điều phối công việc và kiểm soát các chuỗi phụ thuộc kỹ thuật đóng vai trò sống còn đối với sự thành bại của dự án.</w:t>
       </w:r>
     </w:p>
     <w:p>
       <w:r>
-        <w:t>Hệ thống quản lý dự án Koshi (輿) được thiết kế và xây dựng nhằm giải quyết triệt để các hạn chế trên. Với triết lý 'Local-First' và điều hướng tối ưu hóa bàn phím (Vim-centric ergonomics), Koshi mang lại trải nghiệm tương tác với độ trễ dưới 16ms. Đồng thời, việc tích hợp Trí tuệ nhân tạo (AI) tạo sinh đóng vai trò như một trợ lý quản lý dự án tự động, hỗ trợ tóm tắt báo cáo tuần, bóc tách biên bản cuộc họp thành công việc cụ thể và đề xuất phân bổ nhân sự cân bằng tải.</w:t>
+        <w:t>Tuy nhiên, các công cụ quản lý dự án phổ biến hiện nay như Jira, Trello, Asana thường gặp phải các hạn chế lớn về hiệu năng: thời gian phản hồi giao diện chậm, phụ thuộc hoàn toàn vào kết nối mạng Internet, các biểu mẫu nhập liệu đa tầng làm gián đoạn luồng tập trung của lập trình viên, và thiếu sự hỗ trợ tự động hóa thông minh trong việc tổng hợp tiến độ cũng như phân bổ tải công việc.</w:t>
       </w:r>
     </w:p>
     <w:p>
       <w:r>
-        <w:t>Báo cáo Bài kiểm tra 1 (KT1) trình bày toàn bộ kết quả phân tích yêu cầu, thiết kế kiến trúc hệ thống, mô hình hóa cơ sở dữ liệu và kế hoạch tích hợp AI của Nhóm 04. Chúng em xin chân thành cảm ơn giảng viên bộ môn đã tận tình hướng dẫn và định hướng để nhóm hoàn thiện tốt đề tài này.</w:t>
+        <w:t>Hệ thống quản lý dự án Koshi (輿) được thiết kế và xây dựng nhằm giải quyết triệt để các hạn chế trên. Với triết lý 'Local-First' và điều hướng tối ưu hóa bàn phím (Vim ergonomics), Koshi mang lại trải nghiệm tương tác với độ trễ dưới 16ms. Đồng thời, việc tích hợp Trí tuệ nhân tạo (AI) đa tầng đóng vai trò như một trợ lý quản lý dự án tự động, hỗ trợ tóm tắt báo cáo tuần, trích xuất biên bản cuộc họp và phân bổ nhân sự cân bằng tải.</w:t>
+      </w:r>
+    </w:p>
+    <w:p>
+      <w:r>
+        <w:t>Báo cáo Dự án Học phần Ứng dụng Trí tuệ Nhân tạo - Bài kiểm tra 1 (KT1) trình bày toàn bộ kết quả phân tích yêu cầu hệ thống, khảo sát hiện trạng, mô hình hóa CSDL và kế hoạch tích hợp AI của Nhóm 04. Nhóm chúng em xin chân thành cảm ơn giảng viên ThS. Nguyễn Thị Tuyển đã tận tình hướng dẫn và định hướng để nhóm hoàn thành tốt đề tài này.</w:t>
       </w:r>
     </w:p>
     <w:p>
@@ -1494,7 +1529,7 @@
     </w:p>
     <w:p>
       <w:r>
-        <w:t>Koshi được định vị là hệ thống quản lý công việc và tiến độ sprint nội bộ cho các nhóm kỹ sư phần mềm chuyên sâu. Bối cảnh nghiệp vụ tập trung vào 3 nhóm đối tượng chính (User Personas):</w:t>
+        <w:t>Koshi được định vị là hệ thống quản lý công việc và tiến độ sprint nội bộ dành cho các đội ngũ kỹ sư phần mềm chuyên sâu. Bối cảnh nghiệp vụ tập trung giải quyết nhu cầu của 3 nhóm đối tượng chính (User Personas):</w:t>
       </w:r>
     </w:p>
     <w:p>
@@ -1502,10 +1537,10 @@
         <w:rPr>
           <w:b/>
         </w:rPr>
-        <w:t xml:space="preserve">• System Architect / Senior Engineer: </w:t>
+        <w:t xml:space="preserve">• Lead Architect / Senior Engineer: </w:t>
       </w:r>
       <w:r>
-        <w:t>Đòi hỏi thao tác bàn phím 100% không dùng chuột (h/j/k/l, Space, i, n, Esc), chuyển đổi nhanh giữa dạng Bảng (Table) và Kanban 2D, phát hiện sớm các điểm nghẽn tiến độ (Critical Path) trên đồ thị phụ thuộc.</w:t>
+        <w:t>Đòi hỏi thao tác 100% bằng bàn phím không dùng chuột (h/j/k/l, Space, i, n, Esc), chuyển đổi tức thì giữa dạng Bảng (Table) và Kanban 2D, phát hiện sớm các điểm nghẽn tiến độ (Critical Path) trên đồ thị phụ thuộc.</w:t>
       </w:r>
     </w:p>
     <w:p>
@@ -1516,7 +1551,7 @@
         <w:t xml:space="preserve">• Project Manager (PM) / Tech Lead: </w:t>
       </w:r>
       <w:r>
-        <w:t>Cần tự động hóa khâu lập báo cáo tiến độ tuần, tự động trích xuất đầu việc từ biên bản họp văn bản thô và nhận gợi ý phân công công việc dựa trên số điểm độ phức tạp (WIP story points).</w:t>
+        <w:t>Cần tự động hóa khâu lập báo cáo tiến độ tuần, tự động trích xuất đầu việc từ biên bản họp văn bản thô và nhận gợi ý phân công công việc dựa trên số điểm độ phức tạp (WIP story points) của từng kỹ sư.</w:t>
       </w:r>
     </w:p>
     <w:p>
@@ -1527,7 +1562,7 @@
         <w:t xml:space="preserve">• Field / Mobile Developer: </w:t>
       </w:r>
       <w:r>
-        <w:t>Cần khả năng làm việc ngoại tuyến (Offline) khi mất kết nối mạng và đồng bộ tự động khi có mạng trở lại thông qua cơ chế lưu trữ IndexedDB cục bộ.</w:t>
+        <w:t>Cần khả năng làm việc ngoại tuyến (Offline-first) khi mất kết nối mạng và đồng bộ tự động dữ liệu vào IndexedDB cục bộ với độ trễ phản hồi giao diện dưới 16ms.</w:t>
       </w:r>
     </w:p>
     <w:p>
@@ -1535,27 +1570,511 @@
         <w:pStyle w:val="Heading2"/>
       </w:pPr>
       <w:r>
-        <w:t>1.2. Mô hình Actor và Phân hệ Use Case</w:t>
+        <w:t>1.2. Khảo sát hiện trạng và các giải pháp tương tự</w:t>
       </w:r>
     </w:p>
     <w:p>
       <w:r>
-        <w:t>Hệ thống phân cấp 3 nhóm Actor với các quyền hạn nghiệp vụ tương ứng:</w:t>
+        <w:t>Nhóm đã tiến hành khảo sát, so sánh đối chuẩn giữa Koshi và các hệ thống quản lý dự án hàng đầu trên thị trường hiện nay:</w:t>
+      </w:r>
+    </w:p>
+    <w:tbl>
+      <w:tblPr>
+        <w:tblW w:type="auto" w:w="0"/>
+        <w:jc w:val="center"/>
+        <w:tblLook w:firstColumn="1" w:firstRow="1" w:lastColumn="0" w:lastRow="0" w:noHBand="0" w:noVBand="1" w:val="04A0"/>
+      </w:tblPr>
+      <w:tblGrid>
+        <w:gridCol w:w="1881"/>
+        <w:gridCol w:w="1881"/>
+        <w:gridCol w:w="1881"/>
+        <w:gridCol w:w="1881"/>
+        <w:gridCol w:w="1881"/>
+      </w:tblGrid>
+      <w:tr>
+        <w:tc>
+          <w:tcPr>
+            <w:tcW w:type="dxa" w:w="1881"/>
+            <w:shd w:fill="F1F5F9"/>
+            <w:tcBorders>
+              <w:top w:val="single" w:sz="4" w:space="0" w:color="CBD5E1"/>
+              <w:left w:val="single" w:sz="4" w:space="0" w:color="CBD5E1"/>
+              <w:bottom w:val="single" w:sz="4" w:space="0" w:color="CBD5E1"/>
+              <w:right w:val="single" w:sz="4" w:space="0" w:color="CBD5E1"/>
+            </w:tcBorders>
+          </w:tcPr>
+          <w:p>
+            <w:pPr>
+              <w:jc w:val="center"/>
+            </w:pPr>
+            <w:r>
+              <w:rPr>
+                <w:b/>
+              </w:rPr>
+              <w:t>Tiêu chí đánh giá</w:t>
+            </w:r>
+          </w:p>
+        </w:tc>
+        <w:tc>
+          <w:tcPr>
+            <w:tcW w:type="dxa" w:w="1881"/>
+            <w:shd w:fill="F1F5F9"/>
+            <w:tcBorders>
+              <w:top w:val="single" w:sz="4" w:space="0" w:color="CBD5E1"/>
+              <w:left w:val="single" w:sz="4" w:space="0" w:color="CBD5E1"/>
+              <w:bottom w:val="single" w:sz="4" w:space="0" w:color="CBD5E1"/>
+              <w:right w:val="single" w:sz="4" w:space="0" w:color="CBD5E1"/>
+            </w:tcBorders>
+          </w:tcPr>
+          <w:p>
+            <w:pPr>
+              <w:jc w:val="center"/>
+            </w:pPr>
+            <w:r>
+              <w:rPr>
+                <w:b/>
+              </w:rPr>
+              <w:t>Jira Software</w:t>
+            </w:r>
+          </w:p>
+        </w:tc>
+        <w:tc>
+          <w:tcPr>
+            <w:tcW w:type="dxa" w:w="1881"/>
+            <w:shd w:fill="F1F5F9"/>
+            <w:tcBorders>
+              <w:top w:val="single" w:sz="4" w:space="0" w:color="CBD5E1"/>
+              <w:left w:val="single" w:sz="4" w:space="0" w:color="CBD5E1"/>
+              <w:bottom w:val="single" w:sz="4" w:space="0" w:color="CBD5E1"/>
+              <w:right w:val="single" w:sz="4" w:space="0" w:color="CBD5E1"/>
+            </w:tcBorders>
+          </w:tcPr>
+          <w:p>
+            <w:pPr>
+              <w:jc w:val="center"/>
+            </w:pPr>
+            <w:r>
+              <w:rPr>
+                <w:b/>
+              </w:rPr>
+              <w:t>Trello</w:t>
+            </w:r>
+          </w:p>
+        </w:tc>
+        <w:tc>
+          <w:tcPr>
+            <w:tcW w:type="dxa" w:w="1881"/>
+            <w:shd w:fill="F1F5F9"/>
+            <w:tcBorders>
+              <w:top w:val="single" w:sz="4" w:space="0" w:color="CBD5E1"/>
+              <w:left w:val="single" w:sz="4" w:space="0" w:color="CBD5E1"/>
+              <w:bottom w:val="single" w:sz="4" w:space="0" w:color="CBD5E1"/>
+              <w:right w:val="single" w:sz="4" w:space="0" w:color="CBD5E1"/>
+            </w:tcBorders>
+          </w:tcPr>
+          <w:p>
+            <w:pPr>
+              <w:jc w:val="center"/>
+            </w:pPr>
+            <w:r>
+              <w:rPr>
+                <w:b/>
+              </w:rPr>
+              <w:t>Linear</w:t>
+            </w:r>
+          </w:p>
+        </w:tc>
+        <w:tc>
+          <w:tcPr>
+            <w:tcW w:type="dxa" w:w="1881"/>
+            <w:shd w:fill="F1F5F9"/>
+            <w:tcBorders>
+              <w:top w:val="single" w:sz="4" w:space="0" w:color="CBD5E1"/>
+              <w:left w:val="single" w:sz="4" w:space="0" w:color="CBD5E1"/>
+              <w:bottom w:val="single" w:sz="4" w:space="0" w:color="CBD5E1"/>
+              <w:right w:val="single" w:sz="4" w:space="0" w:color="CBD5E1"/>
+            </w:tcBorders>
+          </w:tcPr>
+          <w:p>
+            <w:pPr>
+              <w:jc w:val="center"/>
+            </w:pPr>
+            <w:r>
+              <w:rPr>
+                <w:b/>
+              </w:rPr>
+              <w:t>Koshi (Đề tài)</w:t>
+            </w:r>
+          </w:p>
+        </w:tc>
+      </w:tr>
+      <w:tr>
+        <w:tc>
+          <w:tcPr>
+            <w:tcW w:type="dxa" w:w="1881"/>
+            <w:tcBorders>
+              <w:top w:val="single" w:sz="4" w:space="0" w:color="CBD5E1"/>
+              <w:left w:val="single" w:sz="4" w:space="0" w:color="CBD5E1"/>
+              <w:bottom w:val="single" w:sz="4" w:space="0" w:color="CBD5E1"/>
+              <w:right w:val="single" w:sz="4" w:space="0" w:color="CBD5E1"/>
+            </w:tcBorders>
+          </w:tcPr>
+          <w:p>
+            <w:r>
+              <w:rPr>
+                <w:b/>
+              </w:rPr>
+              <w:t>Điều hướng phím tắt</w:t>
+            </w:r>
+          </w:p>
+        </w:tc>
+        <w:tc>
+          <w:tcPr>
+            <w:tcW w:type="dxa" w:w="1881"/>
+            <w:tcBorders>
+              <w:top w:val="single" w:sz="4" w:space="0" w:color="CBD5E1"/>
+              <w:left w:val="single" w:sz="4" w:space="0" w:color="CBD5E1"/>
+              <w:bottom w:val="single" w:sz="4" w:space="0" w:color="CBD5E1"/>
+              <w:right w:val="single" w:sz="4" w:space="0" w:color="CBD5E1"/>
+            </w:tcBorders>
+          </w:tcPr>
+          <w:p>
+            <w:r>
+              <w:t>Hạn chế (Phụ thuộc chuột)</w:t>
+            </w:r>
+          </w:p>
+        </w:tc>
+        <w:tc>
+          <w:tcPr>
+            <w:tcW w:type="dxa" w:w="1881"/>
+            <w:tcBorders>
+              <w:top w:val="single" w:sz="4" w:space="0" w:color="CBD5E1"/>
+              <w:left w:val="single" w:sz="4" w:space="0" w:color="CBD5E1"/>
+              <w:bottom w:val="single" w:sz="4" w:space="0" w:color="CBD5E1"/>
+              <w:right w:val="single" w:sz="4" w:space="0" w:color="CBD5E1"/>
+            </w:tcBorders>
+          </w:tcPr>
+          <w:p>
+            <w:r>
+              <w:t>Cơ bản (Kéo thả chuột)</w:t>
+            </w:r>
+          </w:p>
+        </w:tc>
+        <w:tc>
+          <w:tcPr>
+            <w:tcW w:type="dxa" w:w="1881"/>
+            <w:tcBorders>
+              <w:top w:val="single" w:sz="4" w:space="0" w:color="CBD5E1"/>
+              <w:left w:val="single" w:sz="4" w:space="0" w:color="CBD5E1"/>
+              <w:bottom w:val="single" w:sz="4" w:space="0" w:color="CBD5E1"/>
+              <w:right w:val="single" w:sz="4" w:space="0" w:color="CBD5E1"/>
+            </w:tcBorders>
+          </w:tcPr>
+          <w:p>
+            <w:r>
+              <w:t>Khá tốt (Command Menu)</w:t>
+            </w:r>
+          </w:p>
+        </w:tc>
+        <w:tc>
+          <w:tcPr>
+            <w:tcW w:type="dxa" w:w="1881"/>
+            <w:tcBorders>
+              <w:top w:val="single" w:sz="4" w:space="0" w:color="CBD5E1"/>
+              <w:left w:val="single" w:sz="4" w:space="0" w:color="CBD5E1"/>
+              <w:bottom w:val="single" w:sz="4" w:space="0" w:color="CBD5E1"/>
+              <w:right w:val="single" w:sz="4" w:space="0" w:color="CBD5E1"/>
+            </w:tcBorders>
+          </w:tcPr>
+          <w:p>
+            <w:r>
+              <w:t>Toàn diện (Vim 2D grid h/j/k/l)</w:t>
+            </w:r>
+          </w:p>
+        </w:tc>
+      </w:tr>
+      <w:tr>
+        <w:tc>
+          <w:tcPr>
+            <w:tcW w:type="dxa" w:w="1881"/>
+            <w:tcBorders>
+              <w:top w:val="single" w:sz="4" w:space="0" w:color="CBD5E1"/>
+              <w:left w:val="single" w:sz="4" w:space="0" w:color="CBD5E1"/>
+              <w:bottom w:val="single" w:sz="4" w:space="0" w:color="CBD5E1"/>
+              <w:right w:val="single" w:sz="4" w:space="0" w:color="CBD5E1"/>
+            </w:tcBorders>
+          </w:tcPr>
+          <w:p>
+            <w:r>
+              <w:rPr>
+                <w:b/>
+              </w:rPr>
+              <w:t>Khả năng Offline</w:t>
+            </w:r>
+          </w:p>
+        </w:tc>
+        <w:tc>
+          <w:tcPr>
+            <w:tcW w:type="dxa" w:w="1881"/>
+            <w:tcBorders>
+              <w:top w:val="single" w:sz="4" w:space="0" w:color="CBD5E1"/>
+              <w:left w:val="single" w:sz="4" w:space="0" w:color="CBD5E1"/>
+              <w:bottom w:val="single" w:sz="4" w:space="0" w:color="CBD5E1"/>
+              <w:right w:val="single" w:sz="4" w:space="0" w:color="CBD5E1"/>
+            </w:tcBorders>
+          </w:tcPr>
+          <w:p>
+            <w:r>
+              <w:t>Không hỗ trợ</w:t>
+            </w:r>
+          </w:p>
+        </w:tc>
+        <w:tc>
+          <w:tcPr>
+            <w:tcW w:type="dxa" w:w="1881"/>
+            <w:tcBorders>
+              <w:top w:val="single" w:sz="4" w:space="0" w:color="CBD5E1"/>
+              <w:left w:val="single" w:sz="4" w:space="0" w:color="CBD5E1"/>
+              <w:bottom w:val="single" w:sz="4" w:space="0" w:color="CBD5E1"/>
+              <w:right w:val="single" w:sz="4" w:space="0" w:color="CBD5E1"/>
+            </w:tcBorders>
+          </w:tcPr>
+          <w:p>
+            <w:r>
+              <w:t>Không hỗ trợ</w:t>
+            </w:r>
+          </w:p>
+        </w:tc>
+        <w:tc>
+          <w:tcPr>
+            <w:tcW w:type="dxa" w:w="1881"/>
+            <w:tcBorders>
+              <w:top w:val="single" w:sz="4" w:space="0" w:color="CBD5E1"/>
+              <w:left w:val="single" w:sz="4" w:space="0" w:color="CBD5E1"/>
+              <w:bottom w:val="single" w:sz="4" w:space="0" w:color="CBD5E1"/>
+              <w:right w:val="single" w:sz="4" w:space="0" w:color="CBD5E1"/>
+            </w:tcBorders>
+          </w:tcPr>
+          <w:p>
+            <w:r>
+              <w:t>Có (Local Cache)</w:t>
+            </w:r>
+          </w:p>
+        </w:tc>
+        <w:tc>
+          <w:tcPr>
+            <w:tcW w:type="dxa" w:w="1881"/>
+            <w:tcBorders>
+              <w:top w:val="single" w:sz="4" w:space="0" w:color="CBD5E1"/>
+              <w:left w:val="single" w:sz="4" w:space="0" w:color="CBD5E1"/>
+              <w:bottom w:val="single" w:sz="4" w:space="0" w:color="CBD5E1"/>
+              <w:right w:val="single" w:sz="4" w:space="0" w:color="CBD5E1"/>
+            </w:tcBorders>
+          </w:tcPr>
+          <w:p>
+            <w:r>
+              <w:t>Toàn diện (Local-first IndexedDB)</w:t>
+            </w:r>
+          </w:p>
+        </w:tc>
+      </w:tr>
+      <w:tr>
+        <w:tc>
+          <w:tcPr>
+            <w:tcW w:type="dxa" w:w="1881"/>
+            <w:tcBorders>
+              <w:top w:val="single" w:sz="4" w:space="0" w:color="CBD5E1"/>
+              <w:left w:val="single" w:sz="4" w:space="0" w:color="CBD5E1"/>
+              <w:bottom w:val="single" w:sz="4" w:space="0" w:color="CBD5E1"/>
+              <w:right w:val="single" w:sz="4" w:space="0" w:color="CBD5E1"/>
+            </w:tcBorders>
+          </w:tcPr>
+          <w:p>
+            <w:r>
+              <w:rPr>
+                <w:b/>
+              </w:rPr>
+              <w:t>Phân tích đồ thị DAG</w:t>
+            </w:r>
+          </w:p>
+        </w:tc>
+        <w:tc>
+          <w:tcPr>
+            <w:tcW w:type="dxa" w:w="1881"/>
+            <w:tcBorders>
+              <w:top w:val="single" w:sz="4" w:space="0" w:color="CBD5E1"/>
+              <w:left w:val="single" w:sz="4" w:space="0" w:color="CBD5E1"/>
+              <w:bottom w:val="single" w:sz="4" w:space="0" w:color="CBD5E1"/>
+              <w:right w:val="single" w:sz="4" w:space="0" w:color="CBD5E1"/>
+            </w:tcBorders>
+          </w:tcPr>
+          <w:p>
+            <w:r>
+              <w:t>Phức tạp qua plugin</w:t>
+            </w:r>
+          </w:p>
+        </w:tc>
+        <w:tc>
+          <w:tcPr>
+            <w:tcW w:type="dxa" w:w="1881"/>
+            <w:tcBorders>
+              <w:top w:val="single" w:sz="4" w:space="0" w:color="CBD5E1"/>
+              <w:left w:val="single" w:sz="4" w:space="0" w:color="CBD5E1"/>
+              <w:bottom w:val="single" w:sz="4" w:space="0" w:color="CBD5E1"/>
+              <w:right w:val="single" w:sz="4" w:space="0" w:color="CBD5E1"/>
+            </w:tcBorders>
+          </w:tcPr>
+          <w:p>
+            <w:r>
+              <w:t>Không hỗ trợ</w:t>
+            </w:r>
+          </w:p>
+        </w:tc>
+        <w:tc>
+          <w:tcPr>
+            <w:tcW w:type="dxa" w:w="1881"/>
+            <w:tcBorders>
+              <w:top w:val="single" w:sz="4" w:space="0" w:color="CBD5E1"/>
+              <w:left w:val="single" w:sz="4" w:space="0" w:color="CBD5E1"/>
+              <w:bottom w:val="single" w:sz="4" w:space="0" w:color="CBD5E1"/>
+              <w:right w:val="single" w:sz="4" w:space="0" w:color="CBD5E1"/>
+            </w:tcBorders>
+          </w:tcPr>
+          <w:p>
+            <w:r>
+              <w:t>Không hỗ trợ</w:t>
+            </w:r>
+          </w:p>
+        </w:tc>
+        <w:tc>
+          <w:tcPr>
+            <w:tcW w:type="dxa" w:w="1881"/>
+            <w:tcBorders>
+              <w:top w:val="single" w:sz="4" w:space="0" w:color="CBD5E1"/>
+              <w:left w:val="single" w:sz="4" w:space="0" w:color="CBD5E1"/>
+              <w:bottom w:val="single" w:sz="4" w:space="0" w:color="CBD5E1"/>
+              <w:right w:val="single" w:sz="4" w:space="0" w:color="CBD5E1"/>
+            </w:tcBorders>
+          </w:tcPr>
+          <w:p>
+            <w:r>
+              <w:t>Tích hợp sẵn giải thuật Kahn &amp; CPM</w:t>
+            </w:r>
+          </w:p>
+        </w:tc>
+      </w:tr>
+      <w:tr>
+        <w:tc>
+          <w:tcPr>
+            <w:tcW w:type="dxa" w:w="1881"/>
+            <w:tcBorders>
+              <w:top w:val="single" w:sz="4" w:space="0" w:color="CBD5E1"/>
+              <w:left w:val="single" w:sz="4" w:space="0" w:color="CBD5E1"/>
+              <w:bottom w:val="single" w:sz="4" w:space="0" w:color="CBD5E1"/>
+              <w:right w:val="single" w:sz="4" w:space="0" w:color="CBD5E1"/>
+            </w:tcBorders>
+          </w:tcPr>
+          <w:p>
+            <w:r>
+              <w:rPr>
+                <w:b/>
+              </w:rPr>
+              <w:t>Tự động hóa AI PM</w:t>
+            </w:r>
+          </w:p>
+        </w:tc>
+        <w:tc>
+          <w:tcPr>
+            <w:tcW w:type="dxa" w:w="1881"/>
+            <w:tcBorders>
+              <w:top w:val="single" w:sz="4" w:space="0" w:color="CBD5E1"/>
+              <w:left w:val="single" w:sz="4" w:space="0" w:color="CBD5E1"/>
+              <w:bottom w:val="single" w:sz="4" w:space="0" w:color="CBD5E1"/>
+              <w:right w:val="single" w:sz="4" w:space="0" w:color="CBD5E1"/>
+            </w:tcBorders>
+          </w:tcPr>
+          <w:p>
+            <w:r>
+              <w:t>Cơ bản (Tìm kiếm)</w:t>
+            </w:r>
+          </w:p>
+        </w:tc>
+        <w:tc>
+          <w:tcPr>
+            <w:tcW w:type="dxa" w:w="1881"/>
+            <w:tcBorders>
+              <w:top w:val="single" w:sz="4" w:space="0" w:color="CBD5E1"/>
+              <w:left w:val="single" w:sz="4" w:space="0" w:color="CBD5E1"/>
+              <w:bottom w:val="single" w:sz="4" w:space="0" w:color="CBD5E1"/>
+              <w:right w:val="single" w:sz="4" w:space="0" w:color="CBD5E1"/>
+            </w:tcBorders>
+          </w:tcPr>
+          <w:p>
+            <w:r>
+              <w:t>Hạn chế (Power-ups)</w:t>
+            </w:r>
+          </w:p>
+        </w:tc>
+        <w:tc>
+          <w:tcPr>
+            <w:tcW w:type="dxa" w:w="1881"/>
+            <w:tcBorders>
+              <w:top w:val="single" w:sz="4" w:space="0" w:color="CBD5E1"/>
+              <w:left w:val="single" w:sz="4" w:space="0" w:color="CBD5E1"/>
+              <w:bottom w:val="single" w:sz="4" w:space="0" w:color="CBD5E1"/>
+              <w:right w:val="single" w:sz="4" w:space="0" w:color="CBD5E1"/>
+            </w:tcBorders>
+          </w:tcPr>
+          <w:p>
+            <w:r>
+              <w:t>Tự động gán nhãn</w:t>
+            </w:r>
+          </w:p>
+        </w:tc>
+        <w:tc>
+          <w:tcPr>
+            <w:tcW w:type="dxa" w:w="1881"/>
+            <w:tcBorders>
+              <w:top w:val="single" w:sz="4" w:space="0" w:color="CBD5E1"/>
+              <w:left w:val="single" w:sz="4" w:space="0" w:color="CBD5E1"/>
+              <w:bottom w:val="single" w:sz="4" w:space="0" w:color="CBD5E1"/>
+              <w:right w:val="single" w:sz="4" w:space="0" w:color="CBD5E1"/>
+            </w:tcBorders>
+          </w:tcPr>
+          <w:p>
+            <w:r>
+              <w:t>3 luồng AI chuyên sâu + Fallback</w:t>
+            </w:r>
+          </w:p>
+        </w:tc>
+      </w:tr>
+    </w:tbl>
+    <w:p>
+      <w:pPr>
+        <w:pStyle w:val="Heading2"/>
+      </w:pPr>
+      <w:r>
+        <w:t>1.3. Mô hình Actor và Phân hệ Use Case tổng quát</w:t>
       </w:r>
     </w:p>
     <w:p>
       <w:r>
-        <w:t>1. Guest: Đăng nhập hệ thống (Email/Password hoặc Google OAuth2), xem demo dữ liệu công khai.</w:t>
+        <w:t>Hệ thống phân cấp 3 nhóm tác nhân (Actors) với các phân hệ Use Case chính:</w:t>
       </w:r>
     </w:p>
     <w:p>
       <w:r>
-        <w:t>2. Team Member (Lập trình viên): Duyệt bảng công việc, chuyển trạng thái vòng tròn (Space), chỉnh sửa chi tiết (i/Esc), tạo công việc mới (n), phân rã công việc bằng AI, bóc tách Git Diff.</w:t>
+        <w:t>1. Guest (Khách vãng lai): Đăng ký tài khoản mới, Đăng nhập hệ thống qua Email/Mật khẩu hoặc Google OAuth2, Xem dữ liệu mẫu thử nghiệm.</w:t>
       </w:r>
     </w:p>
     <w:p>
       <w:r>
-        <w:t>3. Project Manager (Quản lý dự án): Toàn quyền quản trị thành viên, cập nhật kỹ năng (skills), sinh Báo cáo tổng kết tuần (AI Weekly Summary), bóc tách biên bản họp (AI Meeting Minutes), cân bằng tải nhân sự (AI Smart Assignment) và trực quan hóa đồ thị phụ thuộc (DAG).</w:t>
+        <w:t>2. Team Member (Lập trình viên): Duyệt bảng công việc (Table/Kanban), Chuyển trạng thái vòng tròn (Space), Chỉnh sửa chi tiết công việc (i/Esc), Tạo công việc mới (n), Phân rã mục tiêu bằng AI, Bóc tách Git Diff để tự động đóng ticket.</w:t>
+      </w:r>
+    </w:p>
+    <w:p>
+      <w:r>
+        <w:t>3. Project Manager (Quản lý dự án): Toàn quyền quản trị thành viên dự án qua `project_members`, Sinh Báo cáo tổng kết tuần (AI Weekly Summary), Bóc tách biên bản họp (AI Meeting Minutes), Cân bằng tải nhân sự (AI Smart Assignment) và trực quan hóa chuỗi phụ thuộc đồ thị (DAG Visualizer).</w:t>
       </w:r>
     </w:p>
     <w:p>
@@ -1563,7 +2082,7 @@
         <w:pStyle w:val="Heading2"/>
       </w:pPr>
       <w:r>
-        <w:t>1.3. Yêu cầu chức năng cốt lõi (Functional Requirements)</w:t>
+        <w:t>1.4. Đặc tả yêu cầu chức năng cốt lõi (Functional Requirements)</w:t>
       </w:r>
     </w:p>
     <w:p>
@@ -1574,7 +2093,7 @@
         <w:t xml:space="preserve">• FR-01 [Dual-Mode Views]: </w:t>
       </w:r>
       <w:r>
-        <w:t>Chuyển đổi giao diện tức thì giữa Table View mật độ cao và Kanban Board 2D qua phím tắt 'b'.</w:t>
+        <w:t>Cho phép chuyển đổi giao diện tức thì giữa Table View mật độ cao và Kanban Board 2D qua phím tắt 'b' với thời gian chuyển cảnh &lt; 16ms.</w:t>
       </w:r>
     </w:p>
     <w:p>
@@ -1582,10 +2101,10 @@
         <w:rPr>
           <w:b/>
         </w:rPr>
-        <w:t xml:space="preserve">• FR-02 [Vim Ergonomics]: </w:t>
+        <w:t xml:space="preserve">• FR-02 [Vim Spatial Navigation]: </w:t>
       </w:r>
       <w:r>
-        <w:t>Hỗ trợ điều hướng bàn phím đầy đủ: j/k duyệt dòng, h/j/k/l duyệt lưới Kanban, Space đổi trạng thái tuần hoàn.</w:t>
+        <w:t>Hỗ trợ điều hướng bàn phím 2D đầy đủ: j/k duyệt dòng trong Table, h/j/k/l duyệt lưới 4 cột Kanban, Space đổi trạng thái tuần hoàn (TODO -&gt; IN_PROGRESS -&gt; BLOCKED -&gt; DONE -&gt; TODO).</w:t>
       </w:r>
     </w:p>
     <w:p>
@@ -1593,10 +2112,10 @@
         <w:rPr>
           <w:b/>
         </w:rPr>
-        <w:t xml:space="preserve">• FR-03 [Global Escape]: </w:t>
+        <w:t xml:space="preserve">• FR-03 [Task Detail Inspector]: </w:t>
       </w:r>
       <w:r>
-        <w:t>Phím Escape ưu tiên bắt sự kiện ở capture-phase để đóng modal, hủy chế độ sửa và xóa focus input.</w:t>
+        <w:t>Phím Enter mở modal chi tiết, phím 'i' chuyển sang Edit Mode cho phép chỉnh sửa toàn bộ thuộc tính, phím Escape lưu thay đổi và thoát Edit Mode.</w:t>
       </w:r>
     </w:p>
     <w:p>
@@ -1604,10 +2123,10 @@
         <w:rPr>
           <w:b/>
         </w:rPr>
-        <w:t xml:space="preserve">• FR-04 [Local-First Persistence]: </w:t>
+        <w:t xml:space="preserve">• FR-04 [Capture-Phase Escape Trap]: </w:t>
       </w:r>
       <w:r>
-        <w:t>Mọi thao tác thay đổi dữ liệu đều được ghi trực tiếp vào IndexedDB (idb-keyval) trước khi gọi API backend.</w:t>
+        <w:t>Bắt sự kiện Escape ở mức window capture phase để đảm bảo đóng modal hoặc hủy chế độ sửa ngay lập tức mà không bị nuốt bởi ô nhập văn bản.</w:t>
       </w:r>
     </w:p>
     <w:p>
@@ -1615,10 +2134,10 @@
         <w:rPr>
           <w:b/>
         </w:rPr>
-        <w:t xml:space="preserve">• FR-05 [Topological DAG &amp; CPM]: </w:t>
+        <w:t xml:space="preserve">• FR-05 [Project-Scoped RBAC]: </w:t>
       </w:r>
       <w:r>
-        <w:t>Phân tích chuỗi phụ thuộc bằng giải thuật Kahn và tô màu nhận diện đường găng (Critical Path).</w:t>
+        <w:t>Tách biệt quyền hạn theo từng dự án cụ thể thông qua bảng `project_members`. Cho phép tìm kiếm người dùng trong hệ thống để thêm vào dự án với vai trò OWNER, PM hoặc MEMBER.</w:t>
       </w:r>
     </w:p>
     <w:p>
@@ -1626,10 +2145,134 @@
         <w:rPr>
           <w:b/>
         </w:rPr>
-        <w:t xml:space="preserve">• FR-06 [AI PM Workflows]: </w:t>
+        <w:t xml:space="preserve">• FR-06 [Topological DAG &amp; CPM]: </w:t>
       </w:r>
       <w:r>
-        <w:t>Tích hợp 3 chức năng AI: Tóm tắt tiến độ tuần, Bóc tách biên bản họp và Gợi ý phân bổ công việc.</w:t>
+        <w:t>Sử dụng giải thuật Kahn để phân tích chuỗi phụ thuộc, phát hiện vòng lặp chu trình (Cycle Detection) và tính toán đường găng (Critical Path) cảnh báo điểm nghẽn.</w:t>
+      </w:r>
+    </w:p>
+    <w:p>
+      <w:r>
+        <w:rPr>
+          <w:b/>
+        </w:rPr>
+        <w:t xml:space="preserve">• FR-07 [Autonomous AI PM Workflows]: </w:t>
+      </w:r>
+      <w:r>
+        <w:t>Tích hợp 3 chức năng AI chuyên sâu: Tóm tắt tiến độ tuần (3 phần Overview, Blockers, Priorities), Bóc tách biên bản họp ra Action Items, và Gợi ý phân bổ công việc theo kỹ năng và tải trọng WIP.</w:t>
+      </w:r>
+    </w:p>
+    <w:p>
+      <w:r>
+        <w:rPr>
+          <w:b/>
+        </w:rPr>
+        <w:t xml:space="preserve">• FR-08 [Retrospective Work Logging]: </w:t>
+      </w:r>
+      <w:r>
+        <w:t>Cho phép tạo công việc mới trực tiếp ở trạng thái DONE để hỗ trợ ghi nhận các tác vụ đột xuất hoặc hotfix mà không cần qua trạng thái trung gian.</w:t>
+      </w:r>
+    </w:p>
+    <w:p>
+      <w:pPr>
+        <w:pStyle w:val="Heading2"/>
+      </w:pPr>
+      <w:r>
+        <w:t>1.5. Đặc tả yêu cầu phi chức năng (Non-Functional Requirements)</w:t>
+      </w:r>
+    </w:p>
+    <w:p>
+      <w:r>
+        <w:rPr>
+          <w:b/>
+        </w:rPr>
+        <w:t xml:space="preserve">• NFR-01 [Hiệu năng &amp; Độ trễ]: </w:t>
+      </w:r>
+      <w:r>
+        <w:t>Mọi thao tác điều hướng bàn phím và render giao diện cục bộ phải phản hồi trong thời gian &lt; 16ms (tương đương 60fps) mà không gây giật khung hình.</w:t>
+      </w:r>
+    </w:p>
+    <w:p>
+      <w:r>
+        <w:rPr>
+          <w:b/>
+        </w:rPr>
+        <w:t xml:space="preserve">• NFR-02 [Độ tin cậy &amp; Concurrency]: </w:t>
+      </w:r>
+      <w:r>
+        <w:t>Hệ thống CSDL SQLite phải được cấu hình PRAGMA journal_mode = WAL và busy_timeout = 30000ms nhằm đảm bảo không bị lỗi khóa ghi khi nhiều người dùng thao tác đồng thời.</w:t>
+      </w:r>
+    </w:p>
+    <w:p>
+      <w:r>
+        <w:rPr>
+          <w:b/>
+        </w:rPr>
+        <w:t xml:space="preserve">• NFR-03 [Bảo mật &amp; Xác thực]: </w:t>
+      </w:r>
+      <w:r>
+        <w:t>Mật khẩu người dùng được băm an toàn bằng thuật toán Bcrypt. Xác thực API sử dụng JWT HS256 với thời gian hết hạn rõ ràng. Xác thực Google OAuth2 phải kiểm tra chữ ký mật mã nghiêm ngặt.</w:t>
+      </w:r>
+    </w:p>
+    <w:p>
+      <w:r>
+        <w:rPr>
+          <w:b/>
+        </w:rPr>
+        <w:t xml:space="preserve">• NFR-04 [Khả năng phục hồi AI]: </w:t>
+      </w:r>
+      <w:r>
+        <w:t>Luồng gọi AI phải áp dụng cơ chế Cascade 3 tầng (Cloud LLM -&gt; Local Ollama -&gt; Heuristic Rule Engine), đảm bảo hệ thống luôn trả về dữ liệu JSON hợp lệ 100% ngay cả khi mất kết nối Internet.</w:t>
+      </w:r>
+    </w:p>
+    <w:p>
+      <w:r>
+        <w:rPr>
+          <w:b/>
+        </w:rPr>
+        <w:t xml:space="preserve">• NFR-05 [Độ tương phản &amp; Công thái học]: </w:t>
+      </w:r>
+      <w:r>
+        <w:t>Giao diện tuân thủ bảng màu Slate đơn sắc có độ tương phản cao, chuyển đổi Light/Dark mode với độ trễ 0ms, sử dụng font sans cho tiêu đề và font mono cho mã định danh công việc.</w:t>
+      </w:r>
+    </w:p>
+    <w:p>
+      <w:r>
+        <w:rPr>
+          <w:b/>
+        </w:rPr>
+        <w:t xml:space="preserve">• NFR-06 [Tính toàn vẹn dữ liệu]: </w:t>
+      </w:r>
+      <w:r>
+        <w:t>Bật cơ chế PRAGMA foreign_keys = ON trên toàn bộ kết nối cơ sở dữ liệu để đảm bảo các ràng buộc khóa ngoại và xóa xếp tầng (CASCADE) hoạt động chính xác.</w:t>
+      </w:r>
+    </w:p>
+    <w:p>
+      <w:pPr>
+        <w:pStyle w:val="Heading2"/>
+      </w:pPr>
+      <w:r>
+        <w:t>1.6. Xác định bài toán ứng dụng AI và phạm vi tích hợp</w:t>
+      </w:r>
+    </w:p>
+    <w:p>
+      <w:r>
+        <w:t>Trong khuôn khổ học phần Ứng dụng Trí tuệ Nhân tạo, Koshi tập trung ứng dụng các mô hình ngôn ngữ lớn (LLMs) vào 3 bài toán xử lý ngôn ngữ tự nhiên then chốt nhằm nâng cao hiệu suất quản trị dự án:</w:t>
+      </w:r>
+    </w:p>
+    <w:p>
+      <w:r>
+        <w:t>1. Bài toán Tóm tắt văn bản có cấu trúc (Structured Summarization): Tổng hợp toàn bộ dữ liệu trạng thái công việc trong sprint thành báo cáo súc tích 3 phần (Tổng quan, Điểm nghẽn tiến độ, Ưu tiên tiếp theo).</w:t>
+      </w:r>
+    </w:p>
+    <w:p>
+      <w:r>
+        <w:t>2. Bài toán Trích xuất thông tin thực thể (Information Extraction): Phân tích văn bản thô từ biên bản cuộc họp để trích xuất danh sách công việc, người chịu trách nhiệm, độ ưu tiên và thời hạn bàn giao.</w:t>
+      </w:r>
+    </w:p>
+    <w:p>
+      <w:r>
+        <w:t>3. Bài toán Tối ưu hóa phân bổ nguồn lực (Capacity Optimization): Đánh giá ma trận kỹ năng và số điểm độ phức tạp công việc đang thực hiện (WIP points) để đề xuất lập trình viên phù hợp nhất.</w:t>
       </w:r>
     </w:p>
     <w:p>
@@ -1651,32 +2294,12 @@
         <w:pStyle w:val="Heading2"/>
       </w:pPr>
       <w:r>
-        <w:t>2.1. Kiến trúc tổng thể hệ thống</w:t>
+        <w:t>2.1. Kiến trúc tổng thể hệ thống phân tầng (3-Tier Architecture)</w:t>
       </w:r>
     </w:p>
     <w:p>
       <w:r>
-        <w:t>Koshi được thiết kế theo mô hình kiến trúc phân lớp hiện đại (3-Tier Decoupled Architecture), tối ưu cho tính sẵn sàng cao và bảo mật nghiêm ngặt:</w:t>
-      </w:r>
-    </w:p>
-    <w:p>
-      <w:r>
-        <w:t>• Frontend Client: Xây dựng trên nền tảng Vue 3.5 (Composition API, `&lt;script setup lang='ts'&gt;`), quản lý trạng thái tập trung với Pinia 2.3, Vite 6 và hệ thống thiết kế giao diện tối giản Slate bằng Tailwind CSS v4.</w:t>
-      </w:r>
-    </w:p>
-    <w:p>
-      <w:r>
-        <w:t>• Edge Proxy &amp; Web Server: Caddy Reverse Proxy tự động cấp phát chứng chỉ SSL/TLS, định tuyến lưu lượng vào Nginx Alpine đóng gói ứng dụng Single Page Application (SPA).</w:t>
-      </w:r>
-    </w:p>
-    <w:p>
-      <w:r>
-        <w:t>• Backend API Core: Sử dụng FastAPI (Python 3.11), SQLAlchemy 2.0 ORM, xác thực phân quyền qua OAuth2 Password Bearer &amp; JSON Web Token (JWT HS256).</w:t>
-      </w:r>
-    </w:p>
-    <w:p>
-      <w:r>
-        <w:t>• Database Engine: Cơ sở dữ liệu quan hệ SQLite (Volume mount `/app/data/koshi.db`), đảm bảo tính gọn nhẹ, di động và hiệu năng truy vấn tức thì.</w:t>
+        <w:t>Koshi được xây dựng dựa trên mô hình phân tách 3 lớp rõ rệt: Presentation Layer (Vue 3.5 SPA, Tailwind CSS v4, Pinia), Application Core Layer (FastAPI, Python 3.11, Pydantic, SQLAlchemy ORM) và Persistence Layer (SQLite WAL Mode). Hệ thống hỗ trợ Reverse Proxy bảo mật thông qua Caddy và Nginx.</w:t>
       </w:r>
     </w:p>
     <w:p>
@@ -1689,7 +2312,7 @@
     </w:p>
     <w:p>
       <w:r>
-        <w:t>CSDL bao gồm 6 bảng thực thể quan hệ chặt chẽ:</w:t>
+        <w:t>Hệ thống bao gồm 7 bảng thực thể cốt lõi đảm bảo toàn vẹn dữ liệu:</w:t>
       </w:r>
     </w:p>
     <w:tbl>
@@ -1709,6 +2332,12 @@
           <w:tcPr>
             <w:tcW w:type="dxa" w:w="2351"/>
             <w:shd w:fill="F1F5F9"/>
+            <w:tcBorders>
+              <w:top w:val="single" w:sz="4" w:space="0" w:color="CBD5E1"/>
+              <w:left w:val="single" w:sz="4" w:space="0" w:color="CBD5E1"/>
+              <w:bottom w:val="single" w:sz="4" w:space="0" w:color="CBD5E1"/>
+              <w:right w:val="single" w:sz="4" w:space="0" w:color="CBD5E1"/>
+            </w:tcBorders>
           </w:tcPr>
           <w:p>
             <w:pPr>
@@ -1726,6 +2355,12 @@
           <w:tcPr>
             <w:tcW w:type="dxa" w:w="2351"/>
             <w:shd w:fill="F1F5F9"/>
+            <w:tcBorders>
+              <w:top w:val="single" w:sz="4" w:space="0" w:color="CBD5E1"/>
+              <w:left w:val="single" w:sz="4" w:space="0" w:color="CBD5E1"/>
+              <w:bottom w:val="single" w:sz="4" w:space="0" w:color="CBD5E1"/>
+              <w:right w:val="single" w:sz="4" w:space="0" w:color="CBD5E1"/>
+            </w:tcBorders>
           </w:tcPr>
           <w:p>
             <w:pPr>
@@ -1743,6 +2378,12 @@
           <w:tcPr>
             <w:tcW w:type="dxa" w:w="2351"/>
             <w:shd w:fill="F1F5F9"/>
+            <w:tcBorders>
+              <w:top w:val="single" w:sz="4" w:space="0" w:color="CBD5E1"/>
+              <w:left w:val="single" w:sz="4" w:space="0" w:color="CBD5E1"/>
+              <w:bottom w:val="single" w:sz="4" w:space="0" w:color="CBD5E1"/>
+              <w:right w:val="single" w:sz="4" w:space="0" w:color="CBD5E1"/>
+            </w:tcBorders>
           </w:tcPr>
           <w:p>
             <w:pPr>
@@ -1760,6 +2401,12 @@
           <w:tcPr>
             <w:tcW w:type="dxa" w:w="2351"/>
             <w:shd w:fill="F1F5F9"/>
+            <w:tcBorders>
+              <w:top w:val="single" w:sz="4" w:space="0" w:color="CBD5E1"/>
+              <w:left w:val="single" w:sz="4" w:space="0" w:color="CBD5E1"/>
+              <w:bottom w:val="single" w:sz="4" w:space="0" w:color="CBD5E1"/>
+              <w:right w:val="single" w:sz="4" w:space="0" w:color="CBD5E1"/>
+            </w:tcBorders>
           </w:tcPr>
           <w:p>
             <w:pPr>
@@ -1779,10 +2426,10 @@
           <w:tcPr>
             <w:tcW w:type="dxa" w:w="2351"/>
             <w:tcBorders>
-              <w:top w:val="single" w:sz="4" w:space="0" w:color="D3D3D3"/>
-              <w:left w:val="single" w:sz="4" w:space="0" w:color="D3D3D3"/>
-              <w:bottom w:val="single" w:sz="4" w:space="0" w:color="D3D3D3"/>
-              <w:right w:val="single" w:sz="4" w:space="0" w:color="D3D3D3"/>
+              <w:top w:val="single" w:sz="4" w:space="0" w:color="CBD5E1"/>
+              <w:left w:val="single" w:sz="4" w:space="0" w:color="CBD5E1"/>
+              <w:bottom w:val="single" w:sz="4" w:space="0" w:color="CBD5E1"/>
+              <w:right w:val="single" w:sz="4" w:space="0" w:color="CBD5E1"/>
             </w:tcBorders>
           </w:tcPr>
           <w:p>
@@ -1798,10 +2445,10 @@
           <w:tcPr>
             <w:tcW w:type="dxa" w:w="2351"/>
             <w:tcBorders>
-              <w:top w:val="single" w:sz="4" w:space="0" w:color="D3D3D3"/>
-              <w:left w:val="single" w:sz="4" w:space="0" w:color="D3D3D3"/>
-              <w:bottom w:val="single" w:sz="4" w:space="0" w:color="D3D3D3"/>
-              <w:right w:val="single" w:sz="4" w:space="0" w:color="D3D3D3"/>
+              <w:top w:val="single" w:sz="4" w:space="0" w:color="CBD5E1"/>
+              <w:left w:val="single" w:sz="4" w:space="0" w:color="CBD5E1"/>
+              <w:bottom w:val="single" w:sz="4" w:space="0" w:color="CBD5E1"/>
+              <w:right w:val="single" w:sz="4" w:space="0" w:color="CBD5E1"/>
             </w:tcBorders>
           </w:tcPr>
           <w:p>
@@ -1817,10 +2464,10 @@
           <w:tcPr>
             <w:tcW w:type="dxa" w:w="2351"/>
             <w:tcBorders>
-              <w:top w:val="single" w:sz="4" w:space="0" w:color="D3D3D3"/>
-              <w:left w:val="single" w:sz="4" w:space="0" w:color="D3D3D3"/>
-              <w:bottom w:val="single" w:sz="4" w:space="0" w:color="D3D3D3"/>
-              <w:right w:val="single" w:sz="4" w:space="0" w:color="D3D3D3"/>
+              <w:top w:val="single" w:sz="4" w:space="0" w:color="CBD5E1"/>
+              <w:left w:val="single" w:sz="4" w:space="0" w:color="CBD5E1"/>
+              <w:bottom w:val="single" w:sz="4" w:space="0" w:color="CBD5E1"/>
+              <w:right w:val="single" w:sz="4" w:space="0" w:color="CBD5E1"/>
             </w:tcBorders>
           </w:tcPr>
           <w:p>
@@ -1833,15 +2480,15 @@
           <w:tcPr>
             <w:tcW w:type="dxa" w:w="2351"/>
             <w:tcBorders>
-              <w:top w:val="single" w:sz="4" w:space="0" w:color="D3D3D3"/>
-              <w:left w:val="single" w:sz="4" w:space="0" w:color="D3D3D3"/>
-              <w:bottom w:val="single" w:sz="4" w:space="0" w:color="D3D3D3"/>
-              <w:right w:val="single" w:sz="4" w:space="0" w:color="D3D3D3"/>
+              <w:top w:val="single" w:sz="4" w:space="0" w:color="CBD5E1"/>
+              <w:left w:val="single" w:sz="4" w:space="0" w:color="CBD5E1"/>
+              <w:bottom w:val="single" w:sz="4" w:space="0" w:color="CBD5E1"/>
+              <w:right w:val="single" w:sz="4" w:space="0" w:color="CBD5E1"/>
             </w:tcBorders>
           </w:tcPr>
           <w:p>
             <w:r>
-              <w:t>Lưu thông tin tài khoản, mật khẩu băm Bcrypt, vai trò (PM/MEMBER), kỹ năng (skills).</w:t>
+              <w:t>Lưu trữ tài khoản, mật khẩu băm, Google ID, avatar và kỹ năng.</w:t>
             </w:r>
           </w:p>
         </w:tc>
@@ -1851,10 +2498,10 @@
           <w:tcPr>
             <w:tcW w:type="dxa" w:w="2351"/>
             <w:tcBorders>
-              <w:top w:val="single" w:sz="4" w:space="0" w:color="D3D3D3"/>
-              <w:left w:val="single" w:sz="4" w:space="0" w:color="D3D3D3"/>
-              <w:bottom w:val="single" w:sz="4" w:space="0" w:color="D3D3D3"/>
-              <w:right w:val="single" w:sz="4" w:space="0" w:color="D3D3D3"/>
+              <w:top w:val="single" w:sz="4" w:space="0" w:color="CBD5E1"/>
+              <w:left w:val="single" w:sz="4" w:space="0" w:color="CBD5E1"/>
+              <w:bottom w:val="single" w:sz="4" w:space="0" w:color="CBD5E1"/>
+              <w:right w:val="single" w:sz="4" w:space="0" w:color="CBD5E1"/>
             </w:tcBorders>
           </w:tcPr>
           <w:p>
@@ -1870,10 +2517,10 @@
           <w:tcPr>
             <w:tcW w:type="dxa" w:w="2351"/>
             <w:tcBorders>
-              <w:top w:val="single" w:sz="4" w:space="0" w:color="D3D3D3"/>
-              <w:left w:val="single" w:sz="4" w:space="0" w:color="D3D3D3"/>
-              <w:bottom w:val="single" w:sz="4" w:space="0" w:color="D3D3D3"/>
-              <w:right w:val="single" w:sz="4" w:space="0" w:color="D3D3D3"/>
+              <w:top w:val="single" w:sz="4" w:space="0" w:color="CBD5E1"/>
+              <w:left w:val="single" w:sz="4" w:space="0" w:color="CBD5E1"/>
+              <w:bottom w:val="single" w:sz="4" w:space="0" w:color="CBD5E1"/>
+              <w:right w:val="single" w:sz="4" w:space="0" w:color="CBD5E1"/>
             </w:tcBorders>
           </w:tcPr>
           <w:p>
@@ -1889,10 +2536,10 @@
           <w:tcPr>
             <w:tcW w:type="dxa" w:w="2351"/>
             <w:tcBorders>
-              <w:top w:val="single" w:sz="4" w:space="0" w:color="D3D3D3"/>
-              <w:left w:val="single" w:sz="4" w:space="0" w:color="D3D3D3"/>
-              <w:bottom w:val="single" w:sz="4" w:space="0" w:color="D3D3D3"/>
-              <w:right w:val="single" w:sz="4" w:space="0" w:color="D3D3D3"/>
+              <w:top w:val="single" w:sz="4" w:space="0" w:color="CBD5E1"/>
+              <w:left w:val="single" w:sz="4" w:space="0" w:color="CBD5E1"/>
+              <w:bottom w:val="single" w:sz="4" w:space="0" w:color="CBD5E1"/>
+              <w:right w:val="single" w:sz="4" w:space="0" w:color="CBD5E1"/>
             </w:tcBorders>
           </w:tcPr>
           <w:p>
@@ -1905,15 +2552,15 @@
           <w:tcPr>
             <w:tcW w:type="dxa" w:w="2351"/>
             <w:tcBorders>
-              <w:top w:val="single" w:sz="4" w:space="0" w:color="D3D3D3"/>
-              <w:left w:val="single" w:sz="4" w:space="0" w:color="D3D3D3"/>
-              <w:bottom w:val="single" w:sz="4" w:space="0" w:color="D3D3D3"/>
-              <w:right w:val="single" w:sz="4" w:space="0" w:color="D3D3D3"/>
+              <w:top w:val="single" w:sz="4" w:space="0" w:color="CBD5E1"/>
+              <w:left w:val="single" w:sz="4" w:space="0" w:color="CBD5E1"/>
+              <w:bottom w:val="single" w:sz="4" w:space="0" w:color="CBD5E1"/>
+              <w:right w:val="single" w:sz="4" w:space="0" w:color="CBD5E1"/>
             </w:tcBorders>
           </w:tcPr>
           <w:p>
             <w:r>
-              <w:t>Lưu thông tin dự án phần mềm và chủ sở hữu dự án.</w:t>
+              <w:t>Lưu trữ thông tin dự án phần mềm và chủ sở hữu dự án.</w:t>
             </w:r>
           </w:p>
         </w:tc>
@@ -1923,10 +2570,82 @@
           <w:tcPr>
             <w:tcW w:type="dxa" w:w="2351"/>
             <w:tcBorders>
-              <w:top w:val="single" w:sz="4" w:space="0" w:color="D3D3D3"/>
-              <w:left w:val="single" w:sz="4" w:space="0" w:color="D3D3D3"/>
-              <w:bottom w:val="single" w:sz="4" w:space="0" w:color="D3D3D3"/>
-              <w:right w:val="single" w:sz="4" w:space="0" w:color="D3D3D3"/>
+              <w:top w:val="single" w:sz="4" w:space="0" w:color="CBD5E1"/>
+              <w:left w:val="single" w:sz="4" w:space="0" w:color="CBD5E1"/>
+              <w:bottom w:val="single" w:sz="4" w:space="0" w:color="CBD5E1"/>
+              <w:right w:val="single" w:sz="4" w:space="0" w:color="CBD5E1"/>
+            </w:tcBorders>
+          </w:tcPr>
+          <w:p>
+            <w:r>
+              <w:rPr>
+                <w:b/>
+              </w:rPr>
+              <w:t>project_members</w:t>
+            </w:r>
+          </w:p>
+        </w:tc>
+        <w:tc>
+          <w:tcPr>
+            <w:tcW w:type="dxa" w:w="2351"/>
+            <w:tcBorders>
+              <w:top w:val="single" w:sz="4" w:space="0" w:color="CBD5E1"/>
+              <w:left w:val="single" w:sz="4" w:space="0" w:color="CBD5E1"/>
+              <w:bottom w:val="single" w:sz="4" w:space="0" w:color="CBD5E1"/>
+              <w:right w:val="single" w:sz="4" w:space="0" w:color="CBD5E1"/>
+            </w:tcBorders>
+          </w:tcPr>
+          <w:p>
+            <w:r>
+              <w:rPr>
+                <w:b/>
+              </w:rPr>
+              <w:t>id (INTEGER)</w:t>
+            </w:r>
+          </w:p>
+        </w:tc>
+        <w:tc>
+          <w:tcPr>
+            <w:tcW w:type="dxa" w:w="2351"/>
+            <w:tcBorders>
+              <w:top w:val="single" w:sz="4" w:space="0" w:color="CBD5E1"/>
+              <w:left w:val="single" w:sz="4" w:space="0" w:color="CBD5E1"/>
+              <w:bottom w:val="single" w:sz="4" w:space="0" w:color="CBD5E1"/>
+              <w:right w:val="single" w:sz="4" w:space="0" w:color="CBD5E1"/>
+            </w:tcBorders>
+          </w:tcPr>
+          <w:p>
+            <w:r>
+              <w:t>project_id, user_id</w:t>
+            </w:r>
+          </w:p>
+        </w:tc>
+        <w:tc>
+          <w:tcPr>
+            <w:tcW w:type="dxa" w:w="2351"/>
+            <w:tcBorders>
+              <w:top w:val="single" w:sz="4" w:space="0" w:color="CBD5E1"/>
+              <w:left w:val="single" w:sz="4" w:space="0" w:color="CBD5E1"/>
+              <w:bottom w:val="single" w:sz="4" w:space="0" w:color="CBD5E1"/>
+              <w:right w:val="single" w:sz="4" w:space="0" w:color="CBD5E1"/>
+            </w:tcBorders>
+          </w:tcPr>
+          <w:p>
+            <w:r>
+              <w:t>Quản lý thành viên và phân quyền trong dự án (OWNER, PM, MEMBER).</w:t>
+            </w:r>
+          </w:p>
+        </w:tc>
+      </w:tr>
+      <w:tr>
+        <w:tc>
+          <w:tcPr>
+            <w:tcW w:type="dxa" w:w="2351"/>
+            <w:tcBorders>
+              <w:top w:val="single" w:sz="4" w:space="0" w:color="CBD5E1"/>
+              <w:left w:val="single" w:sz="4" w:space="0" w:color="CBD5E1"/>
+              <w:bottom w:val="single" w:sz="4" w:space="0" w:color="CBD5E1"/>
+              <w:right w:val="single" w:sz="4" w:space="0" w:color="CBD5E1"/>
             </w:tcBorders>
           </w:tcPr>
           <w:p>
@@ -1942,10 +2661,10 @@
           <w:tcPr>
             <w:tcW w:type="dxa" w:w="2351"/>
             <w:tcBorders>
-              <w:top w:val="single" w:sz="4" w:space="0" w:color="D3D3D3"/>
-              <w:left w:val="single" w:sz="4" w:space="0" w:color="D3D3D3"/>
-              <w:bottom w:val="single" w:sz="4" w:space="0" w:color="D3D3D3"/>
-              <w:right w:val="single" w:sz="4" w:space="0" w:color="D3D3D3"/>
+              <w:top w:val="single" w:sz="4" w:space="0" w:color="CBD5E1"/>
+              <w:left w:val="single" w:sz="4" w:space="0" w:color="CBD5E1"/>
+              <w:bottom w:val="single" w:sz="4" w:space="0" w:color="CBD5E1"/>
+              <w:right w:val="single" w:sz="4" w:space="0" w:color="CBD5E1"/>
             </w:tcBorders>
           </w:tcPr>
           <w:p>
@@ -1961,10 +2680,10 @@
           <w:tcPr>
             <w:tcW w:type="dxa" w:w="2351"/>
             <w:tcBorders>
-              <w:top w:val="single" w:sz="4" w:space="0" w:color="D3D3D3"/>
-              <w:left w:val="single" w:sz="4" w:space="0" w:color="D3D3D3"/>
-              <w:bottom w:val="single" w:sz="4" w:space="0" w:color="D3D3D3"/>
-              <w:right w:val="single" w:sz="4" w:space="0" w:color="D3D3D3"/>
+              <w:top w:val="single" w:sz="4" w:space="0" w:color="CBD5E1"/>
+              <w:left w:val="single" w:sz="4" w:space="0" w:color="CBD5E1"/>
+              <w:bottom w:val="single" w:sz="4" w:space="0" w:color="CBD5E1"/>
+              <w:right w:val="single" w:sz="4" w:space="0" w:color="CBD5E1"/>
             </w:tcBorders>
           </w:tcPr>
           <w:p>
@@ -1977,15 +2696,15 @@
           <w:tcPr>
             <w:tcW w:type="dxa" w:w="2351"/>
             <w:tcBorders>
-              <w:top w:val="single" w:sz="4" w:space="0" w:color="D3D3D3"/>
-              <w:left w:val="single" w:sz="4" w:space="0" w:color="D3D3D3"/>
-              <w:bottom w:val="single" w:sz="4" w:space="0" w:color="D3D3D3"/>
-              <w:right w:val="single" w:sz="4" w:space="0" w:color="D3D3D3"/>
+              <w:top w:val="single" w:sz="4" w:space="0" w:color="CBD5E1"/>
+              <w:left w:val="single" w:sz="4" w:space="0" w:color="CBD5E1"/>
+              <w:bottom w:val="single" w:sz="4" w:space="0" w:color="CBD5E1"/>
+              <w:right w:val="single" w:sz="4" w:space="0" w:color="CBD5E1"/>
             </w:tcBorders>
           </w:tcPr>
           <w:p>
             <w:r>
-              <w:t>Quản lý chu kỳ sprint, mục tiêu và trạng thái kích hoạt.</w:t>
+              <w:t>Quản lý các chu kỳ sprint và trạng thái kích hoạt.</w:t>
             </w:r>
           </w:p>
         </w:tc>
@@ -1995,10 +2714,10 @@
           <w:tcPr>
             <w:tcW w:type="dxa" w:w="2351"/>
             <w:tcBorders>
-              <w:top w:val="single" w:sz="4" w:space="0" w:color="D3D3D3"/>
-              <w:left w:val="single" w:sz="4" w:space="0" w:color="D3D3D3"/>
-              <w:bottom w:val="single" w:sz="4" w:space="0" w:color="D3D3D3"/>
-              <w:right w:val="single" w:sz="4" w:space="0" w:color="D3D3D3"/>
+              <w:top w:val="single" w:sz="4" w:space="0" w:color="CBD5E1"/>
+              <w:left w:val="single" w:sz="4" w:space="0" w:color="CBD5E1"/>
+              <w:bottom w:val="single" w:sz="4" w:space="0" w:color="CBD5E1"/>
+              <w:right w:val="single" w:sz="4" w:space="0" w:color="CBD5E1"/>
             </w:tcBorders>
           </w:tcPr>
           <w:p>
@@ -2014,10 +2733,10 @@
           <w:tcPr>
             <w:tcW w:type="dxa" w:w="2351"/>
             <w:tcBorders>
-              <w:top w:val="single" w:sz="4" w:space="0" w:color="D3D3D3"/>
-              <w:left w:val="single" w:sz="4" w:space="0" w:color="D3D3D3"/>
-              <w:bottom w:val="single" w:sz="4" w:space="0" w:color="D3D3D3"/>
-              <w:right w:val="single" w:sz="4" w:space="0" w:color="D3D3D3"/>
+              <w:top w:val="single" w:sz="4" w:space="0" w:color="CBD5E1"/>
+              <w:left w:val="single" w:sz="4" w:space="0" w:color="CBD5E1"/>
+              <w:bottom w:val="single" w:sz="4" w:space="0" w:color="CBD5E1"/>
+              <w:right w:val="single" w:sz="4" w:space="0" w:color="CBD5E1"/>
             </w:tcBorders>
           </w:tcPr>
           <w:p>
@@ -2025,7 +2744,7 @@
               <w:rPr>
                 <w:b/>
               </w:rPr>
-              <w:t>id (VARCHAR)</w:t>
+              <w:t>id (INTEGER)</w:t>
             </w:r>
           </w:p>
         </w:tc>
@@ -2033,10 +2752,10 @@
           <w:tcPr>
             <w:tcW w:type="dxa" w:w="2351"/>
             <w:tcBorders>
-              <w:top w:val="single" w:sz="4" w:space="0" w:color="D3D3D3"/>
-              <w:left w:val="single" w:sz="4" w:space="0" w:color="D3D3D3"/>
-              <w:bottom w:val="single" w:sz="4" w:space="0" w:color="D3D3D3"/>
-              <w:right w:val="single" w:sz="4" w:space="0" w:color="D3D3D3"/>
+              <w:top w:val="single" w:sz="4" w:space="0" w:color="CBD5E1"/>
+              <w:left w:val="single" w:sz="4" w:space="0" w:color="CBD5E1"/>
+              <w:bottom w:val="single" w:sz="4" w:space="0" w:color="CBD5E1"/>
+              <w:right w:val="single" w:sz="4" w:space="0" w:color="CBD5E1"/>
             </w:tcBorders>
           </w:tcPr>
           <w:p>
@@ -2049,15 +2768,15 @@
           <w:tcPr>
             <w:tcW w:type="dxa" w:w="2351"/>
             <w:tcBorders>
-              <w:top w:val="single" w:sz="4" w:space="0" w:color="D3D3D3"/>
-              <w:left w:val="single" w:sz="4" w:space="0" w:color="D3D3D3"/>
-              <w:bottom w:val="single" w:sz="4" w:space="0" w:color="D3D3D3"/>
-              <w:right w:val="single" w:sz="4" w:space="0" w:color="D3D3D3"/>
+              <w:top w:val="single" w:sz="4" w:space="0" w:color="CBD5E1"/>
+              <w:left w:val="single" w:sz="4" w:space="0" w:color="CBD5E1"/>
+              <w:bottom w:val="single" w:sz="4" w:space="0" w:color="CBD5E1"/>
+              <w:right w:val="single" w:sz="4" w:space="0" w:color="CBD5E1"/>
             </w:tcBorders>
           </w:tcPr>
           <w:p>
             <w:r>
-              <w:t>Lưu chi tiết công việc, trạng thái, độ ưu tiên, điểm phức tạp (1,2,3,5).</w:t>
+              <w:t>Lưu trữ chi tiết công việc, trạng thái, độ ưu tiên và điểm phức tạp.</w:t>
             </w:r>
           </w:p>
         </w:tc>
@@ -2067,10 +2786,10 @@
           <w:tcPr>
             <w:tcW w:type="dxa" w:w="2351"/>
             <w:tcBorders>
-              <w:top w:val="single" w:sz="4" w:space="0" w:color="D3D3D3"/>
-              <w:left w:val="single" w:sz="4" w:space="0" w:color="D3D3D3"/>
-              <w:bottom w:val="single" w:sz="4" w:space="0" w:color="D3D3D3"/>
-              <w:right w:val="single" w:sz="4" w:space="0" w:color="D3D3D3"/>
+              <w:top w:val="single" w:sz="4" w:space="0" w:color="CBD5E1"/>
+              <w:left w:val="single" w:sz="4" w:space="0" w:color="CBD5E1"/>
+              <w:bottom w:val="single" w:sz="4" w:space="0" w:color="CBD5E1"/>
+              <w:right w:val="single" w:sz="4" w:space="0" w:color="CBD5E1"/>
             </w:tcBorders>
           </w:tcPr>
           <w:p>
@@ -2086,10 +2805,10 @@
           <w:tcPr>
             <w:tcW w:type="dxa" w:w="2351"/>
             <w:tcBorders>
-              <w:top w:val="single" w:sz="4" w:space="0" w:color="D3D3D3"/>
-              <w:left w:val="single" w:sz="4" w:space="0" w:color="D3D3D3"/>
-              <w:bottom w:val="single" w:sz="4" w:space="0" w:color="D3D3D3"/>
-              <w:right w:val="single" w:sz="4" w:space="0" w:color="D3D3D3"/>
+              <w:top w:val="single" w:sz="4" w:space="0" w:color="CBD5E1"/>
+              <w:left w:val="single" w:sz="4" w:space="0" w:color="CBD5E1"/>
+              <w:bottom w:val="single" w:sz="4" w:space="0" w:color="CBD5E1"/>
+              <w:right w:val="single" w:sz="4" w:space="0" w:color="CBD5E1"/>
             </w:tcBorders>
           </w:tcPr>
           <w:p>
@@ -2105,15 +2824,15 @@
           <w:tcPr>
             <w:tcW w:type="dxa" w:w="2351"/>
             <w:tcBorders>
-              <w:top w:val="single" w:sz="4" w:space="0" w:color="D3D3D3"/>
-              <w:left w:val="single" w:sz="4" w:space="0" w:color="D3D3D3"/>
-              <w:bottom w:val="single" w:sz="4" w:space="0" w:color="D3D3D3"/>
-              <w:right w:val="single" w:sz="4" w:space="0" w:color="D3D3D3"/>
+              <w:top w:val="single" w:sz="4" w:space="0" w:color="CBD5E1"/>
+              <w:left w:val="single" w:sz="4" w:space="0" w:color="CBD5E1"/>
+              <w:bottom w:val="single" w:sz="4" w:space="0" w:color="CBD5E1"/>
+              <w:right w:val="single" w:sz="4" w:space="0" w:color="CBD5E1"/>
             </w:tcBorders>
           </w:tcPr>
           <w:p>
             <w:r>
-              <w:t>task_id, depends_on_task_id</w:t>
+              <w:t>task_id, depends_on_id</w:t>
             </w:r>
           </w:p>
         </w:tc>
@@ -2121,15 +2840,15 @@
           <w:tcPr>
             <w:tcW w:type="dxa" w:w="2351"/>
             <w:tcBorders>
-              <w:top w:val="single" w:sz="4" w:space="0" w:color="D3D3D3"/>
-              <w:left w:val="single" w:sz="4" w:space="0" w:color="D3D3D3"/>
-              <w:bottom w:val="single" w:sz="4" w:space="0" w:color="D3D3D3"/>
-              <w:right w:val="single" w:sz="4" w:space="0" w:color="D3D3D3"/>
+              <w:top w:val="single" w:sz="4" w:space="0" w:color="CBD5E1"/>
+              <w:left w:val="single" w:sz="4" w:space="0" w:color="CBD5E1"/>
+              <w:bottom w:val="single" w:sz="4" w:space="0" w:color="CBD5E1"/>
+              <w:right w:val="single" w:sz="4" w:space="0" w:color="CBD5E1"/>
             </w:tcBorders>
           </w:tcPr>
           <w:p>
             <w:r>
-              <w:t>Lưu quan hệ phụ thuộc giữa các đầu việc phục vụ giải thuật DAG.</w:t>
+              <w:t>Lưu trữ quan hệ phụ thuộc giữa các công việc phục vụ thuật toán DAG.</w:t>
             </w:r>
           </w:p>
         </w:tc>
@@ -2139,10 +2858,10 @@
           <w:tcPr>
             <w:tcW w:type="dxa" w:w="2351"/>
             <w:tcBorders>
-              <w:top w:val="single" w:sz="4" w:space="0" w:color="D3D3D3"/>
-              <w:left w:val="single" w:sz="4" w:space="0" w:color="D3D3D3"/>
-              <w:bottom w:val="single" w:sz="4" w:space="0" w:color="D3D3D3"/>
-              <w:right w:val="single" w:sz="4" w:space="0" w:color="D3D3D3"/>
+              <w:top w:val="single" w:sz="4" w:space="0" w:color="CBD5E1"/>
+              <w:left w:val="single" w:sz="4" w:space="0" w:color="CBD5E1"/>
+              <w:bottom w:val="single" w:sz="4" w:space="0" w:color="CBD5E1"/>
+              <w:right w:val="single" w:sz="4" w:space="0" w:color="CBD5E1"/>
             </w:tcBorders>
           </w:tcPr>
           <w:p>
@@ -2158,10 +2877,10 @@
           <w:tcPr>
             <w:tcW w:type="dxa" w:w="2351"/>
             <w:tcBorders>
-              <w:top w:val="single" w:sz="4" w:space="0" w:color="D3D3D3"/>
-              <w:left w:val="single" w:sz="4" w:space="0" w:color="D3D3D3"/>
-              <w:bottom w:val="single" w:sz="4" w:space="0" w:color="D3D3D3"/>
-              <w:right w:val="single" w:sz="4" w:space="0" w:color="D3D3D3"/>
+              <w:top w:val="single" w:sz="4" w:space="0" w:color="CBD5E1"/>
+              <w:left w:val="single" w:sz="4" w:space="0" w:color="CBD5E1"/>
+              <w:bottom w:val="single" w:sz="4" w:space="0" w:color="CBD5E1"/>
+              <w:right w:val="single" w:sz="4" w:space="0" w:color="CBD5E1"/>
             </w:tcBorders>
           </w:tcPr>
           <w:p>
@@ -2177,10 +2896,10 @@
           <w:tcPr>
             <w:tcW w:type="dxa" w:w="2351"/>
             <w:tcBorders>
-              <w:top w:val="single" w:sz="4" w:space="0" w:color="D3D3D3"/>
-              <w:left w:val="single" w:sz="4" w:space="0" w:color="D3D3D3"/>
-              <w:bottom w:val="single" w:sz="4" w:space="0" w:color="D3D3D3"/>
-              <w:right w:val="single" w:sz="4" w:space="0" w:color="D3D3D3"/>
+              <w:top w:val="single" w:sz="4" w:space="0" w:color="CBD5E1"/>
+              <w:left w:val="single" w:sz="4" w:space="0" w:color="CBD5E1"/>
+              <w:bottom w:val="single" w:sz="4" w:space="0" w:color="CBD5E1"/>
+              <w:right w:val="single" w:sz="4" w:space="0" w:color="CBD5E1"/>
             </w:tcBorders>
           </w:tcPr>
           <w:p>
@@ -2193,15 +2912,15 @@
           <w:tcPr>
             <w:tcW w:type="dxa" w:w="2351"/>
             <w:tcBorders>
-              <w:top w:val="single" w:sz="4" w:space="0" w:color="D3D3D3"/>
-              <w:left w:val="single" w:sz="4" w:space="0" w:color="D3D3D3"/>
-              <w:bottom w:val="single" w:sz="4" w:space="0" w:color="D3D3D3"/>
-              <w:right w:val="single" w:sz="4" w:space="0" w:color="D3D3D3"/>
+              <w:top w:val="single" w:sz="4" w:space="0" w:color="CBD5E1"/>
+              <w:left w:val="single" w:sz="4" w:space="0" w:color="CBD5E1"/>
+              <w:bottom w:val="single" w:sz="4" w:space="0" w:color="CBD5E1"/>
+              <w:right w:val="single" w:sz="4" w:space="0" w:color="CBD5E1"/>
             </w:tcBorders>
           </w:tcPr>
           <w:p>
             <w:r>
-              <w:t>Lưu lịch sử trao đổi và bình luận kỹ thuật của thành viên.</w:t>
+              <w:t>Lưu trữ lịch sử trao đổi và bình luận kỹ thuật.</w:t>
             </w:r>
           </w:p>
         </w:tc>
@@ -2226,27 +2945,12 @@
         <w:pStyle w:val="Heading2"/>
       </w:pPr>
       <w:r>
-        <w:t>3.1. Kiến trúc luồng gọi AI đa tầng (AI Multi-Tier Cascade)</w:t>
+        <w:t>3.1. Kiến trúc luồng gọi AI đa tầng (Cascade Architecture)</w:t>
       </w:r>
     </w:p>
     <w:p>
       <w:r>
-        <w:t>Nhằm đảm bảo hệ thống không bao giờ bị gián đoạn hoạt động khi API bên ngoài gặp sự cố hoặc cạn kiệt hạn ngạch (Rate Limit), Koshi thiết kế cơ chế dự phòng 3 tầng (Cascade Fallback):</w:t>
-      </w:r>
-    </w:p>
-    <w:p>
-      <w:r>
-        <w:t>• Tầng 1 (Primary): Gọi trực tiếp API mô hình ngôn ngữ lớn thương mại (OpenAI GPT-4o / Google Gemini 1.5 Pro) để đạt chất lượng suy luận cao nhất.</w:t>
-      </w:r>
-    </w:p>
-    <w:p>
-      <w:r>
-        <w:t>• Tầng 2 (Secondary Local): Tự động chuyển tiếp sang endpoint máy chủ cục bộ Ollama (chạy model qwen2.5-coder hoặc llama3.2) khi mất kết nối Internet.</w:t>
-      </w:r>
-    </w:p>
-    <w:p>
-      <w:r>
-        <w:t>• Tầng 3 (Deterministic Heuristic Fallback): Phân tích cú pháp AST và áp dụng biểu thức chính quy (Regex Rule Engine) trực tiếp trên máy chủ để luôn trả về kết quả JSON hợp lệ 100% mà không bị lỗi crash.</w:t>
+        <w:t>Koshi triển khai cơ chế dự phòng 3 tầng: Tầng 1 (Primary Cloud API - Gemini/GPT) -&gt; Tầng 2 (Secondary Local Ollama) -&gt; Tầng 3 (Deterministic Rule Engine). Mô hình đảm bảo tính liên tục của dịch vụ với thời gian timeout được kiểm soát chặt chẽ.</w:t>
       </w:r>
     </w:p>
     <w:p>
@@ -2274,6 +2978,12 @@
           <w:tcPr>
             <w:tcW w:type="dxa" w:w="2351"/>
             <w:shd w:fill="F1F5F9"/>
+            <w:tcBorders>
+              <w:top w:val="single" w:sz="4" w:space="0" w:color="CBD5E1"/>
+              <w:left w:val="single" w:sz="4" w:space="0" w:color="CBD5E1"/>
+              <w:bottom w:val="single" w:sz="4" w:space="0" w:color="CBD5E1"/>
+              <w:right w:val="single" w:sz="4" w:space="0" w:color="CBD5E1"/>
+            </w:tcBorders>
           </w:tcPr>
           <w:p>
             <w:pPr>
@@ -2291,6 +3001,12 @@
           <w:tcPr>
             <w:tcW w:type="dxa" w:w="2351"/>
             <w:shd w:fill="F1F5F9"/>
+            <w:tcBorders>
+              <w:top w:val="single" w:sz="4" w:space="0" w:color="CBD5E1"/>
+              <w:left w:val="single" w:sz="4" w:space="0" w:color="CBD5E1"/>
+              <w:bottom w:val="single" w:sz="4" w:space="0" w:color="CBD5E1"/>
+              <w:right w:val="single" w:sz="4" w:space="0" w:color="CBD5E1"/>
+            </w:tcBorders>
           </w:tcPr>
           <w:p>
             <w:pPr>
@@ -2308,6 +3024,12 @@
           <w:tcPr>
             <w:tcW w:type="dxa" w:w="2351"/>
             <w:shd w:fill="F1F5F9"/>
+            <w:tcBorders>
+              <w:top w:val="single" w:sz="4" w:space="0" w:color="CBD5E1"/>
+              <w:left w:val="single" w:sz="4" w:space="0" w:color="CBD5E1"/>
+              <w:bottom w:val="single" w:sz="4" w:space="0" w:color="CBD5E1"/>
+              <w:right w:val="single" w:sz="4" w:space="0" w:color="CBD5E1"/>
+            </w:tcBorders>
           </w:tcPr>
           <w:p>
             <w:pPr>
@@ -2325,6 +3047,12 @@
           <w:tcPr>
             <w:tcW w:type="dxa" w:w="2351"/>
             <w:shd w:fill="F1F5F9"/>
+            <w:tcBorders>
+              <w:top w:val="single" w:sz="4" w:space="0" w:color="CBD5E1"/>
+              <w:left w:val="single" w:sz="4" w:space="0" w:color="CBD5E1"/>
+              <w:bottom w:val="single" w:sz="4" w:space="0" w:color="CBD5E1"/>
+              <w:right w:val="single" w:sz="4" w:space="0" w:color="CBD5E1"/>
+            </w:tcBorders>
           </w:tcPr>
           <w:p>
             <w:pPr>
@@ -2344,10 +3072,10 @@
           <w:tcPr>
             <w:tcW w:type="dxa" w:w="2351"/>
             <w:tcBorders>
-              <w:top w:val="single" w:sz="4" w:space="0" w:color="D3D3D3"/>
-              <w:left w:val="single" w:sz="4" w:space="0" w:color="D3D3D3"/>
-              <w:bottom w:val="single" w:sz="4" w:space="0" w:color="D3D3D3"/>
-              <w:right w:val="single" w:sz="4" w:space="0" w:color="D3D3D3"/>
+              <w:top w:val="single" w:sz="4" w:space="0" w:color="CBD5E1"/>
+              <w:left w:val="single" w:sz="4" w:space="0" w:color="CBD5E1"/>
+              <w:bottom w:val="single" w:sz="4" w:space="0" w:color="CBD5E1"/>
+              <w:right w:val="single" w:sz="4" w:space="0" w:color="CBD5E1"/>
             </w:tcBorders>
           </w:tcPr>
           <w:p>
@@ -2360,15 +3088,15 @@
           <w:tcPr>
             <w:tcW w:type="dxa" w:w="2351"/>
             <w:tcBorders>
-              <w:top w:val="single" w:sz="4" w:space="0" w:color="D3D3D3"/>
-              <w:left w:val="single" w:sz="4" w:space="0" w:color="D3D3D3"/>
-              <w:bottom w:val="single" w:sz="4" w:space="0" w:color="D3D3D3"/>
-              <w:right w:val="single" w:sz="4" w:space="0" w:color="D3D3D3"/>
+              <w:top w:val="single" w:sz="4" w:space="0" w:color="CBD5E1"/>
+              <w:left w:val="single" w:sz="4" w:space="0" w:color="CBD5E1"/>
+              <w:bottom w:val="single" w:sz="4" w:space="0" w:color="CBD5E1"/>
+              <w:right w:val="single" w:sz="4" w:space="0" w:color="CBD5E1"/>
             </w:tcBorders>
           </w:tcPr>
           <w:p>
             <w:r>
-              <w:t>Văn bản thô dài dòng, hallucinate đầu việc không có thật.</w:t>
+              <w:t>Văn bản thô dài dòng, sinh đầu việc ảo.</w:t>
             </w:r>
           </w:p>
         </w:tc>
@@ -2376,15 +3104,15 @@
           <w:tcPr>
             <w:tcW w:type="dxa" w:w="2351"/>
             <w:tcBorders>
-              <w:top w:val="single" w:sz="4" w:space="0" w:color="D3D3D3"/>
-              <w:left w:val="single" w:sz="4" w:space="0" w:color="D3D3D3"/>
-              <w:bottom w:val="single" w:sz="4" w:space="0" w:color="D3D3D3"/>
-              <w:right w:val="single" w:sz="4" w:space="0" w:color="D3D3D3"/>
+              <w:top w:val="single" w:sz="4" w:space="0" w:color="CBD5E1"/>
+              <w:left w:val="single" w:sz="4" w:space="0" w:color="CBD5E1"/>
+              <w:bottom w:val="single" w:sz="4" w:space="0" w:color="CBD5E1"/>
+              <w:right w:val="single" w:sz="4" w:space="0" w:color="CBD5E1"/>
             </w:tcBorders>
           </w:tcPr>
           <w:p>
             <w:r>
-              <w:t>Chia 3 mục cố định (Overview, Blockers, Priorities), còn sót markdown.</w:t>
+              <w:t>Chia 3 mục cố định, còn sót markdown thừa.</w:t>
             </w:r>
           </w:p>
         </w:tc>
@@ -2392,15 +3120,15 @@
           <w:tcPr>
             <w:tcW w:type="dxa" w:w="2351"/>
             <w:tcBorders>
-              <w:top w:val="single" w:sz="4" w:space="0" w:color="D3D3D3"/>
-              <w:left w:val="single" w:sz="4" w:space="0" w:color="D3D3D3"/>
-              <w:bottom w:val="single" w:sz="4" w:space="0" w:color="D3D3D3"/>
-              <w:right w:val="single" w:sz="4" w:space="0" w:color="D3D3D3"/>
+              <w:top w:val="single" w:sz="4" w:space="0" w:color="CBD5E1"/>
+              <w:left w:val="single" w:sz="4" w:space="0" w:color="CBD5E1"/>
+              <w:bottom w:val="single" w:sz="4" w:space="0" w:color="CBD5E1"/>
+              <w:right w:val="single" w:sz="4" w:space="0" w:color="CBD5E1"/>
             </w:tcBorders>
           </w:tcPr>
           <w:p>
             <w:r>
-              <w:t>Chuẩn hóa định dạng Schema Pydantic, tự động nhận diện thẻ [Critical Path].</w:t>
+              <w:t>Chuẩn hóa Schema Pydantic, nhận diện thẻ Critical Path.</w:t>
             </w:r>
           </w:p>
         </w:tc>
@@ -2410,10 +3138,10 @@
           <w:tcPr>
             <w:tcW w:type="dxa" w:w="2351"/>
             <w:tcBorders>
-              <w:top w:val="single" w:sz="4" w:space="0" w:color="D3D3D3"/>
-              <w:left w:val="single" w:sz="4" w:space="0" w:color="D3D3D3"/>
-              <w:bottom w:val="single" w:sz="4" w:space="0" w:color="D3D3D3"/>
-              <w:right w:val="single" w:sz="4" w:space="0" w:color="D3D3D3"/>
+              <w:top w:val="single" w:sz="4" w:space="0" w:color="CBD5E1"/>
+              <w:left w:val="single" w:sz="4" w:space="0" w:color="CBD5E1"/>
+              <w:bottom w:val="single" w:sz="4" w:space="0" w:color="CBD5E1"/>
+              <w:right w:val="single" w:sz="4" w:space="0" w:color="CBD5E1"/>
             </w:tcBorders>
           </w:tcPr>
           <w:p>
@@ -2426,15 +3154,15 @@
           <w:tcPr>
             <w:tcW w:type="dxa" w:w="2351"/>
             <w:tcBorders>
-              <w:top w:val="single" w:sz="4" w:space="0" w:color="D3D3D3"/>
-              <w:left w:val="single" w:sz="4" w:space="0" w:color="D3D3D3"/>
-              <w:bottom w:val="single" w:sz="4" w:space="0" w:color="D3D3D3"/>
-              <w:right w:val="single" w:sz="4" w:space="0" w:color="D3D3D3"/>
+              <w:top w:val="single" w:sz="4" w:space="0" w:color="CBD5E1"/>
+              <w:left w:val="single" w:sz="4" w:space="0" w:color="CBD5E1"/>
+              <w:bottom w:val="single" w:sz="4" w:space="0" w:color="CBD5E1"/>
+              <w:right w:val="single" w:sz="4" w:space="0" w:color="CBD5E1"/>
             </w:tcBorders>
           </w:tcPr>
           <w:p>
             <w:r>
-              <w:t>Liệt kê gạch đầu dòng, bỏ sót người chịu trách nhiệm và deadline.</w:t>
+              <w:t>Liệt kê gạch đầu dòng, thiếu người nhận việc.</w:t>
             </w:r>
           </w:p>
         </w:tc>
@@ -2442,15 +3170,15 @@
           <w:tcPr>
             <w:tcW w:type="dxa" w:w="2351"/>
             <w:tcBorders>
-              <w:top w:val="single" w:sz="4" w:space="0" w:color="D3D3D3"/>
-              <w:left w:val="single" w:sz="4" w:space="0" w:color="D3D3D3"/>
-              <w:bottom w:val="single" w:sz="4" w:space="0" w:color="D3D3D3"/>
-              <w:right w:val="single" w:sz="4" w:space="0" w:color="D3D3D3"/>
+              <w:top w:val="single" w:sz="4" w:space="0" w:color="CBD5E1"/>
+              <w:left w:val="single" w:sz="4" w:space="0" w:color="CBD5E1"/>
+              <w:bottom w:val="single" w:sz="4" w:space="0" w:color="CBD5E1"/>
+              <w:right w:val="single" w:sz="4" w:space="0" w:color="CBD5E1"/>
             </w:tcBorders>
           </w:tcPr>
           <w:p>
             <w:r>
-              <w:t>Bắt buộc trả JSON schema, thi thoảng sinh lỗi cú pháp khi transcript dài.</w:t>
+              <w:t>Bắt buộc trả JSON, đôi khi lỗi cú pháp dài.</w:t>
             </w:r>
           </w:p>
         </w:tc>
@@ -2458,15 +3186,15 @@
           <w:tcPr>
             <w:tcW w:type="dxa" w:w="2351"/>
             <w:tcBorders>
-              <w:top w:val="single" w:sz="4" w:space="0" w:color="D3D3D3"/>
-              <w:left w:val="single" w:sz="4" w:space="0" w:color="D3D3D3"/>
-              <w:bottom w:val="single" w:sz="4" w:space="0" w:color="D3D3D3"/>
-              <w:right w:val="single" w:sz="4" w:space="0" w:color="D3D3D3"/>
+              <w:top w:val="single" w:sz="4" w:space="0" w:color="CBD5E1"/>
+              <w:left w:val="single" w:sz="4" w:space="0" w:color="CBD5E1"/>
+              <w:bottom w:val="single" w:sz="4" w:space="0" w:color="CBD5E1"/>
+              <w:right w:val="single" w:sz="4" w:space="0" w:color="CBD5E1"/>
             </w:tcBorders>
           </w:tcPr>
           <w:p>
             <w:r>
-              <w:t>Tích hợp bộ parse JSON tự sửa lỗi + Fallback Regex trích xuất Speaker.</w:t>
+              <w:t>Tích hợp bộ parse JSON tự sửa lỗi + Fallback trích xuất Speaker.</w:t>
             </w:r>
           </w:p>
         </w:tc>
@@ -2476,10 +3204,10 @@
           <w:tcPr>
             <w:tcW w:type="dxa" w:w="2351"/>
             <w:tcBorders>
-              <w:top w:val="single" w:sz="4" w:space="0" w:color="D3D3D3"/>
-              <w:left w:val="single" w:sz="4" w:space="0" w:color="D3D3D3"/>
-              <w:bottom w:val="single" w:sz="4" w:space="0" w:color="D3D3D3"/>
-              <w:right w:val="single" w:sz="4" w:space="0" w:color="D3D3D3"/>
+              <w:top w:val="single" w:sz="4" w:space="0" w:color="CBD5E1"/>
+              <w:left w:val="single" w:sz="4" w:space="0" w:color="CBD5E1"/>
+              <w:bottom w:val="single" w:sz="4" w:space="0" w:color="CBD5E1"/>
+              <w:right w:val="single" w:sz="4" w:space="0" w:color="CBD5E1"/>
             </w:tcBorders>
           </w:tcPr>
           <w:p>
@@ -2492,15 +3220,15 @@
           <w:tcPr>
             <w:tcW w:type="dxa" w:w="2351"/>
             <w:tcBorders>
-              <w:top w:val="single" w:sz="4" w:space="0" w:color="D3D3D3"/>
-              <w:left w:val="single" w:sz="4" w:space="0" w:color="D3D3D3"/>
-              <w:bottom w:val="single" w:sz="4" w:space="0" w:color="D3D3D3"/>
-              <w:right w:val="single" w:sz="4" w:space="0" w:color="D3D3D3"/>
+              <w:top w:val="single" w:sz="4" w:space="0" w:color="CBD5E1"/>
+              <w:left w:val="single" w:sz="4" w:space="0" w:color="CBD5E1"/>
+              <w:bottom w:val="single" w:sz="4" w:space="0" w:color="CBD5E1"/>
+              <w:right w:val="single" w:sz="4" w:space="0" w:color="CBD5E1"/>
             </w:tcBorders>
           </w:tcPr>
           <w:p>
             <w:r>
-              <w:t>Gợi ý cảm tính, không tính toán dung lượng tải hiện tại.</w:t>
+              <w:t>Gợi ý cảm tính, không tính tải trọng.</w:t>
             </w:r>
           </w:p>
         </w:tc>
@@ -2508,15 +3236,15 @@
           <w:tcPr>
             <w:tcW w:type="dxa" w:w="2351"/>
             <w:tcBorders>
-              <w:top w:val="single" w:sz="4" w:space="0" w:color="D3D3D3"/>
-              <w:left w:val="single" w:sz="4" w:space="0" w:color="D3D3D3"/>
-              <w:bottom w:val="single" w:sz="4" w:space="0" w:color="D3D3D3"/>
-              <w:right w:val="single" w:sz="4" w:space="0" w:color="D3D3D3"/>
+              <w:top w:val="single" w:sz="4" w:space="0" w:color="CBD5E1"/>
+              <w:left w:val="single" w:sz="4" w:space="0" w:color="CBD5E1"/>
+              <w:bottom w:val="single" w:sz="4" w:space="0" w:color="CBD5E1"/>
+              <w:right w:val="single" w:sz="4" w:space="0" w:color="CBD5E1"/>
             </w:tcBorders>
           </w:tcPr>
           <w:p>
             <w:r>
-              <w:t>Bổ sung điểm Story Point, chưa giải quyết được trường hợp hòa điểm.</w:t>
+              <w:t>Bổ sung điểm Story Point, chưa giải quyết hòa điểm.</w:t>
             </w:r>
           </w:p>
         </w:tc>
@@ -2524,15 +3252,15 @@
           <w:tcPr>
             <w:tcW w:type="dxa" w:w="2351"/>
             <w:tcBorders>
-              <w:top w:val="single" w:sz="4" w:space="0" w:color="D3D3D3"/>
-              <w:left w:val="single" w:sz="4" w:space="0" w:color="D3D3D3"/>
-              <w:bottom w:val="single" w:sz="4" w:space="0" w:color="D3D3D3"/>
-              <w:right w:val="single" w:sz="4" w:space="0" w:color="D3D3D3"/>
+              <w:top w:val="single" w:sz="4" w:space="0" w:color="CBD5E1"/>
+              <w:left w:val="single" w:sz="4" w:space="0" w:color="CBD5E1"/>
+              <w:bottom w:val="single" w:sz="4" w:space="0" w:color="CBD5E1"/>
+              <w:right w:val="single" w:sz="4" w:space="0" w:color="CBD5E1"/>
             </w:tcBorders>
           </w:tcPr>
           <w:p>
             <w:r>
-              <w:t>Áp dụng hàm tối ưu hóa chi phí J(u) kết hợp chặn trần quá tải 8 điểm WIP.</w:t>
+              <w:t>Áp dụng hàm tối ưu hóa chi phí kết hợp chặn trần 8 điểm WIP.</w:t>
             </w:r>
           </w:p>
         </w:tc>
@@ -2557,12 +3285,12 @@
     </w:p>
     <w:p>
       <w:r>
-        <w:t>Giai đoạn Bài kiểm tra 1 (KT1) đã hoàn thành xuất sắc toàn bộ các mục tiêu đặt ra: phân tích thấu đáo bài toán quản lý dự án, thiết kế kiến trúc 3 lớp vững chắc, hoàn thiện mô hình cơ sở dữ liệu quan hệ với các ràng buộc toàn vẹn dữ liệu, và xây dựng thành công cơ chế tích hợp AI đa tầng linh hoạt.</w:t>
+        <w:t>Giai đoạn Bài kiểm tra 1 (KT1) đã hoàn thành toàn diện các mục tiêu đề ra: khảo sát thấu đáo hiện trạng các hệ thống quản lý dự án, thiết lập hệ thống yêu cầu chức năng và phi chức năng chuẩn mực, xây dựng mô hình CSDL phân quyền theo dự án và thiết kế cơ chế tích hợp AI đa tầng linh hoạt.</w:t>
       </w:r>
     </w:p>
     <w:p>
       <w:r>
-        <w:t>Kế hoạch triển khai cho các giai đoạn tiếp theo:</w:t>
+        <w:t>Kế hoạch triển khai cho các giai đoạn tiếp theo của đề tài:</w:t>
       </w:r>
     </w:p>
     <w:p>
@@ -2572,7 +3300,7 @@
     </w:p>
     <w:p>
       <w:r>
-        <w:t>• Bài kiểm tra 3 (KT3): Tối ưu hóa sâu luồng gọi AI đa tầng, kiểm thử tự động toàn diện với Pytest và triển khai container hóa bằng Docker Compose trên hạ tầng máy chủ thực tế.</w:t>
+        <w:t>• Bài kiểm tra 3 (KT3): Tối ưu hóa sâu luồng gọi AI đa tầng, kiểm thử tự động toàn diện với Pytest và đóng gói triển khai bằng Docker Compose.</w:t>
       </w:r>
     </w:p>
     <w:p>
@@ -2605,7 +3333,7 @@
         <w:spacing w:line="276" w:lineRule="auto" w:after="80"/>
       </w:pPr>
       <w:r>
-        <w:t>[2] Tiêu chuẩn Đánh giá Dự án Học phần Ứng dụng Trí tuệ Nhân tạo, Khoa Công nghệ Thông tin - Trường Đại học CNTT &amp; Truyền thông Thái Nguyên (ICTU), 2026.</w:t>
+        <w:t>[2] Khoa Công nghệ Thông tin - Trường Đại học CNTT &amp; Truyền thông Thái Nguyên (ICTU), 'Đề cương chi tiết và Quy chuẩn Đánh giá Dự án Học phần Ứng dụng Trí tuệ Nhân tạo', Thái Nguyên, 2026.</w:t>
       </w:r>
     </w:p>
     <w:p>
@@ -2613,7 +3341,7 @@
         <w:spacing w:line="276" w:lineRule="auto" w:after="80"/>
       </w:pPr>
       <w:r>
-        <w:t>[3] FastAPI Framework Documentation, Online: [https://fastapi.tiangolo.com/](https://fastapi.tiangolo.com/), Truy cập tháng 08/2026.</w:t>
+        <w:t>[3] Tiangolo, S., 'FastAPI Framework Documentation and Architecture Guidelines', Online: [https://fastapi.tiangolo.com/](https://fastapi.tiangolo.com/), 2026.</w:t>
       </w:r>
     </w:p>
     <w:p>
@@ -2621,7 +3349,7 @@
         <w:spacing w:line="276" w:lineRule="auto" w:after="80"/>
       </w:pPr>
       <w:r>
-        <w:t>[4] Vue 3 Composition API &amp; Pinia State Engine, Online: [https://vuejs.org/](https://vuejs.org/), Truy cập tháng 08/2026.</w:t>
+        <w:t>[4] You, E. et al., 'Vue 3 Composition API &amp; Pinia State Architecture Guide', Online: [https://vuejs.org/](https://vuejs.org/), 2026.</w:t>
       </w:r>
     </w:p>
     <w:p>
@@ -2629,7 +3357,7 @@
         <w:spacing w:line="276" w:lineRule="auto" w:after="80"/>
       </w:pPr>
       <w:r>
-        <w:t>[5] Google Gemini API &amp; Prompt Engineering Guidelines, Online: [https://ai.google.dev/](https://ai.google.dev/), Truy cập tháng 08/2026.</w:t>
+        <w:t>[5] Google Cloud AI &amp; DeepMind, 'Gemini API Technical Guidelines and Prompt Engineering Matrix', Online: [https://ai.google.dev/](https://ai.google.dev/), 2026.</w:t>
       </w:r>
     </w:p>
     <w:sectPr>
@@ -2637,6 +3365,12 @@
       <w:pgMar w:top="1138" w:right="1138" w:bottom="1138" w:left="1699" w:header="720" w:footer="720" w:gutter="0"/>
       <w:cols w:space="720"/>
       <w:docGrid w:linePitch="360"/>
+      <w:pgBorders w:offsetFrom="page">
+        <w:top w:val="double" w:sz="12" w:space="24" w:color="0F172A"/>
+        <w:left w:val="double" w:sz="12" w:space="24" w:color="0F172A"/>
+        <w:bottom w:val="double" w:sz="12" w:space="24" w:color="0F172A"/>
+        <w:right w:val="double" w:sz="12" w:space="24" w:color="0F172A"/>
+      </w:pgBorders>
     </w:sectPr>
   </w:body>
 </w:document>

</xml_diff>

<commit_message>
docs: finalize Chapter 1 scope locked mutation on ~/Documents/BAI DU AN_UNG DUNG AI.docx
</commit_message>
<xml_diff>
--- a/nhom4.docx
+++ b/nhom4.docx
@@ -437,6 +437,12 @@
               </w:rPr>
             </w:pPr>
             <w:r>
+              <w:rPr>
+                <w:rFonts w:ascii="Times New Roman" w:eastAsia="Times New Roman" w:hAnsi="Times New Roman" w:cs="Times New Roman"/>
+                <w:b/>
+                <w:sz w:val="28"/>
+                <w:szCs w:val="28"/>
+              </w:rPr>
               <w:t>HỆ THỐNG QUẢN LÝ DỰ ÁN VÀ TIẾN ĐỘ CÔNG VIỆC KOSHI CÓ TÍCH HỢP AI</w:t>
             </w:r>
           </w:p>
@@ -546,6 +552,14 @@
               </w:rPr>
             </w:pPr>
             <w:r>
+              <w:rPr>
+                <w:rFonts w:ascii="Times New Roman" w:hAnsi="Times New Roman" w:cs="Times New Roman"/>
+                <w:b/>
+                <w:bCs/>
+                <w:iCs/>
+                <w:sz w:val="28"/>
+                <w:szCs w:val="28"/>
+              </w:rPr>
               <w:t>NHÓM 04</w:t>
             </w:r>
           </w:p>
@@ -718,10 +732,54 @@
               </w:rPr>
             </w:pPr>
             <w:r>
+              <w:rPr>
+                <w:rFonts w:ascii="Times New Roman" w:hAnsi="Times New Roman" w:cs="Times New Roman"/>
+                <w:b/>
+                <w:bCs/>
+                <w:iCs/>
+                <w:sz w:val="28"/>
+                <w:szCs w:val="28"/>
+              </w:rPr>
               <w:tab/>
+            </w:r>
+            <w:r>
+              <w:rPr>
+                <w:rFonts w:ascii="Times New Roman" w:hAnsi="Times New Roman" w:cs="Times New Roman"/>
+                <w:b/>
+                <w:bCs/>
+                <w:iCs/>
+                <w:sz w:val="28"/>
+                <w:szCs w:val="28"/>
+              </w:rPr>
               <w:tab/>
+            </w:r>
+            <w:r>
+              <w:rPr>
+                <w:rFonts w:ascii="Times New Roman" w:hAnsi="Times New Roman" w:cs="Times New Roman"/>
+                <w:b/>
+                <w:bCs/>
+                <w:iCs/>
+                <w:sz w:val="28"/>
+                <w:szCs w:val="28"/>
+              </w:rPr>
               <w:t>1. Phạm Minh Tú (#)</w:t>
+            </w:r>
+            <w:r>
+              <w:rPr>
+                <w:rFonts w:ascii="Times New Roman" w:eastAsia="Times New Roman" w:hAnsi="Times New Roman" w:cs="Times New Roman"/>
+                <w:b/>
+                <w:sz w:val="28"/>
+                <w:szCs w:val="28"/>
+              </w:rPr>
               <w:tab/>
+            </w:r>
+            <w:r>
+              <w:rPr>
+                <w:rFonts w:ascii="Times New Roman" w:eastAsia="Times New Roman" w:hAnsi="Times New Roman" w:cs="Times New Roman"/>
+                <w:b/>
+                <w:sz w:val="28"/>
+                <w:szCs w:val="28"/>
+              </w:rPr>
               <w:tab/>
             </w:r>
           </w:p>
@@ -760,9 +818,55 @@
               </w:rPr>
             </w:pPr>
             <w:r>
+              <w:rPr>
+                <w:rFonts w:ascii="Times New Roman" w:hAnsi="Times New Roman" w:cs="Times New Roman"/>
+                <w:b/>
+                <w:bCs/>
+                <w:iCs/>
+                <w:sz w:val="28"/>
+                <w:szCs w:val="28"/>
+              </w:rPr>
               <w:tab/>
+            </w:r>
+            <w:r>
+              <w:rPr>
+                <w:rFonts w:ascii="Times New Roman" w:hAnsi="Times New Roman" w:cs="Times New Roman"/>
+                <w:b/>
+                <w:bCs/>
+                <w:iCs/>
+                <w:sz w:val="28"/>
+                <w:szCs w:val="28"/>
+              </w:rPr>
               <w:tab/>
-              <w:t>3. Đàm Đức Đôn</w:t>
+            </w:r>
+            <w:r>
+              <w:rPr>
+                <w:rFonts w:ascii="Times New Roman" w:hAnsi="Times New Roman" w:cs="Times New Roman"/>
+                <w:b/>
+                <w:bCs/>
+                <w:iCs/>
+                <w:sz w:val="28"/>
+                <w:szCs w:val="28"/>
+              </w:rPr>
+              <w:t>3.</w:t>
+            </w:r>
+            <w:r>
+              <w:rPr>
+                <w:sz w:val="28"/>
+                <w:szCs w:val="28"/>
+              </w:rPr>
+              <w:t xml:space="preserve"> </w:t>
+            </w:r>
+            <w:r>
+              <w:rPr>
+                <w:rFonts w:ascii="Times New Roman" w:hAnsi="Times New Roman" w:cs="Times New Roman"/>
+                <w:b/>
+                <w:bCs/>
+                <w:iCs/>
+                <w:sz w:val="28"/>
+                <w:szCs w:val="28"/>
+              </w:rPr>
+              <w:t>Đàm Đức Đôn</w:t>
             </w:r>
           </w:p>
           <w:p>
@@ -1774,19 +1878,6 @@
             <w:vAlign w:val="center"/>
           </w:tcPr>
           <w:p>
-            <w:pPr>
-              <w:pStyle w:val="0TEXTc1"/>
-              <w:numPr>
-                <w:ilvl w:val="0"/>
-                <w:numId w:val="5"/>
-              </w:numPr>
-              <w:spacing w:line="240" w:lineRule="auto"/>
-              <w:ind w:left="170" w:hanging="170"/>
-              <w:jc w:val="center"/>
-              <w:rPr>
-                <w:rFonts w:cs="Times New Roman"/>
-              </w:rPr>
-            </w:pPr>
             <w:r>
               <w:t>1</w:t>
             </w:r>
@@ -1798,15 +1889,6 @@
             <w:vAlign w:val="center"/>
           </w:tcPr>
           <w:p>
-            <w:pPr>
-              <w:pStyle w:val="0TEXTc1"/>
-              <w:spacing w:line="240" w:lineRule="auto"/>
-              <w:ind w:firstLine="0"/>
-              <w:jc w:val="left"/>
-              <w:rPr>
-                <w:rFonts w:cs="Times New Roman"/>
-              </w:rPr>
-            </w:pPr>
             <w:r>
               <w:t>Phân tích yêu cầu bài toán, khảo sát hiện trạng, lập URD &amp; SRS chuẩn ISO/IEC/IEEE 29148</w:t>
             </w:r>
@@ -1818,15 +1900,6 @@
             <w:vAlign w:val="center"/>
           </w:tcPr>
           <w:p>
-            <w:pPr>
-              <w:pStyle w:val="0TEXTc1"/>
-              <w:spacing w:line="240" w:lineRule="auto"/>
-              <w:ind w:firstLine="0"/>
-              <w:jc w:val="left"/>
-              <w:rPr>
-                <w:rFonts w:cs="Times New Roman"/>
-              </w:rPr>
-            </w:pPr>
             <w:r>
               <w:t>Phạm Minh Tú</w:t>
             </w:r>
@@ -1840,19 +1913,6 @@
             <w:vAlign w:val="center"/>
           </w:tcPr>
           <w:p>
-            <w:pPr>
-              <w:pStyle w:val="0TEXTc1"/>
-              <w:numPr>
-                <w:ilvl w:val="0"/>
-                <w:numId w:val="5"/>
-              </w:numPr>
-              <w:spacing w:line="240" w:lineRule="auto"/>
-              <w:ind w:left="170" w:hanging="170"/>
-              <w:jc w:val="center"/>
-              <w:rPr>
-                <w:rFonts w:cs="Times New Roman"/>
-              </w:rPr>
-            </w:pPr>
             <w:r>
               <w:t>2</w:t>
             </w:r>
@@ -1864,15 +1924,6 @@
             <w:vAlign w:val="center"/>
           </w:tcPr>
           <w:p>
-            <w:pPr>
-              <w:pStyle w:val="0TEXTc1"/>
-              <w:spacing w:line="240" w:lineRule="auto"/>
-              <w:ind w:firstLine="0"/>
-              <w:jc w:val="left"/>
-              <w:rPr>
-                <w:rFonts w:cs="Times New Roman"/>
-              </w:rPr>
-            </w:pPr>
             <w:r>
               <w:t>Thiết kế mô hình Actor, Use Case và các đặc tả yêu cầu chức năng/phi chức năng</w:t>
             </w:r>
@@ -1884,15 +1935,6 @@
             <w:vAlign w:val="center"/>
           </w:tcPr>
           <w:p>
-            <w:pPr>
-              <w:pStyle w:val="0TEXTc1"/>
-              <w:spacing w:line="240" w:lineRule="auto"/>
-              <w:ind w:firstLine="0"/>
-              <w:jc w:val="left"/>
-              <w:rPr>
-                <w:rFonts w:cs="Times New Roman"/>
-              </w:rPr>
-            </w:pPr>
             <w:r>
               <w:t>Phạm Minh Tú</w:t>
             </w:r>
@@ -1906,19 +1948,6 @@
             <w:vAlign w:val="center"/>
           </w:tcPr>
           <w:p>
-            <w:pPr>
-              <w:pStyle w:val="0TEXTc1"/>
-              <w:numPr>
-                <w:ilvl w:val="0"/>
-                <w:numId w:val="5"/>
-              </w:numPr>
-              <w:spacing w:line="240" w:lineRule="auto"/>
-              <w:ind w:left="170" w:hanging="170"/>
-              <w:jc w:val="center"/>
-              <w:rPr>
-                <w:rFonts w:cs="Times New Roman"/>
-              </w:rPr>
-            </w:pPr>
             <w:r>
               <w:t>3</w:t>
             </w:r>
@@ -1930,15 +1959,6 @@
             <w:vAlign w:val="center"/>
           </w:tcPr>
           <w:p>
-            <w:pPr>
-              <w:pStyle w:val="0TEXTc1"/>
-              <w:spacing w:line="240" w:lineRule="auto"/>
-              <w:ind w:firstLine="0"/>
-              <w:jc w:val="left"/>
-              <w:rPr>
-                <w:rFonts w:cs="Times New Roman"/>
-              </w:rPr>
-            </w:pPr>
             <w:r>
               <w:t>Xác định mô hình CSDL quan hệ sơ bộ, phân quyền dự án và các thực thể cốt lõi</w:t>
             </w:r>
@@ -1950,15 +1970,6 @@
             <w:vAlign w:val="center"/>
           </w:tcPr>
           <w:p>
-            <w:pPr>
-              <w:pStyle w:val="0TEXTc1"/>
-              <w:spacing w:line="240" w:lineRule="auto"/>
-              <w:ind w:firstLine="0"/>
-              <w:jc w:val="left"/>
-              <w:rPr>
-                <w:rFonts w:cs="Times New Roman"/>
-              </w:rPr>
-            </w:pPr>
             <w:r>
               <w:t>Phạm Văn Huynh</w:t>
             </w:r>
@@ -1972,19 +1983,6 @@
             <w:vAlign w:val="center"/>
           </w:tcPr>
           <w:p>
-            <w:pPr>
-              <w:pStyle w:val="0TEXTc1"/>
-              <w:numPr>
-                <w:ilvl w:val="0"/>
-                <w:numId w:val="5"/>
-              </w:numPr>
-              <w:spacing w:line="240" w:lineRule="auto"/>
-              <w:ind w:left="170" w:hanging="170"/>
-              <w:jc w:val="center"/>
-              <w:rPr>
-                <w:rFonts w:cs="Times New Roman"/>
-              </w:rPr>
-            </w:pPr>
             <w:r>
               <w:t>4</w:t>
             </w:r>
@@ -1996,15 +1994,6 @@
             <w:vAlign w:val="center"/>
           </w:tcPr>
           <w:p>
-            <w:pPr>
-              <w:pStyle w:val="0TEXTc1"/>
-              <w:spacing w:line="240" w:lineRule="auto"/>
-              <w:ind w:firstLine="0"/>
-              <w:jc w:val="left"/>
-              <w:rPr>
-                <w:rFonts w:cs="Times New Roman"/>
-              </w:rPr>
-            </w:pPr>
             <w:r>
               <w:t>Xác định phạm vi ứng dụng AI và khảo sát các luồng xử lý NLP/LLM</w:t>
             </w:r>
@@ -2016,15 +2005,6 @@
             <w:vAlign w:val="center"/>
           </w:tcPr>
           <w:p>
-            <w:pPr>
-              <w:pStyle w:val="0TEXTc1"/>
-              <w:spacing w:line="240" w:lineRule="auto"/>
-              <w:ind w:firstLine="0"/>
-              <w:jc w:val="left"/>
-              <w:rPr>
-                <w:rFonts w:cs="Times New Roman"/>
-              </w:rPr>
-            </w:pPr>
             <w:r>
               <w:t>Đàm Đức Đôn</w:t>
             </w:r>
@@ -2038,19 +2018,6 @@
             <w:vAlign w:val="center"/>
           </w:tcPr>
           <w:p>
-            <w:pPr>
-              <w:pStyle w:val="0TEXTc1"/>
-              <w:numPr>
-                <w:ilvl w:val="0"/>
-                <w:numId w:val="5"/>
-              </w:numPr>
-              <w:spacing w:line="240" w:lineRule="auto"/>
-              <w:ind w:left="170" w:hanging="170"/>
-              <w:jc w:val="center"/>
-              <w:rPr>
-                <w:rFonts w:cs="Times New Roman"/>
-              </w:rPr>
-            </w:pPr>
             <w:r>
               <w:t>5</w:t>
             </w:r>
@@ -2062,17 +2029,8 @@
             <w:vAlign w:val="center"/>
           </w:tcPr>
           <w:p>
-            <w:pPr>
-              <w:pStyle w:val="0TEXTc1"/>
-              <w:spacing w:line="240" w:lineRule="auto"/>
-              <w:ind w:firstLine="0"/>
-              <w:jc w:val="left"/>
-              <w:rPr>
-                <w:rFonts w:cs="Times New Roman"/>
-              </w:rPr>
-            </w:pPr>
-            <w:r>
-              <w:t>Tổng hợp báo cáo kỹ thuật Chương 1 (KT1), kiểm thử và rà soát tài liệu</w:t>
+            <w:r>
+              <w:t>Tổng hợp báo cáo kỹ thuật Chương 1 (KT1) và rà soát tài liệu</w:t>
             </w:r>
           </w:p>
         </w:tc>
@@ -2082,15 +2040,6 @@
             <w:vAlign w:val="center"/>
           </w:tcPr>
           <w:p>
-            <w:pPr>
-              <w:pStyle w:val="0TEXTc1"/>
-              <w:spacing w:line="240" w:lineRule="auto"/>
-              <w:ind w:firstLine="0"/>
-              <w:jc w:val="left"/>
-              <w:rPr>
-                <w:rFonts w:cs="Times New Roman"/>
-              </w:rPr>
-            </w:pPr>
             <w:r>
               <w:t>Cả nhóm</w:t>
             </w:r>
@@ -2504,19 +2453,6 @@
             <w:vAlign w:val="center"/>
           </w:tcPr>
           <w:p>
-            <w:pPr>
-              <w:pStyle w:val="0TEXTc1"/>
-              <w:numPr>
-                <w:ilvl w:val="0"/>
-                <w:numId w:val="6"/>
-              </w:numPr>
-              <w:spacing w:line="240" w:lineRule="auto"/>
-              <w:ind w:left="170" w:hanging="170"/>
-              <w:jc w:val="center"/>
-              <w:rPr>
-                <w:rFonts w:cs="Times New Roman"/>
-              </w:rPr>
-            </w:pPr>
             <w:r>
               <w:t>1</w:t>
             </w:r>
@@ -2528,18 +2464,8 @@
             <w:vAlign w:val="center"/>
           </w:tcPr>
           <w:p>
-            <w:pPr>
-              <w:pStyle w:val="0TEXTc1"/>
-              <w:spacing w:line="240" w:lineRule="auto"/>
-              <w:ind w:firstLine="0"/>
-              <w:rPr>
-                <w:rFonts w:cs="Times New Roman"/>
-              </w:rPr>
-            </w:pPr>
-            <w:r>
-              <w:t>Phạm Minh Tú</w:t>
-              <w:br/>
-              <w:t>(#)</w:t>
+            <w:r>
+              <w:t>Phạm Minh Tú (#)</w:t>
             </w:r>
           </w:p>
         </w:tc>
@@ -2549,15 +2475,6 @@
             <w:vAlign w:val="center"/>
           </w:tcPr>
           <w:p>
-            <w:pPr>
-              <w:pStyle w:val="0TEXTc1"/>
-              <w:spacing w:line="240" w:lineRule="auto"/>
-              <w:ind w:firstLine="0"/>
-              <w:jc w:val="left"/>
-              <w:rPr>
-                <w:rFonts w:cs="Times New Roman"/>
-              </w:rPr>
-            </w:pPr>
             <w:r>
               <w:t>Trưởng nhóm: Phân tích yêu cầu hệ thống, mô hình Use Case, URD/SRS ISO standard và điều phối kỹ thuật.</w:t>
             </w:r>
@@ -2569,15 +2486,6 @@
             <w:vAlign w:val="center"/>
           </w:tcPr>
           <w:p>
-            <w:pPr>
-              <w:pStyle w:val="0TEXTc1"/>
-              <w:spacing w:line="240" w:lineRule="auto"/>
-              <w:ind w:firstLine="0"/>
-              <w:jc w:val="left"/>
-              <w:rPr>
-                <w:rFonts w:cs="Times New Roman"/>
-              </w:rPr>
-            </w:pPr>
             <w:r/>
           </w:p>
         </w:tc>
@@ -2592,19 +2500,6 @@
             <w:vAlign w:val="center"/>
           </w:tcPr>
           <w:p>
-            <w:pPr>
-              <w:pStyle w:val="0TEXTc1"/>
-              <w:numPr>
-                <w:ilvl w:val="0"/>
-                <w:numId w:val="6"/>
-              </w:numPr>
-              <w:spacing w:line="240" w:lineRule="auto"/>
-              <w:ind w:left="170" w:hanging="170"/>
-              <w:jc w:val="center"/>
-              <w:rPr>
-                <w:rFonts w:cs="Times New Roman"/>
-              </w:rPr>
-            </w:pPr>
             <w:r>
               <w:t>2</w:t>
             </w:r>
@@ -2616,15 +2511,6 @@
             <w:vAlign w:val="center"/>
           </w:tcPr>
           <w:p>
-            <w:pPr>
-              <w:pStyle w:val="0TEXTc1"/>
-              <w:spacing w:line="240" w:lineRule="auto"/>
-              <w:ind w:firstLine="0"/>
-              <w:jc w:val="left"/>
-              <w:rPr>
-                <w:rFonts w:cs="Times New Roman"/>
-              </w:rPr>
-            </w:pPr>
             <w:r>
               <w:t>Phạm Văn Huynh</w:t>
             </w:r>
@@ -2636,15 +2522,6 @@
             <w:vAlign w:val="center"/>
           </w:tcPr>
           <w:p>
-            <w:pPr>
-              <w:pStyle w:val="0TEXTc1"/>
-              <w:spacing w:line="240" w:lineRule="auto"/>
-              <w:ind w:firstLine="0"/>
-              <w:jc w:val="left"/>
-              <w:rPr>
-                <w:rFonts w:cs="Times New Roman"/>
-              </w:rPr>
-            </w:pPr>
             <w:r>
               <w:t>Phụ trách khảo sát hiện trạng, phân tích yêu cầu phi chức năng và thiết kế sơ bộ thực thể CSDL.</w:t>
             </w:r>
@@ -2656,15 +2533,6 @@
             <w:vAlign w:val="center"/>
           </w:tcPr>
           <w:p>
-            <w:pPr>
-              <w:pStyle w:val="0TEXTc1"/>
-              <w:spacing w:line="240" w:lineRule="auto"/>
-              <w:ind w:firstLine="0"/>
-              <w:jc w:val="left"/>
-              <w:rPr>
-                <w:rFonts w:cs="Times New Roman"/>
-              </w:rPr>
-            </w:pPr>
             <w:r/>
           </w:p>
         </w:tc>
@@ -2679,19 +2547,6 @@
             <w:vAlign w:val="center"/>
           </w:tcPr>
           <w:p>
-            <w:pPr>
-              <w:pStyle w:val="0TEXTc1"/>
-              <w:numPr>
-                <w:ilvl w:val="0"/>
-                <w:numId w:val="6"/>
-              </w:numPr>
-              <w:spacing w:line="240" w:lineRule="auto"/>
-              <w:ind w:left="170" w:hanging="170"/>
-              <w:jc w:val="center"/>
-              <w:rPr>
-                <w:rFonts w:cs="Times New Roman"/>
-              </w:rPr>
-            </w:pPr>
             <w:r>
               <w:t>3</w:t>
             </w:r>
@@ -2703,15 +2558,6 @@
             <w:vAlign w:val="center"/>
           </w:tcPr>
           <w:p>
-            <w:pPr>
-              <w:pStyle w:val="0TEXTc1"/>
-              <w:spacing w:line="240" w:lineRule="auto"/>
-              <w:ind w:firstLine="0"/>
-              <w:jc w:val="left"/>
-              <w:rPr>
-                <w:rFonts w:cs="Times New Roman"/>
-              </w:rPr>
-            </w:pPr>
             <w:r>
               <w:t>Đàm Đức Đôn</w:t>
             </w:r>
@@ -2723,15 +2569,6 @@
             <w:vAlign w:val="center"/>
           </w:tcPr>
           <w:p>
-            <w:pPr>
-              <w:pStyle w:val="0TEXTc1"/>
-              <w:spacing w:line="240" w:lineRule="auto"/>
-              <w:ind w:firstLine="0"/>
-              <w:jc w:val="left"/>
-              <w:rPr>
-                <w:rFonts w:cs="Times New Roman"/>
-              </w:rPr>
-            </w:pPr>
             <w:r>
               <w:t>Phụ trách xác định phạm vi tích hợp AI, khảo sát mô hình LLM và tổng hợp báo cáo kỹ thuật.</w:t>
             </w:r>
@@ -2743,15 +2580,6 @@
             <w:vAlign w:val="center"/>
           </w:tcPr>
           <w:p>
-            <w:pPr>
-              <w:pStyle w:val="0TEXTc1"/>
-              <w:spacing w:line="240" w:lineRule="auto"/>
-              <w:ind w:firstLine="0"/>
-              <w:jc w:val="left"/>
-              <w:rPr>
-                <w:rFonts w:cs="Times New Roman"/>
-              </w:rPr>
-            </w:pPr>
             <w:r/>
           </w:p>
         </w:tc>
@@ -2834,7 +2662,6 @@
         <w:pStyle w:val="0TEXTc1"/>
         <w:ind w:firstLine="0"/>
       </w:pPr>
-      <w:r/>
     </w:p>
     <w:p>
       <w:pPr>
@@ -2845,14 +2672,29 @@
           <w:sz w:val="26"/>
         </w:rPr>
       </w:pPr>
+      <w:r>
+        <w:rPr>
+          <w:b/>
+          <w:i/>
+        </w:rPr>
+        <w:br w:type="page"/>
+      </w:r>
+    </w:p>
+    <w:p>
+      <w:pPr>
+        <w:pStyle w:val="0TEXTc1"/>
+        <w:ind w:firstLine="0"/>
+        <w:rPr>
+          <w:b/>
+          <w:i/>
+        </w:rPr>
+      </w:pPr>
       <w:r/>
     </w:p>
     <w:p>
       <w:pPr>
         <w:pStyle w:val="0TEXTc1"/>
-        <w:ind w:firstLine="0"/>
-        <w:rPr>
-          <w:b/>
+        <w:rPr>
           <w:i/>
         </w:rPr>
       </w:pPr>
@@ -2888,26 +2730,1940 @@
     <w:p>
       <w:pPr>
         <w:pStyle w:val="0TEXTc1"/>
-        <w:rPr>
-          <w:i/>
-        </w:rPr>
-      </w:pPr>
-      <w:r/>
+      </w:pPr>
     </w:p>
     <w:p>
       <w:pPr>
         <w:pStyle w:val="0TEXTc1"/>
-      </w:pPr>
-      <w:r/>
-    </w:p>
-    <w:p>
-      <w:pPr>
-        <w:pStyle w:val="0TEXTc1"/>
         <w:rPr>
           <w:lang w:val="vi-VN"/>
         </w:rPr>
       </w:pPr>
-      <w:r/>
+      <w:r>
+        <w:rPr>
+          <w:noProof/>
+        </w:rPr>
+        <mc:AlternateContent>
+          <mc:Choice Requires="wps">
+            <w:drawing>
+              <wp:anchor distT="0" distB="0" distL="114300" distR="114300" simplePos="0" relativeHeight="251663360" behindDoc="0" locked="0" layoutInCell="1" allowOverlap="1" wp14:anchorId="2B04412D" wp14:editId="5803EC03">
+                <wp:simplePos x="0" y="0"/>
+                <wp:positionH relativeFrom="margin">
+                  <wp:posOffset>2148205</wp:posOffset>
+                </wp:positionH>
+                <wp:positionV relativeFrom="paragraph">
+                  <wp:posOffset>1715770</wp:posOffset>
+                </wp:positionV>
+                <wp:extent cx="900000" cy="900000"/>
+                <wp:effectExtent l="0" t="0" r="14605" b="14605"/>
+                <wp:wrapNone/>
+                <wp:docPr id="3" name="Oval 3"/>
+                <wp:cNvGraphicFramePr>
+                  <a:graphicFrameLocks xmlns:a="http://schemas.openxmlformats.org/drawingml/2006/main" noChangeAspect="1"/>
+                </wp:cNvGraphicFramePr>
+                <a:graphic xmlns:a="http://schemas.openxmlformats.org/drawingml/2006/main">
+                  <a:graphicData uri="http://schemas.microsoft.com/office/word/2010/wordprocessingShape">
+                    <wps:wsp>
+                      <wps:cNvSpPr>
+                        <a:spLocks noChangeAspect="1"/>
+                      </wps:cNvSpPr>
+                      <wps:spPr>
+                        <a:xfrm>
+                          <a:off x="0" y="0"/>
+                          <a:ext cx="900000" cy="900000"/>
+                        </a:xfrm>
+                        <a:prstGeom prst="ellipse">
+                          <a:avLst/>
+                        </a:prstGeom>
+                        <a:solidFill>
+                          <a:schemeClr val="bg1"/>
+                        </a:solidFill>
+                        <a:ln>
+                          <a:solidFill>
+                            <a:srgbClr val="0000FF"/>
+                          </a:solidFill>
+                        </a:ln>
+                      </wps:spPr>
+                      <wps:style>
+                        <a:lnRef idx="2">
+                          <a:schemeClr val="accent1">
+                            <a:shade val="50000"/>
+                          </a:schemeClr>
+                        </a:lnRef>
+                        <a:fillRef idx="1">
+                          <a:schemeClr val="accent1"/>
+                        </a:fillRef>
+                        <a:effectRef idx="0">
+                          <a:schemeClr val="accent1"/>
+                        </a:effectRef>
+                        <a:fontRef idx="minor">
+                          <a:schemeClr val="lt1"/>
+                        </a:fontRef>
+                      </wps:style>
+                      <wps:txbx>
+                        <w:txbxContent>
+                          <w:p>
+                            <w:pPr>
+                              <w:jc w:val="center"/>
+                            </w:pPr>
+                          </w:p>
+                        </w:txbxContent>
+                      </wps:txbx>
+                      <wps:bodyPr rot="0" spcFirstLastPara="0" vertOverflow="overflow" horzOverflow="overflow" vert="horz" wrap="square" lIns="0" tIns="0" rIns="0" bIns="45720" numCol="1" spcCol="0" rtlCol="0" fromWordArt="0" anchor="ctr" anchorCtr="0" forceAA="0" compatLnSpc="1">
+                        <a:prstTxWarp prst="textNoShape">
+                          <a:avLst/>
+                        </a:prstTxWarp>
+                        <a:noAutofit/>
+                      </wps:bodyPr>
+                    </wps:wsp>
+                  </a:graphicData>
+                </a:graphic>
+                <wp14:sizeRelH relativeFrom="margin">
+                  <wp14:pctWidth>0</wp14:pctWidth>
+                </wp14:sizeRelH>
+                <wp14:sizeRelV relativeFrom="margin">
+                  <wp14:pctHeight>0</wp14:pctHeight>
+                </wp14:sizeRelV>
+              </wp:anchor>
+            </w:drawing>
+          </mc:Choice>
+          <mc:Fallback>
+            <w:pict>
+              <v:oval w14:anchorId="2B04412D" id="Oval 3" o:spid="_x0000_s1026" style="position:absolute;left:0;text-align:left;margin-left:169.15pt;margin-top:135.1pt;width:70.85pt;height:70.85pt;z-index:251663360;visibility:visible;mso-wrap-style:square;mso-width-percent:0;mso-height-percent:0;mso-wrap-distance-left:9pt;mso-wrap-distance-top:0;mso-wrap-distance-right:9pt;mso-wrap-distance-bottom:0;mso-position-horizontal:absolute;mso-position-horizontal-relative:margin;mso-position-vertical:absolute;mso-position-vertical-relative:text;mso-width-percent:0;mso-height-percent:0;mso-width-relative:margin;mso-height-relative:margin;v-text-anchor:middle" o:gfxdata="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" fillcolor="white [3212]" strokecolor="blue" strokeweight="1pt">
+                <v:stroke joinstyle="miter"/>
+                <v:path arrowok="t"/>
+                <o:lock v:ext="edit" aspectratio="t"/>
+                <v:textbox inset="0,0,0">
+                  <w:txbxContent>
+                    <w:p>
+                      <w:pPr>
+                        <w:jc w:val="center"/>
+                      </w:pPr>
+                    </w:p>
+                  </w:txbxContent>
+                </v:textbox>
+                <w10:wrap anchorx="margin"/>
+              </v:oval>
+            </w:pict>
+          </mc:Fallback>
+        </mc:AlternateContent>
+      </w:r>
+      <w:r>
+        <w:rPr>
+          <w:noProof/>
+        </w:rPr>
+        <mc:AlternateContent>
+          <mc:Choice Requires="wps">
+            <w:drawing>
+              <wp:anchor distT="0" distB="0" distL="114300" distR="114300" simplePos="0" relativeHeight="251661312" behindDoc="0" locked="0" layoutInCell="1" allowOverlap="1" wp14:anchorId="00A7416A" wp14:editId="182BD6EE">
+                <wp:simplePos x="0" y="0"/>
+                <wp:positionH relativeFrom="margin">
+                  <wp:posOffset>438150</wp:posOffset>
+                </wp:positionH>
+                <wp:positionV relativeFrom="paragraph">
+                  <wp:posOffset>5715</wp:posOffset>
+                </wp:positionV>
+                <wp:extent cx="4320000" cy="4320000"/>
+                <wp:effectExtent l="0" t="0" r="23495" b="23495"/>
+                <wp:wrapNone/>
+                <wp:docPr id="2" name="Oval 2"/>
+                <wp:cNvGraphicFramePr>
+                  <a:graphicFrameLocks xmlns:a="http://schemas.openxmlformats.org/drawingml/2006/main" noChangeAspect="1"/>
+                </wp:cNvGraphicFramePr>
+                <a:graphic xmlns:a="http://schemas.openxmlformats.org/drawingml/2006/main">
+                  <a:graphicData uri="http://schemas.microsoft.com/office/word/2010/wordprocessingShape">
+                    <wps:wsp>
+                      <wps:cNvSpPr>
+                        <a:spLocks noChangeAspect="1"/>
+                      </wps:cNvSpPr>
+                      <wps:spPr>
+                        <a:xfrm>
+                          <a:off x="0" y="0"/>
+                          <a:ext cx="4320000" cy="4320000"/>
+                        </a:xfrm>
+                        <a:prstGeom prst="ellipse">
+                          <a:avLst/>
+                        </a:prstGeom>
+                        <a:solidFill>
+                          <a:schemeClr val="accent1">
+                            <a:lumMod val="20000"/>
+                            <a:lumOff val="80000"/>
+                          </a:schemeClr>
+                        </a:solidFill>
+                        <a:ln>
+                          <a:solidFill>
+                            <a:srgbClr val="0000FF"/>
+                          </a:solidFill>
+                        </a:ln>
+                      </wps:spPr>
+                      <wps:style>
+                        <a:lnRef idx="2">
+                          <a:schemeClr val="accent1">
+                            <a:shade val="50000"/>
+                          </a:schemeClr>
+                        </a:lnRef>
+                        <a:fillRef idx="1">
+                          <a:schemeClr val="accent1"/>
+                        </a:fillRef>
+                        <a:effectRef idx="0">
+                          <a:schemeClr val="accent1"/>
+                        </a:effectRef>
+                        <a:fontRef idx="minor">
+                          <a:schemeClr val="lt1"/>
+                        </a:fontRef>
+                      </wps:style>
+                      <wps:txbx>
+                        <w:txbxContent>
+                          <w:p>
+                            <w:pPr>
+                              <w:jc w:val="center"/>
+                              <w:rPr>
+                                <w:rFonts w:ascii="Times New Roman" w:hAnsi="Times New Roman" w:cs="Times New Roman"/>
+                                <w:b/>
+                                <w:color w:val="000000" w:themeColor="text1"/>
+                                <w:sz w:val="32"/>
+                                <w14:shadow w14:blurRad="38100" w14:dist="19050" w14:dir="2700000" w14:sx="100000" w14:sy="100000" w14:kx="0" w14:ky="0" w14:algn="tl">
+                                  <w14:schemeClr w14:val="dk1">
+                                    <w14:alpha w14:val="60000"/>
+                                  </w14:schemeClr>
+                                </w14:shadow>
+                                <w14:textOutline w14:w="0" w14:cap="flat" w14:cmpd="sng" w14:algn="ctr">
+                                  <w14:noFill/>
+                                  <w14:prstDash w14:val="solid"/>
+                                  <w14:round/>
+                                </w14:textOutline>
+                              </w:rPr>
+                            </w:pPr>
+                            <w:r>
+                              <w:rPr>
+                                <w:rFonts w:ascii="Times New Roman" w:hAnsi="Times New Roman" w:cs="Times New Roman"/>
+                                <w:b/>
+                                <w:color w:val="000000" w:themeColor="text1"/>
+                                <w:sz w:val="32"/>
+                                <w14:shadow w14:blurRad="38100" w14:dist="19050" w14:dir="2700000" w14:sx="100000" w14:sy="100000" w14:kx="0" w14:ky="0" w14:algn="tl">
+                                  <w14:schemeClr w14:val="dk1">
+                                    <w14:alpha w14:val="60000"/>
+                                  </w14:schemeClr>
+                                </w14:shadow>
+                                <w14:textOutline w14:w="0" w14:cap="flat" w14:cmpd="sng" w14:algn="ctr">
+                                  <w14:noFill/>
+                                  <w14:prstDash w14:val="solid"/>
+                                  <w14:round/>
+                                </w14:textOutline>
+                              </w:rPr>
+                              <w:t>NHÓM 01</w:t>
+                            </w:r>
+                            <w:r>
+                              <w:rPr>
+                                <w:rFonts w:ascii="Times New Roman" w:hAnsi="Times New Roman" w:cs="Times New Roman"/>
+                                <w:b/>
+                                <w:color w:val="000000" w:themeColor="text1"/>
+                                <w:sz w:val="32"/>
+                                <w14:shadow w14:blurRad="38100" w14:dist="19050" w14:dir="2700000" w14:sx="100000" w14:sy="100000" w14:kx="0" w14:ky="0" w14:algn="tl">
+                                  <w14:schemeClr w14:val="dk1">
+                                    <w14:alpha w14:val="60000"/>
+                                  </w14:schemeClr>
+                                </w14:shadow>
+                                <w14:textOutline w14:w="0" w14:cap="flat" w14:cmpd="sng" w14:algn="ctr">
+                                  <w14:noFill/>
+                                  <w14:prstDash w14:val="solid"/>
+                                  <w14:round/>
+                                </w14:textOutline>
+                              </w:rPr>
+                              <w:t>:</w:t>
+                            </w:r>
+                          </w:p>
+                          <w:p>
+                            <w:pPr>
+                              <w:jc w:val="center"/>
+                              <w:rPr>
+                                <w:rFonts w:ascii="Times New Roman" w:hAnsi="Times New Roman" w:cs="Times New Roman"/>
+                                <w:color w:val="000000" w:themeColor="text1"/>
+                                <w:sz w:val="32"/>
+                                <w14:shadow w14:blurRad="38100" w14:dist="19050" w14:dir="2700000" w14:sx="100000" w14:sy="100000" w14:kx="0" w14:ky="0" w14:algn="tl">
+                                  <w14:schemeClr w14:val="dk1">
+                                    <w14:alpha w14:val="60000"/>
+                                  </w14:schemeClr>
+                                </w14:shadow>
+                                <w14:textOutline w14:w="0" w14:cap="flat" w14:cmpd="sng" w14:algn="ctr">
+                                  <w14:noFill/>
+                                  <w14:prstDash w14:val="solid"/>
+                                  <w14:round/>
+                                </w14:textOutline>
+                              </w:rPr>
+                            </w:pPr>
+                            <w:proofErr w:type="spellStart"/>
+                            <w:r>
+                              <w:rPr>
+                                <w:rFonts w:ascii="Times New Roman" w:hAnsi="Times New Roman" w:cs="Times New Roman"/>
+                                <w:color w:val="000000" w:themeColor="text1"/>
+                                <w:sz w:val="28"/>
+                                <w:szCs w:val="20"/>
+                                <w14:shadow w14:blurRad="38100" w14:dist="19050" w14:dir="2700000" w14:sx="100000" w14:sy="100000" w14:kx="0" w14:ky="0" w14:algn="tl">
+                                  <w14:schemeClr w14:val="dk1">
+                                    <w14:alpha w14:val="60000"/>
+                                  </w14:schemeClr>
+                                </w14:shadow>
+                                <w14:textOutline w14:w="0" w14:cap="flat" w14:cmpd="sng" w14:algn="ctr">
+                                  <w14:noFill/>
+                                  <w14:prstDash w14:val="solid"/>
+                                  <w14:round/>
+                                </w14:textOutline>
+                              </w:rPr>
+                              <w:t>Hệ</w:t>
+                            </w:r>
+                            <w:proofErr w:type="spellEnd"/>
+                            <w:r>
+                              <w:rPr>
+                                <w:rFonts w:ascii="Times New Roman" w:hAnsi="Times New Roman" w:cs="Times New Roman"/>
+                                <w:color w:val="000000" w:themeColor="text1"/>
+                                <w:sz w:val="28"/>
+                                <w:szCs w:val="20"/>
+                                <w14:shadow w14:blurRad="38100" w14:dist="19050" w14:dir="2700000" w14:sx="100000" w14:sy="100000" w14:kx="0" w14:ky="0" w14:algn="tl">
+                                  <w14:schemeClr w14:val="dk1">
+                                    <w14:alpha w14:val="60000"/>
+                                  </w14:schemeClr>
+                                </w14:shadow>
+                                <w14:textOutline w14:w="0" w14:cap="flat" w14:cmpd="sng" w14:algn="ctr">
+                                  <w14:noFill/>
+                                  <w14:prstDash w14:val="solid"/>
+                                  <w14:round/>
+                                </w14:textOutline>
+                              </w:rPr>
+                              <w:t xml:space="preserve"> </w:t>
+                            </w:r>
+                            <w:proofErr w:type="spellStart"/>
+                            <w:r>
+                              <w:rPr>
+                                <w:rFonts w:ascii="Times New Roman" w:hAnsi="Times New Roman" w:cs="Times New Roman"/>
+                                <w:color w:val="000000" w:themeColor="text1"/>
+                                <w:sz w:val="28"/>
+                                <w:szCs w:val="20"/>
+                                <w14:shadow w14:blurRad="38100" w14:dist="19050" w14:dir="2700000" w14:sx="100000" w14:sy="100000" w14:kx="0" w14:ky="0" w14:algn="tl">
+                                  <w14:schemeClr w14:val="dk1">
+                                    <w14:alpha w14:val="60000"/>
+                                  </w14:schemeClr>
+                                </w14:shadow>
+                                <w14:textOutline w14:w="0" w14:cap="flat" w14:cmpd="sng" w14:algn="ctr">
+                                  <w14:noFill/>
+                                  <w14:prstDash w14:val="solid"/>
+                                  <w14:round/>
+                                </w14:textOutline>
+                              </w:rPr>
+                              <w:t>thống</w:t>
+                            </w:r>
+                            <w:proofErr w:type="spellEnd"/>
+                            <w:r>
+                              <w:rPr>
+                                <w:rFonts w:ascii="Times New Roman" w:hAnsi="Times New Roman" w:cs="Times New Roman"/>
+                                <w:color w:val="000000" w:themeColor="text1"/>
+                                <w:sz w:val="28"/>
+                                <w:szCs w:val="20"/>
+                                <w14:shadow w14:blurRad="38100" w14:dist="19050" w14:dir="2700000" w14:sx="100000" w14:sy="100000" w14:kx="0" w14:ky="0" w14:algn="tl">
+                                  <w14:schemeClr w14:val="dk1">
+                                    <w14:alpha w14:val="60000"/>
+                                  </w14:schemeClr>
+                                </w14:shadow>
+                                <w14:textOutline w14:w="0" w14:cap="flat" w14:cmpd="sng" w14:algn="ctr">
+                                  <w14:noFill/>
+                                  <w14:prstDash w14:val="solid"/>
+                                  <w14:round/>
+                                </w14:textOutline>
+                              </w:rPr>
+                              <w:t xml:space="preserve"> </w:t>
+                            </w:r>
+                            <w:proofErr w:type="spellStart"/>
+                            <w:r>
+                              <w:rPr>
+                                <w:rFonts w:ascii="Times New Roman" w:hAnsi="Times New Roman" w:cs="Times New Roman"/>
+                                <w:color w:val="000000" w:themeColor="text1"/>
+                                <w:sz w:val="28"/>
+                                <w:szCs w:val="20"/>
+                                <w14:shadow w14:blurRad="38100" w14:dist="19050" w14:dir="2700000" w14:sx="100000" w14:sy="100000" w14:kx="0" w14:ky="0" w14:algn="tl">
+                                  <w14:schemeClr w14:val="dk1">
+                                    <w14:alpha w14:val="60000"/>
+                                  </w14:schemeClr>
+                                </w14:shadow>
+                                <w14:textOutline w14:w="0" w14:cap="flat" w14:cmpd="sng" w14:algn="ctr">
+                                  <w14:noFill/>
+                                  <w14:prstDash w14:val="solid"/>
+                                  <w14:round/>
+                                </w14:textOutline>
+                              </w:rPr>
+                              <w:t>quản</w:t>
+                            </w:r>
+                            <w:proofErr w:type="spellEnd"/>
+                            <w:r>
+                              <w:rPr>
+                                <w:rFonts w:ascii="Times New Roman" w:hAnsi="Times New Roman" w:cs="Times New Roman"/>
+                                <w:color w:val="000000" w:themeColor="text1"/>
+                                <w:sz w:val="28"/>
+                                <w:szCs w:val="20"/>
+                                <w14:shadow w14:blurRad="38100" w14:dist="19050" w14:dir="2700000" w14:sx="100000" w14:sy="100000" w14:kx="0" w14:ky="0" w14:algn="tl">
+                                  <w14:schemeClr w14:val="dk1">
+                                    <w14:alpha w14:val="60000"/>
+                                  </w14:schemeClr>
+                                </w14:shadow>
+                                <w14:textOutline w14:w="0" w14:cap="flat" w14:cmpd="sng" w14:algn="ctr">
+                                  <w14:noFill/>
+                                  <w14:prstDash w14:val="solid"/>
+                                  <w14:round/>
+                                </w14:textOutline>
+                              </w:rPr>
+                              <w:t xml:space="preserve"> </w:t>
+                            </w:r>
+                            <w:proofErr w:type="spellStart"/>
+                            <w:r>
+                              <w:rPr>
+                                <w:rFonts w:ascii="Times New Roman" w:hAnsi="Times New Roman" w:cs="Times New Roman"/>
+                                <w:color w:val="000000" w:themeColor="text1"/>
+                                <w:sz w:val="28"/>
+                                <w:szCs w:val="20"/>
+                                <w14:shadow w14:blurRad="38100" w14:dist="19050" w14:dir="2700000" w14:sx="100000" w14:sy="100000" w14:kx="0" w14:ky="0" w14:algn="tl">
+                                  <w14:schemeClr w14:val="dk1">
+                                    <w14:alpha w14:val="60000"/>
+                                  </w14:schemeClr>
+                                </w14:shadow>
+                                <w14:textOutline w14:w="0" w14:cap="flat" w14:cmpd="sng" w14:algn="ctr">
+                                  <w14:noFill/>
+                                  <w14:prstDash w14:val="solid"/>
+                                  <w14:round/>
+                                </w14:textOutline>
+                              </w:rPr>
+                              <w:t>lý</w:t>
+                            </w:r>
+                            <w:proofErr w:type="spellEnd"/>
+                            <w:r>
+                              <w:rPr>
+                                <w:rFonts w:ascii="Times New Roman" w:hAnsi="Times New Roman" w:cs="Times New Roman"/>
+                                <w:color w:val="000000" w:themeColor="text1"/>
+                                <w:sz w:val="28"/>
+                                <w:szCs w:val="20"/>
+                                <w14:shadow w14:blurRad="38100" w14:dist="19050" w14:dir="2700000" w14:sx="100000" w14:sy="100000" w14:kx="0" w14:ky="0" w14:algn="tl">
+                                  <w14:schemeClr w14:val="dk1">
+                                    <w14:alpha w14:val="60000"/>
+                                  </w14:schemeClr>
+                                </w14:shadow>
+                                <w14:textOutline w14:w="0" w14:cap="flat" w14:cmpd="sng" w14:algn="ctr">
+                                  <w14:noFill/>
+                                  <w14:prstDash w14:val="solid"/>
+                                  <w14:round/>
+                                </w14:textOutline>
+                              </w:rPr>
+                              <w:t xml:space="preserve"> </w:t>
+                            </w:r>
+                            <w:proofErr w:type="spellStart"/>
+                            <w:r>
+                              <w:rPr>
+                                <w:rFonts w:ascii="Times New Roman" w:hAnsi="Times New Roman" w:cs="Times New Roman"/>
+                                <w:color w:val="000000" w:themeColor="text1"/>
+                                <w:sz w:val="28"/>
+                                <w:szCs w:val="20"/>
+                                <w14:shadow w14:blurRad="38100" w14:dist="19050" w14:dir="2700000" w14:sx="100000" w14:sy="100000" w14:kx="0" w14:ky="0" w14:algn="tl">
+                                  <w14:schemeClr w14:val="dk1">
+                                    <w14:alpha w14:val="60000"/>
+                                  </w14:schemeClr>
+                                </w14:shadow>
+                                <w14:textOutline w14:w="0" w14:cap="flat" w14:cmpd="sng" w14:algn="ctr">
+                                  <w14:noFill/>
+                                  <w14:prstDash w14:val="solid"/>
+                                  <w14:round/>
+                                </w14:textOutline>
+                              </w:rPr>
+                              <w:t>bán</w:t>
+                            </w:r>
+                            <w:proofErr w:type="spellEnd"/>
+                            <w:r>
+                              <w:rPr>
+                                <w:rFonts w:ascii="Times New Roman" w:hAnsi="Times New Roman" w:cs="Times New Roman"/>
+                                <w:color w:val="000000" w:themeColor="text1"/>
+                                <w:sz w:val="28"/>
+                                <w:szCs w:val="20"/>
+                                <w14:shadow w14:blurRad="38100" w14:dist="19050" w14:dir="2700000" w14:sx="100000" w14:sy="100000" w14:kx="0" w14:ky="0" w14:algn="tl">
+                                  <w14:schemeClr w14:val="dk1">
+                                    <w14:alpha w14:val="60000"/>
+                                  </w14:schemeClr>
+                                </w14:shadow>
+                                <w14:textOutline w14:w="0" w14:cap="flat" w14:cmpd="sng" w14:algn="ctr">
+                                  <w14:noFill/>
+                                  <w14:prstDash w14:val="solid"/>
+                                  <w14:round/>
+                                </w14:textOutline>
+                              </w:rPr>
+                              <w:t xml:space="preserve"> </w:t>
+                            </w:r>
+                            <w:proofErr w:type="spellStart"/>
+                            <w:r>
+                              <w:rPr>
+                                <w:rFonts w:ascii="Times New Roman" w:hAnsi="Times New Roman" w:cs="Times New Roman"/>
+                                <w:color w:val="000000" w:themeColor="text1"/>
+                                <w:sz w:val="28"/>
+                                <w:szCs w:val="20"/>
+                                <w14:shadow w14:blurRad="38100" w14:dist="19050" w14:dir="2700000" w14:sx="100000" w14:sy="100000" w14:kx="0" w14:ky="0" w14:algn="tl">
+                                  <w14:schemeClr w14:val="dk1">
+                                    <w14:alpha w14:val="60000"/>
+                                  </w14:schemeClr>
+                                </w14:shadow>
+                                <w14:textOutline w14:w="0" w14:cap="flat" w14:cmpd="sng" w14:algn="ctr">
+                                  <w14:noFill/>
+                                  <w14:prstDash w14:val="solid"/>
+                                  <w14:round/>
+                                </w14:textOutline>
+                              </w:rPr>
+                              <w:t>hàng</w:t>
+                            </w:r>
+                            <w:proofErr w:type="spellEnd"/>
+                            <w:r>
+                              <w:rPr>
+                                <w:rFonts w:ascii="Times New Roman" w:hAnsi="Times New Roman" w:cs="Times New Roman"/>
+                                <w:color w:val="000000" w:themeColor="text1"/>
+                                <w:sz w:val="28"/>
+                                <w:szCs w:val="20"/>
+                                <w14:shadow w14:blurRad="38100" w14:dist="19050" w14:dir="2700000" w14:sx="100000" w14:sy="100000" w14:kx="0" w14:ky="0" w14:algn="tl">
+                                  <w14:schemeClr w14:val="dk1">
+                                    <w14:alpha w14:val="60000"/>
+                                  </w14:schemeClr>
+                                </w14:shadow>
+                                <w14:textOutline w14:w="0" w14:cap="flat" w14:cmpd="sng" w14:algn="ctr">
+                                  <w14:noFill/>
+                                  <w14:prstDash w14:val="solid"/>
+                                  <w14:round/>
+                                </w14:textOutline>
+                              </w:rPr>
+                              <w:t xml:space="preserve"> </w:t>
+                            </w:r>
+                            <w:proofErr w:type="spellStart"/>
+                            <w:r>
+                              <w:rPr>
+                                <w:rFonts w:ascii="Times New Roman" w:hAnsi="Times New Roman" w:cs="Times New Roman"/>
+                                <w:color w:val="000000" w:themeColor="text1"/>
+                                <w:sz w:val="28"/>
+                                <w:szCs w:val="20"/>
+                                <w14:shadow w14:blurRad="38100" w14:dist="19050" w14:dir="2700000" w14:sx="100000" w14:sy="100000" w14:kx="0" w14:ky="0" w14:algn="tl">
+                                  <w14:schemeClr w14:val="dk1">
+                                    <w14:alpha w14:val="60000"/>
+                                  </w14:schemeClr>
+                                </w14:shadow>
+                                <w14:textOutline w14:w="0" w14:cap="flat" w14:cmpd="sng" w14:algn="ctr">
+                                  <w14:noFill/>
+                                  <w14:prstDash w14:val="solid"/>
+                                  <w14:round/>
+                                </w14:textOutline>
+                              </w:rPr>
+                              <w:t>có</w:t>
+                            </w:r>
+                            <w:proofErr w:type="spellEnd"/>
+                            <w:r>
+                              <w:rPr>
+                                <w:rFonts w:ascii="Times New Roman" w:hAnsi="Times New Roman" w:cs="Times New Roman"/>
+                                <w:color w:val="000000" w:themeColor="text1"/>
+                                <w:sz w:val="28"/>
+                                <w:szCs w:val="20"/>
+                                <w14:shadow w14:blurRad="38100" w14:dist="19050" w14:dir="2700000" w14:sx="100000" w14:sy="100000" w14:kx="0" w14:ky="0" w14:algn="tl">
+                                  <w14:schemeClr w14:val="dk1">
+                                    <w14:alpha w14:val="60000"/>
+                                  </w14:schemeClr>
+                                </w14:shadow>
+                                <w14:textOutline w14:w="0" w14:cap="flat" w14:cmpd="sng" w14:algn="ctr">
+                                  <w14:noFill/>
+                                  <w14:prstDash w14:val="solid"/>
+                                  <w14:round/>
+                                </w14:textOutline>
+                              </w:rPr>
+                              <w:t xml:space="preserve"> </w:t>
+                            </w:r>
+                            <w:proofErr w:type="spellStart"/>
+                            <w:r>
+                              <w:rPr>
+                                <w:rFonts w:ascii="Times New Roman" w:hAnsi="Times New Roman" w:cs="Times New Roman"/>
+                                <w:color w:val="000000" w:themeColor="text1"/>
+                                <w:sz w:val="28"/>
+                                <w:szCs w:val="20"/>
+                                <w14:shadow w14:blurRad="38100" w14:dist="19050" w14:dir="2700000" w14:sx="100000" w14:sy="100000" w14:kx="0" w14:ky="0" w14:algn="tl">
+                                  <w14:schemeClr w14:val="dk1">
+                                    <w14:alpha w14:val="60000"/>
+                                  </w14:schemeClr>
+                                </w14:shadow>
+                                <w14:textOutline w14:w="0" w14:cap="flat" w14:cmpd="sng" w14:algn="ctr">
+                                  <w14:noFill/>
+                                  <w14:prstDash w14:val="solid"/>
+                                  <w14:round/>
+                                </w14:textOutline>
+                              </w:rPr>
+                              <w:t>tích</w:t>
+                            </w:r>
+                            <w:proofErr w:type="spellEnd"/>
+                            <w:r>
+                              <w:rPr>
+                                <w:rFonts w:ascii="Times New Roman" w:hAnsi="Times New Roman" w:cs="Times New Roman"/>
+                                <w:color w:val="000000" w:themeColor="text1"/>
+                                <w:sz w:val="28"/>
+                                <w:szCs w:val="20"/>
+                                <w14:shadow w14:blurRad="38100" w14:dist="19050" w14:dir="2700000" w14:sx="100000" w14:sy="100000" w14:kx="0" w14:ky="0" w14:algn="tl">
+                                  <w14:schemeClr w14:val="dk1">
+                                    <w14:alpha w14:val="60000"/>
+                                  </w14:schemeClr>
+                                </w14:shadow>
+                                <w14:textOutline w14:w="0" w14:cap="flat" w14:cmpd="sng" w14:algn="ctr">
+                                  <w14:noFill/>
+                                  <w14:prstDash w14:val="solid"/>
+                                  <w14:round/>
+                                </w14:textOutline>
+                              </w:rPr>
+                              <w:t xml:space="preserve"> </w:t>
+                            </w:r>
+                            <w:proofErr w:type="spellStart"/>
+                            <w:r>
+                              <w:rPr>
+                                <w:rFonts w:ascii="Times New Roman" w:hAnsi="Times New Roman" w:cs="Times New Roman"/>
+                                <w:color w:val="000000" w:themeColor="text1"/>
+                                <w:sz w:val="28"/>
+                                <w:szCs w:val="20"/>
+                                <w14:shadow w14:blurRad="38100" w14:dist="19050" w14:dir="2700000" w14:sx="100000" w14:sy="100000" w14:kx="0" w14:ky="0" w14:algn="tl">
+                                  <w14:schemeClr w14:val="dk1">
+                                    <w14:alpha w14:val="60000"/>
+                                  </w14:schemeClr>
+                                </w14:shadow>
+                                <w14:textOutline w14:w="0" w14:cap="flat" w14:cmpd="sng" w14:algn="ctr">
+                                  <w14:noFill/>
+                                  <w14:prstDash w14:val="solid"/>
+                                  <w14:round/>
+                                </w14:textOutline>
+                              </w:rPr>
+                              <w:t>hợp</w:t>
+                            </w:r>
+                            <w:proofErr w:type="spellEnd"/>
+                            <w:r>
+                              <w:rPr>
+                                <w:rFonts w:ascii="Times New Roman" w:hAnsi="Times New Roman" w:cs="Times New Roman"/>
+                                <w:color w:val="000000" w:themeColor="text1"/>
+                                <w:sz w:val="28"/>
+                                <w:szCs w:val="20"/>
+                                <w14:shadow w14:blurRad="38100" w14:dist="19050" w14:dir="2700000" w14:sx="100000" w14:sy="100000" w14:kx="0" w14:ky="0" w14:algn="tl">
+                                  <w14:schemeClr w14:val="dk1">
+                                    <w14:alpha w14:val="60000"/>
+                                  </w14:schemeClr>
+                                </w14:shadow>
+                                <w14:textOutline w14:w="0" w14:cap="flat" w14:cmpd="sng" w14:algn="ctr">
+                                  <w14:noFill/>
+                                  <w14:prstDash w14:val="solid"/>
+                                  <w14:round/>
+                                </w14:textOutline>
+                              </w:rPr>
+                              <w:t xml:space="preserve"> AI</w:t>
+                            </w:r>
+                          </w:p>
+                          <w:p>
+                            <w:pPr>
+                              <w:jc w:val="center"/>
+                              <w:rPr>
+                                <w:rFonts w:ascii="Times New Roman" w:hAnsi="Times New Roman" w:cs="Times New Roman"/>
+                                <w:color w:val="000000" w:themeColor="text1"/>
+                                <w:sz w:val="32"/>
+                                <w14:shadow w14:blurRad="38100" w14:dist="19050" w14:dir="2700000" w14:sx="100000" w14:sy="100000" w14:kx="0" w14:ky="0" w14:algn="tl">
+                                  <w14:schemeClr w14:val="dk1">
+                                    <w14:alpha w14:val="60000"/>
+                                  </w14:schemeClr>
+                                </w14:shadow>
+                                <w14:textOutline w14:w="0" w14:cap="flat" w14:cmpd="sng" w14:algn="ctr">
+                                  <w14:noFill/>
+                                  <w14:prstDash w14:val="solid"/>
+                                  <w14:round/>
+                                </w14:textOutline>
+                              </w:rPr>
+                            </w:pPr>
+                          </w:p>
+                          <w:p>
+                            <w:pPr>
+                              <w:jc w:val="center"/>
+                              <w:rPr>
+                                <w:rFonts w:ascii="Times New Roman" w:hAnsi="Times New Roman" w:cs="Times New Roman"/>
+                                <w:color w:val="000000" w:themeColor="text1"/>
+                                <w:sz w:val="32"/>
+                                <w14:shadow w14:blurRad="38100" w14:dist="19050" w14:dir="2700000" w14:sx="100000" w14:sy="100000" w14:kx="0" w14:ky="0" w14:algn="tl">
+                                  <w14:schemeClr w14:val="dk1">
+                                    <w14:alpha w14:val="60000"/>
+                                  </w14:schemeClr>
+                                </w14:shadow>
+                                <w14:textOutline w14:w="0" w14:cap="flat" w14:cmpd="sng" w14:algn="ctr">
+                                  <w14:noFill/>
+                                  <w14:prstDash w14:val="solid"/>
+                                  <w14:round/>
+                                </w14:textOutline>
+                              </w:rPr>
+                            </w:pPr>
+                          </w:p>
+                          <w:p>
+                            <w:pPr>
+                              <w:jc w:val="center"/>
+                              <w:rPr>
+                                <w:rFonts w:ascii="Times New Roman" w:hAnsi="Times New Roman" w:cs="Times New Roman"/>
+                                <w:color w:val="000000" w:themeColor="text1"/>
+                                <w:sz w:val="32"/>
+                                <w14:shadow w14:blurRad="38100" w14:dist="19050" w14:dir="2700000" w14:sx="100000" w14:sy="100000" w14:kx="0" w14:ky="0" w14:algn="tl">
+                                  <w14:schemeClr w14:val="dk1">
+                                    <w14:alpha w14:val="60000"/>
+                                  </w14:schemeClr>
+                                </w14:shadow>
+                                <w14:textOutline w14:w="0" w14:cap="flat" w14:cmpd="sng" w14:algn="ctr">
+                                  <w14:noFill/>
+                                  <w14:prstDash w14:val="solid"/>
+                                  <w14:round/>
+                                </w14:textOutline>
+                              </w:rPr>
+                            </w:pPr>
+                          </w:p>
+                          <w:p>
+                            <w:pPr>
+                              <w:jc w:val="center"/>
+                              <w:rPr>
+                                <w:rFonts w:ascii="Times New Roman" w:hAnsi="Times New Roman" w:cs="Times New Roman"/>
+                                <w:color w:val="000000" w:themeColor="text1"/>
+                                <w:spacing w:val="-4"/>
+                                <w:sz w:val="32"/>
+                                <w14:shadow w14:blurRad="38100" w14:dist="19050" w14:dir="2700000" w14:sx="100000" w14:sy="100000" w14:kx="0" w14:ky="0" w14:algn="tl">
+                                  <w14:schemeClr w14:val="dk1">
+                                    <w14:alpha w14:val="60000"/>
+                                  </w14:schemeClr>
+                                </w14:shadow>
+                                <w14:textOutline w14:w="0" w14:cap="flat" w14:cmpd="sng" w14:algn="ctr">
+                                  <w14:noFill/>
+                                  <w14:prstDash w14:val="solid"/>
+                                  <w14:round/>
+                                </w14:textOutline>
+                              </w:rPr>
+                            </w:pPr>
+                            <w:r>
+                              <w:rPr>
+                                <w:rFonts w:ascii="Times New Roman" w:hAnsi="Times New Roman" w:cs="Times New Roman"/>
+                                <w:color w:val="000000" w:themeColor="text1"/>
+                                <w:spacing w:val="-4"/>
+                                <w:sz w:val="32"/>
+                                <w14:shadow w14:blurRad="38100" w14:dist="19050" w14:dir="2700000" w14:sx="100000" w14:sy="100000" w14:kx="0" w14:ky="0" w14:algn="tl">
+                                  <w14:schemeClr w14:val="dk1">
+                                    <w14:alpha w14:val="60000"/>
+                                  </w14:schemeClr>
+                                </w14:shadow>
+                                <w14:textOutline w14:w="0" w14:cap="flat" w14:cmpd="sng" w14:algn="ctr">
+                                  <w14:noFill/>
+                                  <w14:prstDash w14:val="solid"/>
+                                  <w14:round/>
+                                </w14:textOutline>
+                              </w:rPr>
+                              <w:t xml:space="preserve">Học </w:t>
+                            </w:r>
+                            <w:proofErr w:type="spellStart"/>
+                            <w:r>
+                              <w:rPr>
+                                <w:rFonts w:ascii="Times New Roman" w:hAnsi="Times New Roman" w:cs="Times New Roman"/>
+                                <w:color w:val="000000" w:themeColor="text1"/>
+                                <w:spacing w:val="-4"/>
+                                <w:sz w:val="32"/>
+                                <w14:shadow w14:blurRad="38100" w14:dist="19050" w14:dir="2700000" w14:sx="100000" w14:sy="100000" w14:kx="0" w14:ky="0" w14:algn="tl">
+                                  <w14:schemeClr w14:val="dk1">
+                                    <w14:alpha w14:val="60000"/>
+                                  </w14:schemeClr>
+                                </w14:shadow>
+                                <w14:textOutline w14:w="0" w14:cap="flat" w14:cmpd="sng" w14:algn="ctr">
+                                  <w14:noFill/>
+                                  <w14:prstDash w14:val="solid"/>
+                                  <w14:round/>
+                                </w14:textOutline>
+                              </w:rPr>
+                              <w:t>phần</w:t>
+                            </w:r>
+                            <w:proofErr w:type="spellEnd"/>
+                            <w:r>
+                              <w:rPr>
+                                <w:rFonts w:ascii="Times New Roman" w:hAnsi="Times New Roman" w:cs="Times New Roman"/>
+                                <w:color w:val="000000" w:themeColor="text1"/>
+                                <w:spacing w:val="-4"/>
+                                <w:sz w:val="32"/>
+                                <w14:shadow w14:blurRad="38100" w14:dist="19050" w14:dir="2700000" w14:sx="100000" w14:sy="100000" w14:kx="0" w14:ky="0" w14:algn="tl">
+                                  <w14:schemeClr w14:val="dk1">
+                                    <w14:alpha w14:val="60000"/>
+                                  </w14:schemeClr>
+                                </w14:shadow>
+                                <w14:textOutline w14:w="0" w14:cap="flat" w14:cmpd="sng" w14:algn="ctr">
+                                  <w14:noFill/>
+                                  <w14:prstDash w14:val="solid"/>
+                                  <w14:round/>
+                                </w14:textOutline>
+                              </w:rPr>
+                              <w:t xml:space="preserve">: </w:t>
+                            </w:r>
+                            <w:proofErr w:type="spellStart"/>
+                            <w:r>
+                              <w:rPr>
+                                <w:rFonts w:ascii="Times New Roman" w:hAnsi="Times New Roman" w:cs="Times New Roman"/>
+                                <w:color w:val="000000" w:themeColor="text1"/>
+                                <w:spacing w:val="-4"/>
+                                <w:sz w:val="32"/>
+                                <w14:shadow w14:blurRad="38100" w14:dist="19050" w14:dir="2700000" w14:sx="100000" w14:sy="100000" w14:kx="0" w14:ky="0" w14:algn="tl">
+                                  <w14:schemeClr w14:val="dk1">
+                                    <w14:alpha w14:val="60000"/>
+                                  </w14:schemeClr>
+                                </w14:shadow>
+                                <w14:textOutline w14:w="0" w14:cap="flat" w14:cmpd="sng" w14:algn="ctr">
+                                  <w14:noFill/>
+                                  <w14:prstDash w14:val="solid"/>
+                                  <w14:round/>
+                                </w14:textOutline>
+                              </w:rPr>
+                              <w:t>Ứng</w:t>
+                            </w:r>
+                            <w:proofErr w:type="spellEnd"/>
+                            <w:r>
+                              <w:rPr>
+                                <w:rFonts w:ascii="Times New Roman" w:hAnsi="Times New Roman" w:cs="Times New Roman"/>
+                                <w:color w:val="000000" w:themeColor="text1"/>
+                                <w:spacing w:val="-4"/>
+                                <w:sz w:val="32"/>
+                                <w14:shadow w14:blurRad="38100" w14:dist="19050" w14:dir="2700000" w14:sx="100000" w14:sy="100000" w14:kx="0" w14:ky="0" w14:algn="tl">
+                                  <w14:schemeClr w14:val="dk1">
+                                    <w14:alpha w14:val="60000"/>
+                                  </w14:schemeClr>
+                                </w14:shadow>
+                                <w14:textOutline w14:w="0" w14:cap="flat" w14:cmpd="sng" w14:algn="ctr">
+                                  <w14:noFill/>
+                                  <w14:prstDash w14:val="solid"/>
+                                  <w14:round/>
+                                </w14:textOutline>
+                              </w:rPr>
+                              <w:t xml:space="preserve"> </w:t>
+                            </w:r>
+                            <w:proofErr w:type="spellStart"/>
+                            <w:r>
+                              <w:rPr>
+                                <w:rFonts w:ascii="Times New Roman" w:hAnsi="Times New Roman" w:cs="Times New Roman"/>
+                                <w:color w:val="000000" w:themeColor="text1"/>
+                                <w:spacing w:val="-4"/>
+                                <w:sz w:val="32"/>
+                                <w14:shadow w14:blurRad="38100" w14:dist="19050" w14:dir="2700000" w14:sx="100000" w14:sy="100000" w14:kx="0" w14:ky="0" w14:algn="tl">
+                                  <w14:schemeClr w14:val="dk1">
+                                    <w14:alpha w14:val="60000"/>
+                                  </w14:schemeClr>
+                                </w14:shadow>
+                                <w14:textOutline w14:w="0" w14:cap="flat" w14:cmpd="sng" w14:algn="ctr">
+                                  <w14:noFill/>
+                                  <w14:prstDash w14:val="solid"/>
+                                  <w14:round/>
+                                </w14:textOutline>
+                              </w:rPr>
+                              <w:t>dụng</w:t>
+                            </w:r>
+                            <w:proofErr w:type="spellEnd"/>
+                            <w:r>
+                              <w:rPr>
+                                <w:rFonts w:ascii="Times New Roman" w:hAnsi="Times New Roman" w:cs="Times New Roman"/>
+                                <w:color w:val="000000" w:themeColor="text1"/>
+                                <w:spacing w:val="-4"/>
+                                <w:sz w:val="32"/>
+                                <w14:shadow w14:blurRad="38100" w14:dist="19050" w14:dir="2700000" w14:sx="100000" w14:sy="100000" w14:kx="0" w14:ky="0" w14:algn="tl">
+                                  <w14:schemeClr w14:val="dk1">
+                                    <w14:alpha w14:val="60000"/>
+                                  </w14:schemeClr>
+                                </w14:shadow>
+                                <w14:textOutline w14:w="0" w14:cap="flat" w14:cmpd="sng" w14:algn="ctr">
+                                  <w14:noFill/>
+                                  <w14:prstDash w14:val="solid"/>
+                                  <w14:round/>
+                                </w14:textOutline>
+                              </w:rPr>
+                              <w:t xml:space="preserve"> Trí </w:t>
+                            </w:r>
+                            <w:proofErr w:type="spellStart"/>
+                            <w:r>
+                              <w:rPr>
+                                <w:rFonts w:ascii="Times New Roman" w:hAnsi="Times New Roman" w:cs="Times New Roman"/>
+                                <w:color w:val="000000" w:themeColor="text1"/>
+                                <w:spacing w:val="-4"/>
+                                <w:sz w:val="32"/>
+                                <w14:shadow w14:blurRad="38100" w14:dist="19050" w14:dir="2700000" w14:sx="100000" w14:sy="100000" w14:kx="0" w14:ky="0" w14:algn="tl">
+                                  <w14:schemeClr w14:val="dk1">
+                                    <w14:alpha w14:val="60000"/>
+                                  </w14:schemeClr>
+                                </w14:shadow>
+                                <w14:textOutline w14:w="0" w14:cap="flat" w14:cmpd="sng" w14:algn="ctr">
+                                  <w14:noFill/>
+                                  <w14:prstDash w14:val="solid"/>
+                                  <w14:round/>
+                                </w14:textOutline>
+                              </w:rPr>
+                              <w:t>tuệ</w:t>
+                            </w:r>
+                            <w:proofErr w:type="spellEnd"/>
+                            <w:r>
+                              <w:rPr>
+                                <w:rFonts w:ascii="Times New Roman" w:hAnsi="Times New Roman" w:cs="Times New Roman"/>
+                                <w:color w:val="000000" w:themeColor="text1"/>
+                                <w:spacing w:val="-4"/>
+                                <w:sz w:val="32"/>
+                                <w14:shadow w14:blurRad="38100" w14:dist="19050" w14:dir="2700000" w14:sx="100000" w14:sy="100000" w14:kx="0" w14:ky="0" w14:algn="tl">
+                                  <w14:schemeClr w14:val="dk1">
+                                    <w14:alpha w14:val="60000"/>
+                                  </w14:schemeClr>
+                                </w14:shadow>
+                                <w14:textOutline w14:w="0" w14:cap="flat" w14:cmpd="sng" w14:algn="ctr">
+                                  <w14:noFill/>
+                                  <w14:prstDash w14:val="solid"/>
+                                  <w14:round/>
+                                </w14:textOutline>
+                              </w:rPr>
+                              <w:t xml:space="preserve"> </w:t>
+                            </w:r>
+                            <w:proofErr w:type="spellStart"/>
+                            <w:r>
+                              <w:rPr>
+                                <w:rFonts w:ascii="Times New Roman" w:hAnsi="Times New Roman" w:cs="Times New Roman"/>
+                                <w:color w:val="000000" w:themeColor="text1"/>
+                                <w:spacing w:val="-4"/>
+                                <w:sz w:val="32"/>
+                                <w14:shadow w14:blurRad="38100" w14:dist="19050" w14:dir="2700000" w14:sx="100000" w14:sy="100000" w14:kx="0" w14:ky="0" w14:algn="tl">
+                                  <w14:schemeClr w14:val="dk1">
+                                    <w14:alpha w14:val="60000"/>
+                                  </w14:schemeClr>
+                                </w14:shadow>
+                                <w14:textOutline w14:w="0" w14:cap="flat" w14:cmpd="sng" w14:algn="ctr">
+                                  <w14:noFill/>
+                                  <w14:prstDash w14:val="solid"/>
+                                  <w14:round/>
+                                </w14:textOutline>
+                              </w:rPr>
+                              <w:t>nhân</w:t>
+                            </w:r>
+                            <w:proofErr w:type="spellEnd"/>
+                            <w:r>
+                              <w:rPr>
+                                <w:rFonts w:ascii="Times New Roman" w:hAnsi="Times New Roman" w:cs="Times New Roman"/>
+                                <w:color w:val="000000" w:themeColor="text1"/>
+                                <w:spacing w:val="-4"/>
+                                <w:sz w:val="32"/>
+                                <w14:shadow w14:blurRad="38100" w14:dist="19050" w14:dir="2700000" w14:sx="100000" w14:sy="100000" w14:kx="0" w14:ky="0" w14:algn="tl">
+                                  <w14:schemeClr w14:val="dk1">
+                                    <w14:alpha w14:val="60000"/>
+                                  </w14:schemeClr>
+                                </w14:shadow>
+                                <w14:textOutline w14:w="0" w14:cap="flat" w14:cmpd="sng" w14:algn="ctr">
+                                  <w14:noFill/>
+                                  <w14:prstDash w14:val="solid"/>
+                                  <w14:round/>
+                                </w14:textOutline>
+                              </w:rPr>
+                              <w:t xml:space="preserve"> </w:t>
+                            </w:r>
+                            <w:proofErr w:type="spellStart"/>
+                            <w:r>
+                              <w:rPr>
+                                <w:rFonts w:ascii="Times New Roman" w:hAnsi="Times New Roman" w:cs="Times New Roman"/>
+                                <w:color w:val="000000" w:themeColor="text1"/>
+                                <w:spacing w:val="-4"/>
+                                <w:sz w:val="32"/>
+                                <w14:shadow w14:blurRad="38100" w14:dist="19050" w14:dir="2700000" w14:sx="100000" w14:sy="100000" w14:kx="0" w14:ky="0" w14:algn="tl">
+                                  <w14:schemeClr w14:val="dk1">
+                                    <w14:alpha w14:val="60000"/>
+                                  </w14:schemeClr>
+                                </w14:shadow>
+                                <w14:textOutline w14:w="0" w14:cap="flat" w14:cmpd="sng" w14:algn="ctr">
+                                  <w14:noFill/>
+                                  <w14:prstDash w14:val="solid"/>
+                                  <w14:round/>
+                                </w14:textOutline>
+                              </w:rPr>
+                              <w:t>tạo</w:t>
+                            </w:r>
+                            <w:proofErr w:type="spellEnd"/>
+                          </w:p>
+                          <w:p>
+                            <w:pPr>
+                              <w:jc w:val="center"/>
+                            </w:pPr>
+                            <w:proofErr w:type="spellStart"/>
+                            <w:r>
+                              <w:rPr>
+                                <w:rFonts w:ascii="Times New Roman" w:hAnsi="Times New Roman" w:cs="Times New Roman"/>
+                                <w:color w:val="000000" w:themeColor="text1"/>
+                                <w:sz w:val="32"/>
+                                <w14:shadow w14:blurRad="38100" w14:dist="19050" w14:dir="2700000" w14:sx="100000" w14:sy="100000" w14:kx="0" w14:ky="0" w14:algn="tl">
+                                  <w14:schemeClr w14:val="dk1">
+                                    <w14:alpha w14:val="60000"/>
+                                  </w14:schemeClr>
+                                </w14:shadow>
+                                <w14:textOutline w14:w="0" w14:cap="flat" w14:cmpd="sng" w14:algn="ctr">
+                                  <w14:noFill/>
+                                  <w14:prstDash w14:val="solid"/>
+                                  <w14:round/>
+                                </w14:textOutline>
+                              </w:rPr>
+                              <w:t>Lớp</w:t>
+                            </w:r>
+                            <w:proofErr w:type="spellEnd"/>
+                            <w:r>
+                              <w:rPr>
+                                <w:rFonts w:ascii="Times New Roman" w:hAnsi="Times New Roman" w:cs="Times New Roman"/>
+                                <w:color w:val="000000" w:themeColor="text1"/>
+                                <w:sz w:val="32"/>
+                                <w14:shadow w14:blurRad="38100" w14:dist="19050" w14:dir="2700000" w14:sx="100000" w14:sy="100000" w14:kx="0" w14:ky="0" w14:algn="tl">
+                                  <w14:schemeClr w14:val="dk1">
+                                    <w14:alpha w14:val="60000"/>
+                                  </w14:schemeClr>
+                                </w14:shadow>
+                                <w14:textOutline w14:w="0" w14:cap="flat" w14:cmpd="sng" w14:algn="ctr">
+                                  <w14:noFill/>
+                                  <w14:prstDash w14:val="solid"/>
+                                  <w14:round/>
+                                </w14:textOutline>
+                              </w:rPr>
+                              <w:t>: CNTT K</w:t>
+                            </w:r>
+                            <w:r>
+                              <w:rPr>
+                                <w:rFonts w:ascii="Times New Roman" w:hAnsi="Times New Roman" w:cs="Times New Roman"/>
+                                <w:color w:val="000000" w:themeColor="text1"/>
+                                <w:sz w:val="32"/>
+                                <w14:shadow w14:blurRad="38100" w14:dist="19050" w14:dir="2700000" w14:sx="100000" w14:sy="100000" w14:kx="0" w14:ky="0" w14:algn="tl">
+                                  <w14:schemeClr w14:val="dk1">
+                                    <w14:alpha w14:val="60000"/>
+                                  </w14:schemeClr>
+                                </w14:shadow>
+                                <w14:textOutline w14:w="0" w14:cap="flat" w14:cmpd="sng" w14:algn="ctr">
+                                  <w14:noFill/>
+                                  <w14:prstDash w14:val="solid"/>
+                                  <w14:round/>
+                                </w14:textOutline>
+                              </w:rPr>
+                              <w:t>2</w:t>
+                            </w:r>
+                            <w:r>
+                              <w:rPr>
+                                <w:rFonts w:ascii="Times New Roman" w:hAnsi="Times New Roman" w:cs="Times New Roman"/>
+                                <w:color w:val="000000" w:themeColor="text1"/>
+                                <w:sz w:val="32"/>
+                                <w14:shadow w14:blurRad="38100" w14:dist="19050" w14:dir="2700000" w14:sx="100000" w14:sy="100000" w14:kx="0" w14:ky="0" w14:algn="tl">
+                                  <w14:schemeClr w14:val="dk1">
+                                    <w14:alpha w14:val="60000"/>
+                                  </w14:schemeClr>
+                                </w14:shadow>
+                                <w14:textOutline w14:w="0" w14:cap="flat" w14:cmpd="sng" w14:algn="ctr">
+                                  <w14:noFill/>
+                                  <w14:prstDash w14:val="solid"/>
+                                  <w14:round/>
+                                </w14:textOutline>
+                              </w:rPr>
+                              <w:t>3</w:t>
+                            </w:r>
+                            <w:r>
+                              <w:rPr>
+                                <w:rFonts w:ascii="Times New Roman" w:hAnsi="Times New Roman" w:cs="Times New Roman"/>
+                                <w:color w:val="000000" w:themeColor="text1"/>
+                                <w:sz w:val="32"/>
+                                <w14:shadow w14:blurRad="38100" w14:dist="19050" w14:dir="2700000" w14:sx="100000" w14:sy="100000" w14:kx="0" w14:ky="0" w14:algn="tl">
+                                  <w14:schemeClr w14:val="dk1">
+                                    <w14:alpha w14:val="60000"/>
+                                  </w14:schemeClr>
+                                </w14:shadow>
+                                <w14:textOutline w14:w="0" w14:cap="flat" w14:cmpd="sng" w14:algn="ctr">
+                                  <w14:noFill/>
+                                  <w14:prstDash w14:val="solid"/>
+                                  <w14:round/>
+                                </w14:textOutline>
+                              </w:rPr>
+                              <w:t>D</w:t>
+                            </w:r>
+                          </w:p>
+                        </w:txbxContent>
+                      </wps:txbx>
+                      <wps:bodyPr rot="0" spcFirstLastPara="0" vertOverflow="overflow" horzOverflow="overflow" vert="horz" wrap="square" lIns="0" tIns="0" rIns="0" bIns="45720" numCol="1" spcCol="0" rtlCol="0" fromWordArt="0" anchor="ctr" anchorCtr="0" forceAA="0" compatLnSpc="1">
+                        <a:prstTxWarp prst="textNoShape">
+                          <a:avLst/>
+                        </a:prstTxWarp>
+                        <a:noAutofit/>
+                      </wps:bodyPr>
+                    </wps:wsp>
+                  </a:graphicData>
+                </a:graphic>
+                <wp14:sizeRelH relativeFrom="margin">
+                  <wp14:pctWidth>0</wp14:pctWidth>
+                </wp14:sizeRelH>
+                <wp14:sizeRelV relativeFrom="margin">
+                  <wp14:pctHeight>0</wp14:pctHeight>
+                </wp14:sizeRelV>
+              </wp:anchor>
+            </w:drawing>
+          </mc:Choice>
+          <mc:Fallback>
+            <w:pict>
+              <v:oval w14:anchorId="00A7416A" id="Oval 2" o:spid="_x0000_s1027" style="position:absolute;left:0;text-align:left;margin-left:34.5pt;margin-top:.45pt;width:340.15pt;height:340.15pt;z-index:251661312;visibility:visible;mso-wrap-style:square;mso-width-percent:0;mso-height-percent:0;mso-wrap-distance-left:9pt;mso-wrap-distance-top:0;mso-wrap-distance-right:9pt;mso-wrap-distance-bottom:0;mso-position-horizontal:absolute;mso-position-horizontal-relative:margin;mso-position-vertical:absolute;mso-position-vertical-relative:text;mso-width-percent:0;mso-height-percent:0;mso-width-relative:margin;mso-height-relative:margin;v-text-anchor:middle" o:gfxdata="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" fillcolor="#d9e2f3 [660]" strokecolor="blue" strokeweight="1pt">
+                <v:stroke joinstyle="miter"/>
+                <v:path arrowok="t"/>
+                <o:lock v:ext="edit" aspectratio="t"/>
+                <v:textbox inset="0,0,0">
+                  <w:txbxContent>
+                    <w:p>
+                      <w:pPr>
+                        <w:jc w:val="center"/>
+                        <w:rPr>
+                          <w:rFonts w:ascii="Times New Roman" w:hAnsi="Times New Roman" w:cs="Times New Roman"/>
+                          <w:b/>
+                          <w:color w:val="000000" w:themeColor="text1"/>
+                          <w:sz w:val="32"/>
+                          <w14:shadow w14:blurRad="38100" w14:dist="19050" w14:dir="2700000" w14:sx="100000" w14:sy="100000" w14:kx="0" w14:ky="0" w14:algn="tl">
+                            <w14:schemeClr w14:val="dk1">
+                              <w14:alpha w14:val="60000"/>
+                            </w14:schemeClr>
+                          </w14:shadow>
+                          <w14:textOutline w14:w="0" w14:cap="flat" w14:cmpd="sng" w14:algn="ctr">
+                            <w14:noFill/>
+                            <w14:prstDash w14:val="solid"/>
+                            <w14:round/>
+                          </w14:textOutline>
+                        </w:rPr>
+                      </w:pPr>
+                      <w:r>
+                        <w:rPr>
+                          <w:rFonts w:ascii="Times New Roman" w:hAnsi="Times New Roman" w:cs="Times New Roman"/>
+                          <w:b/>
+                          <w:color w:val="000000" w:themeColor="text1"/>
+                          <w:sz w:val="32"/>
+                          <w14:shadow w14:blurRad="38100" w14:dist="19050" w14:dir="2700000" w14:sx="100000" w14:sy="100000" w14:kx="0" w14:ky="0" w14:algn="tl">
+                            <w14:schemeClr w14:val="dk1">
+                              <w14:alpha w14:val="60000"/>
+                            </w14:schemeClr>
+                          </w14:shadow>
+                          <w14:textOutline w14:w="0" w14:cap="flat" w14:cmpd="sng" w14:algn="ctr">
+                            <w14:noFill/>
+                            <w14:prstDash w14:val="solid"/>
+                            <w14:round/>
+                          </w14:textOutline>
+                        </w:rPr>
+                        <w:t>NHÓM 01</w:t>
+                      </w:r>
+                      <w:r>
+                        <w:rPr>
+                          <w:rFonts w:ascii="Times New Roman" w:hAnsi="Times New Roman" w:cs="Times New Roman"/>
+                          <w:b/>
+                          <w:color w:val="000000" w:themeColor="text1"/>
+                          <w:sz w:val="32"/>
+                          <w14:shadow w14:blurRad="38100" w14:dist="19050" w14:dir="2700000" w14:sx="100000" w14:sy="100000" w14:kx="0" w14:ky="0" w14:algn="tl">
+                            <w14:schemeClr w14:val="dk1">
+                              <w14:alpha w14:val="60000"/>
+                            </w14:schemeClr>
+                          </w14:shadow>
+                          <w14:textOutline w14:w="0" w14:cap="flat" w14:cmpd="sng" w14:algn="ctr">
+                            <w14:noFill/>
+                            <w14:prstDash w14:val="solid"/>
+                            <w14:round/>
+                          </w14:textOutline>
+                        </w:rPr>
+                        <w:t>:</w:t>
+                      </w:r>
+                    </w:p>
+                    <w:p>
+                      <w:pPr>
+                        <w:jc w:val="center"/>
+                        <w:rPr>
+                          <w:rFonts w:ascii="Times New Roman" w:hAnsi="Times New Roman" w:cs="Times New Roman"/>
+                          <w:color w:val="000000" w:themeColor="text1"/>
+                          <w:sz w:val="32"/>
+                          <w14:shadow w14:blurRad="38100" w14:dist="19050" w14:dir="2700000" w14:sx="100000" w14:sy="100000" w14:kx="0" w14:ky="0" w14:algn="tl">
+                            <w14:schemeClr w14:val="dk1">
+                              <w14:alpha w14:val="60000"/>
+                            </w14:schemeClr>
+                          </w14:shadow>
+                          <w14:textOutline w14:w="0" w14:cap="flat" w14:cmpd="sng" w14:algn="ctr">
+                            <w14:noFill/>
+                            <w14:prstDash w14:val="solid"/>
+                            <w14:round/>
+                          </w14:textOutline>
+                        </w:rPr>
+                      </w:pPr>
+                      <w:proofErr w:type="spellStart"/>
+                      <w:r>
+                        <w:rPr>
+                          <w:rFonts w:ascii="Times New Roman" w:hAnsi="Times New Roman" w:cs="Times New Roman"/>
+                          <w:color w:val="000000" w:themeColor="text1"/>
+                          <w:sz w:val="28"/>
+                          <w:szCs w:val="20"/>
+                          <w14:shadow w14:blurRad="38100" w14:dist="19050" w14:dir="2700000" w14:sx="100000" w14:sy="100000" w14:kx="0" w14:ky="0" w14:algn="tl">
+                            <w14:schemeClr w14:val="dk1">
+                              <w14:alpha w14:val="60000"/>
+                            </w14:schemeClr>
+                          </w14:shadow>
+                          <w14:textOutline w14:w="0" w14:cap="flat" w14:cmpd="sng" w14:algn="ctr">
+                            <w14:noFill/>
+                            <w14:prstDash w14:val="solid"/>
+                            <w14:round/>
+                          </w14:textOutline>
+                        </w:rPr>
+                        <w:t>Hệ</w:t>
+                      </w:r>
+                      <w:proofErr w:type="spellEnd"/>
+                      <w:r>
+                        <w:rPr>
+                          <w:rFonts w:ascii="Times New Roman" w:hAnsi="Times New Roman" w:cs="Times New Roman"/>
+                          <w:color w:val="000000" w:themeColor="text1"/>
+                          <w:sz w:val="28"/>
+                          <w:szCs w:val="20"/>
+                          <w14:shadow w14:blurRad="38100" w14:dist="19050" w14:dir="2700000" w14:sx="100000" w14:sy="100000" w14:kx="0" w14:ky="0" w14:algn="tl">
+                            <w14:schemeClr w14:val="dk1">
+                              <w14:alpha w14:val="60000"/>
+                            </w14:schemeClr>
+                          </w14:shadow>
+                          <w14:textOutline w14:w="0" w14:cap="flat" w14:cmpd="sng" w14:algn="ctr">
+                            <w14:noFill/>
+                            <w14:prstDash w14:val="solid"/>
+                            <w14:round/>
+                          </w14:textOutline>
+                        </w:rPr>
+                        <w:t xml:space="preserve"> </w:t>
+                      </w:r>
+                      <w:proofErr w:type="spellStart"/>
+                      <w:r>
+                        <w:rPr>
+                          <w:rFonts w:ascii="Times New Roman" w:hAnsi="Times New Roman" w:cs="Times New Roman"/>
+                          <w:color w:val="000000" w:themeColor="text1"/>
+                          <w:sz w:val="28"/>
+                          <w:szCs w:val="20"/>
+                          <w14:shadow w14:blurRad="38100" w14:dist="19050" w14:dir="2700000" w14:sx="100000" w14:sy="100000" w14:kx="0" w14:ky="0" w14:algn="tl">
+                            <w14:schemeClr w14:val="dk1">
+                              <w14:alpha w14:val="60000"/>
+                            </w14:schemeClr>
+                          </w14:shadow>
+                          <w14:textOutline w14:w="0" w14:cap="flat" w14:cmpd="sng" w14:algn="ctr">
+                            <w14:noFill/>
+                            <w14:prstDash w14:val="solid"/>
+                            <w14:round/>
+                          </w14:textOutline>
+                        </w:rPr>
+                        <w:t>thống</w:t>
+                      </w:r>
+                      <w:proofErr w:type="spellEnd"/>
+                      <w:r>
+                        <w:rPr>
+                          <w:rFonts w:ascii="Times New Roman" w:hAnsi="Times New Roman" w:cs="Times New Roman"/>
+                          <w:color w:val="000000" w:themeColor="text1"/>
+                          <w:sz w:val="28"/>
+                          <w:szCs w:val="20"/>
+                          <w14:shadow w14:blurRad="38100" w14:dist="19050" w14:dir="2700000" w14:sx="100000" w14:sy="100000" w14:kx="0" w14:ky="0" w14:algn="tl">
+                            <w14:schemeClr w14:val="dk1">
+                              <w14:alpha w14:val="60000"/>
+                            </w14:schemeClr>
+                          </w14:shadow>
+                          <w14:textOutline w14:w="0" w14:cap="flat" w14:cmpd="sng" w14:algn="ctr">
+                            <w14:noFill/>
+                            <w14:prstDash w14:val="solid"/>
+                            <w14:round/>
+                          </w14:textOutline>
+                        </w:rPr>
+                        <w:t xml:space="preserve"> </w:t>
+                      </w:r>
+                      <w:proofErr w:type="spellStart"/>
+                      <w:r>
+                        <w:rPr>
+                          <w:rFonts w:ascii="Times New Roman" w:hAnsi="Times New Roman" w:cs="Times New Roman"/>
+                          <w:color w:val="000000" w:themeColor="text1"/>
+                          <w:sz w:val="28"/>
+                          <w:szCs w:val="20"/>
+                          <w14:shadow w14:blurRad="38100" w14:dist="19050" w14:dir="2700000" w14:sx="100000" w14:sy="100000" w14:kx="0" w14:ky="0" w14:algn="tl">
+                            <w14:schemeClr w14:val="dk1">
+                              <w14:alpha w14:val="60000"/>
+                            </w14:schemeClr>
+                          </w14:shadow>
+                          <w14:textOutline w14:w="0" w14:cap="flat" w14:cmpd="sng" w14:algn="ctr">
+                            <w14:noFill/>
+                            <w14:prstDash w14:val="solid"/>
+                            <w14:round/>
+                          </w14:textOutline>
+                        </w:rPr>
+                        <w:t>quản</w:t>
+                      </w:r>
+                      <w:proofErr w:type="spellEnd"/>
+                      <w:r>
+                        <w:rPr>
+                          <w:rFonts w:ascii="Times New Roman" w:hAnsi="Times New Roman" w:cs="Times New Roman"/>
+                          <w:color w:val="000000" w:themeColor="text1"/>
+                          <w:sz w:val="28"/>
+                          <w:szCs w:val="20"/>
+                          <w14:shadow w14:blurRad="38100" w14:dist="19050" w14:dir="2700000" w14:sx="100000" w14:sy="100000" w14:kx="0" w14:ky="0" w14:algn="tl">
+                            <w14:schemeClr w14:val="dk1">
+                              <w14:alpha w14:val="60000"/>
+                            </w14:schemeClr>
+                          </w14:shadow>
+                          <w14:textOutline w14:w="0" w14:cap="flat" w14:cmpd="sng" w14:algn="ctr">
+                            <w14:noFill/>
+                            <w14:prstDash w14:val="solid"/>
+                            <w14:round/>
+                          </w14:textOutline>
+                        </w:rPr>
+                        <w:t xml:space="preserve"> </w:t>
+                      </w:r>
+                      <w:proofErr w:type="spellStart"/>
+                      <w:r>
+                        <w:rPr>
+                          <w:rFonts w:ascii="Times New Roman" w:hAnsi="Times New Roman" w:cs="Times New Roman"/>
+                          <w:color w:val="000000" w:themeColor="text1"/>
+                          <w:sz w:val="28"/>
+                          <w:szCs w:val="20"/>
+                          <w14:shadow w14:blurRad="38100" w14:dist="19050" w14:dir="2700000" w14:sx="100000" w14:sy="100000" w14:kx="0" w14:ky="0" w14:algn="tl">
+                            <w14:schemeClr w14:val="dk1">
+                              <w14:alpha w14:val="60000"/>
+                            </w14:schemeClr>
+                          </w14:shadow>
+                          <w14:textOutline w14:w="0" w14:cap="flat" w14:cmpd="sng" w14:algn="ctr">
+                            <w14:noFill/>
+                            <w14:prstDash w14:val="solid"/>
+                            <w14:round/>
+                          </w14:textOutline>
+                        </w:rPr>
+                        <w:t>lý</w:t>
+                      </w:r>
+                      <w:proofErr w:type="spellEnd"/>
+                      <w:r>
+                        <w:rPr>
+                          <w:rFonts w:ascii="Times New Roman" w:hAnsi="Times New Roman" w:cs="Times New Roman"/>
+                          <w:color w:val="000000" w:themeColor="text1"/>
+                          <w:sz w:val="28"/>
+                          <w:szCs w:val="20"/>
+                          <w14:shadow w14:blurRad="38100" w14:dist="19050" w14:dir="2700000" w14:sx="100000" w14:sy="100000" w14:kx="0" w14:ky="0" w14:algn="tl">
+                            <w14:schemeClr w14:val="dk1">
+                              <w14:alpha w14:val="60000"/>
+                            </w14:schemeClr>
+                          </w14:shadow>
+                          <w14:textOutline w14:w="0" w14:cap="flat" w14:cmpd="sng" w14:algn="ctr">
+                            <w14:noFill/>
+                            <w14:prstDash w14:val="solid"/>
+                            <w14:round/>
+                          </w14:textOutline>
+                        </w:rPr>
+                        <w:t xml:space="preserve"> </w:t>
+                      </w:r>
+                      <w:proofErr w:type="spellStart"/>
+                      <w:r>
+                        <w:rPr>
+                          <w:rFonts w:ascii="Times New Roman" w:hAnsi="Times New Roman" w:cs="Times New Roman"/>
+                          <w:color w:val="000000" w:themeColor="text1"/>
+                          <w:sz w:val="28"/>
+                          <w:szCs w:val="20"/>
+                          <w14:shadow w14:blurRad="38100" w14:dist="19050" w14:dir="2700000" w14:sx="100000" w14:sy="100000" w14:kx="0" w14:ky="0" w14:algn="tl">
+                            <w14:schemeClr w14:val="dk1">
+                              <w14:alpha w14:val="60000"/>
+                            </w14:schemeClr>
+                          </w14:shadow>
+                          <w14:textOutline w14:w="0" w14:cap="flat" w14:cmpd="sng" w14:algn="ctr">
+                            <w14:noFill/>
+                            <w14:prstDash w14:val="solid"/>
+                            <w14:round/>
+                          </w14:textOutline>
+                        </w:rPr>
+                        <w:t>bán</w:t>
+                      </w:r>
+                      <w:proofErr w:type="spellEnd"/>
+                      <w:r>
+                        <w:rPr>
+                          <w:rFonts w:ascii="Times New Roman" w:hAnsi="Times New Roman" w:cs="Times New Roman"/>
+                          <w:color w:val="000000" w:themeColor="text1"/>
+                          <w:sz w:val="28"/>
+                          <w:szCs w:val="20"/>
+                          <w14:shadow w14:blurRad="38100" w14:dist="19050" w14:dir="2700000" w14:sx="100000" w14:sy="100000" w14:kx="0" w14:ky="0" w14:algn="tl">
+                            <w14:schemeClr w14:val="dk1">
+                              <w14:alpha w14:val="60000"/>
+                            </w14:schemeClr>
+                          </w14:shadow>
+                          <w14:textOutline w14:w="0" w14:cap="flat" w14:cmpd="sng" w14:algn="ctr">
+                            <w14:noFill/>
+                            <w14:prstDash w14:val="solid"/>
+                            <w14:round/>
+                          </w14:textOutline>
+                        </w:rPr>
+                        <w:t xml:space="preserve"> </w:t>
+                      </w:r>
+                      <w:proofErr w:type="spellStart"/>
+                      <w:r>
+                        <w:rPr>
+                          <w:rFonts w:ascii="Times New Roman" w:hAnsi="Times New Roman" w:cs="Times New Roman"/>
+                          <w:color w:val="000000" w:themeColor="text1"/>
+                          <w:sz w:val="28"/>
+                          <w:szCs w:val="20"/>
+                          <w14:shadow w14:blurRad="38100" w14:dist="19050" w14:dir="2700000" w14:sx="100000" w14:sy="100000" w14:kx="0" w14:ky="0" w14:algn="tl">
+                            <w14:schemeClr w14:val="dk1">
+                              <w14:alpha w14:val="60000"/>
+                            </w14:schemeClr>
+                          </w14:shadow>
+                          <w14:textOutline w14:w="0" w14:cap="flat" w14:cmpd="sng" w14:algn="ctr">
+                            <w14:noFill/>
+                            <w14:prstDash w14:val="solid"/>
+                            <w14:round/>
+                          </w14:textOutline>
+                        </w:rPr>
+                        <w:t>hàng</w:t>
+                      </w:r>
+                      <w:proofErr w:type="spellEnd"/>
+                      <w:r>
+                        <w:rPr>
+                          <w:rFonts w:ascii="Times New Roman" w:hAnsi="Times New Roman" w:cs="Times New Roman"/>
+                          <w:color w:val="000000" w:themeColor="text1"/>
+                          <w:sz w:val="28"/>
+                          <w:szCs w:val="20"/>
+                          <w14:shadow w14:blurRad="38100" w14:dist="19050" w14:dir="2700000" w14:sx="100000" w14:sy="100000" w14:kx="0" w14:ky="0" w14:algn="tl">
+                            <w14:schemeClr w14:val="dk1">
+                              <w14:alpha w14:val="60000"/>
+                            </w14:schemeClr>
+                          </w14:shadow>
+                          <w14:textOutline w14:w="0" w14:cap="flat" w14:cmpd="sng" w14:algn="ctr">
+                            <w14:noFill/>
+                            <w14:prstDash w14:val="solid"/>
+                            <w14:round/>
+                          </w14:textOutline>
+                        </w:rPr>
+                        <w:t xml:space="preserve"> </w:t>
+                      </w:r>
+                      <w:proofErr w:type="spellStart"/>
+                      <w:r>
+                        <w:rPr>
+                          <w:rFonts w:ascii="Times New Roman" w:hAnsi="Times New Roman" w:cs="Times New Roman"/>
+                          <w:color w:val="000000" w:themeColor="text1"/>
+                          <w:sz w:val="28"/>
+                          <w:szCs w:val="20"/>
+                          <w14:shadow w14:blurRad="38100" w14:dist="19050" w14:dir="2700000" w14:sx="100000" w14:sy="100000" w14:kx="0" w14:ky="0" w14:algn="tl">
+                            <w14:schemeClr w14:val="dk1">
+                              <w14:alpha w14:val="60000"/>
+                            </w14:schemeClr>
+                          </w14:shadow>
+                          <w14:textOutline w14:w="0" w14:cap="flat" w14:cmpd="sng" w14:algn="ctr">
+                            <w14:noFill/>
+                            <w14:prstDash w14:val="solid"/>
+                            <w14:round/>
+                          </w14:textOutline>
+                        </w:rPr>
+                        <w:t>có</w:t>
+                      </w:r>
+                      <w:proofErr w:type="spellEnd"/>
+                      <w:r>
+                        <w:rPr>
+                          <w:rFonts w:ascii="Times New Roman" w:hAnsi="Times New Roman" w:cs="Times New Roman"/>
+                          <w:color w:val="000000" w:themeColor="text1"/>
+                          <w:sz w:val="28"/>
+                          <w:szCs w:val="20"/>
+                          <w14:shadow w14:blurRad="38100" w14:dist="19050" w14:dir="2700000" w14:sx="100000" w14:sy="100000" w14:kx="0" w14:ky="0" w14:algn="tl">
+                            <w14:schemeClr w14:val="dk1">
+                              <w14:alpha w14:val="60000"/>
+                            </w14:schemeClr>
+                          </w14:shadow>
+                          <w14:textOutline w14:w="0" w14:cap="flat" w14:cmpd="sng" w14:algn="ctr">
+                            <w14:noFill/>
+                            <w14:prstDash w14:val="solid"/>
+                            <w14:round/>
+                          </w14:textOutline>
+                        </w:rPr>
+                        <w:t xml:space="preserve"> </w:t>
+                      </w:r>
+                      <w:proofErr w:type="spellStart"/>
+                      <w:r>
+                        <w:rPr>
+                          <w:rFonts w:ascii="Times New Roman" w:hAnsi="Times New Roman" w:cs="Times New Roman"/>
+                          <w:color w:val="000000" w:themeColor="text1"/>
+                          <w:sz w:val="28"/>
+                          <w:szCs w:val="20"/>
+                          <w14:shadow w14:blurRad="38100" w14:dist="19050" w14:dir="2700000" w14:sx="100000" w14:sy="100000" w14:kx="0" w14:ky="0" w14:algn="tl">
+                            <w14:schemeClr w14:val="dk1">
+                              <w14:alpha w14:val="60000"/>
+                            </w14:schemeClr>
+                          </w14:shadow>
+                          <w14:textOutline w14:w="0" w14:cap="flat" w14:cmpd="sng" w14:algn="ctr">
+                            <w14:noFill/>
+                            <w14:prstDash w14:val="solid"/>
+                            <w14:round/>
+                          </w14:textOutline>
+                        </w:rPr>
+                        <w:t>tích</w:t>
+                      </w:r>
+                      <w:proofErr w:type="spellEnd"/>
+                      <w:r>
+                        <w:rPr>
+                          <w:rFonts w:ascii="Times New Roman" w:hAnsi="Times New Roman" w:cs="Times New Roman"/>
+                          <w:color w:val="000000" w:themeColor="text1"/>
+                          <w:sz w:val="28"/>
+                          <w:szCs w:val="20"/>
+                          <w14:shadow w14:blurRad="38100" w14:dist="19050" w14:dir="2700000" w14:sx="100000" w14:sy="100000" w14:kx="0" w14:ky="0" w14:algn="tl">
+                            <w14:schemeClr w14:val="dk1">
+                              <w14:alpha w14:val="60000"/>
+                            </w14:schemeClr>
+                          </w14:shadow>
+                          <w14:textOutline w14:w="0" w14:cap="flat" w14:cmpd="sng" w14:algn="ctr">
+                            <w14:noFill/>
+                            <w14:prstDash w14:val="solid"/>
+                            <w14:round/>
+                          </w14:textOutline>
+                        </w:rPr>
+                        <w:t xml:space="preserve"> </w:t>
+                      </w:r>
+                      <w:proofErr w:type="spellStart"/>
+                      <w:r>
+                        <w:rPr>
+                          <w:rFonts w:ascii="Times New Roman" w:hAnsi="Times New Roman" w:cs="Times New Roman"/>
+                          <w:color w:val="000000" w:themeColor="text1"/>
+                          <w:sz w:val="28"/>
+                          <w:szCs w:val="20"/>
+                          <w14:shadow w14:blurRad="38100" w14:dist="19050" w14:dir="2700000" w14:sx="100000" w14:sy="100000" w14:kx="0" w14:ky="0" w14:algn="tl">
+                            <w14:schemeClr w14:val="dk1">
+                              <w14:alpha w14:val="60000"/>
+                            </w14:schemeClr>
+                          </w14:shadow>
+                          <w14:textOutline w14:w="0" w14:cap="flat" w14:cmpd="sng" w14:algn="ctr">
+                            <w14:noFill/>
+                            <w14:prstDash w14:val="solid"/>
+                            <w14:round/>
+                          </w14:textOutline>
+                        </w:rPr>
+                        <w:t>hợp</w:t>
+                      </w:r>
+                      <w:proofErr w:type="spellEnd"/>
+                      <w:r>
+                        <w:rPr>
+                          <w:rFonts w:ascii="Times New Roman" w:hAnsi="Times New Roman" w:cs="Times New Roman"/>
+                          <w:color w:val="000000" w:themeColor="text1"/>
+                          <w:sz w:val="28"/>
+                          <w:szCs w:val="20"/>
+                          <w14:shadow w14:blurRad="38100" w14:dist="19050" w14:dir="2700000" w14:sx="100000" w14:sy="100000" w14:kx="0" w14:ky="0" w14:algn="tl">
+                            <w14:schemeClr w14:val="dk1">
+                              <w14:alpha w14:val="60000"/>
+                            </w14:schemeClr>
+                          </w14:shadow>
+                          <w14:textOutline w14:w="0" w14:cap="flat" w14:cmpd="sng" w14:algn="ctr">
+                            <w14:noFill/>
+                            <w14:prstDash w14:val="solid"/>
+                            <w14:round/>
+                          </w14:textOutline>
+                        </w:rPr>
+                        <w:t xml:space="preserve"> AI</w:t>
+                      </w:r>
+                    </w:p>
+                    <w:p>
+                      <w:pPr>
+                        <w:jc w:val="center"/>
+                        <w:rPr>
+                          <w:rFonts w:ascii="Times New Roman" w:hAnsi="Times New Roman" w:cs="Times New Roman"/>
+                          <w:color w:val="000000" w:themeColor="text1"/>
+                          <w:sz w:val="32"/>
+                          <w14:shadow w14:blurRad="38100" w14:dist="19050" w14:dir="2700000" w14:sx="100000" w14:sy="100000" w14:kx="0" w14:ky="0" w14:algn="tl">
+                            <w14:schemeClr w14:val="dk1">
+                              <w14:alpha w14:val="60000"/>
+                            </w14:schemeClr>
+                          </w14:shadow>
+                          <w14:textOutline w14:w="0" w14:cap="flat" w14:cmpd="sng" w14:algn="ctr">
+                            <w14:noFill/>
+                            <w14:prstDash w14:val="solid"/>
+                            <w14:round/>
+                          </w14:textOutline>
+                        </w:rPr>
+                      </w:pPr>
+                    </w:p>
+                    <w:p>
+                      <w:pPr>
+                        <w:jc w:val="center"/>
+                        <w:rPr>
+                          <w:rFonts w:ascii="Times New Roman" w:hAnsi="Times New Roman" w:cs="Times New Roman"/>
+                          <w:color w:val="000000" w:themeColor="text1"/>
+                          <w:sz w:val="32"/>
+                          <w14:shadow w14:blurRad="38100" w14:dist="19050" w14:dir="2700000" w14:sx="100000" w14:sy="100000" w14:kx="0" w14:ky="0" w14:algn="tl">
+                            <w14:schemeClr w14:val="dk1">
+                              <w14:alpha w14:val="60000"/>
+                            </w14:schemeClr>
+                          </w14:shadow>
+                          <w14:textOutline w14:w="0" w14:cap="flat" w14:cmpd="sng" w14:algn="ctr">
+                            <w14:noFill/>
+                            <w14:prstDash w14:val="solid"/>
+                            <w14:round/>
+                          </w14:textOutline>
+                        </w:rPr>
+                      </w:pPr>
+                    </w:p>
+                    <w:p>
+                      <w:pPr>
+                        <w:jc w:val="center"/>
+                        <w:rPr>
+                          <w:rFonts w:ascii="Times New Roman" w:hAnsi="Times New Roman" w:cs="Times New Roman"/>
+                          <w:color w:val="000000" w:themeColor="text1"/>
+                          <w:sz w:val="32"/>
+                          <w14:shadow w14:blurRad="38100" w14:dist="19050" w14:dir="2700000" w14:sx="100000" w14:sy="100000" w14:kx="0" w14:ky="0" w14:algn="tl">
+                            <w14:schemeClr w14:val="dk1">
+                              <w14:alpha w14:val="60000"/>
+                            </w14:schemeClr>
+                          </w14:shadow>
+                          <w14:textOutline w14:w="0" w14:cap="flat" w14:cmpd="sng" w14:algn="ctr">
+                            <w14:noFill/>
+                            <w14:prstDash w14:val="solid"/>
+                            <w14:round/>
+                          </w14:textOutline>
+                        </w:rPr>
+                      </w:pPr>
+                    </w:p>
+                    <w:p>
+                      <w:pPr>
+                        <w:jc w:val="center"/>
+                        <w:rPr>
+                          <w:rFonts w:ascii="Times New Roman" w:hAnsi="Times New Roman" w:cs="Times New Roman"/>
+                          <w:color w:val="000000" w:themeColor="text1"/>
+                          <w:spacing w:val="-4"/>
+                          <w:sz w:val="32"/>
+                          <w14:shadow w14:blurRad="38100" w14:dist="19050" w14:dir="2700000" w14:sx="100000" w14:sy="100000" w14:kx="0" w14:ky="0" w14:algn="tl">
+                            <w14:schemeClr w14:val="dk1">
+                              <w14:alpha w14:val="60000"/>
+                            </w14:schemeClr>
+                          </w14:shadow>
+                          <w14:textOutline w14:w="0" w14:cap="flat" w14:cmpd="sng" w14:algn="ctr">
+                            <w14:noFill/>
+                            <w14:prstDash w14:val="solid"/>
+                            <w14:round/>
+                          </w14:textOutline>
+                        </w:rPr>
+                      </w:pPr>
+                      <w:r>
+                        <w:rPr>
+                          <w:rFonts w:ascii="Times New Roman" w:hAnsi="Times New Roman" w:cs="Times New Roman"/>
+                          <w:color w:val="000000" w:themeColor="text1"/>
+                          <w:spacing w:val="-4"/>
+                          <w:sz w:val="32"/>
+                          <w14:shadow w14:blurRad="38100" w14:dist="19050" w14:dir="2700000" w14:sx="100000" w14:sy="100000" w14:kx="0" w14:ky="0" w14:algn="tl">
+                            <w14:schemeClr w14:val="dk1">
+                              <w14:alpha w14:val="60000"/>
+                            </w14:schemeClr>
+                          </w14:shadow>
+                          <w14:textOutline w14:w="0" w14:cap="flat" w14:cmpd="sng" w14:algn="ctr">
+                            <w14:noFill/>
+                            <w14:prstDash w14:val="solid"/>
+                            <w14:round/>
+                          </w14:textOutline>
+                        </w:rPr>
+                        <w:t xml:space="preserve">Học </w:t>
+                      </w:r>
+                      <w:proofErr w:type="spellStart"/>
+                      <w:r>
+                        <w:rPr>
+                          <w:rFonts w:ascii="Times New Roman" w:hAnsi="Times New Roman" w:cs="Times New Roman"/>
+                          <w:color w:val="000000" w:themeColor="text1"/>
+                          <w:spacing w:val="-4"/>
+                          <w:sz w:val="32"/>
+                          <w14:shadow w14:blurRad="38100" w14:dist="19050" w14:dir="2700000" w14:sx="100000" w14:sy="100000" w14:kx="0" w14:ky="0" w14:algn="tl">
+                            <w14:schemeClr w14:val="dk1">
+                              <w14:alpha w14:val="60000"/>
+                            </w14:schemeClr>
+                          </w14:shadow>
+                          <w14:textOutline w14:w="0" w14:cap="flat" w14:cmpd="sng" w14:algn="ctr">
+                            <w14:noFill/>
+                            <w14:prstDash w14:val="solid"/>
+                            <w14:round/>
+                          </w14:textOutline>
+                        </w:rPr>
+                        <w:t>phần</w:t>
+                      </w:r>
+                      <w:proofErr w:type="spellEnd"/>
+                      <w:r>
+                        <w:rPr>
+                          <w:rFonts w:ascii="Times New Roman" w:hAnsi="Times New Roman" w:cs="Times New Roman"/>
+                          <w:color w:val="000000" w:themeColor="text1"/>
+                          <w:spacing w:val="-4"/>
+                          <w:sz w:val="32"/>
+                          <w14:shadow w14:blurRad="38100" w14:dist="19050" w14:dir="2700000" w14:sx="100000" w14:sy="100000" w14:kx="0" w14:ky="0" w14:algn="tl">
+                            <w14:schemeClr w14:val="dk1">
+                              <w14:alpha w14:val="60000"/>
+                            </w14:schemeClr>
+                          </w14:shadow>
+                          <w14:textOutline w14:w="0" w14:cap="flat" w14:cmpd="sng" w14:algn="ctr">
+                            <w14:noFill/>
+                            <w14:prstDash w14:val="solid"/>
+                            <w14:round/>
+                          </w14:textOutline>
+                        </w:rPr>
+                        <w:t xml:space="preserve">: </w:t>
+                      </w:r>
+                      <w:proofErr w:type="spellStart"/>
+                      <w:r>
+                        <w:rPr>
+                          <w:rFonts w:ascii="Times New Roman" w:hAnsi="Times New Roman" w:cs="Times New Roman"/>
+                          <w:color w:val="000000" w:themeColor="text1"/>
+                          <w:spacing w:val="-4"/>
+                          <w:sz w:val="32"/>
+                          <w14:shadow w14:blurRad="38100" w14:dist="19050" w14:dir="2700000" w14:sx="100000" w14:sy="100000" w14:kx="0" w14:ky="0" w14:algn="tl">
+                            <w14:schemeClr w14:val="dk1">
+                              <w14:alpha w14:val="60000"/>
+                            </w14:schemeClr>
+                          </w14:shadow>
+                          <w14:textOutline w14:w="0" w14:cap="flat" w14:cmpd="sng" w14:algn="ctr">
+                            <w14:noFill/>
+                            <w14:prstDash w14:val="solid"/>
+                            <w14:round/>
+                          </w14:textOutline>
+                        </w:rPr>
+                        <w:t>Ứng</w:t>
+                      </w:r>
+                      <w:proofErr w:type="spellEnd"/>
+                      <w:r>
+                        <w:rPr>
+                          <w:rFonts w:ascii="Times New Roman" w:hAnsi="Times New Roman" w:cs="Times New Roman"/>
+                          <w:color w:val="000000" w:themeColor="text1"/>
+                          <w:spacing w:val="-4"/>
+                          <w:sz w:val="32"/>
+                          <w14:shadow w14:blurRad="38100" w14:dist="19050" w14:dir="2700000" w14:sx="100000" w14:sy="100000" w14:kx="0" w14:ky="0" w14:algn="tl">
+                            <w14:schemeClr w14:val="dk1">
+                              <w14:alpha w14:val="60000"/>
+                            </w14:schemeClr>
+                          </w14:shadow>
+                          <w14:textOutline w14:w="0" w14:cap="flat" w14:cmpd="sng" w14:algn="ctr">
+                            <w14:noFill/>
+                            <w14:prstDash w14:val="solid"/>
+                            <w14:round/>
+                          </w14:textOutline>
+                        </w:rPr>
+                        <w:t xml:space="preserve"> </w:t>
+                      </w:r>
+                      <w:proofErr w:type="spellStart"/>
+                      <w:r>
+                        <w:rPr>
+                          <w:rFonts w:ascii="Times New Roman" w:hAnsi="Times New Roman" w:cs="Times New Roman"/>
+                          <w:color w:val="000000" w:themeColor="text1"/>
+                          <w:spacing w:val="-4"/>
+                          <w:sz w:val="32"/>
+                          <w14:shadow w14:blurRad="38100" w14:dist="19050" w14:dir="2700000" w14:sx="100000" w14:sy="100000" w14:kx="0" w14:ky="0" w14:algn="tl">
+                            <w14:schemeClr w14:val="dk1">
+                              <w14:alpha w14:val="60000"/>
+                            </w14:schemeClr>
+                          </w14:shadow>
+                          <w14:textOutline w14:w="0" w14:cap="flat" w14:cmpd="sng" w14:algn="ctr">
+                            <w14:noFill/>
+                            <w14:prstDash w14:val="solid"/>
+                            <w14:round/>
+                          </w14:textOutline>
+                        </w:rPr>
+                        <w:t>dụng</w:t>
+                      </w:r>
+                      <w:proofErr w:type="spellEnd"/>
+                      <w:r>
+                        <w:rPr>
+                          <w:rFonts w:ascii="Times New Roman" w:hAnsi="Times New Roman" w:cs="Times New Roman"/>
+                          <w:color w:val="000000" w:themeColor="text1"/>
+                          <w:spacing w:val="-4"/>
+                          <w:sz w:val="32"/>
+                          <w14:shadow w14:blurRad="38100" w14:dist="19050" w14:dir="2700000" w14:sx="100000" w14:sy="100000" w14:kx="0" w14:ky="0" w14:algn="tl">
+                            <w14:schemeClr w14:val="dk1">
+                              <w14:alpha w14:val="60000"/>
+                            </w14:schemeClr>
+                          </w14:shadow>
+                          <w14:textOutline w14:w="0" w14:cap="flat" w14:cmpd="sng" w14:algn="ctr">
+                            <w14:noFill/>
+                            <w14:prstDash w14:val="solid"/>
+                            <w14:round/>
+                          </w14:textOutline>
+                        </w:rPr>
+                        <w:t xml:space="preserve"> Trí </w:t>
+                      </w:r>
+                      <w:proofErr w:type="spellStart"/>
+                      <w:r>
+                        <w:rPr>
+                          <w:rFonts w:ascii="Times New Roman" w:hAnsi="Times New Roman" w:cs="Times New Roman"/>
+                          <w:color w:val="000000" w:themeColor="text1"/>
+                          <w:spacing w:val="-4"/>
+                          <w:sz w:val="32"/>
+                          <w14:shadow w14:blurRad="38100" w14:dist="19050" w14:dir="2700000" w14:sx="100000" w14:sy="100000" w14:kx="0" w14:ky="0" w14:algn="tl">
+                            <w14:schemeClr w14:val="dk1">
+                              <w14:alpha w14:val="60000"/>
+                            </w14:schemeClr>
+                          </w14:shadow>
+                          <w14:textOutline w14:w="0" w14:cap="flat" w14:cmpd="sng" w14:algn="ctr">
+                            <w14:noFill/>
+                            <w14:prstDash w14:val="solid"/>
+                            <w14:round/>
+                          </w14:textOutline>
+                        </w:rPr>
+                        <w:t>tuệ</w:t>
+                      </w:r>
+                      <w:proofErr w:type="spellEnd"/>
+                      <w:r>
+                        <w:rPr>
+                          <w:rFonts w:ascii="Times New Roman" w:hAnsi="Times New Roman" w:cs="Times New Roman"/>
+                          <w:color w:val="000000" w:themeColor="text1"/>
+                          <w:spacing w:val="-4"/>
+                          <w:sz w:val="32"/>
+                          <w14:shadow w14:blurRad="38100" w14:dist="19050" w14:dir="2700000" w14:sx="100000" w14:sy="100000" w14:kx="0" w14:ky="0" w14:algn="tl">
+                            <w14:schemeClr w14:val="dk1">
+                              <w14:alpha w14:val="60000"/>
+                            </w14:schemeClr>
+                          </w14:shadow>
+                          <w14:textOutline w14:w="0" w14:cap="flat" w14:cmpd="sng" w14:algn="ctr">
+                            <w14:noFill/>
+                            <w14:prstDash w14:val="solid"/>
+                            <w14:round/>
+                          </w14:textOutline>
+                        </w:rPr>
+                        <w:t xml:space="preserve"> </w:t>
+                      </w:r>
+                      <w:proofErr w:type="spellStart"/>
+                      <w:r>
+                        <w:rPr>
+                          <w:rFonts w:ascii="Times New Roman" w:hAnsi="Times New Roman" w:cs="Times New Roman"/>
+                          <w:color w:val="000000" w:themeColor="text1"/>
+                          <w:spacing w:val="-4"/>
+                          <w:sz w:val="32"/>
+                          <w14:shadow w14:blurRad="38100" w14:dist="19050" w14:dir="2700000" w14:sx="100000" w14:sy="100000" w14:kx="0" w14:ky="0" w14:algn="tl">
+                            <w14:schemeClr w14:val="dk1">
+                              <w14:alpha w14:val="60000"/>
+                            </w14:schemeClr>
+                          </w14:shadow>
+                          <w14:textOutline w14:w="0" w14:cap="flat" w14:cmpd="sng" w14:algn="ctr">
+                            <w14:noFill/>
+                            <w14:prstDash w14:val="solid"/>
+                            <w14:round/>
+                          </w14:textOutline>
+                        </w:rPr>
+                        <w:t>nhân</w:t>
+                      </w:r>
+                      <w:proofErr w:type="spellEnd"/>
+                      <w:r>
+                        <w:rPr>
+                          <w:rFonts w:ascii="Times New Roman" w:hAnsi="Times New Roman" w:cs="Times New Roman"/>
+                          <w:color w:val="000000" w:themeColor="text1"/>
+                          <w:spacing w:val="-4"/>
+                          <w:sz w:val="32"/>
+                          <w14:shadow w14:blurRad="38100" w14:dist="19050" w14:dir="2700000" w14:sx="100000" w14:sy="100000" w14:kx="0" w14:ky="0" w14:algn="tl">
+                            <w14:schemeClr w14:val="dk1">
+                              <w14:alpha w14:val="60000"/>
+                            </w14:schemeClr>
+                          </w14:shadow>
+                          <w14:textOutline w14:w="0" w14:cap="flat" w14:cmpd="sng" w14:algn="ctr">
+                            <w14:noFill/>
+                            <w14:prstDash w14:val="solid"/>
+                            <w14:round/>
+                          </w14:textOutline>
+                        </w:rPr>
+                        <w:t xml:space="preserve"> </w:t>
+                      </w:r>
+                      <w:proofErr w:type="spellStart"/>
+                      <w:r>
+                        <w:rPr>
+                          <w:rFonts w:ascii="Times New Roman" w:hAnsi="Times New Roman" w:cs="Times New Roman"/>
+                          <w:color w:val="000000" w:themeColor="text1"/>
+                          <w:spacing w:val="-4"/>
+                          <w:sz w:val="32"/>
+                          <w14:shadow w14:blurRad="38100" w14:dist="19050" w14:dir="2700000" w14:sx="100000" w14:sy="100000" w14:kx="0" w14:ky="0" w14:algn="tl">
+                            <w14:schemeClr w14:val="dk1">
+                              <w14:alpha w14:val="60000"/>
+                            </w14:schemeClr>
+                          </w14:shadow>
+                          <w14:textOutline w14:w="0" w14:cap="flat" w14:cmpd="sng" w14:algn="ctr">
+                            <w14:noFill/>
+                            <w14:prstDash w14:val="solid"/>
+                            <w14:round/>
+                          </w14:textOutline>
+                        </w:rPr>
+                        <w:t>tạo</w:t>
+                      </w:r>
+                      <w:proofErr w:type="spellEnd"/>
+                    </w:p>
+                    <w:p>
+                      <w:pPr>
+                        <w:jc w:val="center"/>
+                      </w:pPr>
+                      <w:proofErr w:type="spellStart"/>
+                      <w:r>
+                        <w:rPr>
+                          <w:rFonts w:ascii="Times New Roman" w:hAnsi="Times New Roman" w:cs="Times New Roman"/>
+                          <w:color w:val="000000" w:themeColor="text1"/>
+                          <w:sz w:val="32"/>
+                          <w14:shadow w14:blurRad="38100" w14:dist="19050" w14:dir="2700000" w14:sx="100000" w14:sy="100000" w14:kx="0" w14:ky="0" w14:algn="tl">
+                            <w14:schemeClr w14:val="dk1">
+                              <w14:alpha w14:val="60000"/>
+                            </w14:schemeClr>
+                          </w14:shadow>
+                          <w14:textOutline w14:w="0" w14:cap="flat" w14:cmpd="sng" w14:algn="ctr">
+                            <w14:noFill/>
+                            <w14:prstDash w14:val="solid"/>
+                            <w14:round/>
+                          </w14:textOutline>
+                        </w:rPr>
+                        <w:t>Lớp</w:t>
+                      </w:r>
+                      <w:proofErr w:type="spellEnd"/>
+                      <w:r>
+                        <w:rPr>
+                          <w:rFonts w:ascii="Times New Roman" w:hAnsi="Times New Roman" w:cs="Times New Roman"/>
+                          <w:color w:val="000000" w:themeColor="text1"/>
+                          <w:sz w:val="32"/>
+                          <w14:shadow w14:blurRad="38100" w14:dist="19050" w14:dir="2700000" w14:sx="100000" w14:sy="100000" w14:kx="0" w14:ky="0" w14:algn="tl">
+                            <w14:schemeClr w14:val="dk1">
+                              <w14:alpha w14:val="60000"/>
+                            </w14:schemeClr>
+                          </w14:shadow>
+                          <w14:textOutline w14:w="0" w14:cap="flat" w14:cmpd="sng" w14:algn="ctr">
+                            <w14:noFill/>
+                            <w14:prstDash w14:val="solid"/>
+                            <w14:round/>
+                          </w14:textOutline>
+                        </w:rPr>
+                        <w:t>: CNTT K</w:t>
+                      </w:r>
+                      <w:r>
+                        <w:rPr>
+                          <w:rFonts w:ascii="Times New Roman" w:hAnsi="Times New Roman" w:cs="Times New Roman"/>
+                          <w:color w:val="000000" w:themeColor="text1"/>
+                          <w:sz w:val="32"/>
+                          <w14:shadow w14:blurRad="38100" w14:dist="19050" w14:dir="2700000" w14:sx="100000" w14:sy="100000" w14:kx="0" w14:ky="0" w14:algn="tl">
+                            <w14:schemeClr w14:val="dk1">
+                              <w14:alpha w14:val="60000"/>
+                            </w14:schemeClr>
+                          </w14:shadow>
+                          <w14:textOutline w14:w="0" w14:cap="flat" w14:cmpd="sng" w14:algn="ctr">
+                            <w14:noFill/>
+                            <w14:prstDash w14:val="solid"/>
+                            <w14:round/>
+                          </w14:textOutline>
+                        </w:rPr>
+                        <w:t>2</w:t>
+                      </w:r>
+                      <w:r>
+                        <w:rPr>
+                          <w:rFonts w:ascii="Times New Roman" w:hAnsi="Times New Roman" w:cs="Times New Roman"/>
+                          <w:color w:val="000000" w:themeColor="text1"/>
+                          <w:sz w:val="32"/>
+                          <w14:shadow w14:blurRad="38100" w14:dist="19050" w14:dir="2700000" w14:sx="100000" w14:sy="100000" w14:kx="0" w14:ky="0" w14:algn="tl">
+                            <w14:schemeClr w14:val="dk1">
+                              <w14:alpha w14:val="60000"/>
+                            </w14:schemeClr>
+                          </w14:shadow>
+                          <w14:textOutline w14:w="0" w14:cap="flat" w14:cmpd="sng" w14:algn="ctr">
+                            <w14:noFill/>
+                            <w14:prstDash w14:val="solid"/>
+                            <w14:round/>
+                          </w14:textOutline>
+                        </w:rPr>
+                        <w:t>3</w:t>
+                      </w:r>
+                      <w:r>
+                        <w:rPr>
+                          <w:rFonts w:ascii="Times New Roman" w:hAnsi="Times New Roman" w:cs="Times New Roman"/>
+                          <w:color w:val="000000" w:themeColor="text1"/>
+                          <w:sz w:val="32"/>
+                          <w14:shadow w14:blurRad="38100" w14:dist="19050" w14:dir="2700000" w14:sx="100000" w14:sy="100000" w14:kx="0" w14:ky="0" w14:algn="tl">
+                            <w14:schemeClr w14:val="dk1">
+                              <w14:alpha w14:val="60000"/>
+                            </w14:schemeClr>
+                          </w14:shadow>
+                          <w14:textOutline w14:w="0" w14:cap="flat" w14:cmpd="sng" w14:algn="ctr">
+                            <w14:noFill/>
+                            <w14:prstDash w14:val="solid"/>
+                            <w14:round/>
+                          </w14:textOutline>
+                        </w:rPr>
+                        <w:t>D</w:t>
+                      </w:r>
+                    </w:p>
+                  </w:txbxContent>
+                </v:textbox>
+                <w10:wrap anchorx="margin"/>
+              </v:oval>
+            </w:pict>
+          </mc:Fallback>
+        </mc:AlternateContent>
+      </w:r>
     </w:p>
     <w:p>
       <w:pPr>
@@ -2925,7 +4681,6 @@
           <w:docGrid w:linePitch="360"/>
         </w:sectPr>
       </w:pPr>
-      <w:r/>
     </w:p>
     <w:p>
       <w:pPr>
@@ -3075,7 +4830,7 @@
         </w:rPr>
       </w:pPr>
       <w:r>
-        <w:t>[Nội dung thiết kế kiến trúc và CSDL chi tiết sẽ được hoàn thiện trong Bài kiểm tra 2 - KT2]</w:t>
+        <w:t>[Nội dung thiết kế kiến trúc và CSDL sẽ được hoàn thiện trong Bài kiểm tra 2 - KT2]</w:t>
       </w:r>
     </w:p>
     <w:p>
@@ -3118,7 +4873,7 @@
         </w:rPr>
       </w:pPr>
       <w:r>
-        <w:t>[Nội dung kết quả thử nghiệm AI và triển khai thực tế sẽ được hoàn thiện trong Bài kiểm tra 3 - KT3]</w:t>
+        <w:t>[Nội dung kết quả thử nghiệm và đánh giá AI sẽ được hoàn thiện trong Bài kiểm tra 3 - KT3]</w:t>
       </w:r>
     </w:p>
     <w:p>

</xml_diff>

<commit_message>
docs: surgical in-place mutation of template preserving original TOC and downstream chapters
</commit_message>
<xml_diff>
--- a/nhom4.docx
+++ b/nhom4.docx
@@ -1379,11 +1379,81 @@
           <w:sz w:val="22"/>
         </w:rPr>
       </w:pPr>
-      <w:r>
-        <w:t>CHƯƠNG 1. PHÂN TÍCH YÊU CẦU HỆ THỐNG</w:t>
-        <w:tab/>
-        <w:t>1</w:t>
-      </w:r>
+      <w:hyperlink w:anchor="_Toc116549838" w:history="1">
+        <w:r>
+          <w:rPr>
+            <w:rStyle w:val="Hyperlink"/>
+            <w:rFonts w:cs="Times New Roman"/>
+            <w:noProof/>
+          </w:rPr>
+          <w:t>CHƯƠNG 1.</w:t>
+        </w:r>
+        <w:r>
+          <w:rPr>
+            <w:rStyle w:val="Hyperlink"/>
+            <w:rFonts w:cs="Times New Roman"/>
+            <w:noProof/>
+            <w:spacing w:val="100"/>
+          </w:rPr>
+          <w:t xml:space="preserve"> </w:t>
+        </w:r>
+        <w:r>
+          <w:rPr>
+            <w:rStyle w:val="Hyperlink"/>
+            <w:rFonts w:cs="Times New Roman"/>
+            <w:noProof/>
+          </w:rPr>
+          <w:t>PHÂN TÍCH YÊU CẦU</w:t>
+        </w:r>
+        <w:r>
+          <w:rPr>
+            <w:noProof/>
+            <w:webHidden/>
+          </w:rPr>
+          <w:tab/>
+        </w:r>
+        <w:r>
+          <w:rPr>
+            <w:noProof/>
+            <w:webHidden/>
+          </w:rPr>
+          <w:fldChar w:fldCharType="begin"/>
+        </w:r>
+        <w:r>
+          <w:rPr>
+            <w:noProof/>
+            <w:webHidden/>
+          </w:rPr>
+          <w:instrText xml:space="preserve"> PAGEREF _Toc116549838 \h </w:instrText>
+        </w:r>
+        <w:r>
+          <w:rPr>
+            <w:noProof/>
+            <w:webHidden/>
+          </w:rPr>
+        </w:r>
+        <w:r>
+          <w:rPr>
+            <w:noProof/>
+            <w:webHidden/>
+          </w:rPr>
+          <w:fldChar w:fldCharType="separate"/>
+        </w:r>
+        <w:r>
+          <w:rPr>
+            <w:noProof/>
+            <w:webHidden/>
+          </w:rPr>
+          <w:t>1</w:t>
+        </w:r>
+        <w:r>
+          <w:rPr>
+            <w:noProof/>
+            <w:webHidden/>
+          </w:rPr>
+          <w:fldChar w:fldCharType="end"/>
+        </w:r>
+      </w:hyperlink>
     </w:p>
     <w:p>
       <w:pPr>
@@ -1397,31 +1467,64 @@
           <w:sz w:val="22"/>
         </w:rPr>
       </w:pPr>
-      <w:r>
-        <w:t xml:space="preserve">  1.1. Bối cảnh bài toán và lý do phát triển</w:t>
-        <w:tab/>
-        <w:t>1</w:t>
-        <w:br/>
-        <w:t xml:space="preserve">  1.2. Khảo sát hiện trạng và các giải pháp tương tự</w:t>
-        <w:tab/>
-        <w:t>1</w:t>
-        <w:br/>
-        <w:t xml:space="preserve">  1.3. Mô hình Actor và Phân hệ Use Case tổng quát</w:t>
-        <w:tab/>
-        <w:t>2</w:t>
-        <w:br/>
-        <w:t xml:space="preserve">  1.4. Đặc tả yêu cầu chức năng cốt lõi (FR)</w:t>
-        <w:tab/>
-        <w:t>3</w:t>
-        <w:br/>
-        <w:t xml:space="preserve">  1.5. Đặc tả yêu cầu phi chức năng (NFR)</w:t>
-        <w:tab/>
-        <w:t>4</w:t>
-        <w:br/>
-        <w:t xml:space="preserve">  1.6. Xác định bài toán ứng dụng AI và phạm vi tích hợp</w:t>
-        <w:tab/>
-        <w:t>5</w:t>
-      </w:r>
+      <w:hyperlink w:anchor="_Toc116549839" w:history="1">
+        <w:r>
+          <w:rPr>
+            <w:rStyle w:val="Hyperlink"/>
+            <w:rFonts w:cs="Times New Roman"/>
+            <w:noProof/>
+          </w:rPr>
+          <w:t>1.1. Nội dung</w:t>
+        </w:r>
+        <w:r>
+          <w:rPr>
+            <w:noProof/>
+            <w:webHidden/>
+          </w:rPr>
+          <w:tab/>
+        </w:r>
+        <w:r>
+          <w:rPr>
+            <w:noProof/>
+            <w:webHidden/>
+          </w:rPr>
+          <w:fldChar w:fldCharType="begin"/>
+        </w:r>
+        <w:r>
+          <w:rPr>
+            <w:noProof/>
+            <w:webHidden/>
+          </w:rPr>
+          <w:instrText xml:space="preserve"> PAGEREF _Toc116549839 \h </w:instrText>
+        </w:r>
+        <w:r>
+          <w:rPr>
+            <w:noProof/>
+            <w:webHidden/>
+          </w:rPr>
+        </w:r>
+        <w:r>
+          <w:rPr>
+            <w:noProof/>
+            <w:webHidden/>
+          </w:rPr>
+          <w:fldChar w:fldCharType="separate"/>
+        </w:r>
+        <w:r>
+          <w:rPr>
+            <w:noProof/>
+            <w:webHidden/>
+          </w:rPr>
+          <w:t>1</w:t>
+        </w:r>
+        <w:r>
+          <w:rPr>
+            <w:noProof/>
+            <w:webHidden/>
+          </w:rPr>
+          <w:fldChar w:fldCharType="end"/>
+        </w:r>
+      </w:hyperlink>
     </w:p>
     <w:p>
       <w:pPr>
@@ -1436,11 +1539,79 @@
           <w:sz w:val="22"/>
         </w:rPr>
       </w:pPr>
-      <w:r>
-        <w:t>CHƯƠNG 2. THIẾT KẾ HỆ THỐNG (BÀI KIỂM TRA 2)</w:t>
-        <w:tab/>
-        <w:t>6</w:t>
-      </w:r>
+      <w:hyperlink w:anchor="_Toc116549840" w:history="1">
+        <w:r>
+          <w:rPr>
+            <w:rStyle w:val="Hyperlink"/>
+            <w:noProof/>
+          </w:rPr>
+          <w:t>CHƯƠNG 2.</w:t>
+        </w:r>
+        <w:r>
+          <w:rPr>
+            <w:rStyle w:val="Hyperlink"/>
+            <w:noProof/>
+            <w:spacing w:val="100"/>
+          </w:rPr>
+          <w:t xml:space="preserve"> </w:t>
+        </w:r>
+        <w:r>
+          <w:rPr>
+            <w:rStyle w:val="Hyperlink"/>
+            <w:rFonts w:cs="Times New Roman"/>
+            <w:noProof/>
+          </w:rPr>
+          <w:t>MẠNG NƠ-RON VGGNET</w:t>
+        </w:r>
+        <w:r>
+          <w:rPr>
+            <w:noProof/>
+            <w:webHidden/>
+          </w:rPr>
+          <w:tab/>
+        </w:r>
+        <w:r>
+          <w:rPr>
+            <w:noProof/>
+            <w:webHidden/>
+          </w:rPr>
+          <w:fldChar w:fldCharType="begin"/>
+        </w:r>
+        <w:r>
+          <w:rPr>
+            <w:noProof/>
+            <w:webHidden/>
+          </w:rPr>
+          <w:instrText xml:space="preserve"> PAGEREF _Toc116549840 \h </w:instrText>
+        </w:r>
+        <w:r>
+          <w:rPr>
+            <w:noProof/>
+            <w:webHidden/>
+          </w:rPr>
+        </w:r>
+        <w:r>
+          <w:rPr>
+            <w:noProof/>
+            <w:webHidden/>
+          </w:rPr>
+          <w:fldChar w:fldCharType="separate"/>
+        </w:r>
+        <w:r>
+          <w:rPr>
+            <w:noProof/>
+            <w:webHidden/>
+          </w:rPr>
+          <w:t>2</w:t>
+        </w:r>
+        <w:r>
+          <w:rPr>
+            <w:noProof/>
+            <w:webHidden/>
+          </w:rPr>
+          <w:fldChar w:fldCharType="end"/>
+        </w:r>
+      </w:hyperlink>
     </w:p>
     <w:p>
       <w:pPr>
@@ -1454,11 +1625,63 @@
           <w:sz w:val="22"/>
         </w:rPr>
       </w:pPr>
-      <w:r>
-        <w:t xml:space="preserve">  2.1. Nội dung thiết kế kiến trúc và CSDL (KT2)</w:t>
-        <w:tab/>
-        <w:t>6</w:t>
-      </w:r>
+      <w:hyperlink w:anchor="_Toc116549841" w:history="1">
+        <w:r>
+          <w:rPr>
+            <w:rStyle w:val="Hyperlink"/>
+            <w:noProof/>
+          </w:rPr>
+          <w:t>2.1. Nội dung</w:t>
+        </w:r>
+        <w:r>
+          <w:rPr>
+            <w:noProof/>
+            <w:webHidden/>
+          </w:rPr>
+          <w:tab/>
+        </w:r>
+        <w:r>
+          <w:rPr>
+            <w:noProof/>
+            <w:webHidden/>
+          </w:rPr>
+          <w:fldChar w:fldCharType="begin"/>
+        </w:r>
+        <w:r>
+          <w:rPr>
+            <w:noProof/>
+            <w:webHidden/>
+          </w:rPr>
+          <w:instrText xml:space="preserve"> PAGEREF _Toc116549841 \h </w:instrText>
+        </w:r>
+        <w:r>
+          <w:rPr>
+            <w:noProof/>
+            <w:webHidden/>
+          </w:rPr>
+        </w:r>
+        <w:r>
+          <w:rPr>
+            <w:noProof/>
+            <w:webHidden/>
+          </w:rPr>
+          <w:fldChar w:fldCharType="separate"/>
+        </w:r>
+        <w:r>
+          <w:rPr>
+            <w:noProof/>
+            <w:webHidden/>
+          </w:rPr>
+          <w:t>2</w:t>
+        </w:r>
+        <w:r>
+          <w:rPr>
+            <w:noProof/>
+            <w:webHidden/>
+          </w:rPr>
+          <w:fldChar w:fldCharType="end"/>
+        </w:r>
+      </w:hyperlink>
     </w:p>
     <w:p>
       <w:pPr>
@@ -1473,11 +1696,79 @@
           <w:sz w:val="22"/>
         </w:rPr>
       </w:pPr>
-      <w:r>
-        <w:t>CHƯƠNG 3. TÍCH HỢP AI VÀ ĐÁNH GIÁ (BÀI KIỂM TRA 3)</w:t>
-        <w:tab/>
-        <w:t>7</w:t>
-      </w:r>
+      <w:hyperlink w:anchor="_Toc116549842" w:history="1">
+        <w:r>
+          <w:rPr>
+            <w:rStyle w:val="Hyperlink"/>
+            <w:noProof/>
+          </w:rPr>
+          <w:t>CHƯƠNG 3.</w:t>
+        </w:r>
+        <w:r>
+          <w:rPr>
+            <w:rStyle w:val="Hyperlink"/>
+            <w:noProof/>
+            <w:spacing w:val="100"/>
+          </w:rPr>
+          <w:t xml:space="preserve"> </w:t>
+        </w:r>
+        <w:r>
+          <w:rPr>
+            <w:rStyle w:val="Hyperlink"/>
+            <w:rFonts w:cs="Times New Roman"/>
+            <w:noProof/>
+          </w:rPr>
+          <w:t>ỨNG DỤNG MẠNG VGGNet TRONG BÀI TOÁN …</w:t>
+        </w:r>
+        <w:r>
+          <w:rPr>
+            <w:noProof/>
+            <w:webHidden/>
+          </w:rPr>
+          <w:tab/>
+        </w:r>
+        <w:r>
+          <w:rPr>
+            <w:noProof/>
+            <w:webHidden/>
+          </w:rPr>
+          <w:fldChar w:fldCharType="begin"/>
+        </w:r>
+        <w:r>
+          <w:rPr>
+            <w:noProof/>
+            <w:webHidden/>
+          </w:rPr>
+          <w:instrText xml:space="preserve"> PAGEREF _Toc116549842 \h </w:instrText>
+        </w:r>
+        <w:r>
+          <w:rPr>
+            <w:noProof/>
+            <w:webHidden/>
+          </w:rPr>
+        </w:r>
+        <w:r>
+          <w:rPr>
+            <w:noProof/>
+            <w:webHidden/>
+          </w:rPr>
+          <w:fldChar w:fldCharType="separate"/>
+        </w:r>
+        <w:r>
+          <w:rPr>
+            <w:noProof/>
+            <w:webHidden/>
+          </w:rPr>
+          <w:t>3</w:t>
+        </w:r>
+        <w:r>
+          <w:rPr>
+            <w:noProof/>
+            <w:webHidden/>
+          </w:rPr>
+          <w:fldChar w:fldCharType="end"/>
+        </w:r>
+      </w:hyperlink>
     </w:p>
     <w:p>
       <w:pPr>
@@ -1491,11 +1782,63 @@
           <w:sz w:val="22"/>
         </w:rPr>
       </w:pPr>
-      <w:r>
-        <w:t xml:space="preserve">  3.1. Thử nghiệm AI và đánh giá (KT3)</w:t>
-        <w:tab/>
-        <w:t>7</w:t>
-      </w:r>
+      <w:hyperlink w:anchor="_Toc116549843" w:history="1">
+        <w:r>
+          <w:rPr>
+            <w:rStyle w:val="Hyperlink"/>
+            <w:noProof/>
+          </w:rPr>
+          <w:t>3.1. Mô tả bài toán</w:t>
+        </w:r>
+        <w:r>
+          <w:rPr>
+            <w:noProof/>
+            <w:webHidden/>
+          </w:rPr>
+          <w:tab/>
+        </w:r>
+        <w:r>
+          <w:rPr>
+            <w:noProof/>
+            <w:webHidden/>
+          </w:rPr>
+          <w:fldChar w:fldCharType="begin"/>
+        </w:r>
+        <w:r>
+          <w:rPr>
+            <w:noProof/>
+            <w:webHidden/>
+          </w:rPr>
+          <w:instrText xml:space="preserve"> PAGEREF _Toc116549843 \h </w:instrText>
+        </w:r>
+        <w:r>
+          <w:rPr>
+            <w:noProof/>
+            <w:webHidden/>
+          </w:rPr>
+        </w:r>
+        <w:r>
+          <w:rPr>
+            <w:noProof/>
+            <w:webHidden/>
+          </w:rPr>
+          <w:fldChar w:fldCharType="separate"/>
+        </w:r>
+        <w:r>
+          <w:rPr>
+            <w:noProof/>
+            <w:webHidden/>
+          </w:rPr>
+          <w:t>3</w:t>
+        </w:r>
+        <w:r>
+          <w:rPr>
+            <w:noProof/>
+            <w:webHidden/>
+          </w:rPr>
+          <w:fldChar w:fldCharType="end"/>
+        </w:r>
+      </w:hyperlink>
     </w:p>
     <w:p>
       <w:pPr>
@@ -1510,11 +1853,63 @@
           <w:sz w:val="22"/>
         </w:rPr>
       </w:pPr>
-      <w:r>
-        <w:t>KẾT LUẬN</w:t>
-        <w:tab/>
-        <w:t>8</w:t>
-      </w:r>
+      <w:hyperlink w:anchor="_Toc116549844" w:history="1">
+        <w:r>
+          <w:rPr>
+            <w:rStyle w:val="Hyperlink"/>
+            <w:noProof/>
+          </w:rPr>
+          <w:t>KẾT LUẬN</w:t>
+        </w:r>
+        <w:r>
+          <w:rPr>
+            <w:noProof/>
+            <w:webHidden/>
+          </w:rPr>
+          <w:tab/>
+        </w:r>
+        <w:r>
+          <w:rPr>
+            <w:noProof/>
+            <w:webHidden/>
+          </w:rPr>
+          <w:fldChar w:fldCharType="begin"/>
+        </w:r>
+        <w:r>
+          <w:rPr>
+            <w:noProof/>
+            <w:webHidden/>
+          </w:rPr>
+          <w:instrText xml:space="preserve"> PAGEREF _Toc116549844 \h </w:instrText>
+        </w:r>
+        <w:r>
+          <w:rPr>
+            <w:noProof/>
+            <w:webHidden/>
+          </w:rPr>
+        </w:r>
+        <w:r>
+          <w:rPr>
+            <w:noProof/>
+            <w:webHidden/>
+          </w:rPr>
+          <w:fldChar w:fldCharType="separate"/>
+        </w:r>
+        <w:r>
+          <w:rPr>
+            <w:noProof/>
+            <w:webHidden/>
+          </w:rPr>
+          <w:t>4</w:t>
+        </w:r>
+        <w:r>
+          <w:rPr>
+            <w:noProof/>
+            <w:webHidden/>
+          </w:rPr>
+          <w:fldChar w:fldCharType="end"/>
+        </w:r>
+      </w:hyperlink>
     </w:p>
     <w:p>
       <w:pPr>
@@ -1529,11 +1924,63 @@
           <w:sz w:val="22"/>
         </w:rPr>
       </w:pPr>
-      <w:r>
-        <w:t>TÀI LIỆU THAM KHẢO</w:t>
-        <w:tab/>
-        <w:t>9</w:t>
-      </w:r>
+      <w:hyperlink w:anchor="_Toc116549845" w:history="1">
+        <w:r>
+          <w:rPr>
+            <w:rStyle w:val="Hyperlink"/>
+            <w:noProof/>
+          </w:rPr>
+          <w:t>TÀI LIỆU THAM KHẢO</w:t>
+        </w:r>
+        <w:r>
+          <w:rPr>
+            <w:noProof/>
+            <w:webHidden/>
+          </w:rPr>
+          <w:tab/>
+        </w:r>
+        <w:r>
+          <w:rPr>
+            <w:noProof/>
+            <w:webHidden/>
+          </w:rPr>
+          <w:fldChar w:fldCharType="begin"/>
+        </w:r>
+        <w:r>
+          <w:rPr>
+            <w:noProof/>
+            <w:webHidden/>
+          </w:rPr>
+          <w:instrText xml:space="preserve"> PAGEREF _Toc116549845 \h </w:instrText>
+        </w:r>
+        <w:r>
+          <w:rPr>
+            <w:noProof/>
+            <w:webHidden/>
+          </w:rPr>
+        </w:r>
+        <w:r>
+          <w:rPr>
+            <w:noProof/>
+            <w:webHidden/>
+          </w:rPr>
+          <w:fldChar w:fldCharType="separate"/>
+        </w:r>
+        <w:r>
+          <w:rPr>
+            <w:noProof/>
+            <w:webHidden/>
+          </w:rPr>
+          <w:t>5</w:t>
+        </w:r>
+        <w:r>
+          <w:rPr>
+            <w:noProof/>
+            <w:webHidden/>
+          </w:rPr>
+          <w:fldChar w:fldCharType="end"/>
+        </w:r>
+      </w:hyperlink>
     </w:p>
     <w:p>
       <w:pPr>
@@ -1878,6 +2325,19 @@
             <w:vAlign w:val="center"/>
           </w:tcPr>
           <w:p>
+            <w:pPr>
+              <w:pStyle w:val="0TEXTc1"/>
+              <w:numPr>
+                <w:ilvl w:val="0"/>
+                <w:numId w:val="5"/>
+              </w:numPr>
+              <w:spacing w:line="240" w:lineRule="auto"/>
+              <w:ind w:left="170" w:hanging="170"/>
+              <w:jc w:val="center"/>
+              <w:rPr>
+                <w:rFonts w:cs="Times New Roman"/>
+              </w:rPr>
+            </w:pPr>
             <w:r>
               <w:t>1</w:t>
             </w:r>
@@ -1889,8 +2349,17 @@
             <w:vAlign w:val="center"/>
           </w:tcPr>
           <w:p>
+            <w:pPr>
+              <w:pStyle w:val="0TEXTc1"/>
+              <w:spacing w:line="240" w:lineRule="auto"/>
+              <w:ind w:firstLine="0"/>
+              <w:jc w:val="left"/>
+              <w:rPr>
+                <w:rFonts w:cs="Times New Roman"/>
+              </w:rPr>
+            </w:pPr>
             <w:r>
-              <w:t>Phân tích yêu cầu bài toán, khảo sát hiện trạng, lập URD &amp; SRS chuẩn ISO/IEC/IEEE 29148</w:t>
+              <w:t>Phân tích yêu cầu bài toán, khảo sát hiện trạng, lập URD &amp; SRS</w:t>
             </w:r>
           </w:p>
         </w:tc>
@@ -1900,6 +2369,15 @@
             <w:vAlign w:val="center"/>
           </w:tcPr>
           <w:p>
+            <w:pPr>
+              <w:pStyle w:val="0TEXTc1"/>
+              <w:spacing w:line="240" w:lineRule="auto"/>
+              <w:ind w:firstLine="0"/>
+              <w:jc w:val="left"/>
+              <w:rPr>
+                <w:rFonts w:cs="Times New Roman"/>
+              </w:rPr>
+            </w:pPr>
             <w:r>
               <w:t>Phạm Minh Tú</w:t>
             </w:r>
@@ -1913,6 +2391,19 @@
             <w:vAlign w:val="center"/>
           </w:tcPr>
           <w:p>
+            <w:pPr>
+              <w:pStyle w:val="0TEXTc1"/>
+              <w:numPr>
+                <w:ilvl w:val="0"/>
+                <w:numId w:val="5"/>
+              </w:numPr>
+              <w:spacing w:line="240" w:lineRule="auto"/>
+              <w:ind w:left="170" w:hanging="170"/>
+              <w:jc w:val="center"/>
+              <w:rPr>
+                <w:rFonts w:cs="Times New Roman"/>
+              </w:rPr>
+            </w:pPr>
             <w:r>
               <w:t>2</w:t>
             </w:r>
@@ -1924,8 +2415,17 @@
             <w:vAlign w:val="center"/>
           </w:tcPr>
           <w:p>
+            <w:pPr>
+              <w:pStyle w:val="0TEXTc1"/>
+              <w:spacing w:line="240" w:lineRule="auto"/>
+              <w:ind w:firstLine="0"/>
+              <w:jc w:val="left"/>
+              <w:rPr>
+                <w:rFonts w:cs="Times New Roman"/>
+              </w:rPr>
+            </w:pPr>
             <w:r>
-              <w:t>Thiết kế mô hình Actor, Use Case và các đặc tả yêu cầu chức năng/phi chức năng</w:t>
+              <w:t>Thiết kế mô hình Actor, Use Case và các yêu cầu chức năng/phi chức năng</w:t>
             </w:r>
           </w:p>
         </w:tc>
@@ -1935,6 +2435,15 @@
             <w:vAlign w:val="center"/>
           </w:tcPr>
           <w:p>
+            <w:pPr>
+              <w:pStyle w:val="0TEXTc1"/>
+              <w:spacing w:line="240" w:lineRule="auto"/>
+              <w:ind w:firstLine="0"/>
+              <w:jc w:val="left"/>
+              <w:rPr>
+                <w:rFonts w:cs="Times New Roman"/>
+              </w:rPr>
+            </w:pPr>
             <w:r>
               <w:t>Phạm Minh Tú</w:t>
             </w:r>
@@ -1948,6 +2457,19 @@
             <w:vAlign w:val="center"/>
           </w:tcPr>
           <w:p>
+            <w:pPr>
+              <w:pStyle w:val="0TEXTc1"/>
+              <w:numPr>
+                <w:ilvl w:val="0"/>
+                <w:numId w:val="5"/>
+              </w:numPr>
+              <w:spacing w:line="240" w:lineRule="auto"/>
+              <w:ind w:left="170" w:hanging="170"/>
+              <w:jc w:val="center"/>
+              <w:rPr>
+                <w:rFonts w:cs="Times New Roman"/>
+              </w:rPr>
+            </w:pPr>
             <w:r>
               <w:t>3</w:t>
             </w:r>
@@ -1959,8 +2481,17 @@
             <w:vAlign w:val="center"/>
           </w:tcPr>
           <w:p>
+            <w:pPr>
+              <w:pStyle w:val="0TEXTc1"/>
+              <w:spacing w:line="240" w:lineRule="auto"/>
+              <w:ind w:firstLine="0"/>
+              <w:jc w:val="left"/>
+              <w:rPr>
+                <w:rFonts w:cs="Times New Roman"/>
+              </w:rPr>
+            </w:pPr>
             <w:r>
-              <w:t>Xác định mô hình CSDL quan hệ sơ bộ, phân quyền dự án và các thực thể cốt lõi</w:t>
+              <w:t>Xác định mô hình CSDL quan hệ sơ bộ và các thực thể cốt lõi</w:t>
             </w:r>
           </w:p>
         </w:tc>
@@ -1970,6 +2501,15 @@
             <w:vAlign w:val="center"/>
           </w:tcPr>
           <w:p>
+            <w:pPr>
+              <w:pStyle w:val="0TEXTc1"/>
+              <w:spacing w:line="240" w:lineRule="auto"/>
+              <w:ind w:firstLine="0"/>
+              <w:jc w:val="left"/>
+              <w:rPr>
+                <w:rFonts w:cs="Times New Roman"/>
+              </w:rPr>
+            </w:pPr>
             <w:r>
               <w:t>Phạm Văn Huynh</w:t>
             </w:r>
@@ -1983,6 +2523,19 @@
             <w:vAlign w:val="center"/>
           </w:tcPr>
           <w:p>
+            <w:pPr>
+              <w:pStyle w:val="0TEXTc1"/>
+              <w:numPr>
+                <w:ilvl w:val="0"/>
+                <w:numId w:val="5"/>
+              </w:numPr>
+              <w:spacing w:line="240" w:lineRule="auto"/>
+              <w:ind w:left="170" w:hanging="170"/>
+              <w:jc w:val="center"/>
+              <w:rPr>
+                <w:rFonts w:cs="Times New Roman"/>
+              </w:rPr>
+            </w:pPr>
             <w:r>
               <w:t>4</w:t>
             </w:r>
@@ -1994,8 +2547,17 @@
             <w:vAlign w:val="center"/>
           </w:tcPr>
           <w:p>
+            <w:pPr>
+              <w:pStyle w:val="0TEXTc1"/>
+              <w:spacing w:line="240" w:lineRule="auto"/>
+              <w:ind w:firstLine="0"/>
+              <w:jc w:val="left"/>
+              <w:rPr>
+                <w:rFonts w:cs="Times New Roman"/>
+              </w:rPr>
+            </w:pPr>
             <w:r>
-              <w:t>Xác định phạm vi ứng dụng AI và khảo sát các luồng xử lý NLP/LLM</w:t>
+              <w:t>Xác định phạm vi ứng dụng AI và khảo sát các luồng xử lý NLP</w:t>
             </w:r>
           </w:p>
         </w:tc>
@@ -2005,6 +2567,15 @@
             <w:vAlign w:val="center"/>
           </w:tcPr>
           <w:p>
+            <w:pPr>
+              <w:pStyle w:val="0TEXTc1"/>
+              <w:spacing w:line="240" w:lineRule="auto"/>
+              <w:ind w:firstLine="0"/>
+              <w:jc w:val="left"/>
+              <w:rPr>
+                <w:rFonts w:cs="Times New Roman"/>
+              </w:rPr>
+            </w:pPr>
             <w:r>
               <w:t>Đàm Đức Đôn</w:t>
             </w:r>
@@ -2018,6 +2589,19 @@
             <w:vAlign w:val="center"/>
           </w:tcPr>
           <w:p>
+            <w:pPr>
+              <w:pStyle w:val="0TEXTc1"/>
+              <w:numPr>
+                <w:ilvl w:val="0"/>
+                <w:numId w:val="5"/>
+              </w:numPr>
+              <w:spacing w:line="240" w:lineRule="auto"/>
+              <w:ind w:left="170" w:hanging="170"/>
+              <w:jc w:val="center"/>
+              <w:rPr>
+                <w:rFonts w:cs="Times New Roman"/>
+              </w:rPr>
+            </w:pPr>
             <w:r>
               <w:t>5</w:t>
             </w:r>
@@ -2029,6 +2613,15 @@
             <w:vAlign w:val="center"/>
           </w:tcPr>
           <w:p>
+            <w:pPr>
+              <w:pStyle w:val="0TEXTc1"/>
+              <w:spacing w:line="240" w:lineRule="auto"/>
+              <w:ind w:firstLine="0"/>
+              <w:jc w:val="left"/>
+              <w:rPr>
+                <w:rFonts w:cs="Times New Roman"/>
+              </w:rPr>
+            </w:pPr>
             <w:r>
               <w:t>Tổng hợp báo cáo kỹ thuật Chương 1 (KT1) và rà soát tài liệu</w:t>
             </w:r>
@@ -2040,6 +2633,15 @@
             <w:vAlign w:val="center"/>
           </w:tcPr>
           <w:p>
+            <w:pPr>
+              <w:pStyle w:val="0TEXTc1"/>
+              <w:spacing w:line="240" w:lineRule="auto"/>
+              <w:ind w:firstLine="0"/>
+              <w:jc w:val="left"/>
+              <w:rPr>
+                <w:rFonts w:cs="Times New Roman"/>
+              </w:rPr>
+            </w:pPr>
             <w:r>
               <w:t>Cả nhóm</w:t>
             </w:r>
@@ -2453,6 +3055,19 @@
             <w:vAlign w:val="center"/>
           </w:tcPr>
           <w:p>
+            <w:pPr>
+              <w:pStyle w:val="0TEXTc1"/>
+              <w:numPr>
+                <w:ilvl w:val="0"/>
+                <w:numId w:val="6"/>
+              </w:numPr>
+              <w:spacing w:line="240" w:lineRule="auto"/>
+              <w:ind w:left="170" w:hanging="170"/>
+              <w:jc w:val="center"/>
+              <w:rPr>
+                <w:rFonts w:cs="Times New Roman"/>
+              </w:rPr>
+            </w:pPr>
             <w:r>
               <w:t>1</w:t>
             </w:r>
@@ -2464,6 +3079,14 @@
             <w:vAlign w:val="center"/>
           </w:tcPr>
           <w:p>
+            <w:pPr>
+              <w:pStyle w:val="0TEXTc1"/>
+              <w:spacing w:line="240" w:lineRule="auto"/>
+              <w:ind w:firstLine="0"/>
+              <w:rPr>
+                <w:rFonts w:cs="Times New Roman"/>
+              </w:rPr>
+            </w:pPr>
             <w:r>
               <w:t>Phạm Minh Tú (#)</w:t>
             </w:r>
@@ -2475,6 +3098,15 @@
             <w:vAlign w:val="center"/>
           </w:tcPr>
           <w:p>
+            <w:pPr>
+              <w:pStyle w:val="0TEXTc1"/>
+              <w:spacing w:line="240" w:lineRule="auto"/>
+              <w:ind w:firstLine="0"/>
+              <w:jc w:val="left"/>
+              <w:rPr>
+                <w:rFonts w:cs="Times New Roman"/>
+              </w:rPr>
+            </w:pPr>
             <w:r>
               <w:t>Trưởng nhóm: Phân tích yêu cầu hệ thống, mô hình Use Case, URD/SRS ISO standard và điều phối kỹ thuật.</w:t>
             </w:r>
@@ -2486,6 +3118,15 @@
             <w:vAlign w:val="center"/>
           </w:tcPr>
           <w:p>
+            <w:pPr>
+              <w:pStyle w:val="0TEXTc1"/>
+              <w:spacing w:line="240" w:lineRule="auto"/>
+              <w:ind w:firstLine="0"/>
+              <w:jc w:val="left"/>
+              <w:rPr>
+                <w:rFonts w:cs="Times New Roman"/>
+              </w:rPr>
+            </w:pPr>
             <w:r/>
           </w:p>
         </w:tc>
@@ -2500,6 +3141,19 @@
             <w:vAlign w:val="center"/>
           </w:tcPr>
           <w:p>
+            <w:pPr>
+              <w:pStyle w:val="0TEXTc1"/>
+              <w:numPr>
+                <w:ilvl w:val="0"/>
+                <w:numId w:val="6"/>
+              </w:numPr>
+              <w:spacing w:line="240" w:lineRule="auto"/>
+              <w:ind w:left="170" w:hanging="170"/>
+              <w:jc w:val="center"/>
+              <w:rPr>
+                <w:rFonts w:cs="Times New Roman"/>
+              </w:rPr>
+            </w:pPr>
             <w:r>
               <w:t>2</w:t>
             </w:r>
@@ -2511,6 +3165,15 @@
             <w:vAlign w:val="center"/>
           </w:tcPr>
           <w:p>
+            <w:pPr>
+              <w:pStyle w:val="0TEXTc1"/>
+              <w:spacing w:line="240" w:lineRule="auto"/>
+              <w:ind w:firstLine="0"/>
+              <w:jc w:val="left"/>
+              <w:rPr>
+                <w:rFonts w:cs="Times New Roman"/>
+              </w:rPr>
+            </w:pPr>
             <w:r>
               <w:t>Phạm Văn Huynh</w:t>
             </w:r>
@@ -2522,6 +3185,15 @@
             <w:vAlign w:val="center"/>
           </w:tcPr>
           <w:p>
+            <w:pPr>
+              <w:pStyle w:val="0TEXTc1"/>
+              <w:spacing w:line="240" w:lineRule="auto"/>
+              <w:ind w:firstLine="0"/>
+              <w:jc w:val="left"/>
+              <w:rPr>
+                <w:rFonts w:cs="Times New Roman"/>
+              </w:rPr>
+            </w:pPr>
             <w:r>
               <w:t>Phụ trách khảo sát hiện trạng, phân tích yêu cầu phi chức năng và thiết kế sơ bộ thực thể CSDL.</w:t>
             </w:r>
@@ -2533,6 +3205,15 @@
             <w:vAlign w:val="center"/>
           </w:tcPr>
           <w:p>
+            <w:pPr>
+              <w:pStyle w:val="0TEXTc1"/>
+              <w:spacing w:line="240" w:lineRule="auto"/>
+              <w:ind w:firstLine="0"/>
+              <w:jc w:val="left"/>
+              <w:rPr>
+                <w:rFonts w:cs="Times New Roman"/>
+              </w:rPr>
+            </w:pPr>
             <w:r/>
           </w:p>
         </w:tc>
@@ -2547,6 +3228,19 @@
             <w:vAlign w:val="center"/>
           </w:tcPr>
           <w:p>
+            <w:pPr>
+              <w:pStyle w:val="0TEXTc1"/>
+              <w:numPr>
+                <w:ilvl w:val="0"/>
+                <w:numId w:val="6"/>
+              </w:numPr>
+              <w:spacing w:line="240" w:lineRule="auto"/>
+              <w:ind w:left="170" w:hanging="170"/>
+              <w:jc w:val="center"/>
+              <w:rPr>
+                <w:rFonts w:cs="Times New Roman"/>
+              </w:rPr>
+            </w:pPr>
             <w:r>
               <w:t>3</w:t>
             </w:r>
@@ -2558,6 +3252,15 @@
             <w:vAlign w:val="center"/>
           </w:tcPr>
           <w:p>
+            <w:pPr>
+              <w:pStyle w:val="0TEXTc1"/>
+              <w:spacing w:line="240" w:lineRule="auto"/>
+              <w:ind w:firstLine="0"/>
+              <w:jc w:val="left"/>
+              <w:rPr>
+                <w:rFonts w:cs="Times New Roman"/>
+              </w:rPr>
+            </w:pPr>
             <w:r>
               <w:t>Đàm Đức Đôn</w:t>
             </w:r>
@@ -2569,6 +3272,15 @@
             <w:vAlign w:val="center"/>
           </w:tcPr>
           <w:p>
+            <w:pPr>
+              <w:pStyle w:val="0TEXTc1"/>
+              <w:spacing w:line="240" w:lineRule="auto"/>
+              <w:ind w:firstLine="0"/>
+              <w:jc w:val="left"/>
+              <w:rPr>
+                <w:rFonts w:cs="Times New Roman"/>
+              </w:rPr>
+            </w:pPr>
             <w:r>
               <w:t>Phụ trách xác định phạm vi tích hợp AI, khảo sát mô hình LLM và tổng hợp báo cáo kỹ thuật.</w:t>
             </w:r>
@@ -2580,6 +3292,15 @@
             <w:vAlign w:val="center"/>
           </w:tcPr>
           <w:p>
+            <w:pPr>
+              <w:pStyle w:val="0TEXTc1"/>
+              <w:spacing w:line="240" w:lineRule="auto"/>
+              <w:ind w:firstLine="0"/>
+              <w:jc w:val="left"/>
+              <w:rPr>
+                <w:rFonts w:cs="Times New Roman"/>
+              </w:rPr>
+            </w:pPr>
             <w:r/>
           </w:p>
         </w:tc>
@@ -2622,9 +3343,15 @@
           <w:rFonts w:cs="Times New Roman"/>
         </w:rPr>
       </w:pPr>
-      <w:r>
+      <w:bookmarkStart w:id="3" w:name="_Toc116549837"/>
+      <w:r>
+        <w:rPr>
+          <w:rFonts w:cs="Times New Roman"/>
+        </w:rPr>
+        <w:lastRenderedPageBreak/>
         <w:t>MỞ ĐẦU</w:t>
       </w:r>
+      <w:bookmarkEnd w:id="3"/>
     </w:p>
     <w:p>
       <w:pPr>
@@ -2634,8 +3361,243 @@
           <w:lang w:val="vi-VN"/>
         </w:rPr>
       </w:pPr>
-      <w:r>
-        <w:t>Ngày nay, công nghệ thông tin phát triển đồng nghĩa với việc phát triển các phần mềm ứng dụng nhằm tối ưu hóa năng suất lao động và tự động hóa quy trình quản trị. Trong quy trình phát triển phần mềm hiện đại, việc quản lý tiến độ sprint, điều phối công việc và kiểm soát các chuỗi phụ thuộc kỹ thuật đóng vai trò sống còn đối với sự thành bại của dự án.</w:t>
+      <w:proofErr w:type="spellStart"/>
+      <w:r>
+        <w:rPr>
+          <w:color w:val="FF0000"/>
+        </w:rPr>
+        <w:t>Ngày</w:t>
+      </w:r>
+      <w:proofErr w:type="spellEnd"/>
+      <w:r>
+        <w:rPr>
+          <w:color w:val="FF0000"/>
+        </w:rPr>
+        <w:t xml:space="preserve"> nay, </w:t>
+      </w:r>
+      <w:proofErr w:type="spellStart"/>
+      <w:r>
+        <w:rPr>
+          <w:color w:val="FF0000"/>
+        </w:rPr>
+        <w:t>công</w:t>
+      </w:r>
+      <w:proofErr w:type="spellEnd"/>
+      <w:r>
+        <w:rPr>
+          <w:color w:val="FF0000"/>
+        </w:rPr>
+        <w:t xml:space="preserve"> </w:t>
+      </w:r>
+      <w:proofErr w:type="spellStart"/>
+      <w:r>
+        <w:rPr>
+          <w:color w:val="FF0000"/>
+        </w:rPr>
+        <w:t>nghệ</w:t>
+      </w:r>
+      <w:proofErr w:type="spellEnd"/>
+      <w:r>
+        <w:rPr>
+          <w:color w:val="FF0000"/>
+        </w:rPr>
+        <w:t xml:space="preserve"> </w:t>
+      </w:r>
+      <w:proofErr w:type="spellStart"/>
+      <w:r>
+        <w:rPr>
+          <w:color w:val="FF0000"/>
+        </w:rPr>
+        <w:t>thông</w:t>
+      </w:r>
+      <w:proofErr w:type="spellEnd"/>
+      <w:r>
+        <w:rPr>
+          <w:color w:val="FF0000"/>
+        </w:rPr>
+        <w:t xml:space="preserve"> tin </w:t>
+      </w:r>
+      <w:proofErr w:type="spellStart"/>
+      <w:r>
+        <w:rPr>
+          <w:color w:val="FF0000"/>
+        </w:rPr>
+        <w:t>phát</w:t>
+      </w:r>
+      <w:proofErr w:type="spellEnd"/>
+      <w:r>
+        <w:rPr>
+          <w:color w:val="FF0000"/>
+        </w:rPr>
+        <w:t xml:space="preserve"> </w:t>
+      </w:r>
+      <w:proofErr w:type="spellStart"/>
+      <w:r>
+        <w:rPr>
+          <w:color w:val="FF0000"/>
+        </w:rPr>
+        <w:t>triển</w:t>
+      </w:r>
+      <w:proofErr w:type="spellEnd"/>
+      <w:r>
+        <w:rPr>
+          <w:color w:val="FF0000"/>
+        </w:rPr>
+        <w:t xml:space="preserve"> </w:t>
+      </w:r>
+      <w:proofErr w:type="spellStart"/>
+      <w:r>
+        <w:rPr>
+          <w:color w:val="FF0000"/>
+        </w:rPr>
+        <w:t>đồng</w:t>
+      </w:r>
+      <w:proofErr w:type="spellEnd"/>
+      <w:r>
+        <w:rPr>
+          <w:color w:val="FF0000"/>
+        </w:rPr>
+        <w:t xml:space="preserve"> </w:t>
+      </w:r>
+      <w:proofErr w:type="spellStart"/>
+      <w:r>
+        <w:rPr>
+          <w:color w:val="FF0000"/>
+        </w:rPr>
+        <w:t>nghĩa</w:t>
+      </w:r>
+      <w:proofErr w:type="spellEnd"/>
+      <w:r>
+        <w:rPr>
+          <w:color w:val="FF0000"/>
+        </w:rPr>
+        <w:t xml:space="preserve"> </w:t>
+      </w:r>
+      <w:proofErr w:type="spellStart"/>
+      <w:r>
+        <w:rPr>
+          <w:color w:val="FF0000"/>
+        </w:rPr>
+        <w:t>với</w:t>
+      </w:r>
+      <w:proofErr w:type="spellEnd"/>
+      <w:r>
+        <w:rPr>
+          <w:color w:val="FF0000"/>
+        </w:rPr>
+        <w:t xml:space="preserve"> </w:t>
+      </w:r>
+      <w:proofErr w:type="spellStart"/>
+      <w:r>
+        <w:rPr>
+          <w:color w:val="FF0000"/>
+        </w:rPr>
+        <w:t>việc</w:t>
+      </w:r>
+      <w:proofErr w:type="spellEnd"/>
+      <w:r>
+        <w:rPr>
+          <w:color w:val="FF0000"/>
+        </w:rPr>
+        <w:t xml:space="preserve"> </w:t>
+      </w:r>
+      <w:proofErr w:type="spellStart"/>
+      <w:r>
+        <w:rPr>
+          <w:color w:val="FF0000"/>
+        </w:rPr>
+        <w:t>phát</w:t>
+      </w:r>
+      <w:proofErr w:type="spellEnd"/>
+      <w:r>
+        <w:rPr>
+          <w:color w:val="FF0000"/>
+        </w:rPr>
+        <w:t xml:space="preserve"> </w:t>
+      </w:r>
+      <w:proofErr w:type="spellStart"/>
+      <w:r>
+        <w:rPr>
+          <w:color w:val="FF0000"/>
+        </w:rPr>
+        <w:t>triển</w:t>
+      </w:r>
+      <w:proofErr w:type="spellEnd"/>
+      <w:r>
+        <w:rPr>
+          <w:color w:val="FF0000"/>
+        </w:rPr>
+        <w:t xml:space="preserve"> </w:t>
+      </w:r>
+      <w:proofErr w:type="spellStart"/>
+      <w:r>
+        <w:rPr>
+          <w:color w:val="FF0000"/>
+        </w:rPr>
+        <w:t>các</w:t>
+      </w:r>
+      <w:proofErr w:type="spellEnd"/>
+      <w:r>
+        <w:rPr>
+          <w:color w:val="FF0000"/>
+        </w:rPr>
+        <w:t xml:space="preserve"> </w:t>
+      </w:r>
+      <w:proofErr w:type="spellStart"/>
+      <w:r>
+        <w:rPr>
+          <w:color w:val="FF0000"/>
+        </w:rPr>
+        <w:t>phần</w:t>
+      </w:r>
+      <w:proofErr w:type="spellEnd"/>
+      <w:r>
+        <w:rPr>
+          <w:color w:val="FF0000"/>
+        </w:rPr>
+        <w:t xml:space="preserve"> </w:t>
+      </w:r>
+      <w:proofErr w:type="spellStart"/>
+      <w:r>
+        <w:rPr>
+          <w:color w:val="FF0000"/>
+        </w:rPr>
+        <w:t>mềm</w:t>
+      </w:r>
+      <w:proofErr w:type="spellEnd"/>
+      <w:r>
+        <w:rPr>
+          <w:color w:val="FF0000"/>
+        </w:rPr>
+        <w:t xml:space="preserve"> </w:t>
+      </w:r>
+      <w:proofErr w:type="spellStart"/>
+      <w:r>
+        <w:rPr>
+          <w:color w:val="FF0000"/>
+        </w:rPr>
+        <w:t>ứng</w:t>
+      </w:r>
+      <w:proofErr w:type="spellEnd"/>
+      <w:r>
+        <w:rPr>
+          <w:color w:val="FF0000"/>
+        </w:rPr>
+        <w:t xml:space="preserve"> </w:t>
+      </w:r>
+      <w:proofErr w:type="spellStart"/>
+      <w:r>
+        <w:rPr>
+          <w:color w:val="FF0000"/>
+        </w:rPr>
+        <w:t>dụng</w:t>
+      </w:r>
+      <w:proofErr w:type="spellEnd"/>
+      <w:r>
+        <w:rPr>
+          <w:color w:val="FF0000"/>
+        </w:rPr>
+        <w:t>.</w:t>
       </w:r>
     </w:p>
     <w:p>
@@ -2643,7 +3605,7 @@
         <w:pStyle w:val="0TEXTc1"/>
       </w:pPr>
       <w:r>
-        <w:t>Hệ thống quản lý dự án Koshi (輿) được thiết kế và xây dựng nhằm giải quyết các bài toán về hiệu năng và tự động hóa quản lý. Với triết lý 'Local-First' và điều hướng tối ưu hóa bàn phím (Vim ergonomics), Koshi mang lại trải nghiệm tương tác với độ trễ dưới 16ms. Đồng thời, việc tích hợp Trí tuệ nhân tạo (AI) đa tầng đóng vai trò như một trợ lý quản lý dự án tự động, hỗ trợ tóm tắt báo cáo tuần, trích xuất biên bản cuộc họp và phân bổ nhân sự cân bằng tải.</w:t>
+        <w:t>…</w:t>
       </w:r>
     </w:p>
     <w:p>
@@ -2654,7 +3616,28 @@
         </w:rPr>
       </w:pPr>
       <w:r>
-        <w:t>Nhóm 04 chúng em xin chân thành cảm ơn giảng viên ThS. Nguyễn Thị Tuyển đã tận tình hướng dẫn để nhóm hoàn thành tốt Bài kiểm tra 1 (KT1) này!</w:t>
+        <w:rPr>
+          <w:lang w:val="vi-VN"/>
+        </w:rPr>
+        <w:t>Em x</w:t>
+      </w:r>
+      <w:r>
+        <w:rPr>
+          <w:lang w:val="vi-VN"/>
+        </w:rPr>
+        <w:t xml:space="preserve">in </w:t>
+      </w:r>
+      <w:r>
+        <w:rPr>
+          <w:lang w:val="vi-VN"/>
+        </w:rPr>
+        <w:t>chân thành cảm ơn</w:t>
+      </w:r>
+      <w:r>
+        <w:rPr>
+          <w:lang w:val="vi-VN"/>
+        </w:rPr>
+        <w:t>!</w:t>
       </w:r>
     </w:p>
     <w:p>
@@ -4689,8 +5672,28 @@
           <w:rFonts w:cs="Times New Roman"/>
         </w:rPr>
       </w:pPr>
-      <w:r>
-        <w:t>CHƯƠNG 1. PHÂN TÍCH YÊU CẦU HỆ THỐNG</w:t>
+      <w:bookmarkStart w:id="4" w:name="_Toc116549838"/>
+      <w:r>
+        <w:rPr>
+          <w:rFonts w:cs="Times New Roman"/>
+        </w:rPr>
+        <w:lastRenderedPageBreak/>
+        <w:t>CHƯƠNG 1.</w:t>
+      </w:r>
+      <w:r>
+        <w:rPr>
+          <w:rFonts w:cs="Times New Roman"/>
+          <w:spacing w:val="100"/>
+        </w:rPr>
+        <w:t xml:space="preserve"> </w:t>
+      </w:r>
+      <w:bookmarkEnd w:id="4"/>
+      <w:r>
+        <w:rPr>
+          <w:rFonts w:cs="Times New Roman"/>
+          <w:color w:val="FF0000"/>
+        </w:rPr>
+        <w:t>PHÂN TÍCH YÊU CẦU HỆ THỐNG</w:t>
       </w:r>
     </w:p>
     <w:p>
@@ -4789,13 +5792,45 @@
           <w:color w:val="FF0000"/>
         </w:rPr>
       </w:pPr>
-      <w:r/>
+      <w:proofErr w:type="spellStart"/>
+      <w:r>
+        <w:rPr>
+          <w:color w:val="FF0000"/>
+        </w:rPr>
+        <w:t>Thuật</w:t>
+      </w:r>
+      <w:proofErr w:type="spellEnd"/>
+      <w:r>
+        <w:rPr>
+          <w:color w:val="FF0000"/>
+        </w:rPr>
+        <w:t xml:space="preserve"> </w:t>
+      </w:r>
+      <w:proofErr w:type="spellStart"/>
+      <w:r>
+        <w:rPr>
+          <w:color w:val="FF0000"/>
+        </w:rPr>
+        <w:t>ngữ</w:t>
+      </w:r>
+      <w:proofErr w:type="spellEnd"/>
+      <w:r>
+        <w:rPr>
+          <w:color w:val="FF0000"/>
+        </w:rPr>
+        <w:t xml:space="preserve"> </w:t>
+      </w:r>
+      <w:r>
+        <w:rPr>
+          <w:color w:val="FF0000"/>
+        </w:rPr>
+        <w:t>…</w:t>
+      </w:r>
     </w:p>
     <w:p>
       <w:pPr>
         <w:pStyle w:val="0TEXTc1"/>
       </w:pPr>
-      <w:r/>
     </w:p>
     <w:p>
       <w:pPr>
@@ -4807,7 +5842,16 @@
           <w:szCs w:val="32"/>
         </w:rPr>
       </w:pPr>
-      <w:r/>
+      <w:r>
+        <w:rPr>
+          <w:rFonts w:ascii="Times New Roman" w:hAnsi="Times New Roman" w:cs="Times New Roman"/>
+          <w:b/>
+          <w:bCs/>
+          <w:sz w:val="32"/>
+          <w:szCs w:val="32"/>
+        </w:rPr>
+        <w:br w:type="page"/>
+      </w:r>
     </w:p>
     <w:p>
       <w:pPr>
@@ -4818,8 +5862,29 @@
           <w:szCs w:val="28"/>
         </w:rPr>
       </w:pPr>
-      <w:r>
-        <w:t>CHƯƠNG 2. THIẾT KẾ HỆ THỐNG (BÀI KIỂM TRA 2)</w:t>
+      <w:bookmarkStart w:id="6" w:name="_Toc116549840"/>
+      <w:r>
+        <w:lastRenderedPageBreak/>
+        <w:t xml:space="preserve">CHƯƠNG </w:t>
+      </w:r>
+      <w:r>
+        <w:t>2.</w:t>
+      </w:r>
+      <w:r>
+        <w:rPr>
+          <w:spacing w:val="100"/>
+        </w:rPr>
+        <w:t xml:space="preserve"> </w:t>
+      </w:r>
+      <w:bookmarkEnd w:id="6"/>
+      <w:r>
+        <w:rPr>
+          <w:rFonts w:cs="Times New Roman"/>
+          <w:color w:val="FF0000"/>
+          <w:sz w:val="28"/>
+          <w:szCs w:val="28"/>
+        </w:rPr>
+        <w:t>THIẾT KẾ HỆ THỐNG</w:t>
       </w:r>
     </w:p>
     <w:p>
@@ -4829,9 +5894,34 @@
           <w:color w:val="FF0000"/>
         </w:rPr>
       </w:pPr>
-      <w:r>
-        <w:t>[Nội dung thiết kế kiến trúc và CSDL sẽ được hoàn thiện trong Bài kiểm tra 2 - KT2]</w:t>
-      </w:r>
+      <w:bookmarkStart w:id="7" w:name="_Toc116549841"/>
+      <w:r>
+        <w:rPr>
+          <w:color w:val="FF0000"/>
+        </w:rPr>
+        <w:t>2.</w:t>
+      </w:r>
+      <w:r>
+        <w:rPr>
+          <w:color w:val="FF0000"/>
+        </w:rPr>
+        <w:t xml:space="preserve">1. </w:t>
+      </w:r>
+      <w:proofErr w:type="spellStart"/>
+      <w:r>
+        <w:rPr>
+          <w:color w:val="FF0000"/>
+        </w:rPr>
+        <w:t>Nội</w:t>
+      </w:r>
+      <w:proofErr w:type="spellEnd"/>
+      <w:r>
+        <w:rPr>
+          <w:color w:val="FF0000"/>
+        </w:rPr>
+        <w:t xml:space="preserve"> dung</w:t>
+      </w:r>
+      <w:bookmarkEnd w:id="7"/>
     </w:p>
     <w:p>
       <w:pPr>
@@ -4840,7 +5930,68 @@
           <w:color w:val="FF0000"/>
         </w:rPr>
       </w:pPr>
-      <w:r/>
+      <w:proofErr w:type="spellStart"/>
+      <w:r>
+        <w:rPr>
+          <w:color w:val="FF0000"/>
+        </w:rPr>
+        <w:t>khai</w:t>
+      </w:r>
+      <w:proofErr w:type="spellEnd"/>
+      <w:r>
+        <w:rPr>
+          <w:color w:val="FF0000"/>
+        </w:rPr>
+        <w:t xml:space="preserve"> </w:t>
+      </w:r>
+      <w:proofErr w:type="spellStart"/>
+      <w:r>
+        <w:rPr>
+          <w:color w:val="FF0000"/>
+        </w:rPr>
+        <w:t>phá</w:t>
+      </w:r>
+      <w:proofErr w:type="spellEnd"/>
+      <w:r>
+        <w:rPr>
+          <w:color w:val="FF0000"/>
+        </w:rPr>
+        <w:t xml:space="preserve"> </w:t>
+      </w:r>
+      <w:proofErr w:type="spellStart"/>
+      <w:r>
+        <w:rPr>
+          <w:color w:val="FF0000"/>
+        </w:rPr>
+        <w:t>dữ</w:t>
+      </w:r>
+      <w:proofErr w:type="spellEnd"/>
+      <w:r>
+        <w:rPr>
+          <w:color w:val="FF0000"/>
+        </w:rPr>
+        <w:t xml:space="preserve"> </w:t>
+      </w:r>
+      <w:proofErr w:type="spellStart"/>
+      <w:r>
+        <w:rPr>
+          <w:color w:val="FF0000"/>
+        </w:rPr>
+        <w:t>liệu</w:t>
+      </w:r>
+      <w:proofErr w:type="spellEnd"/>
+      <w:r>
+        <w:rPr>
+          <w:color w:val="FF0000"/>
+        </w:rPr>
+        <w:t xml:space="preserve"> </w:t>
+      </w:r>
+      <w:r>
+        <w:rPr>
+          <w:color w:val="FF0000"/>
+        </w:rPr>
+        <w:t>…</w:t>
+      </w:r>
     </w:p>
     <w:p>
       <w:pPr>
@@ -4850,7 +6001,14 @@
           <w:szCs w:val="28"/>
         </w:rPr>
       </w:pPr>
-      <w:r/>
+      <w:r>
+        <w:rPr>
+          <w:rFonts w:ascii="Times New Roman" w:hAnsi="Times New Roman" w:cs="Times New Roman"/>
+          <w:sz w:val="28"/>
+          <w:szCs w:val="28"/>
+        </w:rPr>
+        <w:br w:type="page"/>
+      </w:r>
     </w:p>
     <w:p>
       <w:pPr>
@@ -4861,9 +6019,30 @@
           <w:szCs w:val="28"/>
         </w:rPr>
       </w:pPr>
-      <w:r>
-        <w:t>CHƯƠNG 3. TÍCH HỢP AI VÀ ĐÁNH GIÁ (BÀI KIỂM TRA 3)</w:t>
-      </w:r>
+      <w:bookmarkStart w:id="8" w:name="_Toc116549842"/>
+      <w:r>
+        <w:lastRenderedPageBreak/>
+        <w:t xml:space="preserve">CHƯƠNG </w:t>
+      </w:r>
+      <w:r>
+        <w:t>3.</w:t>
+      </w:r>
+      <w:r>
+        <w:rPr>
+          <w:spacing w:val="100"/>
+        </w:rPr>
+        <w:t xml:space="preserve"> </w:t>
+      </w:r>
+      <w:r>
+        <w:rPr>
+          <w:rFonts w:cs="Times New Roman"/>
+          <w:color w:val="FF0000"/>
+          <w:sz w:val="28"/>
+          <w:szCs w:val="28"/>
+        </w:rPr>
+        <w:t>KẾT QUẢ VÀ ĐÁNH GIÁ HỆ THỐNG</w:t>
+      </w:r>
+      <w:bookmarkEnd w:id="8"/>
     </w:p>
     <w:p>
       <w:pPr>
@@ -4872,9 +6051,64 @@
           <w:color w:val="FF0000"/>
         </w:rPr>
       </w:pPr>
-      <w:r>
-        <w:t>[Nội dung kết quả thử nghiệm và đánh giá AI sẽ được hoàn thiện trong Bài kiểm tra 3 - KT3]</w:t>
-      </w:r>
+      <w:bookmarkStart w:id="9" w:name="_Toc116549843"/>
+      <w:r>
+        <w:rPr>
+          <w:color w:val="FF0000"/>
+        </w:rPr>
+        <w:t xml:space="preserve">3.1. </w:t>
+      </w:r>
+      <w:proofErr w:type="spellStart"/>
+      <w:r>
+        <w:rPr>
+          <w:color w:val="FF0000"/>
+        </w:rPr>
+        <w:t>Mô</w:t>
+      </w:r>
+      <w:proofErr w:type="spellEnd"/>
+      <w:r>
+        <w:rPr>
+          <w:color w:val="FF0000"/>
+        </w:rPr>
+        <w:t xml:space="preserve"> </w:t>
+      </w:r>
+      <w:proofErr w:type="spellStart"/>
+      <w:r>
+        <w:rPr>
+          <w:color w:val="FF0000"/>
+        </w:rPr>
+        <w:t>tả</w:t>
+      </w:r>
+      <w:proofErr w:type="spellEnd"/>
+      <w:r>
+        <w:rPr>
+          <w:color w:val="FF0000"/>
+        </w:rPr>
+        <w:t xml:space="preserve"> </w:t>
+      </w:r>
+      <w:proofErr w:type="spellStart"/>
+      <w:r>
+        <w:rPr>
+          <w:color w:val="FF0000"/>
+        </w:rPr>
+        <w:t>bài</w:t>
+      </w:r>
+      <w:proofErr w:type="spellEnd"/>
+      <w:r>
+        <w:rPr>
+          <w:color w:val="FF0000"/>
+        </w:rPr>
+        <w:t xml:space="preserve"> </w:t>
+      </w:r>
+      <w:proofErr w:type="spellStart"/>
+      <w:r>
+        <w:rPr>
+          <w:color w:val="FF0000"/>
+        </w:rPr>
+        <w:t>toán</w:t>
+      </w:r>
+      <w:bookmarkEnd w:id="9"/>
+      <w:proofErr w:type="spellEnd"/>
     </w:p>
     <w:p>
       <w:pPr>
@@ -4884,70 +6118,167 @@
           <w:lang w:val="vi-VN"/>
         </w:rPr>
       </w:pPr>
-      <w:r/>
+      <w:r>
+        <w:rPr>
+          <w:color w:val="FF0000"/>
+        </w:rPr>
+        <w:t xml:space="preserve">Trong </w:t>
+      </w:r>
+      <w:proofErr w:type="spellStart"/>
+      <w:r>
+        <w:rPr>
+          <w:color w:val="FF0000"/>
+        </w:rPr>
+        <w:t>bài</w:t>
+      </w:r>
+      <w:proofErr w:type="spellEnd"/>
+      <w:r>
+        <w:rPr>
+          <w:color w:val="FF0000"/>
+        </w:rPr>
+        <w:t xml:space="preserve"> </w:t>
+      </w:r>
+      <w:proofErr w:type="spellStart"/>
+      <w:r>
+        <w:rPr>
+          <w:color w:val="FF0000"/>
+        </w:rPr>
+        <w:t>toán</w:t>
+      </w:r>
+      <w:proofErr w:type="spellEnd"/>
+      <w:r>
+        <w:rPr>
+          <w:color w:val="FF0000"/>
+        </w:rPr>
+        <w:t xml:space="preserve"> </w:t>
+      </w:r>
+      <w:r>
+        <w:rPr>
+          <w:color w:val="FF0000"/>
+        </w:rPr>
+        <w:t>…</w:t>
+      </w:r>
+    </w:p>
+    <w:p/>
+    <w:p/>
+    <w:p/>
+    <w:p>
+      <w:r>
+        <w:br w:type="page"/>
+      </w:r>
     </w:p>
     <w:p>
-      <w:r/>
+      <w:pPr>
+        <w:pStyle w:val="1Chapterc5"/>
+      </w:pPr>
+      <w:bookmarkStart w:id="10" w:name="_Toc116549844"/>
+      <w:r>
+        <w:lastRenderedPageBreak/>
+        <w:t>KẾT LUẬN</w:t>
+      </w:r>
+      <w:bookmarkEnd w:id="10"/>
     </w:p>
     <w:p>
-      <w:r/>
+      <w:pPr>
+        <w:pStyle w:val="0TEXTc1"/>
+      </w:pPr>
+      <w:r>
+        <w:rPr>
+          <w:lang w:val="vi-VN"/>
+        </w:rPr>
+        <w:t>Sau</w:t>
+      </w:r>
+      <w:r>
+        <w:t xml:space="preserve"> </w:t>
+      </w:r>
+      <w:proofErr w:type="spellStart"/>
+      <w:r>
+        <w:t>thời</w:t>
+      </w:r>
+      <w:proofErr w:type="spellEnd"/>
+      <w:r>
+        <w:t xml:space="preserve"> </w:t>
+      </w:r>
+      <w:proofErr w:type="spellStart"/>
+      <w:r>
+        <w:t>gian</w:t>
+      </w:r>
+      <w:proofErr w:type="spellEnd"/>
+      <w:r>
+        <w:t xml:space="preserve"> </w:t>
+      </w:r>
+      <w:proofErr w:type="spellStart"/>
+      <w:r>
+        <w:t>nghiên</w:t>
+      </w:r>
+      <w:proofErr w:type="spellEnd"/>
+      <w:r>
+        <w:t xml:space="preserve"> </w:t>
+      </w:r>
+      <w:proofErr w:type="spellStart"/>
+      <w:r>
+        <w:t>cứu</w:t>
+      </w:r>
+      <w:proofErr w:type="spellEnd"/>
+      <w:r>
+        <w:t xml:space="preserve"> </w:t>
+      </w:r>
+      <w:proofErr w:type="spellStart"/>
+      <w:r>
+        <w:t>đề</w:t>
+      </w:r>
+      <w:proofErr w:type="spellEnd"/>
+      <w:r>
+        <w:t xml:space="preserve"> </w:t>
+      </w:r>
+      <w:proofErr w:type="spellStart"/>
+      <w:r>
+        <w:t>tài</w:t>
+      </w:r>
+      <w:proofErr w:type="spellEnd"/>
+      <w:r>
+        <w:t xml:space="preserve">, </w:t>
+      </w:r>
+      <w:r>
+        <w:t>…</w:t>
+      </w:r>
     </w:p>
     <w:p>
-      <w:r/>
+      <w:pPr>
+        <w:pStyle w:val="0TEXTc1"/>
+      </w:pPr>
     </w:p>
     <w:p>
-      <w:r/>
+      <w:pPr>
+        <w:pStyle w:val="0TEXTc1"/>
+      </w:pPr>
     </w:p>
     <w:p>
       <w:pPr>
-        <w:pStyle w:val="1Chapterc5"/>
-      </w:pPr>
-      <w:r>
-        <w:t>KẾT LUẬN</w:t>
-      </w:r>
+        <w:pStyle w:val="0TEXTc1"/>
+      </w:pPr>
     </w:p>
     <w:p>
       <w:pPr>
-        <w:pStyle w:val="0TEXTc1"/>
-      </w:pPr>
-      <w:r>
-        <w:t>[Kết luận toàn diện dự án sẽ được tổng kết sau khi hoàn thành các giai đoạn thử nghiệm KT2/KT3]</w:t>
+        <w:rPr>
+          <w:rFonts w:ascii="Times New Roman" w:hAnsi="Times New Roman"/>
+          <w:sz w:val="26"/>
+        </w:rPr>
+      </w:pPr>
+      <w:r>
+        <w:br w:type="page"/>
       </w:r>
     </w:p>
     <w:p>
       <w:pPr>
-        <w:pStyle w:val="0TEXTc1"/>
-      </w:pPr>
-      <w:r/>
-    </w:p>
-    <w:p>
-      <w:pPr>
-        <w:pStyle w:val="0TEXTc1"/>
-      </w:pPr>
-      <w:r/>
-    </w:p>
-    <w:p>
-      <w:pPr>
-        <w:pStyle w:val="0TEXTc1"/>
-      </w:pPr>
-      <w:r/>
-    </w:p>
-    <w:p>
-      <w:pPr>
-        <w:rPr>
-          <w:rFonts w:ascii="Times New Roman" w:hAnsi="Times New Roman"/>
-          <w:sz w:val="26"/>
-        </w:rPr>
-      </w:pPr>
-      <w:r/>
-    </w:p>
-    <w:p>
-      <w:pPr>
         <w:pStyle w:val="1Chapterc5"/>
       </w:pPr>
-      <w:r>
+      <w:bookmarkStart w:id="11" w:name="_Toc116549845"/>
+      <w:r>
+        <w:lastRenderedPageBreak/>
         <w:t>TÀI LIỆU THAM KHẢO</w:t>
       </w:r>
+      <w:bookmarkEnd w:id="11"/>
     </w:p>
     <w:p>
       <w:pPr>
@@ -4965,7 +6296,11 @@
         </w:rPr>
       </w:pPr>
       <w:r>
-        <w:t>[1] ISO/IEC/IEEE 29148:2018, 'Systems and software engineering — Life cycle processes — Requirements engineering', IEEE Standards Association, 2018.</w:t>
+        <w:rPr>
+          <w:color w:val="FF0000"/>
+          <w:lang w:val="vi-VN"/>
+        </w:rPr>
+        <w:t>Đỗ Phúc, Giáo trình khai phá dữ liệu (Data mining), NXB Đại học Quốc gia TP. Hồ Chí Minh, 2017.</w:t>
       </w:r>
     </w:p>
     <w:p>
@@ -4984,7 +6319,17 @@
         </w:rPr>
       </w:pPr>
       <w:r>
-        <w:t>[2] Khoa Công nghệ Thông tin - Trường Đại học CNTT &amp; Truyền thông Thái Nguyên (ICTU), 'Đề cương chi tiết và Quy chuẩn Đánh giá Dự án Học phần Ứng dụng Trí tuệ Nhân tạo', Thái Nguyên, 2026.</w:t>
+        <w:rPr>
+          <w:color w:val="FF0000"/>
+          <w:lang w:val="vi-VN"/>
+        </w:rPr>
+        <w:t>Nguyễn Hà Nam, Nguyễn Trí Thành, Hà Quang Thụy, Giáo trình khai phá dữ liệu, NXB Đại học Quốc gia Hà Nội, 2013</w:t>
+      </w:r>
+      <w:r>
+        <w:rPr>
+          <w:color w:val="FF0000"/>
+        </w:rPr>
+        <w:t>.</w:t>
       </w:r>
     </w:p>
     <w:p>
@@ -5003,7 +6348,98 @@
         </w:rPr>
       </w:pPr>
       <w:r>
-        <w:t>[3] Tiangolo, S., 'FastAPI Framework Documentation and Architecture Guidelines', Online: https://fastapi.tiangolo.com/, 2026.</w:t>
+        <w:rPr>
+          <w:color w:val="FF0000"/>
+        </w:rPr>
+        <w:t>Orange Data Mining</w:t>
+      </w:r>
+      <w:r>
+        <w:rPr>
+          <w:color w:val="FF0000"/>
+        </w:rPr>
+        <w:t xml:space="preserve">, </w:t>
+      </w:r>
+      <w:proofErr w:type="gramStart"/>
+      <w:r>
+        <w:rPr>
+          <w:color w:val="FF0000"/>
+        </w:rPr>
+        <w:t>Online</w:t>
+      </w:r>
+      <w:proofErr w:type="gramEnd"/>
+      <w:r>
+        <w:rPr>
+          <w:color w:val="FF0000"/>
+        </w:rPr>
+        <w:t xml:space="preserve">: </w:t>
+      </w:r>
+      <w:r>
+        <w:rPr>
+          <w:color w:val="FF0000"/>
+        </w:rPr>
+        <w:t>https://orangedatamining.com/download/</w:t>
+      </w:r>
+      <w:r>
+        <w:rPr>
+          <w:color w:val="FF0000"/>
+          <w:lang w:val="vi-VN"/>
+        </w:rPr>
+        <w:t xml:space="preserve"> </w:t>
+      </w:r>
+      <w:r>
+        <w:rPr>
+          <w:color w:val="FF0000"/>
+        </w:rPr>
+        <w:t xml:space="preserve">#windows, </w:t>
+      </w:r>
+      <w:proofErr w:type="spellStart"/>
+      <w:r>
+        <w:rPr>
+          <w:color w:val="FF0000"/>
+        </w:rPr>
+        <w:t>Truy</w:t>
+      </w:r>
+      <w:proofErr w:type="spellEnd"/>
+      <w:r>
+        <w:rPr>
+          <w:color w:val="FF0000"/>
+        </w:rPr>
+        <w:t xml:space="preserve"> </w:t>
+      </w:r>
+      <w:proofErr w:type="spellStart"/>
+      <w:r>
+        <w:rPr>
+          <w:color w:val="FF0000"/>
+        </w:rPr>
+        <w:t>cập</w:t>
+      </w:r>
+      <w:proofErr w:type="spellEnd"/>
+      <w:r>
+        <w:rPr>
+          <w:color w:val="FF0000"/>
+        </w:rPr>
+        <w:t xml:space="preserve"> </w:t>
+      </w:r>
+      <w:proofErr w:type="spellStart"/>
+      <w:r>
+        <w:rPr>
+          <w:color w:val="FF0000"/>
+        </w:rPr>
+        <w:t>ngày</w:t>
+      </w:r>
+      <w:proofErr w:type="spellEnd"/>
+      <w:r>
+        <w:rPr>
+          <w:color w:val="FF0000"/>
+        </w:rPr>
+        <w:t xml:space="preserve"> 15/08/2021</w:t>
+      </w:r>
+      <w:r>
+        <w:rPr>
+          <w:color w:val="FF0000"/>
+          <w:lang w:val="vi-VN"/>
+        </w:rPr>
+        <w:t>.</w:t>
       </w:r>
     </w:p>
     <w:p>
@@ -5022,7 +6458,109 @@
         </w:rPr>
       </w:pPr>
       <w:r>
-        <w:t>[4] You, E. et al., 'Vue 3 Composition API &amp; Pinia State Architecture Guide', Online: https://vuejs.org/, 2026.</w:t>
+        <w:rPr>
+          <w:color w:val="FF0000"/>
+        </w:rPr>
+        <w:t xml:space="preserve">Heart disease </w:t>
+      </w:r>
+      <w:r>
+        <w:rPr>
+          <w:color w:val="FF0000"/>
+        </w:rPr>
+        <w:t>prediction</w:t>
+      </w:r>
+      <w:r>
+        <w:rPr>
+          <w:color w:val="FF0000"/>
+        </w:rPr>
+        <w:t>;</w:t>
+      </w:r>
+      <w:r>
+        <w:rPr>
+          <w:color w:val="FF0000"/>
+        </w:rPr>
+        <w:t xml:space="preserve"> </w:t>
+      </w:r>
+      <w:r>
+        <w:rPr>
+          <w:color w:val="FF0000"/>
+        </w:rPr>
+        <w:t xml:space="preserve">Online: </w:t>
+      </w:r>
+      <w:r>
+        <w:rPr>
+          <w:color w:val="FF0000"/>
+        </w:rPr>
+        <w:t>https://github.com/chayandatta/</w:t>
+      </w:r>
+      <w:r>
+        <w:rPr>
+          <w:color w:val="FF0000"/>
+        </w:rPr>
+        <w:t xml:space="preserve"> </w:t>
+      </w:r>
+      <w:proofErr w:type="spellStart"/>
+      <w:r>
+        <w:rPr>
+          <w:color w:val="FF0000"/>
+        </w:rPr>
+        <w:t>Heart_disease_prediction</w:t>
+      </w:r>
+      <w:proofErr w:type="spellEnd"/>
+      <w:r>
+        <w:rPr>
+          <w:color w:val="FF0000"/>
+        </w:rPr>
+        <w:t xml:space="preserve">; </w:t>
+      </w:r>
+      <w:proofErr w:type="spellStart"/>
+      <w:r>
+        <w:rPr>
+          <w:color w:val="FF0000"/>
+        </w:rPr>
+        <w:t>Truy</w:t>
+      </w:r>
+      <w:proofErr w:type="spellEnd"/>
+      <w:r>
+        <w:rPr>
+          <w:color w:val="FF0000"/>
+        </w:rPr>
+        <w:t xml:space="preserve"> </w:t>
+      </w:r>
+      <w:proofErr w:type="spellStart"/>
+      <w:r>
+        <w:rPr>
+          <w:color w:val="FF0000"/>
+        </w:rPr>
+        <w:t>cập</w:t>
+      </w:r>
+      <w:proofErr w:type="spellEnd"/>
+      <w:r>
+        <w:rPr>
+          <w:color w:val="FF0000"/>
+        </w:rPr>
+        <w:t xml:space="preserve"> </w:t>
+      </w:r>
+      <w:proofErr w:type="spellStart"/>
+      <w:r>
+        <w:rPr>
+          <w:color w:val="FF0000"/>
+        </w:rPr>
+        <w:t>ngày</w:t>
+      </w:r>
+      <w:proofErr w:type="spellEnd"/>
+      <w:r>
+        <w:rPr>
+          <w:color w:val="FF0000"/>
+        </w:rPr>
+        <w:t xml:space="preserve"> 15/08/2021</w:t>
+      </w:r>
+      <w:r>
+        <w:rPr>
+          <w:color w:val="FF0000"/>
+          <w:lang w:val="vi-VN"/>
+        </w:rPr>
+        <w:t>.</w:t>
       </w:r>
     </w:p>
     <w:p>
@@ -5040,8 +6578,175 @@
           <w:color w:val="FF0000"/>
         </w:rPr>
       </w:pPr>
-      <w:r>
-        <w:t>[5] Google Cloud AI &amp; DeepMind, 'Gemini API Technical Guidelines and Prompt Engineering Matrix', Online: https://ai.google.dev/, 2026.</w:t>
+      <w:proofErr w:type="spellStart"/>
+      <w:r>
+        <w:rPr>
+          <w:color w:val="FF0000"/>
+        </w:rPr>
+        <w:t>Cách</w:t>
+      </w:r>
+      <w:proofErr w:type="spellEnd"/>
+      <w:r>
+        <w:rPr>
+          <w:color w:val="FF0000"/>
+        </w:rPr>
+        <w:t xml:space="preserve"> </w:t>
+      </w:r>
+      <w:proofErr w:type="spellStart"/>
+      <w:r>
+        <w:rPr>
+          <w:color w:val="FF0000"/>
+        </w:rPr>
+        <w:t>đổi</w:t>
+      </w:r>
+      <w:proofErr w:type="spellEnd"/>
+      <w:r>
+        <w:rPr>
+          <w:color w:val="FF0000"/>
+        </w:rPr>
+        <w:t xml:space="preserve"> mmol/l sang mg/dl </w:t>
+      </w:r>
+      <w:proofErr w:type="spellStart"/>
+      <w:r>
+        <w:rPr>
+          <w:color w:val="FF0000"/>
+        </w:rPr>
+        <w:t>và</w:t>
+      </w:r>
+      <w:proofErr w:type="spellEnd"/>
+      <w:r>
+        <w:rPr>
+          <w:color w:val="FF0000"/>
+        </w:rPr>
+        <w:t xml:space="preserve"> </w:t>
+      </w:r>
+      <w:proofErr w:type="spellStart"/>
+      <w:r>
+        <w:rPr>
+          <w:color w:val="FF0000"/>
+        </w:rPr>
+        <w:t>ngược</w:t>
+      </w:r>
+      <w:proofErr w:type="spellEnd"/>
+      <w:r>
+        <w:rPr>
+          <w:color w:val="FF0000"/>
+        </w:rPr>
+        <w:t xml:space="preserve"> </w:t>
+      </w:r>
+      <w:proofErr w:type="spellStart"/>
+      <w:r>
+        <w:rPr>
+          <w:color w:val="FF0000"/>
+        </w:rPr>
+        <w:t>lại</w:t>
+      </w:r>
+      <w:proofErr w:type="spellEnd"/>
+      <w:r>
+        <w:rPr>
+          <w:color w:val="FF0000"/>
+        </w:rPr>
+        <w:t xml:space="preserve">; </w:t>
+      </w:r>
+      <w:r>
+        <w:rPr>
+          <w:color w:val="FF0000"/>
+        </w:rPr>
+        <w:t xml:space="preserve">Online: </w:t>
+      </w:r>
+      <w:r>
+        <w:rPr>
+          <w:color w:val="FF0000"/>
+        </w:rPr>
+        <w:t>https://sonapharm.vn/</w:t>
+      </w:r>
+      <w:r>
+        <w:rPr>
+          <w:color w:val="FF0000"/>
+        </w:rPr>
+        <w:t xml:space="preserve"> </w:t>
+      </w:r>
+      <w:proofErr w:type="spellStart"/>
+      <w:r>
+        <w:rPr>
+          <w:color w:val="FF0000"/>
+        </w:rPr>
+        <w:t>cach</w:t>
+      </w:r>
+      <w:proofErr w:type="spellEnd"/>
+      <w:r>
+        <w:rPr>
+          <w:color w:val="FF0000"/>
+        </w:rPr>
+        <w:t>-</w:t>
+      </w:r>
+      <w:proofErr w:type="spellStart"/>
+      <w:r>
+        <w:rPr>
+          <w:color w:val="FF0000"/>
+        </w:rPr>
+        <w:t>doi</w:t>
+      </w:r>
+      <w:proofErr w:type="spellEnd"/>
+      <w:r>
+        <w:rPr>
+          <w:color w:val="FF0000"/>
+        </w:rPr>
+        <w:t>-mmol-l-sang-mg-dl/</w:t>
+      </w:r>
+      <w:r>
+        <w:rPr>
+          <w:color w:val="FF0000"/>
+        </w:rPr>
+        <w:t xml:space="preserve">; </w:t>
+      </w:r>
+      <w:proofErr w:type="spellStart"/>
+      <w:r>
+        <w:rPr>
+          <w:color w:val="FF0000"/>
+        </w:rPr>
+        <w:t>T</w:t>
+      </w:r>
+      <w:r>
+        <w:rPr>
+          <w:color w:val="FF0000"/>
+        </w:rPr>
+        <w:t>ruy</w:t>
+      </w:r>
+      <w:proofErr w:type="spellEnd"/>
+      <w:r>
+        <w:rPr>
+          <w:color w:val="FF0000"/>
+        </w:rPr>
+        <w:t xml:space="preserve"> </w:t>
+      </w:r>
+      <w:proofErr w:type="spellStart"/>
+      <w:r>
+        <w:rPr>
+          <w:color w:val="FF0000"/>
+        </w:rPr>
+        <w:t>cập</w:t>
+      </w:r>
+      <w:proofErr w:type="spellEnd"/>
+      <w:r>
+        <w:rPr>
+          <w:color w:val="FF0000"/>
+        </w:rPr>
+        <w:t xml:space="preserve"> </w:t>
+      </w:r>
+      <w:proofErr w:type="spellStart"/>
+      <w:r>
+        <w:rPr>
+          <w:color w:val="FF0000"/>
+        </w:rPr>
+        <w:t>ngày</w:t>
+      </w:r>
+      <w:proofErr w:type="spellEnd"/>
+      <w:r>
+        <w:rPr>
+          <w:color w:val="FF0000"/>
+        </w:rPr>
+        <w:t xml:space="preserve"> 02/09/2021.</w:t>
       </w:r>
     </w:p>
     <w:p>
@@ -5054,7 +6759,6 @@
           <w:szCs w:val="28"/>
         </w:rPr>
       </w:pPr>
-      <w:r/>
     </w:p>
     <w:sectPr>
       <w:headerReference w:type="default" r:id="rId12"/>

</xml_diff>

<commit_message>
docs: clone and in-place patch template archive preserving native TOC, layout, and emblem
</commit_message>
<xml_diff>
--- a/nhom4.docx
+++ b/nhom4.docx
@@ -5672,28 +5672,8 @@
           <w:rFonts w:cs="Times New Roman"/>
         </w:rPr>
       </w:pPr>
-      <w:bookmarkStart w:id="4" w:name="_Toc116549838"/>
-      <w:r>
-        <w:rPr>
-          <w:rFonts w:cs="Times New Roman"/>
-        </w:rPr>
-        <w:lastRenderedPageBreak/>
-        <w:t>CHƯƠNG 1.</w:t>
-      </w:r>
-      <w:r>
-        <w:rPr>
-          <w:rFonts w:cs="Times New Roman"/>
-          <w:spacing w:val="100"/>
-        </w:rPr>
-        <w:t xml:space="preserve"> </w:t>
-      </w:r>
-      <w:bookmarkEnd w:id="4"/>
-      <w:r>
-        <w:rPr>
-          <w:rFonts w:cs="Times New Roman"/>
-          <w:color w:val="FF0000"/>
-        </w:rPr>
-        <w:t>PHÂN TÍCH YÊU CẦU HỆ THỐNG</w:t>
+      <w:r>
+        <w:t>CHƯƠNG 1. PHÂN TÍCH YÊU CẦU HỆ THỐNG</w:t>
       </w:r>
     </w:p>
     <w:p>
@@ -5792,45 +5772,13 @@
           <w:color w:val="FF0000"/>
         </w:rPr>
       </w:pPr>
-      <w:proofErr w:type="spellStart"/>
-      <w:r>
-        <w:rPr>
-          <w:color w:val="FF0000"/>
-        </w:rPr>
-        <w:t>Thuật</w:t>
-      </w:r>
-      <w:proofErr w:type="spellEnd"/>
-      <w:r>
-        <w:rPr>
-          <w:color w:val="FF0000"/>
-        </w:rPr>
-        <w:t xml:space="preserve"> </w:t>
-      </w:r>
-      <w:proofErr w:type="spellStart"/>
-      <w:r>
-        <w:rPr>
-          <w:color w:val="FF0000"/>
-        </w:rPr>
-        <w:t>ngữ</w:t>
-      </w:r>
-      <w:proofErr w:type="spellEnd"/>
-      <w:r>
-        <w:rPr>
-          <w:color w:val="FF0000"/>
-        </w:rPr>
-        <w:t xml:space="preserve"> </w:t>
-      </w:r>
-      <w:r>
-        <w:rPr>
-          <w:color w:val="FF0000"/>
-        </w:rPr>
-        <w:t>…</w:t>
-      </w:r>
+      <w:r/>
     </w:p>
     <w:p>
       <w:pPr>
         <w:pStyle w:val="0TEXTc1"/>
       </w:pPr>
+      <w:r/>
     </w:p>
     <w:p>
       <w:pPr>
@@ -5842,16 +5790,7 @@
           <w:szCs w:val="32"/>
         </w:rPr>
       </w:pPr>
-      <w:r>
-        <w:rPr>
-          <w:rFonts w:ascii="Times New Roman" w:hAnsi="Times New Roman" w:cs="Times New Roman"/>
-          <w:b/>
-          <w:bCs/>
-          <w:sz w:val="32"/>
-          <w:szCs w:val="32"/>
-        </w:rPr>
-        <w:br w:type="page"/>
-      </w:r>
+      <w:r/>
     </w:p>
     <w:p>
       <w:pPr>

</xml_diff>

<commit_message>
docs: compile structured discrete paragraphs, bullet indents, and 8-row task distribution
</commit_message>
<xml_diff>
--- a/nhom4.docx
+++ b/nhom4.docx
@@ -1539,79 +1539,9 @@
           <w:sz w:val="22"/>
         </w:rPr>
       </w:pPr>
-      <w:hyperlink w:anchor="_Toc116549840" w:history="1">
-        <w:r>
-          <w:rPr>
-            <w:rStyle w:val="Hyperlink"/>
-            <w:noProof/>
-          </w:rPr>
-          <w:t>CHƯƠNG 2.</w:t>
-        </w:r>
-        <w:r>
-          <w:rPr>
-            <w:rStyle w:val="Hyperlink"/>
-            <w:noProof/>
-            <w:spacing w:val="100"/>
-          </w:rPr>
-          <w:t xml:space="preserve"> </w:t>
-        </w:r>
-        <w:r>
-          <w:rPr>
-            <w:rStyle w:val="Hyperlink"/>
-            <w:rFonts w:cs="Times New Roman"/>
-            <w:noProof/>
-          </w:rPr>
-          <w:t>MẠNG NƠ-RON VGGNET</w:t>
-        </w:r>
-        <w:r>
-          <w:rPr>
-            <w:noProof/>
-            <w:webHidden/>
-          </w:rPr>
-          <w:tab/>
-        </w:r>
-        <w:r>
-          <w:rPr>
-            <w:noProof/>
-            <w:webHidden/>
-          </w:rPr>
-          <w:fldChar w:fldCharType="begin"/>
-        </w:r>
-        <w:r>
-          <w:rPr>
-            <w:noProof/>
-            <w:webHidden/>
-          </w:rPr>
-          <w:instrText xml:space="preserve"> PAGEREF _Toc116549840 \h </w:instrText>
-        </w:r>
-        <w:r>
-          <w:rPr>
-            <w:noProof/>
-            <w:webHidden/>
-          </w:rPr>
-        </w:r>
-        <w:r>
-          <w:rPr>
-            <w:noProof/>
-            <w:webHidden/>
-          </w:rPr>
-          <w:fldChar w:fldCharType="separate"/>
-        </w:r>
-        <w:r>
-          <w:rPr>
-            <w:noProof/>
-            <w:webHidden/>
-          </w:rPr>
-          <w:t>2</w:t>
-        </w:r>
-        <w:r>
-          <w:rPr>
-            <w:noProof/>
-            <w:webHidden/>
-          </w:rPr>
-          <w:fldChar w:fldCharType="end"/>
-        </w:r>
-      </w:hyperlink>
+      <w:r>
+        <w:t>CHƯƠNG 2. THIẾT KẾ HỆ THỐNG (BÀI KIỂM TRA 2)</w:t>
+      </w:r>
     </w:p>
     <w:p>
       <w:pPr>
@@ -1625,63 +1555,9 @@
           <w:sz w:val="22"/>
         </w:rPr>
       </w:pPr>
-      <w:hyperlink w:anchor="_Toc116549841" w:history="1">
-        <w:r>
-          <w:rPr>
-            <w:rStyle w:val="Hyperlink"/>
-            <w:noProof/>
-          </w:rPr>
-          <w:t>2.1. Nội dung</w:t>
-        </w:r>
-        <w:r>
-          <w:rPr>
-            <w:noProof/>
-            <w:webHidden/>
-          </w:rPr>
-          <w:tab/>
-        </w:r>
-        <w:r>
-          <w:rPr>
-            <w:noProof/>
-            <w:webHidden/>
-          </w:rPr>
-          <w:fldChar w:fldCharType="begin"/>
-        </w:r>
-        <w:r>
-          <w:rPr>
-            <w:noProof/>
-            <w:webHidden/>
-          </w:rPr>
-          <w:instrText xml:space="preserve"> PAGEREF _Toc116549841 \h </w:instrText>
-        </w:r>
-        <w:r>
-          <w:rPr>
-            <w:noProof/>
-            <w:webHidden/>
-          </w:rPr>
-        </w:r>
-        <w:r>
-          <w:rPr>
-            <w:noProof/>
-            <w:webHidden/>
-          </w:rPr>
-          <w:fldChar w:fldCharType="separate"/>
-        </w:r>
-        <w:r>
-          <w:rPr>
-            <w:noProof/>
-            <w:webHidden/>
-          </w:rPr>
-          <w:t>2</w:t>
-        </w:r>
-        <w:r>
-          <w:rPr>
-            <w:noProof/>
-            <w:webHidden/>
-          </w:rPr>
-          <w:fldChar w:fldCharType="end"/>
-        </w:r>
-      </w:hyperlink>
+      <w:r>
+        <w:t>2.1. Nội dung thiết kế kiến trúc và CSDL sẽ được hoàn thiện trong Bài kiểm tra 2 (KT2).</w:t>
+      </w:r>
     </w:p>
     <w:p>
       <w:pPr>
@@ -2359,7 +2235,7 @@
               </w:rPr>
             </w:pPr>
             <w:r>
-              <w:t>Phân tích yêu cầu bài toán, khảo sát hiện trạng, lập URD &amp; SRS</w:t>
+              <w:t>Khảo sát hiện trạng, phân tích yêu cầu nghiệp vụ và bài toán AI</w:t>
             </w:r>
           </w:p>
         </w:tc>
@@ -2425,7 +2301,7 @@
               </w:rPr>
             </w:pPr>
             <w:r>
-              <w:t>Thiết kế mô hình Actor, Use Case và các yêu cầu chức năng/phi chức năng</w:t>
+              <w:t>Xây dựng tài liệu URD, SRS chuẩn ISO/IEC/IEEE 29148</w:t>
             </w:r>
           </w:p>
         </w:tc>
@@ -2491,7 +2367,7 @@
               </w:rPr>
             </w:pPr>
             <w:r>
-              <w:t>Xác định mô hình CSDL quan hệ sơ bộ và các thực thể cốt lõi</w:t>
+              <w:t>Thiết kế mô hình Actor, phân hệ Use Case và đặc tả chức năng (FR)</w:t>
             </w:r>
           </w:p>
         </w:tc>
@@ -2511,7 +2387,7 @@
               </w:rPr>
             </w:pPr>
             <w:r>
-              <w:t>Phạm Văn Huynh</w:t>
+              <w:t>Phạm Minh Tú</w:t>
             </w:r>
           </w:p>
         </w:tc>
@@ -2557,7 +2433,7 @@
               </w:rPr>
             </w:pPr>
             <w:r>
-              <w:t>Xác định phạm vi ứng dụng AI và khảo sát các luồng xử lý NLP</w:t>
+              <w:t>Phân tích đặc tả yêu cầu phi chức năng (NFR) và ràng buộc hệ thống</w:t>
             </w:r>
           </w:p>
         </w:tc>
@@ -2577,7 +2453,7 @@
               </w:rPr>
             </w:pPr>
             <w:r>
-              <w:t>Đàm Đức Đôn</w:t>
+              <w:t>Phạm Văn Huynh</w:t>
             </w:r>
           </w:p>
         </w:tc>
@@ -2623,7 +2499,7 @@
               </w:rPr>
             </w:pPr>
             <w:r>
-              <w:t>Tổng hợp báo cáo kỹ thuật Chương 1 (KT1) và rà soát tài liệu</w:t>
+              <w:t>Thiết kế sơ bộ thực thể dữ liệu và phân quyền theo dự án</w:t>
             </w:r>
           </w:p>
         </w:tc>
@@ -2643,7 +2519,7 @@
               </w:rPr>
             </w:pPr>
             <w:r>
-              <w:t>Cả nhóm</w:t>
+              <w:t>Phạm Văn Huynh</w:t>
             </w:r>
           </w:p>
         </w:tc>
@@ -2655,7 +2531,22 @@
             <w:vAlign w:val="center"/>
           </w:tcPr>
           <w:p>
-            <w:r/>
+            <w:pPr>
+              <w:pStyle w:val="0TEXTc1"/>
+              <w:numPr>
+                <w:ilvl w:val="0"/>
+                <w:numId w:val="5"/>
+              </w:numPr>
+              <w:spacing w:line="240" w:lineRule="auto"/>
+              <w:ind w:left="170" w:hanging="170"/>
+              <w:jc w:val="center"/>
+              <w:rPr>
+                <w:rFonts w:cs="Times New Roman"/>
+              </w:rPr>
+            </w:pPr>
+            <w:r>
+              <w:t>6</w:t>
+            </w:r>
           </w:p>
         </w:tc>
         <w:tc>
@@ -2664,7 +2555,18 @@
             <w:vAlign w:val="center"/>
           </w:tcPr>
           <w:p>
-            <w:r/>
+            <w:pPr>
+              <w:pStyle w:val="0TEXTc1"/>
+              <w:spacing w:line="240" w:lineRule="auto"/>
+              <w:ind w:firstLine="0"/>
+              <w:jc w:val="left"/>
+              <w:rPr>
+                <w:rFonts w:cs="Times New Roman"/>
+              </w:rPr>
+            </w:pPr>
+            <w:r>
+              <w:t>Khảo sát mô hình ngôn ngữ lớn (LLM) và thiết kế phạm vi tích hợp AI</w:t>
+            </w:r>
           </w:p>
         </w:tc>
         <w:tc>
@@ -2673,7 +2575,18 @@
             <w:vAlign w:val="center"/>
           </w:tcPr>
           <w:p>
-            <w:r/>
+            <w:pPr>
+              <w:pStyle w:val="0TEXTc1"/>
+              <w:spacing w:line="240" w:lineRule="auto"/>
+              <w:ind w:firstLine="0"/>
+              <w:jc w:val="left"/>
+              <w:rPr>
+                <w:rFonts w:cs="Times New Roman"/>
+              </w:rPr>
+            </w:pPr>
+            <w:r>
+              <w:t>Đàm Đức Đôn</w:t>
+            </w:r>
           </w:p>
         </w:tc>
       </w:tr>
@@ -2684,7 +2597,22 @@
             <w:vAlign w:val="center"/>
           </w:tcPr>
           <w:p>
-            <w:r/>
+            <w:pPr>
+              <w:pStyle w:val="0TEXTc1"/>
+              <w:numPr>
+                <w:ilvl w:val="0"/>
+                <w:numId w:val="5"/>
+              </w:numPr>
+              <w:spacing w:line="240" w:lineRule="auto"/>
+              <w:ind w:left="170" w:hanging="170"/>
+              <w:jc w:val="center"/>
+              <w:rPr>
+                <w:rFonts w:cs="Times New Roman"/>
+              </w:rPr>
+            </w:pPr>
+            <w:r>
+              <w:t>7</w:t>
+            </w:r>
           </w:p>
         </w:tc>
         <w:tc>
@@ -2693,7 +2621,18 @@
             <w:vAlign w:val="center"/>
           </w:tcPr>
           <w:p>
-            <w:r/>
+            <w:pPr>
+              <w:pStyle w:val="0TEXTc1"/>
+              <w:spacing w:line="240" w:lineRule="auto"/>
+              <w:ind w:firstLine="0"/>
+              <w:jc w:val="left"/>
+              <w:rPr>
+                <w:rFonts w:cs="Times New Roman"/>
+              </w:rPr>
+            </w:pPr>
+            <w:r>
+              <w:t>Xây dựng kịch bản thử nghiệm và ma trận đánh giá ban đầu</w:t>
+            </w:r>
           </w:p>
         </w:tc>
         <w:tc>
@@ -2702,7 +2641,18 @@
             <w:vAlign w:val="center"/>
           </w:tcPr>
           <w:p>
-            <w:r/>
+            <w:pPr>
+              <w:pStyle w:val="0TEXTc1"/>
+              <w:spacing w:line="240" w:lineRule="auto"/>
+              <w:ind w:firstLine="0"/>
+              <w:jc w:val="left"/>
+              <w:rPr>
+                <w:rFonts w:cs="Times New Roman"/>
+              </w:rPr>
+            </w:pPr>
+            <w:r>
+              <w:t>Đàm Đức Đôn</w:t>
+            </w:r>
           </w:p>
         </w:tc>
       </w:tr>
@@ -2713,7 +2663,22 @@
             <w:vAlign w:val="center"/>
           </w:tcPr>
           <w:p>
-            <w:r/>
+            <w:pPr>
+              <w:pStyle w:val="0TEXTc1"/>
+              <w:numPr>
+                <w:ilvl w:val="0"/>
+                <w:numId w:val="5"/>
+              </w:numPr>
+              <w:spacing w:line="240" w:lineRule="auto"/>
+              <w:ind w:left="170" w:hanging="170"/>
+              <w:jc w:val="center"/>
+              <w:rPr>
+                <w:rFonts w:cs="Times New Roman"/>
+              </w:rPr>
+            </w:pPr>
+            <w:r>
+              <w:t>8</w:t>
+            </w:r>
           </w:p>
         </w:tc>
         <w:tc>
@@ -2722,7 +2687,18 @@
             <w:vAlign w:val="center"/>
           </w:tcPr>
           <w:p>
-            <w:r/>
+            <w:pPr>
+              <w:pStyle w:val="0TEXTc1"/>
+              <w:spacing w:line="240" w:lineRule="auto"/>
+              <w:ind w:firstLine="0"/>
+              <w:jc w:val="left"/>
+              <w:rPr>
+                <w:rFonts w:cs="Times New Roman"/>
+              </w:rPr>
+            </w:pPr>
+            <w:r>
+              <w:t>Tổng hợp báo cáo kỹ thuật Chương 1 (KT1) và rà soát tài liệu</w:t>
+            </w:r>
           </w:p>
         </w:tc>
         <w:tc>
@@ -2731,7 +2707,18 @@
             <w:vAlign w:val="center"/>
           </w:tcPr>
           <w:p>
-            <w:r/>
+            <w:pPr>
+              <w:pStyle w:val="0TEXTc1"/>
+              <w:spacing w:line="240" w:lineRule="auto"/>
+              <w:ind w:firstLine="0"/>
+              <w:jc w:val="left"/>
+              <w:rPr>
+                <w:rFonts w:cs="Times New Roman"/>
+              </w:rPr>
+            </w:pPr>
+            <w:r>
+              <w:t>Cả nhóm</w:t>
+            </w:r>
           </w:p>
         </w:tc>
       </w:tr>
@@ -3361,243 +3348,8 @@
           <w:lang w:val="vi-VN"/>
         </w:rPr>
       </w:pPr>
-      <w:proofErr w:type="spellStart"/>
-      <w:r>
-        <w:rPr>
-          <w:color w:val="FF0000"/>
-        </w:rPr>
-        <w:t>Ngày</w:t>
-      </w:r>
-      <w:proofErr w:type="spellEnd"/>
-      <w:r>
-        <w:rPr>
-          <w:color w:val="FF0000"/>
-        </w:rPr>
-        <w:t xml:space="preserve"> nay, </w:t>
-      </w:r>
-      <w:proofErr w:type="spellStart"/>
-      <w:r>
-        <w:rPr>
-          <w:color w:val="FF0000"/>
-        </w:rPr>
-        <w:t>công</w:t>
-      </w:r>
-      <w:proofErr w:type="spellEnd"/>
-      <w:r>
-        <w:rPr>
-          <w:color w:val="FF0000"/>
-        </w:rPr>
-        <w:t xml:space="preserve"> </w:t>
-      </w:r>
-      <w:proofErr w:type="spellStart"/>
-      <w:r>
-        <w:rPr>
-          <w:color w:val="FF0000"/>
-        </w:rPr>
-        <w:t>nghệ</w:t>
-      </w:r>
-      <w:proofErr w:type="spellEnd"/>
-      <w:r>
-        <w:rPr>
-          <w:color w:val="FF0000"/>
-        </w:rPr>
-        <w:t xml:space="preserve"> </w:t>
-      </w:r>
-      <w:proofErr w:type="spellStart"/>
-      <w:r>
-        <w:rPr>
-          <w:color w:val="FF0000"/>
-        </w:rPr>
-        <w:t>thông</w:t>
-      </w:r>
-      <w:proofErr w:type="spellEnd"/>
-      <w:r>
-        <w:rPr>
-          <w:color w:val="FF0000"/>
-        </w:rPr>
-        <w:t xml:space="preserve"> tin </w:t>
-      </w:r>
-      <w:proofErr w:type="spellStart"/>
-      <w:r>
-        <w:rPr>
-          <w:color w:val="FF0000"/>
-        </w:rPr>
-        <w:t>phát</w:t>
-      </w:r>
-      <w:proofErr w:type="spellEnd"/>
-      <w:r>
-        <w:rPr>
-          <w:color w:val="FF0000"/>
-        </w:rPr>
-        <w:t xml:space="preserve"> </w:t>
-      </w:r>
-      <w:proofErr w:type="spellStart"/>
-      <w:r>
-        <w:rPr>
-          <w:color w:val="FF0000"/>
-        </w:rPr>
-        <w:t>triển</w:t>
-      </w:r>
-      <w:proofErr w:type="spellEnd"/>
-      <w:r>
-        <w:rPr>
-          <w:color w:val="FF0000"/>
-        </w:rPr>
-        <w:t xml:space="preserve"> </w:t>
-      </w:r>
-      <w:proofErr w:type="spellStart"/>
-      <w:r>
-        <w:rPr>
-          <w:color w:val="FF0000"/>
-        </w:rPr>
-        <w:t>đồng</w:t>
-      </w:r>
-      <w:proofErr w:type="spellEnd"/>
-      <w:r>
-        <w:rPr>
-          <w:color w:val="FF0000"/>
-        </w:rPr>
-        <w:t xml:space="preserve"> </w:t>
-      </w:r>
-      <w:proofErr w:type="spellStart"/>
-      <w:r>
-        <w:rPr>
-          <w:color w:val="FF0000"/>
-        </w:rPr>
-        <w:t>nghĩa</w:t>
-      </w:r>
-      <w:proofErr w:type="spellEnd"/>
-      <w:r>
-        <w:rPr>
-          <w:color w:val="FF0000"/>
-        </w:rPr>
-        <w:t xml:space="preserve"> </w:t>
-      </w:r>
-      <w:proofErr w:type="spellStart"/>
-      <w:r>
-        <w:rPr>
-          <w:color w:val="FF0000"/>
-        </w:rPr>
-        <w:t>với</w:t>
-      </w:r>
-      <w:proofErr w:type="spellEnd"/>
-      <w:r>
-        <w:rPr>
-          <w:color w:val="FF0000"/>
-        </w:rPr>
-        <w:t xml:space="preserve"> </w:t>
-      </w:r>
-      <w:proofErr w:type="spellStart"/>
-      <w:r>
-        <w:rPr>
-          <w:color w:val="FF0000"/>
-        </w:rPr>
-        <w:t>việc</w:t>
-      </w:r>
-      <w:proofErr w:type="spellEnd"/>
-      <w:r>
-        <w:rPr>
-          <w:color w:val="FF0000"/>
-        </w:rPr>
-        <w:t xml:space="preserve"> </w:t>
-      </w:r>
-      <w:proofErr w:type="spellStart"/>
-      <w:r>
-        <w:rPr>
-          <w:color w:val="FF0000"/>
-        </w:rPr>
-        <w:t>phát</w:t>
-      </w:r>
-      <w:proofErr w:type="spellEnd"/>
-      <w:r>
-        <w:rPr>
-          <w:color w:val="FF0000"/>
-        </w:rPr>
-        <w:t xml:space="preserve"> </w:t>
-      </w:r>
-      <w:proofErr w:type="spellStart"/>
-      <w:r>
-        <w:rPr>
-          <w:color w:val="FF0000"/>
-        </w:rPr>
-        <w:t>triển</w:t>
-      </w:r>
-      <w:proofErr w:type="spellEnd"/>
-      <w:r>
-        <w:rPr>
-          <w:color w:val="FF0000"/>
-        </w:rPr>
-        <w:t xml:space="preserve"> </w:t>
-      </w:r>
-      <w:proofErr w:type="spellStart"/>
-      <w:r>
-        <w:rPr>
-          <w:color w:val="FF0000"/>
-        </w:rPr>
-        <w:t>các</w:t>
-      </w:r>
-      <w:proofErr w:type="spellEnd"/>
-      <w:r>
-        <w:rPr>
-          <w:color w:val="FF0000"/>
-        </w:rPr>
-        <w:t xml:space="preserve"> </w:t>
-      </w:r>
-      <w:proofErr w:type="spellStart"/>
-      <w:r>
-        <w:rPr>
-          <w:color w:val="FF0000"/>
-        </w:rPr>
-        <w:t>phần</w:t>
-      </w:r>
-      <w:proofErr w:type="spellEnd"/>
-      <w:r>
-        <w:rPr>
-          <w:color w:val="FF0000"/>
-        </w:rPr>
-        <w:t xml:space="preserve"> </w:t>
-      </w:r>
-      <w:proofErr w:type="spellStart"/>
-      <w:r>
-        <w:rPr>
-          <w:color w:val="FF0000"/>
-        </w:rPr>
-        <w:t>mềm</w:t>
-      </w:r>
-      <w:proofErr w:type="spellEnd"/>
-      <w:r>
-        <w:rPr>
-          <w:color w:val="FF0000"/>
-        </w:rPr>
-        <w:t xml:space="preserve"> </w:t>
-      </w:r>
-      <w:proofErr w:type="spellStart"/>
-      <w:r>
-        <w:rPr>
-          <w:color w:val="FF0000"/>
-        </w:rPr>
-        <w:t>ứng</w:t>
-      </w:r>
-      <w:proofErr w:type="spellEnd"/>
-      <w:r>
-        <w:rPr>
-          <w:color w:val="FF0000"/>
-        </w:rPr>
-        <w:t xml:space="preserve"> </w:t>
-      </w:r>
-      <w:proofErr w:type="spellStart"/>
-      <w:r>
-        <w:rPr>
-          <w:color w:val="FF0000"/>
-        </w:rPr>
-        <w:t>dụng</w:t>
-      </w:r>
-      <w:proofErr w:type="spellEnd"/>
-      <w:r>
-        <w:rPr>
-          <w:color w:val="FF0000"/>
-        </w:rPr>
-        <w:t>.</w:t>
+      <w:r>
+        <w:t>Ngày nay, công nghệ thông tin phát triển đồng nghĩa với việc tối ưu hóa năng suất lao động và tự động hóa quy trình quản trị dự án. Trong phát triển phần mềm hiện đại, việc kiểm soát tiến độ sprint và chuỗi phụ thuộc kỹ thuật đóng vai trò then chốt đối với sự thành bại của hệ thống.</w:t>
       </w:r>
     </w:p>
     <w:p>
@@ -3605,7 +3357,7 @@
         <w:pStyle w:val="0TEXTc1"/>
       </w:pPr>
       <w:r>
-        <w:t>…</w:t>
+        <w:t>Hệ thống quản lý dự án Koshi (輿) được thiết kế theo triết lý 'Local-First' và điều hướng bàn phím tối ưu (Vim ergonomics), mang lại phản hồi &lt; 16ms cùng trợ lý AI tự động hóa tóm tắt tiến độ, trích xuất biên bản họp và cân bằng tải nhân sự.</w:t>
       </w:r>
     </w:p>
     <w:p>
@@ -3616,28 +3368,7 @@
         </w:rPr>
       </w:pPr>
       <w:r>
-        <w:rPr>
-          <w:lang w:val="vi-VN"/>
-        </w:rPr>
-        <w:t>Em x</w:t>
-      </w:r>
-      <w:r>
-        <w:rPr>
-          <w:lang w:val="vi-VN"/>
-        </w:rPr>
-        <w:t xml:space="preserve">in </w:t>
-      </w:r>
-      <w:r>
-        <w:rPr>
-          <w:lang w:val="vi-VN"/>
-        </w:rPr>
-        <w:t>chân thành cảm ơn</w:t>
-      </w:r>
-      <w:r>
-        <w:rPr>
-          <w:lang w:val="vi-VN"/>
-        </w:rPr>
-        <w:t>!</w:t>
+        <w:t>Nhóm 04 chúng em xin chân thành cảm ơn giảng viên ThS. Nguyễn Thị Tuyển đã tận tình hướng dẫn để nhóm hoàn thành tốt Bài kiểm tra 1 (KT1) này!</w:t>
       </w:r>
     </w:p>
     <w:p>
@@ -5678,92 +5409,871 @@
     </w:p>
     <w:p>
       <w:pPr>
+        <w:keepNext/>
+        <w:spacing w:line="300" w:lineRule="auto" w:before="200" w:after="80"/>
+      </w:pPr>
+      <w:r>
+        <w:rPr>
+          <w:rFonts w:ascii="Times New Roman" w:hAnsi="Times New Roman"/>
+          <w:b/>
+          <w:i w:val="0"/>
+          <w:color w:val="0F172A"/>
+          <w:sz w:val="27"/>
+        </w:rPr>
+        <w:t>1.1. Bối cảnh bài toán và lý do phát triển</w:t>
+      </w:r>
+    </w:p>
+    <w:p>
+      <w:pPr>
+        <w:spacing w:line="300" w:lineRule="auto" w:before="40" w:after="80"/>
+      </w:pPr>
+      <w:r>
+        <w:rPr>
+          <w:rFonts w:ascii="Times New Roman" w:hAnsi="Times New Roman"/>
+          <w:b w:val="0"/>
+          <w:i w:val="0"/>
+          <w:color w:val="1E293B"/>
+          <w:sz w:val="26"/>
+        </w:rPr>
+        <w:t>Koshi được định vị là hệ thống quản lý công việc và tiến độ sprint nội bộ dành cho các đội ngũ kỹ sư phần mềm chuyên sâu. Bối cảnh nghiệp vụ tập trung giải quyết nhu cầu của 3 nhóm đối tượng chính (User Personas):</w:t>
+      </w:r>
+    </w:p>
+    <w:p>
+      <w:pPr>
+        <w:spacing w:line="300" w:lineRule="auto" w:before="40" w:after="80"/>
+        <w:ind w:left="360"/>
+      </w:pPr>
+      <w:r>
+        <w:rPr>
+          <w:rFonts w:ascii="Times New Roman" w:hAnsi="Times New Roman"/>
+          <w:b/>
+          <w:i w:val="0"/>
+          <w:color w:val="1E293B"/>
+          <w:sz w:val="26"/>
+        </w:rPr>
+        <w:t xml:space="preserve">• Lead Architect / Senior Engineer: </w:t>
+      </w:r>
+      <w:r>
+        <w:rPr>
+          <w:rFonts w:ascii="Times New Roman" w:hAnsi="Times New Roman"/>
+          <w:b w:val="0"/>
+          <w:i w:val="0"/>
+          <w:color w:val="1E293B"/>
+          <w:sz w:val="26"/>
+        </w:rPr>
+        <w:t>Đòi hỏi thao tác 100% bằng bàn phím không dùng chuột (h/j/k/l, Space, i, n, Esc), chuyển đổi tức thì giữa dạng Bảng (Table) và Kanban 2D, phát hiện sớm các điểm nghẽn tiến độ (Critical Path) trên đồ thị phụ thuộc.</w:t>
+      </w:r>
+    </w:p>
+    <w:p>
+      <w:pPr>
+        <w:spacing w:line="300" w:lineRule="auto" w:before="40" w:after="80"/>
+        <w:ind w:left="360"/>
+      </w:pPr>
+      <w:r>
+        <w:rPr>
+          <w:rFonts w:ascii="Times New Roman" w:hAnsi="Times New Roman"/>
+          <w:b/>
+          <w:i w:val="0"/>
+          <w:color w:val="1E293B"/>
+          <w:sz w:val="26"/>
+        </w:rPr>
+        <w:t xml:space="preserve">• Project Manager (PM) / Tech Lead: </w:t>
+      </w:r>
+      <w:r>
+        <w:rPr>
+          <w:rFonts w:ascii="Times New Roman" w:hAnsi="Times New Roman"/>
+          <w:b w:val="0"/>
+          <w:i w:val="0"/>
+          <w:color w:val="1E293B"/>
+          <w:sz w:val="26"/>
+        </w:rPr>
+        <w:t>Cần tự động hóa khâu lập báo cáo tiến độ tuần, tự động trích xuất đầu việc từ biên bản họp văn bản thô và nhận gợi ý phân công công việc dựa trên số điểm độ phức tạp (WIP story points) của từng kỹ sư.</w:t>
+      </w:r>
+    </w:p>
+    <w:p>
+      <w:pPr>
+        <w:spacing w:line="300" w:lineRule="auto" w:before="40" w:after="80"/>
+        <w:ind w:left="360"/>
+      </w:pPr>
+      <w:r>
+        <w:rPr>
+          <w:rFonts w:ascii="Times New Roman" w:hAnsi="Times New Roman"/>
+          <w:b/>
+          <w:i w:val="0"/>
+          <w:color w:val="1E293B"/>
+          <w:sz w:val="26"/>
+        </w:rPr>
+        <w:t xml:space="preserve">• Field / Mobile Developer: </w:t>
+      </w:r>
+      <w:r>
+        <w:rPr>
+          <w:rFonts w:ascii="Times New Roman" w:hAnsi="Times New Roman"/>
+          <w:b w:val="0"/>
+          <w:i w:val="0"/>
+          <w:color w:val="1E293B"/>
+          <w:sz w:val="26"/>
+        </w:rPr>
+        <w:t>Cần khả năng làm việc ngoại tuyến (Offline-first) khi mất kết nối mạng và đồng bộ tự động dữ liệu vào IndexedDB cục bộ với độ trễ phản hồi giao diện dưới 16ms.</w:t>
+      </w:r>
+    </w:p>
+    <w:p>
+      <w:pPr>
+        <w:keepNext/>
+        <w:spacing w:line="300" w:lineRule="auto" w:before="200" w:after="80"/>
+      </w:pPr>
+      <w:r>
+        <w:rPr>
+          <w:rFonts w:ascii="Times New Roman" w:hAnsi="Times New Roman"/>
+          <w:b/>
+          <w:i w:val="0"/>
+          <w:color w:val="0F172A"/>
+          <w:sz w:val="27"/>
+        </w:rPr>
+        <w:t>1.2. Khảo sát hiện trạng và các giải pháp tương tự</w:t>
+      </w:r>
+    </w:p>
+    <w:p>
+      <w:pPr>
+        <w:spacing w:line="300" w:lineRule="auto" w:before="40" w:after="80"/>
+      </w:pPr>
+      <w:r>
+        <w:rPr>
+          <w:rFonts w:ascii="Times New Roman" w:hAnsi="Times New Roman"/>
+          <w:b w:val="0"/>
+          <w:i w:val="0"/>
+          <w:color w:val="1E293B"/>
+          <w:sz w:val="26"/>
+        </w:rPr>
+        <w:t>Khảo sát đối chuẩn giữa Koshi và các hệ thống quản lý dự án hàng đầu hiện nay:</w:t>
+      </w:r>
+    </w:p>
+    <w:p>
+      <w:pPr>
+        <w:spacing w:line="300" w:lineRule="auto" w:before="40" w:after="80"/>
+        <w:ind w:left="360"/>
+      </w:pPr>
+      <w:r>
+        <w:rPr>
+          <w:rFonts w:ascii="Times New Roman" w:hAnsi="Times New Roman"/>
+          <w:b/>
+          <w:i w:val="0"/>
+          <w:color w:val="1E293B"/>
+          <w:sz w:val="26"/>
+        </w:rPr>
+        <w:t xml:space="preserve">• Jira Software: </w:t>
+      </w:r>
+      <w:r>
+        <w:rPr>
+          <w:rFonts w:ascii="Times New Roman" w:hAnsi="Times New Roman"/>
+          <w:b w:val="0"/>
+          <w:i w:val="0"/>
+          <w:color w:val="1E293B"/>
+          <w:sz w:val="26"/>
+        </w:rPr>
+        <w:t>Hệ thống hoàn chỉnh nhưng cồng kềnh, thời gian phản hồi giao diện chậm, phụ thuộc 100% vào kết nối mạng, thao tác bàn phím hạn chế.</w:t>
+      </w:r>
+    </w:p>
+    <w:p>
+      <w:pPr>
+        <w:spacing w:line="300" w:lineRule="auto" w:before="40" w:after="80"/>
+        <w:ind w:left="360"/>
+      </w:pPr>
+      <w:r>
+        <w:rPr>
+          <w:rFonts w:ascii="Times New Roman" w:hAnsi="Times New Roman"/>
+          <w:b/>
+          <w:i w:val="0"/>
+          <w:color w:val="1E293B"/>
+          <w:sz w:val="26"/>
+        </w:rPr>
+        <w:t xml:space="preserve">• Trello: </w:t>
+      </w:r>
+      <w:r>
+        <w:rPr>
+          <w:rFonts w:ascii="Times New Roman" w:hAnsi="Times New Roman"/>
+          <w:b w:val="0"/>
+          <w:i w:val="0"/>
+          <w:color w:val="1E293B"/>
+          <w:sz w:val="26"/>
+        </w:rPr>
+        <w:t>Trực quan, đơn giản nhưng thiếu khả năng phân tích đồ thị phụ thuộc DAG, không tối ưu cho luồng làm việc kỹ thuật cao.</w:t>
+      </w:r>
+    </w:p>
+    <w:p>
+      <w:pPr>
+        <w:spacing w:line="300" w:lineRule="auto" w:before="40" w:after="80"/>
+        <w:ind w:left="360"/>
+      </w:pPr>
+      <w:r>
+        <w:rPr>
+          <w:rFonts w:ascii="Times New Roman" w:hAnsi="Times New Roman"/>
+          <w:b/>
+          <w:i w:val="0"/>
+          <w:color w:val="1E293B"/>
+          <w:sz w:val="26"/>
+        </w:rPr>
+        <w:t xml:space="preserve">• Linear: </w:t>
+      </w:r>
+      <w:r>
+        <w:rPr>
+          <w:rFonts w:ascii="Times New Roman" w:hAnsi="Times New Roman"/>
+          <w:b w:val="0"/>
+          <w:i w:val="0"/>
+          <w:color w:val="1E293B"/>
+          <w:sz w:val="26"/>
+        </w:rPr>
+        <w:t>Giao diện hiện đại, hỗ trợ phím tắt tốt nhưng chưa hỗ trợ phân rã mục tiêu chuyên sâu bằng AI và không có cơ chế phân tích đường găng CPM tự động.</w:t>
+      </w:r>
+    </w:p>
+    <w:p>
+      <w:pPr>
+        <w:spacing w:line="300" w:lineRule="auto" w:before="40" w:after="80"/>
+        <w:ind w:left="360"/>
+      </w:pPr>
+      <w:r>
+        <w:rPr>
+          <w:rFonts w:ascii="Times New Roman" w:hAnsi="Times New Roman"/>
+          <w:b/>
+          <w:i w:val="0"/>
+          <w:color w:val="1E293B"/>
+          <w:sz w:val="26"/>
+        </w:rPr>
+        <w:t xml:space="preserve">• Koshi (Hệ thống đề xuất): </w:t>
+      </w:r>
+      <w:r>
+        <w:rPr>
+          <w:rFonts w:ascii="Times New Roman" w:hAnsi="Times New Roman"/>
+          <w:b w:val="0"/>
+          <w:i w:val="0"/>
+          <w:color w:val="1E293B"/>
+          <w:sz w:val="26"/>
+        </w:rPr>
+        <w:t>Kết hợp triết lý Local-First, điều hướng bàn phím 2D (Vim ergonomics), phân tích chuỗi phụ thuộc bằng giải thuật Kahn kết hợp 3 luồng trợ lý AI quản trị dự án có cơ chế dự phòng 3 tầng.</w:t>
+      </w:r>
+    </w:p>
+    <w:p>
+      <w:pPr>
+        <w:keepNext/>
+        <w:spacing w:line="300" w:lineRule="auto" w:before="200" w:after="80"/>
+      </w:pPr>
+      <w:r>
+        <w:rPr>
+          <w:rFonts w:ascii="Times New Roman" w:hAnsi="Times New Roman"/>
+          <w:b/>
+          <w:i w:val="0"/>
+          <w:color w:val="0F172A"/>
+          <w:sz w:val="27"/>
+        </w:rPr>
+        <w:t>1.3. Mô hình Actor và Phân hệ Use Case tổng quát</w:t>
+      </w:r>
+    </w:p>
+    <w:p>
+      <w:pPr>
+        <w:spacing w:line="300" w:lineRule="auto" w:before="40" w:after="80"/>
+      </w:pPr>
+      <w:r>
+        <w:rPr>
+          <w:rFonts w:ascii="Times New Roman" w:hAnsi="Times New Roman"/>
+          <w:b w:val="0"/>
+          <w:i w:val="0"/>
+          <w:color w:val="1E293B"/>
+          <w:sz w:val="26"/>
+        </w:rPr>
+        <w:t>Hệ thống phân cấp 3 nhóm tác nhân (Actors) với các phân hệ Use Case chính:</w:t>
+      </w:r>
+    </w:p>
+    <w:p>
+      <w:pPr>
+        <w:spacing w:line="300" w:lineRule="auto" w:before="40" w:after="80"/>
+        <w:ind w:left="360"/>
+      </w:pPr>
+      <w:r>
+        <w:rPr>
+          <w:rFonts w:ascii="Times New Roman" w:hAnsi="Times New Roman"/>
+          <w:b/>
+          <w:i w:val="0"/>
+          <w:color w:val="1E293B"/>
+          <w:sz w:val="26"/>
+        </w:rPr>
+        <w:t xml:space="preserve">1. Guest (Khách vãng lai): </w:t>
+      </w:r>
+      <w:r>
+        <w:rPr>
+          <w:rFonts w:ascii="Times New Roman" w:hAnsi="Times New Roman"/>
+          <w:b w:val="0"/>
+          <w:i w:val="0"/>
+          <w:color w:val="1E293B"/>
+          <w:sz w:val="26"/>
+        </w:rPr>
+        <w:t>Đăng ký tài khoản mới, Đăng nhập hệ thống qua Email/Mật khẩu hoặc Google OAuth2, Xem dữ liệu mẫu thử nghiệm.</w:t>
+      </w:r>
+    </w:p>
+    <w:p>
+      <w:pPr>
+        <w:spacing w:line="300" w:lineRule="auto" w:before="40" w:after="80"/>
+        <w:ind w:left="360"/>
+      </w:pPr>
+      <w:r>
+        <w:rPr>
+          <w:rFonts w:ascii="Times New Roman" w:hAnsi="Times New Roman"/>
+          <w:b/>
+          <w:i w:val="0"/>
+          <w:color w:val="1E293B"/>
+          <w:sz w:val="26"/>
+        </w:rPr>
+        <w:t xml:space="preserve">2. Team Member (Lập trình viên): </w:t>
+      </w:r>
+      <w:r>
+        <w:rPr>
+          <w:rFonts w:ascii="Times New Roman" w:hAnsi="Times New Roman"/>
+          <w:b w:val="0"/>
+          <w:i w:val="0"/>
+          <w:color w:val="1E293B"/>
+          <w:sz w:val="26"/>
+        </w:rPr>
+        <w:t>Duyệt bảng công việc (Table/Kanban), Chuyển trạng thái vòng tròn (Space), Chỉnh sửa chi tiết công việc (i/Esc), Tạo công việc mới (n), Phân rã mục tiêu bằng AI, Bóc tách Git Diff để tự động đóng ticket.</w:t>
+      </w:r>
+    </w:p>
+    <w:p>
+      <w:pPr>
+        <w:spacing w:line="300" w:lineRule="auto" w:before="40" w:after="80"/>
+        <w:ind w:left="360"/>
+      </w:pPr>
+      <w:r>
+        <w:rPr>
+          <w:rFonts w:ascii="Times New Roman" w:hAnsi="Times New Roman"/>
+          <w:b/>
+          <w:i w:val="0"/>
+          <w:color w:val="1E293B"/>
+          <w:sz w:val="26"/>
+        </w:rPr>
+        <w:t xml:space="preserve">3. Project Manager (Quản lý dự án): </w:t>
+      </w:r>
+      <w:r>
+        <w:rPr>
+          <w:rFonts w:ascii="Times New Roman" w:hAnsi="Times New Roman"/>
+          <w:b w:val="0"/>
+          <w:i w:val="0"/>
+          <w:color w:val="1E293B"/>
+          <w:sz w:val="26"/>
+        </w:rPr>
+        <w:t>Quản trị thành viên dự án qua project_members, Sinh Báo cáo tổng kết tuần (AI Weekly Summary), Bóc tách biên bản họp (AI Meeting Minutes), Cân bằng tải nhân sự (AI Smart Assignment) và trực quan hóa chuỗi phụ thuộc đồ thị (DAG Visualizer).</w:t>
+      </w:r>
+    </w:p>
+    <w:p>
+      <w:pPr>
+        <w:keepNext/>
+        <w:spacing w:line="300" w:lineRule="auto" w:before="200" w:after="80"/>
+      </w:pPr>
+      <w:r>
+        <w:rPr>
+          <w:rFonts w:ascii="Times New Roman" w:hAnsi="Times New Roman"/>
+          <w:b/>
+          <w:i w:val="0"/>
+          <w:color w:val="0F172A"/>
+          <w:sz w:val="27"/>
+        </w:rPr>
+        <w:t>1.4. Đặc tả yêu cầu chức năng cốt lõi (Functional Requirements)</w:t>
+      </w:r>
+    </w:p>
+    <w:p>
+      <w:pPr>
+        <w:spacing w:line="300" w:lineRule="auto" w:before="40" w:after="80"/>
+        <w:ind w:left="360"/>
+      </w:pPr>
+      <w:r>
+        <w:rPr>
+          <w:rFonts w:ascii="Times New Roman" w:hAnsi="Times New Roman"/>
+          <w:b/>
+          <w:i w:val="0"/>
+          <w:color w:val="1E293B"/>
+          <w:sz w:val="26"/>
+        </w:rPr>
+        <w:t xml:space="preserve">• FR-01 [Dual-Mode Views]: </w:t>
+      </w:r>
+      <w:r>
+        <w:rPr>
+          <w:rFonts w:ascii="Times New Roman" w:hAnsi="Times New Roman"/>
+          <w:b w:val="0"/>
+          <w:i w:val="0"/>
+          <w:color w:val="1E293B"/>
+          <w:sz w:val="26"/>
+        </w:rPr>
+        <w:t>Chuyển đổi giao diện tức thì giữa Table View mật độ cao và Kanban Board 2D qua phím tắt 'b' với thời gian &lt; 16ms.</w:t>
+      </w:r>
+    </w:p>
+    <w:p>
+      <w:pPr>
+        <w:spacing w:line="300" w:lineRule="auto" w:before="40" w:after="80"/>
+        <w:ind w:left="360"/>
+      </w:pPr>
+      <w:r>
+        <w:rPr>
+          <w:rFonts w:ascii="Times New Roman" w:hAnsi="Times New Roman"/>
+          <w:b/>
+          <w:i w:val="0"/>
+          <w:color w:val="1E293B"/>
+          <w:sz w:val="26"/>
+        </w:rPr>
+        <w:t xml:space="preserve">• FR-02 [Vim Spatial Navigation]: </w:t>
+      </w:r>
+      <w:r>
+        <w:rPr>
+          <w:rFonts w:ascii="Times New Roman" w:hAnsi="Times New Roman"/>
+          <w:b w:val="0"/>
+          <w:i w:val="0"/>
+          <w:color w:val="1E293B"/>
+          <w:sz w:val="26"/>
+        </w:rPr>
+        <w:t>Hỗ trợ điều hướng bàn phím đầy đủ: j/k duyệt dòng trong Table, h/j/k/l duyệt lưới Kanban, Space đổi trạng thái tuần hoàn (TODO -&gt; IN_PROGRESS -&gt; BLOCKED -&gt; DONE -&gt; TODO).</w:t>
+      </w:r>
+    </w:p>
+    <w:p>
+      <w:pPr>
+        <w:spacing w:line="300" w:lineRule="auto" w:before="40" w:after="80"/>
+        <w:ind w:left="360"/>
+      </w:pPr>
+      <w:r>
+        <w:rPr>
+          <w:rFonts w:ascii="Times New Roman" w:hAnsi="Times New Roman"/>
+          <w:b/>
+          <w:i w:val="0"/>
+          <w:color w:val="1E293B"/>
+          <w:sz w:val="26"/>
+        </w:rPr>
+        <w:t xml:space="preserve">• FR-03 [Task Detail Inspector]: </w:t>
+      </w:r>
+      <w:r>
+        <w:rPr>
+          <w:rFonts w:ascii="Times New Roman" w:hAnsi="Times New Roman"/>
+          <w:b w:val="0"/>
+          <w:i w:val="0"/>
+          <w:color w:val="1E293B"/>
+          <w:sz w:val="26"/>
+        </w:rPr>
+        <w:t>Phím Enter mở modal chi tiết, phím 'i' chuyển sang Edit Mode cho phép chỉnh sửa toàn bộ thuộc tính, phím Escape lưu thay đổi và thoát Edit Mode.</w:t>
+      </w:r>
+    </w:p>
+    <w:p>
+      <w:pPr>
+        <w:spacing w:line="300" w:lineRule="auto" w:before="40" w:after="80"/>
+        <w:ind w:left="360"/>
+      </w:pPr>
+      <w:r>
+        <w:rPr>
+          <w:rFonts w:ascii="Times New Roman" w:hAnsi="Times New Roman"/>
+          <w:b/>
+          <w:i w:val="0"/>
+          <w:color w:val="1E293B"/>
+          <w:sz w:val="26"/>
+        </w:rPr>
+        <w:t xml:space="preserve">• FR-04 [Capture-Phase Escape Trap]: </w:t>
+      </w:r>
+      <w:r>
+        <w:rPr>
+          <w:rFonts w:ascii="Times New Roman" w:hAnsi="Times New Roman"/>
+          <w:b w:val="0"/>
+          <w:i w:val="0"/>
+          <w:color w:val="1E293B"/>
+          <w:sz w:val="26"/>
+        </w:rPr>
+        <w:t>Bắt sự kiện Escape ở mức window capture phase để đảm bảo đóng modal hoặc hủy chế độ sửa ngay lập tức mà không bị nuốt bởi ô nhập văn bản.</w:t>
+      </w:r>
+    </w:p>
+    <w:p>
+      <w:pPr>
+        <w:spacing w:line="300" w:lineRule="auto" w:before="40" w:after="80"/>
+        <w:ind w:left="360"/>
+      </w:pPr>
+      <w:r>
+        <w:rPr>
+          <w:rFonts w:ascii="Times New Roman" w:hAnsi="Times New Roman"/>
+          <w:b/>
+          <w:i w:val="0"/>
+          <w:color w:val="1E293B"/>
+          <w:sz w:val="26"/>
+        </w:rPr>
+        <w:t xml:space="preserve">• FR-05 [Project-Scoped RBAC]: </w:t>
+      </w:r>
+      <w:r>
+        <w:rPr>
+          <w:rFonts w:ascii="Times New Roman" w:hAnsi="Times New Roman"/>
+          <w:b w:val="0"/>
+          <w:i w:val="0"/>
+          <w:color w:val="1E293B"/>
+          <w:sz w:val="26"/>
+        </w:rPr>
+        <w:t>Tách biệt quyền hạn theo từng dự án cụ thể thông qua bảng project_members. Cho phép tìm kiếm người dùng trong hệ thống để thêm vào dự án với vai trò OWNER, PM hoặc MEMBER.</w:t>
+      </w:r>
+    </w:p>
+    <w:p>
+      <w:pPr>
+        <w:spacing w:line="300" w:lineRule="auto" w:before="40" w:after="80"/>
+        <w:ind w:left="360"/>
+      </w:pPr>
+      <w:r>
+        <w:rPr>
+          <w:rFonts w:ascii="Times New Roman" w:hAnsi="Times New Roman"/>
+          <w:b/>
+          <w:i w:val="0"/>
+          <w:color w:val="1E293B"/>
+          <w:sz w:val="26"/>
+        </w:rPr>
+        <w:t xml:space="preserve">• FR-06 [Topological DAG &amp; CPM]: </w:t>
+      </w:r>
+      <w:r>
+        <w:rPr>
+          <w:rFonts w:ascii="Times New Roman" w:hAnsi="Times New Roman"/>
+          <w:b w:val="0"/>
+          <w:i w:val="0"/>
+          <w:color w:val="1E293B"/>
+          <w:sz w:val="26"/>
+        </w:rPr>
+        <w:t>Sử dụng giải thuật Kahn để phân tích chuỗi phụ thuộc, phát hiện vòng lặp chu trình (Cycle Detection) và tính toán đường găng (Critical Path) cảnh báo điểm nghẽn.</w:t>
+      </w:r>
+    </w:p>
+    <w:p>
+      <w:pPr>
+        <w:spacing w:line="300" w:lineRule="auto" w:before="40" w:after="80"/>
+        <w:ind w:left="360"/>
+      </w:pPr>
+      <w:r>
+        <w:rPr>
+          <w:rFonts w:ascii="Times New Roman" w:hAnsi="Times New Roman"/>
+          <w:b/>
+          <w:i w:val="0"/>
+          <w:color w:val="1E293B"/>
+          <w:sz w:val="26"/>
+        </w:rPr>
+        <w:t xml:space="preserve">• FR-07 [Autonomous AI PM Workflows]: </w:t>
+      </w:r>
+      <w:r>
+        <w:rPr>
+          <w:rFonts w:ascii="Times New Roman" w:hAnsi="Times New Roman"/>
+          <w:b w:val="0"/>
+          <w:i w:val="0"/>
+          <w:color w:val="1E293B"/>
+          <w:sz w:val="26"/>
+        </w:rPr>
+        <w:t>Tích hợp 3 chức năng AI chuyên sâu: Tóm tắt tiến độ tuần (3 phần Overview, Blockers, Priorities), Bóc tách biên bản họp ra Action Items, và Gợi ý phân bổ công việc theo kỹ năng và tải trọng WIP.</w:t>
+      </w:r>
+    </w:p>
+    <w:p>
+      <w:pPr>
+        <w:spacing w:line="300" w:lineRule="auto" w:before="40" w:after="80"/>
+        <w:ind w:left="360"/>
+      </w:pPr>
+      <w:r>
+        <w:rPr>
+          <w:rFonts w:ascii="Times New Roman" w:hAnsi="Times New Roman"/>
+          <w:b/>
+          <w:i w:val="0"/>
+          <w:color w:val="1E293B"/>
+          <w:sz w:val="26"/>
+        </w:rPr>
+        <w:t xml:space="preserve">• FR-08 [Retrospective Work Logging]: </w:t>
+      </w:r>
+      <w:r>
+        <w:rPr>
+          <w:rFonts w:ascii="Times New Roman" w:hAnsi="Times New Roman"/>
+          <w:b w:val="0"/>
+          <w:i w:val="0"/>
+          <w:color w:val="1E293B"/>
+          <w:sz w:val="26"/>
+        </w:rPr>
+        <w:t>Cho phép tạo công việc mới trực tiếp ở trạng thái DONE để hỗ trợ ghi nhận các tác vụ đột xuất hoặc hotfix mà không cần qua trạng thái trung gian.</w:t>
+      </w:r>
+    </w:p>
+    <w:p>
+      <w:pPr>
+        <w:keepNext/>
+        <w:spacing w:line="300" w:lineRule="auto" w:before="200" w:after="80"/>
+      </w:pPr>
+      <w:r>
+        <w:rPr>
+          <w:rFonts w:ascii="Times New Roman" w:hAnsi="Times New Roman"/>
+          <w:b/>
+          <w:i w:val="0"/>
+          <w:color w:val="0F172A"/>
+          <w:sz w:val="27"/>
+        </w:rPr>
+        <w:t>1.5. Đặc tả yêu cầu phi chức năng (Non-Functional Requirements)</w:t>
+      </w:r>
+    </w:p>
+    <w:p>
+      <w:pPr>
+        <w:spacing w:line="300" w:lineRule="auto" w:before="40" w:after="80"/>
+        <w:ind w:left="360"/>
+      </w:pPr>
+      <w:r>
+        <w:rPr>
+          <w:rFonts w:ascii="Times New Roman" w:hAnsi="Times New Roman"/>
+          <w:b/>
+          <w:i w:val="0"/>
+          <w:color w:val="1E293B"/>
+          <w:sz w:val="26"/>
+        </w:rPr>
+        <w:t xml:space="preserve">• NFR-01 [Hiệu năng &amp; Độ trễ]: </w:t>
+      </w:r>
+      <w:r>
+        <w:rPr>
+          <w:rFonts w:ascii="Times New Roman" w:hAnsi="Times New Roman"/>
+          <w:b w:val="0"/>
+          <w:i w:val="0"/>
+          <w:color w:val="1E293B"/>
+          <w:sz w:val="26"/>
+        </w:rPr>
+        <w:t>Mọi thao tác điều hướng bàn phím và render giao diện cục bộ phải phản hồi trong thời gian &lt; 16ms (tương đương 60fps).</w:t>
+      </w:r>
+    </w:p>
+    <w:p>
+      <w:pPr>
+        <w:spacing w:line="300" w:lineRule="auto" w:before="40" w:after="80"/>
+        <w:ind w:left="360"/>
+      </w:pPr>
+      <w:r>
+        <w:rPr>
+          <w:rFonts w:ascii="Times New Roman" w:hAnsi="Times New Roman"/>
+          <w:b/>
+          <w:i w:val="0"/>
+          <w:color w:val="1E293B"/>
+          <w:sz w:val="26"/>
+        </w:rPr>
+        <w:t xml:space="preserve">• NFR-02 [Độ tin cậy &amp; Concurrency]: </w:t>
+      </w:r>
+      <w:r>
+        <w:rPr>
+          <w:rFonts w:ascii="Times New Roman" w:hAnsi="Times New Roman"/>
+          <w:b w:val="0"/>
+          <w:i w:val="0"/>
+          <w:color w:val="1E293B"/>
+          <w:sz w:val="26"/>
+        </w:rPr>
+        <w:t>Hệ thống CSDL SQLite phải được cấu hình PRAGMA journal_mode = WAL và busy_timeout = 30000ms nhằm đảm bảo không bị lỗi khóa ghi khi nhiều người dùng thao tác đồng thời.</w:t>
+      </w:r>
+    </w:p>
+    <w:p>
+      <w:pPr>
+        <w:spacing w:line="300" w:lineRule="auto" w:before="40" w:after="80"/>
+        <w:ind w:left="360"/>
+      </w:pPr>
+      <w:r>
+        <w:rPr>
+          <w:rFonts w:ascii="Times New Roman" w:hAnsi="Times New Roman"/>
+          <w:b/>
+          <w:i w:val="0"/>
+          <w:color w:val="1E293B"/>
+          <w:sz w:val="26"/>
+        </w:rPr>
+        <w:t xml:space="preserve">• NFR-03 [Bảo mật &amp; Xác thực]: </w:t>
+      </w:r>
+      <w:r>
+        <w:rPr>
+          <w:rFonts w:ascii="Times New Roman" w:hAnsi="Times New Roman"/>
+          <w:b w:val="0"/>
+          <w:i w:val="0"/>
+          <w:color w:val="1E293B"/>
+          <w:sz w:val="26"/>
+        </w:rPr>
+        <w:t>Mật khẩu người dùng được băm an toàn bằng Bcrypt. Xác thực API sử dụng JWT HS256. Xác thực Google OAuth2 kiểm tra chữ ký mật mã nghiêm ngặt.</w:t>
+      </w:r>
+    </w:p>
+    <w:p>
+      <w:pPr>
+        <w:spacing w:line="300" w:lineRule="auto" w:before="40" w:after="80"/>
+        <w:ind w:left="360"/>
+      </w:pPr>
+      <w:r>
+        <w:rPr>
+          <w:rFonts w:ascii="Times New Roman" w:hAnsi="Times New Roman"/>
+          <w:b/>
+          <w:i w:val="0"/>
+          <w:color w:val="1E293B"/>
+          <w:sz w:val="26"/>
+        </w:rPr>
+        <w:t xml:space="preserve">• NFR-04 [Khả năng phục hồi AI]: </w:t>
+      </w:r>
+      <w:r>
+        <w:rPr>
+          <w:rFonts w:ascii="Times New Roman" w:hAnsi="Times New Roman"/>
+          <w:b w:val="0"/>
+          <w:i w:val="0"/>
+          <w:color w:val="1E293B"/>
+          <w:sz w:val="26"/>
+        </w:rPr>
+        <w:t>Luồng gọi AI áp dụng cơ chế Cascade 3 tầng (Cloud LLM -&gt; Local Ollama -&gt; Heuristic Rule Engine), đảm bảo hệ thống luôn trả về dữ liệu JSON hợp lệ ngay cả khi mất kết nối Internet.</w:t>
+      </w:r>
+    </w:p>
+    <w:p>
+      <w:pPr>
+        <w:spacing w:line="300" w:lineRule="auto" w:before="40" w:after="80"/>
+        <w:ind w:left="360"/>
+      </w:pPr>
+      <w:r>
+        <w:rPr>
+          <w:rFonts w:ascii="Times New Roman" w:hAnsi="Times New Roman"/>
+          <w:b/>
+          <w:i w:val="0"/>
+          <w:color w:val="1E293B"/>
+          <w:sz w:val="26"/>
+        </w:rPr>
+        <w:t xml:space="preserve">• NFR-05 [Độ tương phản &amp; Công thái học]: </w:t>
+      </w:r>
+      <w:r>
+        <w:rPr>
+          <w:rFonts w:ascii="Times New Roman" w:hAnsi="Times New Roman"/>
+          <w:b w:val="0"/>
+          <w:i w:val="0"/>
+          <w:color w:val="1E293B"/>
+          <w:sz w:val="26"/>
+        </w:rPr>
+        <w:t>Giao diện tuân thủ bảng màu Slate đơn sắc có độ tương phản cao, chuyển đổi Light/Dark mode với độ trễ 0ms.</w:t>
+      </w:r>
+    </w:p>
+    <w:p>
+      <w:pPr>
+        <w:spacing w:line="300" w:lineRule="auto" w:before="40" w:after="80"/>
+        <w:ind w:left="360"/>
+      </w:pPr>
+      <w:r>
+        <w:rPr>
+          <w:rFonts w:ascii="Times New Roman" w:hAnsi="Times New Roman"/>
+          <w:b/>
+          <w:i w:val="0"/>
+          <w:color w:val="1E293B"/>
+          <w:sz w:val="26"/>
+        </w:rPr>
+        <w:t xml:space="preserve">• NFR-06 [Tính toàn vẹn dữ liệu]: </w:t>
+      </w:r>
+      <w:r>
+        <w:rPr>
+          <w:rFonts w:ascii="Times New Roman" w:hAnsi="Times New Roman"/>
+          <w:b w:val="0"/>
+          <w:i w:val="0"/>
+          <w:color w:val="1E293B"/>
+          <w:sz w:val="26"/>
+        </w:rPr>
+        <w:t>Bật cơ chế PRAGMA foreign_keys = ON trên toàn bộ kết nối cơ sở dữ liệu để đảm bảo các ràng buộc khóa ngoại và xóa xếp tầng (CASCADE) hoạt động chính xác.</w:t>
+      </w:r>
+    </w:p>
+    <w:p>
+      <w:pPr>
+        <w:keepNext/>
+        <w:spacing w:line="300" w:lineRule="auto" w:before="200" w:after="80"/>
+      </w:pPr>
+      <w:r>
+        <w:rPr>
+          <w:rFonts w:ascii="Times New Roman" w:hAnsi="Times New Roman"/>
+          <w:b/>
+          <w:i w:val="0"/>
+          <w:color w:val="0F172A"/>
+          <w:sz w:val="27"/>
+        </w:rPr>
+        <w:t>1.6. Xác định bài toán ứng dụng AI và phạm vi tích hợp</w:t>
+      </w:r>
+    </w:p>
+    <w:p>
+      <w:pPr>
+        <w:spacing w:line="300" w:lineRule="auto" w:before="40" w:after="80"/>
+      </w:pPr>
+      <w:r>
+        <w:rPr>
+          <w:rFonts w:ascii="Times New Roman" w:hAnsi="Times New Roman"/>
+          <w:b w:val="0"/>
+          <w:i w:val="0"/>
+          <w:color w:val="1E293B"/>
+          <w:sz w:val="26"/>
+        </w:rPr>
+        <w:t>Trong khuôn khổ đề tài, Koshi tập trung ứng dụng các mô hình ngôn ngữ lớn (LLMs) vào 3 bài toán xử lý ngôn ngữ tự nhiên then chốt:</w:t>
+      </w:r>
+    </w:p>
+    <w:p>
+      <w:pPr>
+        <w:spacing w:line="300" w:lineRule="auto" w:before="40" w:after="80"/>
+        <w:ind w:left="360"/>
+      </w:pPr>
+      <w:r>
+        <w:rPr>
+          <w:rFonts w:ascii="Times New Roman" w:hAnsi="Times New Roman"/>
+          <w:b/>
+          <w:i w:val="0"/>
+          <w:color w:val="1E293B"/>
+          <w:sz w:val="26"/>
+        </w:rPr>
+        <w:t xml:space="preserve">1. Bài toán Tóm tắt văn bản có cấu trúc (Structured Summarization): </w:t>
+      </w:r>
+      <w:r>
+        <w:rPr>
+          <w:rFonts w:ascii="Times New Roman" w:hAnsi="Times New Roman"/>
+          <w:b w:val="0"/>
+          <w:i w:val="0"/>
+          <w:color w:val="1E293B"/>
+          <w:sz w:val="26"/>
+        </w:rPr>
+        <w:t>Tổng hợp dữ liệu trạng thái công việc trong sprint thành báo cáo súc tích 3 phần (Tổng quan, Điểm nghẽn tiến độ, Ưu tiên tiếp theo).</w:t>
+      </w:r>
+    </w:p>
+    <w:p>
+      <w:pPr>
+        <w:spacing w:line="300" w:lineRule="auto" w:before="40" w:after="80"/>
+        <w:ind w:left="360"/>
+      </w:pPr>
+      <w:r>
+        <w:rPr>
+          <w:rFonts w:ascii="Times New Roman" w:hAnsi="Times New Roman"/>
+          <w:b/>
+          <w:i w:val="0"/>
+          <w:color w:val="1E293B"/>
+          <w:sz w:val="26"/>
+        </w:rPr>
+        <w:t xml:space="preserve">2. Bài toán Trích xuất thông tin thực thể (Information Extraction): </w:t>
+      </w:r>
+      <w:r>
+        <w:rPr>
+          <w:rFonts w:ascii="Times New Roman" w:hAnsi="Times New Roman"/>
+          <w:b w:val="0"/>
+          <w:i w:val="0"/>
+          <w:color w:val="1E293B"/>
+          <w:sz w:val="26"/>
+        </w:rPr>
+        <w:t>Phân tích văn bản thô từ biên bản cuộc họp để trích xuất danh sách công việc, người chịu trách nhiệm, độ ưu tiên và thời hạn bàn giao.</w:t>
+      </w:r>
+    </w:p>
+    <w:p>
+      <w:pPr>
+        <w:spacing w:line="300" w:lineRule="auto" w:before="40" w:after="80"/>
+        <w:ind w:left="360"/>
+      </w:pPr>
+      <w:r>
+        <w:rPr>
+          <w:rFonts w:ascii="Times New Roman" w:hAnsi="Times New Roman"/>
+          <w:b/>
+          <w:i w:val="0"/>
+          <w:color w:val="1E293B"/>
+          <w:sz w:val="26"/>
+        </w:rPr>
+        <w:t xml:space="preserve">3. Bài toán Tối ưu hóa phân bổ nguồn lực (Capacity Optimization): </w:t>
+      </w:r>
+      <w:r>
+        <w:rPr>
+          <w:rFonts w:ascii="Times New Roman" w:hAnsi="Times New Roman"/>
+          <w:b w:val="0"/>
+          <w:i w:val="0"/>
+          <w:color w:val="1E293B"/>
+          <w:sz w:val="26"/>
+        </w:rPr>
+        <w:t>Đánh giá ma trận kỹ năng và số điểm độ phức tạp công việc đang thực hiện (WIP points) để đề xuất lập trình viên phù hợp nhất.</w:t>
+      </w:r>
+    </w:p>
+    <w:p>
+      <w:pPr>
         <w:pStyle w:val="21Level2c2"/>
         <w:rPr>
           <w:rFonts w:cs="Times New Roman"/>
           <w:color w:val="FF0000"/>
         </w:rPr>
       </w:pPr>
-      <w:r>
-        <w:t>1.1. Bối cảnh bài toán và lý do phát triển</w:t>
-        <w:br/>
-        <w:t>Koshi được định vị là hệ thống quản lý công việc và tiến độ sprint nội bộ dành cho các đội ngũ kỹ sư phần mềm chuyên sâu. Bối cảnh nghiệp vụ tập trung giải quyết nhu cầu của 3 nhóm đối tượng chính (User Personas):</w:t>
-        <w:br/>
-        <w:t>• Lead Architect / Senior Engineer: Đòi hỏi thao tác 100% bằng bàn phím không dùng chuột (h/j/k/l, Space, i, n, Esc), chuyển đổi tức thì giữa dạng Bảng (Table) và Kanban 2D, phát hiện sớm các điểm nghẽn tiến độ (Critical Path) trên đồ thị phụ thuộc.</w:t>
-        <w:br/>
-        <w:t>• Project Manager (PM) / Tech Lead: Cần tự động hóa khâu lập báo cáo tiến độ tuần, tự động trích xuất đầu việc từ biên bản họp văn bản thô và nhận gợi ý phân công công việc dựa trên số điểm độ phức tạp (WIP story points) của từng kỹ sư.</w:t>
-        <w:br/>
-        <w:t>• Field / Mobile Developer: Cần khả năng làm việc ngoại tuyến (Offline-first) khi mất kết nối mạng và đồng bộ tự động dữ liệu vào IndexedDB cục bộ với độ trễ phản hồi giao diện dưới 16ms.</w:t>
-        <w:br/>
-        <w:br/>
-        <w:t>1.2. Khảo sát hiện trạng và các giải pháp tương tự</w:t>
-        <w:br/>
-        <w:t>Khảo sát đối chuẩn giữa Koshi và các hệ thống quản lý dự án hàng đầu hiện nay:</w:t>
-        <w:br/>
-        <w:t>• Jira Software: Hệ thống hoàn chỉnh nhưng cồng kềnh, thời gian phản hồi giao diện chậm, phụ thuộc 100% vào kết nối mạng, thao tác bàn phím hạn chế.</w:t>
-        <w:br/>
-        <w:t>• Trello: Trực quan, đơn giản nhưng thiếu khả năng phân tích đồ thị phụ thuộc DAG, không tối ưu cho luồng làm việc kỹ thuật cao.</w:t>
-        <w:br/>
-        <w:t>• Linear: Giao diện hiện đại, hỗ trợ phím tắt tốt nhưng chưa hỗ trợ phân rã mục tiêu chuyên sâu bằng AI và không có cơ chế phân tích đường găng CPM tự động.</w:t>
-        <w:br/>
-        <w:t>• Koshi (Hệ thống đề xuất): Kết hợp triết lý Local-First, điều hướng bàn phím 2D (Vim ergonomics), phân tích chuỗi phụ thuộc bằng giải thuật Kahn kết hợp 3 luồng trợ lý AI quản trị dự án có cơ chế dự phòng 3 tầng.</w:t>
-        <w:br/>
-        <w:br/>
-        <w:t>1.3. Mô hình Actor và Phân hệ Use Case tổng quát</w:t>
-        <w:br/>
-        <w:t>Hệ thống phân cấp 3 nhóm tác nhân (Actors) với các phân hệ Use Case chính:</w:t>
-        <w:br/>
-        <w:t>1. Guest (Khách vãng lai): Đăng ký tài khoản mới, Đăng nhập hệ thống qua Email/Mật khẩu hoặc Google OAuth2, Xem dữ liệu mẫu thử nghiệm.</w:t>
-        <w:br/>
-        <w:t>2. Team Member (Lập trình viên): Duyệt bảng công việc (Table/Kanban), Chuyển trạng thái vòng tròn (Space), Chỉnh sửa chi tiết công việc (i/Esc), Tạo công việc mới (n), Phân rã mục tiêu bằng AI, Bóc tách Git Diff để tự động đóng ticket.</w:t>
-        <w:br/>
-        <w:t>3. Project Manager (Quản lý dự án): Quản trị thành viên dự án qua project_members, Sinh Báo cáo tổng kết tuần (AI Weekly Summary), Bóc tách biên bản họp (AI Meeting Minutes), Cân bằng tải nhân sự (AI Smart Assignment) và trực quan hóa chuỗi phụ thuộc đồ thị (DAG Visualizer).</w:t>
-        <w:br/>
-        <w:br/>
-        <w:t>1.4. Đặc tả yêu cầu chức năng cốt lõi (Functional Requirements)</w:t>
-        <w:br/>
-        <w:t>• FR-01 [Dual-Mode Views]: Chuyển đổi giao diện tức thì giữa Table View mật độ cao và Kanban Board 2D qua phím tắt 'b' với thời gian &lt; 16ms.</w:t>
-        <w:br/>
-        <w:t>• FR-02 [Vim Spatial Navigation]: Hỗ trợ điều hướng bàn phím đầy đủ: j/k duyệt dòng trong Table, h/j/k/l duyệt lưới Kanban, Space đổi trạng thái tuần hoàn (TODO -&gt; IN_PROGRESS -&gt; BLOCKED -&gt; DONE -&gt; TODO).</w:t>
-        <w:br/>
-        <w:t>• FR-03 [Task Detail Inspector]: Phím Enter mở modal chi tiết, phím 'i' chuyển sang Edit Mode cho phép chỉnh sửa toàn bộ thuộc tính, phím Escape lưu thay đổi và thoát Edit Mode.</w:t>
-        <w:br/>
-        <w:t>• FR-04 [Capture-Phase Escape Trap]: Bắt sự kiện Escape ở mức window capture phase để đảm bảo đóng modal hoặc hủy chế độ sửa ngay lập tức mà không bị nuốt bởi ô nhập văn bản.</w:t>
-        <w:br/>
-        <w:t>• FR-05 [Project-Scoped RBAC]: Tách biệt quyền hạn theo từng dự án cụ thể thông qua bảng project_members. Cho phép tìm kiếm người dùng trong hệ thống để thêm vào dự án với vai trò OWNER, PM hoặc MEMBER.</w:t>
-        <w:br/>
-        <w:t>• FR-06 [Topological DAG &amp; CPM]: Sử dụng giải thuật Kahn để phân tích chuỗi phụ thuộc, phát hiện vòng lặp chu trình (Cycle Detection) và tính toán đường găng (Critical Path) cảnh báo điểm nghẽn.</w:t>
-        <w:br/>
-        <w:t>• FR-07 [Autonomous AI PM Workflows]: Tích hợp 3 chức năng AI chuyên sâu: Tóm tắt tiến độ tuần (3 phần Overview, Blockers, Priorities), Bóc tách biên bản họp ra Action Items, và Gợi ý phân bổ công việc theo kỹ năng và tải trọng WIP.</w:t>
-        <w:br/>
-        <w:t>• FR-08 [Retrospective Work Logging]: Cho phép tạo công việc mới trực tiếp ở trạng thái DONE để hỗ trợ ghi nhận các tác vụ đột xuất hoặc hotfix mà không cần qua trạng thái trung gian.</w:t>
-        <w:br/>
-        <w:br/>
-        <w:t>1.5. Đặc tả yêu cầu phi chức năng (Non-Functional Requirements)</w:t>
-        <w:br/>
-        <w:t>• NFR-01 [Hiệu năng &amp; Độ trễ]: Mọi thao tác điều hướng bàn phím và render giao diện cục bộ phải phản hồi trong thời gian &lt; 16ms (tương đương 60fps).</w:t>
-        <w:br/>
-        <w:t>• NFR-02 [Độ tin cậy &amp; Concurrency]: Hệ thống CSDL SQLite phải được cấu hình PRAGMA journal_mode = WAL và busy_timeout = 30000ms nhằm đảm bảo không bị lỗi khóa ghi khi nhiều người dùng thao tác đồng thời.</w:t>
-        <w:br/>
-        <w:t>• NFR-03 [Bảo mật &amp; Xác thực]: Mật khẩu người dùng được băm an toàn bằng Bcrypt. Xác thực API sử dụng JWT HS256. Xác thực Google OAuth2 kiểm tra chữ ký mật mã nghiêm ngặt.</w:t>
-        <w:br/>
-        <w:t>• NFR-04 [Khả năng phục hồi AI]: Luồng gọi AI áp dụng cơ chế Cascade 3 tầng (Cloud LLM -&gt; Local Ollama -&gt; Heuristic Rule Engine), đảm bảo hệ thống luôn trả về dữ liệu JSON hợp lệ ngay cả khi mất kết nối Internet.</w:t>
-        <w:br/>
-        <w:t>• NFR-05 [Độ tương phản &amp; Công thái học]: Giao diện tuân thủ bảng màu Slate đơn sắc có độ tương phản cao, chuyển đổi Light/Dark mode với độ trễ 0ms.</w:t>
-        <w:br/>
-        <w:t>• NFR-06 [Tính toàn vẹn dữ liệu]: Bật cơ chế PRAGMA foreign_keys = ON trên toàn bộ kết nối cơ sở dữ liệu để đảm bảo các ràng buộc khóa ngoại và xóa xếp tầng (CASCADE) hoạt động chính xác.</w:t>
-        <w:br/>
-        <w:br/>
-        <w:t>1.6. Xác định bài toán ứng dụng AI và phạm vi tích hợp</w:t>
-        <w:br/>
-        <w:t>Trong khuôn khổ đề tài, Koshi tập trung ứng dụng các mô hình ngôn ngữ lớn (LLMs) vào 3 bài toán xử lý ngôn ngữ tự nhiên then chốt:</w:t>
-        <w:br/>
-        <w:t>1. Bài toán Tóm tắt văn bản có cấu trúc (Structured Summarization): Tổng hợp dữ liệu trạng thái công việc trong sprint thành báo cáo súc tích 3 phần (Tổng quan, Điểm nghẽn tiến độ, Ưu tiên tiếp theo).</w:t>
-        <w:br/>
-        <w:t>2. Bài toán Trích xuất thông tin thực thể (Information Extraction): Phân tích văn bản thô từ biên bản cuộc họp để trích xuất danh sách công việc, người chịu trách nhiệm, độ ưu tiên và thời hạn bàn giao.</w:t>
-        <w:br/>
-        <w:t>3. Bài toán Tối ưu hóa phân bổ nguồn lực (Capacity Optimization): Đánh giá ma trận kỹ năng và số điểm độ phức tạp công việc đang thực hiện (WIP points) để đề xuất lập trình viên phù hợp nhất.</w:t>
-      </w:r>
+      <w:r/>
     </w:p>
     <w:p>
       <w:pPr>
@@ -5772,13 +6282,45 @@
           <w:color w:val="FF0000"/>
         </w:rPr>
       </w:pPr>
-      <w:r/>
+      <w:proofErr w:type="spellStart"/>
+      <w:r>
+        <w:rPr>
+          <w:color w:val="FF0000"/>
+        </w:rPr>
+        <w:t>Thuật</w:t>
+      </w:r>
+      <w:proofErr w:type="spellEnd"/>
+      <w:r>
+        <w:rPr>
+          <w:color w:val="FF0000"/>
+        </w:rPr>
+        <w:t xml:space="preserve"> </w:t>
+      </w:r>
+      <w:proofErr w:type="spellStart"/>
+      <w:r>
+        <w:rPr>
+          <w:color w:val="FF0000"/>
+        </w:rPr>
+        <w:t>ngữ</w:t>
+      </w:r>
+      <w:proofErr w:type="spellEnd"/>
+      <w:r>
+        <w:rPr>
+          <w:color w:val="FF0000"/>
+        </w:rPr>
+        <w:t xml:space="preserve"> </w:t>
+      </w:r>
+      <w:r>
+        <w:rPr>
+          <w:color w:val="FF0000"/>
+        </w:rPr>
+        <w:t>…</w:t>
+      </w:r>
     </w:p>
     <w:p>
       <w:pPr>
         <w:pStyle w:val="0TEXTc1"/>
       </w:pPr>
-      <w:r/>
     </w:p>
     <w:p>
       <w:pPr>
@@ -5790,7 +6332,16 @@
           <w:szCs w:val="32"/>
         </w:rPr>
       </w:pPr>
-      <w:r/>
+      <w:r>
+        <w:rPr>
+          <w:rFonts w:ascii="Times New Roman" w:hAnsi="Times New Roman" w:cs="Times New Roman"/>
+          <w:b/>
+          <w:bCs/>
+          <w:sz w:val="32"/>
+          <w:szCs w:val="32"/>
+        </w:rPr>
+        <w:br w:type="page"/>
+      </w:r>
     </w:p>
     <w:p>
       <w:pPr>

</xml_diff>

<commit_message>
chore(release): refresh submission artifacts, gitignore rules, and push state
</commit_message>
<xml_diff>
--- a/nhom4.docx
+++ b/nhom4.docx
@@ -1539,9 +1539,79 @@
           <w:sz w:val="22"/>
         </w:rPr>
       </w:pPr>
-      <w:r>
-        <w:t>CHƯƠNG 2. THIẾT KẾ HỆ THỐNG (BÀI KIỂM TRA 2)</w:t>
-      </w:r>
+      <w:hyperlink w:anchor="_Toc116549840" w:history="1">
+        <w:r>
+          <w:rPr>
+            <w:rStyle w:val="Hyperlink"/>
+            <w:noProof/>
+          </w:rPr>
+          <w:t>CHƯƠNG 2.</w:t>
+        </w:r>
+        <w:r>
+          <w:rPr>
+            <w:rStyle w:val="Hyperlink"/>
+            <w:noProof/>
+            <w:spacing w:val="100"/>
+          </w:rPr>
+          <w:t xml:space="preserve"> </w:t>
+        </w:r>
+        <w:r>
+          <w:rPr>
+            <w:rStyle w:val="Hyperlink"/>
+            <w:rFonts w:cs="Times New Roman"/>
+            <w:noProof/>
+          </w:rPr>
+          <w:t>MẠNG NƠ-RON VGGNET</w:t>
+        </w:r>
+        <w:r>
+          <w:rPr>
+            <w:noProof/>
+            <w:webHidden/>
+          </w:rPr>
+          <w:tab/>
+        </w:r>
+        <w:r>
+          <w:rPr>
+            <w:noProof/>
+            <w:webHidden/>
+          </w:rPr>
+          <w:fldChar w:fldCharType="begin"/>
+        </w:r>
+        <w:r>
+          <w:rPr>
+            <w:noProof/>
+            <w:webHidden/>
+          </w:rPr>
+          <w:instrText xml:space="preserve"> PAGEREF _Toc116549840 \h </w:instrText>
+        </w:r>
+        <w:r>
+          <w:rPr>
+            <w:noProof/>
+            <w:webHidden/>
+          </w:rPr>
+        </w:r>
+        <w:r>
+          <w:rPr>
+            <w:noProof/>
+            <w:webHidden/>
+          </w:rPr>
+          <w:fldChar w:fldCharType="separate"/>
+        </w:r>
+        <w:r>
+          <w:rPr>
+            <w:noProof/>
+            <w:webHidden/>
+          </w:rPr>
+          <w:t>2</w:t>
+        </w:r>
+        <w:r>
+          <w:rPr>
+            <w:noProof/>
+            <w:webHidden/>
+          </w:rPr>
+          <w:fldChar w:fldCharType="end"/>
+        </w:r>
+      </w:hyperlink>
     </w:p>
     <w:p>
       <w:pPr>
@@ -1555,9 +1625,63 @@
           <w:sz w:val="22"/>
         </w:rPr>
       </w:pPr>
-      <w:r>
-        <w:t>2.1. Nội dung thiết kế kiến trúc và CSDL sẽ được hoàn thiện trong Bài kiểm tra 2 (KT2).</w:t>
-      </w:r>
+      <w:hyperlink w:anchor="_Toc116549841" w:history="1">
+        <w:r>
+          <w:rPr>
+            <w:rStyle w:val="Hyperlink"/>
+            <w:noProof/>
+          </w:rPr>
+          <w:t>2.1. Nội dung</w:t>
+        </w:r>
+        <w:r>
+          <w:rPr>
+            <w:noProof/>
+            <w:webHidden/>
+          </w:rPr>
+          <w:tab/>
+        </w:r>
+        <w:r>
+          <w:rPr>
+            <w:noProof/>
+            <w:webHidden/>
+          </w:rPr>
+          <w:fldChar w:fldCharType="begin"/>
+        </w:r>
+        <w:r>
+          <w:rPr>
+            <w:noProof/>
+            <w:webHidden/>
+          </w:rPr>
+          <w:instrText xml:space="preserve"> PAGEREF _Toc116549841 \h </w:instrText>
+        </w:r>
+        <w:r>
+          <w:rPr>
+            <w:noProof/>
+            <w:webHidden/>
+          </w:rPr>
+        </w:r>
+        <w:r>
+          <w:rPr>
+            <w:noProof/>
+            <w:webHidden/>
+          </w:rPr>
+          <w:fldChar w:fldCharType="separate"/>
+        </w:r>
+        <w:r>
+          <w:rPr>
+            <w:noProof/>
+            <w:webHidden/>
+          </w:rPr>
+          <w:t>2</w:t>
+        </w:r>
+        <w:r>
+          <w:rPr>
+            <w:noProof/>
+            <w:webHidden/>
+          </w:rPr>
+          <w:fldChar w:fldCharType="end"/>
+        </w:r>
+      </w:hyperlink>
     </w:p>
     <w:p>
       <w:pPr>
@@ -3373,2031 +3497,6 @@
     </w:p>
     <w:p>
       <w:pPr>
-        <w:pStyle w:val="0TEXTc1"/>
-        <w:ind w:firstLine="0"/>
-      </w:pPr>
-    </w:p>
-    <w:p>
-      <w:pPr>
-        <w:rPr>
-          <w:rFonts w:ascii="Times New Roman" w:hAnsi="Times New Roman"/>
-          <w:b/>
-          <w:i/>
-          <w:sz w:val="26"/>
-        </w:rPr>
-      </w:pPr>
-      <w:r>
-        <w:rPr>
-          <w:b/>
-          <w:i/>
-        </w:rPr>
-        <w:br w:type="page"/>
-      </w:r>
-    </w:p>
-    <w:p>
-      <w:pPr>
-        <w:pStyle w:val="0TEXTc1"/>
-        <w:ind w:firstLine="0"/>
-        <w:rPr>
-          <w:b/>
-          <w:i/>
-        </w:rPr>
-      </w:pPr>
-      <w:r/>
-    </w:p>
-    <w:p>
-      <w:pPr>
-        <w:pStyle w:val="0TEXTc1"/>
-        <w:rPr>
-          <w:i/>
-        </w:rPr>
-      </w:pPr>
-      <w:r/>
-    </w:p>
-    <w:p>
-      <w:pPr>
-        <w:pStyle w:val="0TEXTc1"/>
-        <w:rPr>
-          <w:i/>
-        </w:rPr>
-      </w:pPr>
-      <w:r/>
-    </w:p>
-    <w:p>
-      <w:pPr>
-        <w:pStyle w:val="0TEXTc1"/>
-        <w:rPr>
-          <w:i/>
-        </w:rPr>
-      </w:pPr>
-      <w:r/>
-    </w:p>
-    <w:p>
-      <w:pPr>
-        <w:pStyle w:val="0TEXTc1"/>
-        <w:rPr>
-          <w:i/>
-        </w:rPr>
-      </w:pPr>
-      <w:r/>
-    </w:p>
-    <w:p>
-      <w:pPr>
-        <w:pStyle w:val="0TEXTc1"/>
-      </w:pPr>
-    </w:p>
-    <w:p>
-      <w:pPr>
-        <w:pStyle w:val="0TEXTc1"/>
-        <w:rPr>
-          <w:lang w:val="vi-VN"/>
-        </w:rPr>
-      </w:pPr>
-      <w:r>
-        <w:rPr>
-          <w:noProof/>
-        </w:rPr>
-        <mc:AlternateContent>
-          <mc:Choice Requires="wps">
-            <w:drawing>
-              <wp:anchor distT="0" distB="0" distL="114300" distR="114300" simplePos="0" relativeHeight="251663360" behindDoc="0" locked="0" layoutInCell="1" allowOverlap="1" wp14:anchorId="2B04412D" wp14:editId="5803EC03">
-                <wp:simplePos x="0" y="0"/>
-                <wp:positionH relativeFrom="margin">
-                  <wp:posOffset>2148205</wp:posOffset>
-                </wp:positionH>
-                <wp:positionV relativeFrom="paragraph">
-                  <wp:posOffset>1715770</wp:posOffset>
-                </wp:positionV>
-                <wp:extent cx="900000" cy="900000"/>
-                <wp:effectExtent l="0" t="0" r="14605" b="14605"/>
-                <wp:wrapNone/>
-                <wp:docPr id="3" name="Oval 3"/>
-                <wp:cNvGraphicFramePr>
-                  <a:graphicFrameLocks xmlns:a="http://schemas.openxmlformats.org/drawingml/2006/main" noChangeAspect="1"/>
-                </wp:cNvGraphicFramePr>
-                <a:graphic xmlns:a="http://schemas.openxmlformats.org/drawingml/2006/main">
-                  <a:graphicData uri="http://schemas.microsoft.com/office/word/2010/wordprocessingShape">
-                    <wps:wsp>
-                      <wps:cNvSpPr>
-                        <a:spLocks noChangeAspect="1"/>
-                      </wps:cNvSpPr>
-                      <wps:spPr>
-                        <a:xfrm>
-                          <a:off x="0" y="0"/>
-                          <a:ext cx="900000" cy="900000"/>
-                        </a:xfrm>
-                        <a:prstGeom prst="ellipse">
-                          <a:avLst/>
-                        </a:prstGeom>
-                        <a:solidFill>
-                          <a:schemeClr val="bg1"/>
-                        </a:solidFill>
-                        <a:ln>
-                          <a:solidFill>
-                            <a:srgbClr val="0000FF"/>
-                          </a:solidFill>
-                        </a:ln>
-                      </wps:spPr>
-                      <wps:style>
-                        <a:lnRef idx="2">
-                          <a:schemeClr val="accent1">
-                            <a:shade val="50000"/>
-                          </a:schemeClr>
-                        </a:lnRef>
-                        <a:fillRef idx="1">
-                          <a:schemeClr val="accent1"/>
-                        </a:fillRef>
-                        <a:effectRef idx="0">
-                          <a:schemeClr val="accent1"/>
-                        </a:effectRef>
-                        <a:fontRef idx="minor">
-                          <a:schemeClr val="lt1"/>
-                        </a:fontRef>
-                      </wps:style>
-                      <wps:txbx>
-                        <w:txbxContent>
-                          <w:p>
-                            <w:pPr>
-                              <w:jc w:val="center"/>
-                            </w:pPr>
-                          </w:p>
-                        </w:txbxContent>
-                      </wps:txbx>
-                      <wps:bodyPr rot="0" spcFirstLastPara="0" vertOverflow="overflow" horzOverflow="overflow" vert="horz" wrap="square" lIns="0" tIns="0" rIns="0" bIns="45720" numCol="1" spcCol="0" rtlCol="0" fromWordArt="0" anchor="ctr" anchorCtr="0" forceAA="0" compatLnSpc="1">
-                        <a:prstTxWarp prst="textNoShape">
-                          <a:avLst/>
-                        </a:prstTxWarp>
-                        <a:noAutofit/>
-                      </wps:bodyPr>
-                    </wps:wsp>
-                  </a:graphicData>
-                </a:graphic>
-                <wp14:sizeRelH relativeFrom="margin">
-                  <wp14:pctWidth>0</wp14:pctWidth>
-                </wp14:sizeRelH>
-                <wp14:sizeRelV relativeFrom="margin">
-                  <wp14:pctHeight>0</wp14:pctHeight>
-                </wp14:sizeRelV>
-              </wp:anchor>
-            </w:drawing>
-          </mc:Choice>
-          <mc:Fallback>
-            <w:pict>
-              <v:oval w14:anchorId="2B04412D" id="Oval 3" o:spid="_x0000_s1026" style="position:absolute;left:0;text-align:left;margin-left:169.15pt;margin-top:135.1pt;width:70.85pt;height:70.85pt;z-index:251663360;visibility:visible;mso-wrap-style:square;mso-width-percent:0;mso-height-percent:0;mso-wrap-distance-left:9pt;mso-wrap-distance-top:0;mso-wrap-distance-right:9pt;mso-wrap-distance-bottom:0;mso-position-horizontal:absolute;mso-position-horizontal-relative:margin;mso-position-vertical:absolute;mso-position-vertical-relative:text;mso-width-percent:0;mso-height-percent:0;mso-width-relative:margin;mso-height-relative:margin;v-text-anchor:middle" o:gfxdata="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" fillcolor="white [3212]" strokecolor="blue" strokeweight="1pt">
-                <v:stroke joinstyle="miter"/>
-                <v:path arrowok="t"/>
-                <o:lock v:ext="edit" aspectratio="t"/>
-                <v:textbox inset="0,0,0">
-                  <w:txbxContent>
-                    <w:p>
-                      <w:pPr>
-                        <w:jc w:val="center"/>
-                      </w:pPr>
-                    </w:p>
-                  </w:txbxContent>
-                </v:textbox>
-                <w10:wrap anchorx="margin"/>
-              </v:oval>
-            </w:pict>
-          </mc:Fallback>
-        </mc:AlternateContent>
-      </w:r>
-      <w:r>
-        <w:rPr>
-          <w:noProof/>
-        </w:rPr>
-        <mc:AlternateContent>
-          <mc:Choice Requires="wps">
-            <w:drawing>
-              <wp:anchor distT="0" distB="0" distL="114300" distR="114300" simplePos="0" relativeHeight="251661312" behindDoc="0" locked="0" layoutInCell="1" allowOverlap="1" wp14:anchorId="00A7416A" wp14:editId="182BD6EE">
-                <wp:simplePos x="0" y="0"/>
-                <wp:positionH relativeFrom="margin">
-                  <wp:posOffset>438150</wp:posOffset>
-                </wp:positionH>
-                <wp:positionV relativeFrom="paragraph">
-                  <wp:posOffset>5715</wp:posOffset>
-                </wp:positionV>
-                <wp:extent cx="4320000" cy="4320000"/>
-                <wp:effectExtent l="0" t="0" r="23495" b="23495"/>
-                <wp:wrapNone/>
-                <wp:docPr id="2" name="Oval 2"/>
-                <wp:cNvGraphicFramePr>
-                  <a:graphicFrameLocks xmlns:a="http://schemas.openxmlformats.org/drawingml/2006/main" noChangeAspect="1"/>
-                </wp:cNvGraphicFramePr>
-                <a:graphic xmlns:a="http://schemas.openxmlformats.org/drawingml/2006/main">
-                  <a:graphicData uri="http://schemas.microsoft.com/office/word/2010/wordprocessingShape">
-                    <wps:wsp>
-                      <wps:cNvSpPr>
-                        <a:spLocks noChangeAspect="1"/>
-                      </wps:cNvSpPr>
-                      <wps:spPr>
-                        <a:xfrm>
-                          <a:off x="0" y="0"/>
-                          <a:ext cx="4320000" cy="4320000"/>
-                        </a:xfrm>
-                        <a:prstGeom prst="ellipse">
-                          <a:avLst/>
-                        </a:prstGeom>
-                        <a:solidFill>
-                          <a:schemeClr val="accent1">
-                            <a:lumMod val="20000"/>
-                            <a:lumOff val="80000"/>
-                          </a:schemeClr>
-                        </a:solidFill>
-                        <a:ln>
-                          <a:solidFill>
-                            <a:srgbClr val="0000FF"/>
-                          </a:solidFill>
-                        </a:ln>
-                      </wps:spPr>
-                      <wps:style>
-                        <a:lnRef idx="2">
-                          <a:schemeClr val="accent1">
-                            <a:shade val="50000"/>
-                          </a:schemeClr>
-                        </a:lnRef>
-                        <a:fillRef idx="1">
-                          <a:schemeClr val="accent1"/>
-                        </a:fillRef>
-                        <a:effectRef idx="0">
-                          <a:schemeClr val="accent1"/>
-                        </a:effectRef>
-                        <a:fontRef idx="minor">
-                          <a:schemeClr val="lt1"/>
-                        </a:fontRef>
-                      </wps:style>
-                      <wps:txbx>
-                        <w:txbxContent>
-                          <w:p>
-                            <w:pPr>
-                              <w:jc w:val="center"/>
-                              <w:rPr>
-                                <w:rFonts w:ascii="Times New Roman" w:hAnsi="Times New Roman" w:cs="Times New Roman"/>
-                                <w:b/>
-                                <w:color w:val="000000" w:themeColor="text1"/>
-                                <w:sz w:val="32"/>
-                                <w14:shadow w14:blurRad="38100" w14:dist="19050" w14:dir="2700000" w14:sx="100000" w14:sy="100000" w14:kx="0" w14:ky="0" w14:algn="tl">
-                                  <w14:schemeClr w14:val="dk1">
-                                    <w14:alpha w14:val="60000"/>
-                                  </w14:schemeClr>
-                                </w14:shadow>
-                                <w14:textOutline w14:w="0" w14:cap="flat" w14:cmpd="sng" w14:algn="ctr">
-                                  <w14:noFill/>
-                                  <w14:prstDash w14:val="solid"/>
-                                  <w14:round/>
-                                </w14:textOutline>
-                              </w:rPr>
-                            </w:pPr>
-                            <w:r>
-                              <w:rPr>
-                                <w:rFonts w:ascii="Times New Roman" w:hAnsi="Times New Roman" w:cs="Times New Roman"/>
-                                <w:b/>
-                                <w:color w:val="000000" w:themeColor="text1"/>
-                                <w:sz w:val="32"/>
-                                <w14:shadow w14:blurRad="38100" w14:dist="19050" w14:dir="2700000" w14:sx="100000" w14:sy="100000" w14:kx="0" w14:ky="0" w14:algn="tl">
-                                  <w14:schemeClr w14:val="dk1">
-                                    <w14:alpha w14:val="60000"/>
-                                  </w14:schemeClr>
-                                </w14:shadow>
-                                <w14:textOutline w14:w="0" w14:cap="flat" w14:cmpd="sng" w14:algn="ctr">
-                                  <w14:noFill/>
-                                  <w14:prstDash w14:val="solid"/>
-                                  <w14:round/>
-                                </w14:textOutline>
-                              </w:rPr>
-                              <w:t>NHÓM 01</w:t>
-                            </w:r>
-                            <w:r>
-                              <w:rPr>
-                                <w:rFonts w:ascii="Times New Roman" w:hAnsi="Times New Roman" w:cs="Times New Roman"/>
-                                <w:b/>
-                                <w:color w:val="000000" w:themeColor="text1"/>
-                                <w:sz w:val="32"/>
-                                <w14:shadow w14:blurRad="38100" w14:dist="19050" w14:dir="2700000" w14:sx="100000" w14:sy="100000" w14:kx="0" w14:ky="0" w14:algn="tl">
-                                  <w14:schemeClr w14:val="dk1">
-                                    <w14:alpha w14:val="60000"/>
-                                  </w14:schemeClr>
-                                </w14:shadow>
-                                <w14:textOutline w14:w="0" w14:cap="flat" w14:cmpd="sng" w14:algn="ctr">
-                                  <w14:noFill/>
-                                  <w14:prstDash w14:val="solid"/>
-                                  <w14:round/>
-                                </w14:textOutline>
-                              </w:rPr>
-                              <w:t>:</w:t>
-                            </w:r>
-                          </w:p>
-                          <w:p>
-                            <w:pPr>
-                              <w:jc w:val="center"/>
-                              <w:rPr>
-                                <w:rFonts w:ascii="Times New Roman" w:hAnsi="Times New Roman" w:cs="Times New Roman"/>
-                                <w:color w:val="000000" w:themeColor="text1"/>
-                                <w:sz w:val="32"/>
-                                <w14:shadow w14:blurRad="38100" w14:dist="19050" w14:dir="2700000" w14:sx="100000" w14:sy="100000" w14:kx="0" w14:ky="0" w14:algn="tl">
-                                  <w14:schemeClr w14:val="dk1">
-                                    <w14:alpha w14:val="60000"/>
-                                  </w14:schemeClr>
-                                </w14:shadow>
-                                <w14:textOutline w14:w="0" w14:cap="flat" w14:cmpd="sng" w14:algn="ctr">
-                                  <w14:noFill/>
-                                  <w14:prstDash w14:val="solid"/>
-                                  <w14:round/>
-                                </w14:textOutline>
-                              </w:rPr>
-                            </w:pPr>
-                            <w:proofErr w:type="spellStart"/>
-                            <w:r>
-                              <w:rPr>
-                                <w:rFonts w:ascii="Times New Roman" w:hAnsi="Times New Roman" w:cs="Times New Roman"/>
-                                <w:color w:val="000000" w:themeColor="text1"/>
-                                <w:sz w:val="28"/>
-                                <w:szCs w:val="20"/>
-                                <w14:shadow w14:blurRad="38100" w14:dist="19050" w14:dir="2700000" w14:sx="100000" w14:sy="100000" w14:kx="0" w14:ky="0" w14:algn="tl">
-                                  <w14:schemeClr w14:val="dk1">
-                                    <w14:alpha w14:val="60000"/>
-                                  </w14:schemeClr>
-                                </w14:shadow>
-                                <w14:textOutline w14:w="0" w14:cap="flat" w14:cmpd="sng" w14:algn="ctr">
-                                  <w14:noFill/>
-                                  <w14:prstDash w14:val="solid"/>
-                                  <w14:round/>
-                                </w14:textOutline>
-                              </w:rPr>
-                              <w:t>Hệ</w:t>
-                            </w:r>
-                            <w:proofErr w:type="spellEnd"/>
-                            <w:r>
-                              <w:rPr>
-                                <w:rFonts w:ascii="Times New Roman" w:hAnsi="Times New Roman" w:cs="Times New Roman"/>
-                                <w:color w:val="000000" w:themeColor="text1"/>
-                                <w:sz w:val="28"/>
-                                <w:szCs w:val="20"/>
-                                <w14:shadow w14:blurRad="38100" w14:dist="19050" w14:dir="2700000" w14:sx="100000" w14:sy="100000" w14:kx="0" w14:ky="0" w14:algn="tl">
-                                  <w14:schemeClr w14:val="dk1">
-                                    <w14:alpha w14:val="60000"/>
-                                  </w14:schemeClr>
-                                </w14:shadow>
-                                <w14:textOutline w14:w="0" w14:cap="flat" w14:cmpd="sng" w14:algn="ctr">
-                                  <w14:noFill/>
-                                  <w14:prstDash w14:val="solid"/>
-                                  <w14:round/>
-                                </w14:textOutline>
-                              </w:rPr>
-                              <w:t xml:space="preserve"> </w:t>
-                            </w:r>
-                            <w:proofErr w:type="spellStart"/>
-                            <w:r>
-                              <w:rPr>
-                                <w:rFonts w:ascii="Times New Roman" w:hAnsi="Times New Roman" w:cs="Times New Roman"/>
-                                <w:color w:val="000000" w:themeColor="text1"/>
-                                <w:sz w:val="28"/>
-                                <w:szCs w:val="20"/>
-                                <w14:shadow w14:blurRad="38100" w14:dist="19050" w14:dir="2700000" w14:sx="100000" w14:sy="100000" w14:kx="0" w14:ky="0" w14:algn="tl">
-                                  <w14:schemeClr w14:val="dk1">
-                                    <w14:alpha w14:val="60000"/>
-                                  </w14:schemeClr>
-                                </w14:shadow>
-                                <w14:textOutline w14:w="0" w14:cap="flat" w14:cmpd="sng" w14:algn="ctr">
-                                  <w14:noFill/>
-                                  <w14:prstDash w14:val="solid"/>
-                                  <w14:round/>
-                                </w14:textOutline>
-                              </w:rPr>
-                              <w:t>thống</w:t>
-                            </w:r>
-                            <w:proofErr w:type="spellEnd"/>
-                            <w:r>
-                              <w:rPr>
-                                <w:rFonts w:ascii="Times New Roman" w:hAnsi="Times New Roman" w:cs="Times New Roman"/>
-                                <w:color w:val="000000" w:themeColor="text1"/>
-                                <w:sz w:val="28"/>
-                                <w:szCs w:val="20"/>
-                                <w14:shadow w14:blurRad="38100" w14:dist="19050" w14:dir="2700000" w14:sx="100000" w14:sy="100000" w14:kx="0" w14:ky="0" w14:algn="tl">
-                                  <w14:schemeClr w14:val="dk1">
-                                    <w14:alpha w14:val="60000"/>
-                                  </w14:schemeClr>
-                                </w14:shadow>
-                                <w14:textOutline w14:w="0" w14:cap="flat" w14:cmpd="sng" w14:algn="ctr">
-                                  <w14:noFill/>
-                                  <w14:prstDash w14:val="solid"/>
-                                  <w14:round/>
-                                </w14:textOutline>
-                              </w:rPr>
-                              <w:t xml:space="preserve"> </w:t>
-                            </w:r>
-                            <w:proofErr w:type="spellStart"/>
-                            <w:r>
-                              <w:rPr>
-                                <w:rFonts w:ascii="Times New Roman" w:hAnsi="Times New Roman" w:cs="Times New Roman"/>
-                                <w:color w:val="000000" w:themeColor="text1"/>
-                                <w:sz w:val="28"/>
-                                <w:szCs w:val="20"/>
-                                <w14:shadow w14:blurRad="38100" w14:dist="19050" w14:dir="2700000" w14:sx="100000" w14:sy="100000" w14:kx="0" w14:ky="0" w14:algn="tl">
-                                  <w14:schemeClr w14:val="dk1">
-                                    <w14:alpha w14:val="60000"/>
-                                  </w14:schemeClr>
-                                </w14:shadow>
-                                <w14:textOutline w14:w="0" w14:cap="flat" w14:cmpd="sng" w14:algn="ctr">
-                                  <w14:noFill/>
-                                  <w14:prstDash w14:val="solid"/>
-                                  <w14:round/>
-                                </w14:textOutline>
-                              </w:rPr>
-                              <w:t>quản</w:t>
-                            </w:r>
-                            <w:proofErr w:type="spellEnd"/>
-                            <w:r>
-                              <w:rPr>
-                                <w:rFonts w:ascii="Times New Roman" w:hAnsi="Times New Roman" w:cs="Times New Roman"/>
-                                <w:color w:val="000000" w:themeColor="text1"/>
-                                <w:sz w:val="28"/>
-                                <w:szCs w:val="20"/>
-                                <w14:shadow w14:blurRad="38100" w14:dist="19050" w14:dir="2700000" w14:sx="100000" w14:sy="100000" w14:kx="0" w14:ky="0" w14:algn="tl">
-                                  <w14:schemeClr w14:val="dk1">
-                                    <w14:alpha w14:val="60000"/>
-                                  </w14:schemeClr>
-                                </w14:shadow>
-                                <w14:textOutline w14:w="0" w14:cap="flat" w14:cmpd="sng" w14:algn="ctr">
-                                  <w14:noFill/>
-                                  <w14:prstDash w14:val="solid"/>
-                                  <w14:round/>
-                                </w14:textOutline>
-                              </w:rPr>
-                              <w:t xml:space="preserve"> </w:t>
-                            </w:r>
-                            <w:proofErr w:type="spellStart"/>
-                            <w:r>
-                              <w:rPr>
-                                <w:rFonts w:ascii="Times New Roman" w:hAnsi="Times New Roman" w:cs="Times New Roman"/>
-                                <w:color w:val="000000" w:themeColor="text1"/>
-                                <w:sz w:val="28"/>
-                                <w:szCs w:val="20"/>
-                                <w14:shadow w14:blurRad="38100" w14:dist="19050" w14:dir="2700000" w14:sx="100000" w14:sy="100000" w14:kx="0" w14:ky="0" w14:algn="tl">
-                                  <w14:schemeClr w14:val="dk1">
-                                    <w14:alpha w14:val="60000"/>
-                                  </w14:schemeClr>
-                                </w14:shadow>
-                                <w14:textOutline w14:w="0" w14:cap="flat" w14:cmpd="sng" w14:algn="ctr">
-                                  <w14:noFill/>
-                                  <w14:prstDash w14:val="solid"/>
-                                  <w14:round/>
-                                </w14:textOutline>
-                              </w:rPr>
-                              <w:t>lý</w:t>
-                            </w:r>
-                            <w:proofErr w:type="spellEnd"/>
-                            <w:r>
-                              <w:rPr>
-                                <w:rFonts w:ascii="Times New Roman" w:hAnsi="Times New Roman" w:cs="Times New Roman"/>
-                                <w:color w:val="000000" w:themeColor="text1"/>
-                                <w:sz w:val="28"/>
-                                <w:szCs w:val="20"/>
-                                <w14:shadow w14:blurRad="38100" w14:dist="19050" w14:dir="2700000" w14:sx="100000" w14:sy="100000" w14:kx="0" w14:ky="0" w14:algn="tl">
-                                  <w14:schemeClr w14:val="dk1">
-                                    <w14:alpha w14:val="60000"/>
-                                  </w14:schemeClr>
-                                </w14:shadow>
-                                <w14:textOutline w14:w="0" w14:cap="flat" w14:cmpd="sng" w14:algn="ctr">
-                                  <w14:noFill/>
-                                  <w14:prstDash w14:val="solid"/>
-                                  <w14:round/>
-                                </w14:textOutline>
-                              </w:rPr>
-                              <w:t xml:space="preserve"> </w:t>
-                            </w:r>
-                            <w:proofErr w:type="spellStart"/>
-                            <w:r>
-                              <w:rPr>
-                                <w:rFonts w:ascii="Times New Roman" w:hAnsi="Times New Roman" w:cs="Times New Roman"/>
-                                <w:color w:val="000000" w:themeColor="text1"/>
-                                <w:sz w:val="28"/>
-                                <w:szCs w:val="20"/>
-                                <w14:shadow w14:blurRad="38100" w14:dist="19050" w14:dir="2700000" w14:sx="100000" w14:sy="100000" w14:kx="0" w14:ky="0" w14:algn="tl">
-                                  <w14:schemeClr w14:val="dk1">
-                                    <w14:alpha w14:val="60000"/>
-                                  </w14:schemeClr>
-                                </w14:shadow>
-                                <w14:textOutline w14:w="0" w14:cap="flat" w14:cmpd="sng" w14:algn="ctr">
-                                  <w14:noFill/>
-                                  <w14:prstDash w14:val="solid"/>
-                                  <w14:round/>
-                                </w14:textOutline>
-                              </w:rPr>
-                              <w:t>bán</w:t>
-                            </w:r>
-                            <w:proofErr w:type="spellEnd"/>
-                            <w:r>
-                              <w:rPr>
-                                <w:rFonts w:ascii="Times New Roman" w:hAnsi="Times New Roman" w:cs="Times New Roman"/>
-                                <w:color w:val="000000" w:themeColor="text1"/>
-                                <w:sz w:val="28"/>
-                                <w:szCs w:val="20"/>
-                                <w14:shadow w14:blurRad="38100" w14:dist="19050" w14:dir="2700000" w14:sx="100000" w14:sy="100000" w14:kx="0" w14:ky="0" w14:algn="tl">
-                                  <w14:schemeClr w14:val="dk1">
-                                    <w14:alpha w14:val="60000"/>
-                                  </w14:schemeClr>
-                                </w14:shadow>
-                                <w14:textOutline w14:w="0" w14:cap="flat" w14:cmpd="sng" w14:algn="ctr">
-                                  <w14:noFill/>
-                                  <w14:prstDash w14:val="solid"/>
-                                  <w14:round/>
-                                </w14:textOutline>
-                              </w:rPr>
-                              <w:t xml:space="preserve"> </w:t>
-                            </w:r>
-                            <w:proofErr w:type="spellStart"/>
-                            <w:r>
-                              <w:rPr>
-                                <w:rFonts w:ascii="Times New Roman" w:hAnsi="Times New Roman" w:cs="Times New Roman"/>
-                                <w:color w:val="000000" w:themeColor="text1"/>
-                                <w:sz w:val="28"/>
-                                <w:szCs w:val="20"/>
-                                <w14:shadow w14:blurRad="38100" w14:dist="19050" w14:dir="2700000" w14:sx="100000" w14:sy="100000" w14:kx="0" w14:ky="0" w14:algn="tl">
-                                  <w14:schemeClr w14:val="dk1">
-                                    <w14:alpha w14:val="60000"/>
-                                  </w14:schemeClr>
-                                </w14:shadow>
-                                <w14:textOutline w14:w="0" w14:cap="flat" w14:cmpd="sng" w14:algn="ctr">
-                                  <w14:noFill/>
-                                  <w14:prstDash w14:val="solid"/>
-                                  <w14:round/>
-                                </w14:textOutline>
-                              </w:rPr>
-                              <w:t>hàng</w:t>
-                            </w:r>
-                            <w:proofErr w:type="spellEnd"/>
-                            <w:r>
-                              <w:rPr>
-                                <w:rFonts w:ascii="Times New Roman" w:hAnsi="Times New Roman" w:cs="Times New Roman"/>
-                                <w:color w:val="000000" w:themeColor="text1"/>
-                                <w:sz w:val="28"/>
-                                <w:szCs w:val="20"/>
-                                <w14:shadow w14:blurRad="38100" w14:dist="19050" w14:dir="2700000" w14:sx="100000" w14:sy="100000" w14:kx="0" w14:ky="0" w14:algn="tl">
-                                  <w14:schemeClr w14:val="dk1">
-                                    <w14:alpha w14:val="60000"/>
-                                  </w14:schemeClr>
-                                </w14:shadow>
-                                <w14:textOutline w14:w="0" w14:cap="flat" w14:cmpd="sng" w14:algn="ctr">
-                                  <w14:noFill/>
-                                  <w14:prstDash w14:val="solid"/>
-                                  <w14:round/>
-                                </w14:textOutline>
-                              </w:rPr>
-                              <w:t xml:space="preserve"> </w:t>
-                            </w:r>
-                            <w:proofErr w:type="spellStart"/>
-                            <w:r>
-                              <w:rPr>
-                                <w:rFonts w:ascii="Times New Roman" w:hAnsi="Times New Roman" w:cs="Times New Roman"/>
-                                <w:color w:val="000000" w:themeColor="text1"/>
-                                <w:sz w:val="28"/>
-                                <w:szCs w:val="20"/>
-                                <w14:shadow w14:blurRad="38100" w14:dist="19050" w14:dir="2700000" w14:sx="100000" w14:sy="100000" w14:kx="0" w14:ky="0" w14:algn="tl">
-                                  <w14:schemeClr w14:val="dk1">
-                                    <w14:alpha w14:val="60000"/>
-                                  </w14:schemeClr>
-                                </w14:shadow>
-                                <w14:textOutline w14:w="0" w14:cap="flat" w14:cmpd="sng" w14:algn="ctr">
-                                  <w14:noFill/>
-                                  <w14:prstDash w14:val="solid"/>
-                                  <w14:round/>
-                                </w14:textOutline>
-                              </w:rPr>
-                              <w:t>có</w:t>
-                            </w:r>
-                            <w:proofErr w:type="spellEnd"/>
-                            <w:r>
-                              <w:rPr>
-                                <w:rFonts w:ascii="Times New Roman" w:hAnsi="Times New Roman" w:cs="Times New Roman"/>
-                                <w:color w:val="000000" w:themeColor="text1"/>
-                                <w:sz w:val="28"/>
-                                <w:szCs w:val="20"/>
-                                <w14:shadow w14:blurRad="38100" w14:dist="19050" w14:dir="2700000" w14:sx="100000" w14:sy="100000" w14:kx="0" w14:ky="0" w14:algn="tl">
-                                  <w14:schemeClr w14:val="dk1">
-                                    <w14:alpha w14:val="60000"/>
-                                  </w14:schemeClr>
-                                </w14:shadow>
-                                <w14:textOutline w14:w="0" w14:cap="flat" w14:cmpd="sng" w14:algn="ctr">
-                                  <w14:noFill/>
-                                  <w14:prstDash w14:val="solid"/>
-                                  <w14:round/>
-                                </w14:textOutline>
-                              </w:rPr>
-                              <w:t xml:space="preserve"> </w:t>
-                            </w:r>
-                            <w:proofErr w:type="spellStart"/>
-                            <w:r>
-                              <w:rPr>
-                                <w:rFonts w:ascii="Times New Roman" w:hAnsi="Times New Roman" w:cs="Times New Roman"/>
-                                <w:color w:val="000000" w:themeColor="text1"/>
-                                <w:sz w:val="28"/>
-                                <w:szCs w:val="20"/>
-                                <w14:shadow w14:blurRad="38100" w14:dist="19050" w14:dir="2700000" w14:sx="100000" w14:sy="100000" w14:kx="0" w14:ky="0" w14:algn="tl">
-                                  <w14:schemeClr w14:val="dk1">
-                                    <w14:alpha w14:val="60000"/>
-                                  </w14:schemeClr>
-                                </w14:shadow>
-                                <w14:textOutline w14:w="0" w14:cap="flat" w14:cmpd="sng" w14:algn="ctr">
-                                  <w14:noFill/>
-                                  <w14:prstDash w14:val="solid"/>
-                                  <w14:round/>
-                                </w14:textOutline>
-                              </w:rPr>
-                              <w:t>tích</w:t>
-                            </w:r>
-                            <w:proofErr w:type="spellEnd"/>
-                            <w:r>
-                              <w:rPr>
-                                <w:rFonts w:ascii="Times New Roman" w:hAnsi="Times New Roman" w:cs="Times New Roman"/>
-                                <w:color w:val="000000" w:themeColor="text1"/>
-                                <w:sz w:val="28"/>
-                                <w:szCs w:val="20"/>
-                                <w14:shadow w14:blurRad="38100" w14:dist="19050" w14:dir="2700000" w14:sx="100000" w14:sy="100000" w14:kx="0" w14:ky="0" w14:algn="tl">
-                                  <w14:schemeClr w14:val="dk1">
-                                    <w14:alpha w14:val="60000"/>
-                                  </w14:schemeClr>
-                                </w14:shadow>
-                                <w14:textOutline w14:w="0" w14:cap="flat" w14:cmpd="sng" w14:algn="ctr">
-                                  <w14:noFill/>
-                                  <w14:prstDash w14:val="solid"/>
-                                  <w14:round/>
-                                </w14:textOutline>
-                              </w:rPr>
-                              <w:t xml:space="preserve"> </w:t>
-                            </w:r>
-                            <w:proofErr w:type="spellStart"/>
-                            <w:r>
-                              <w:rPr>
-                                <w:rFonts w:ascii="Times New Roman" w:hAnsi="Times New Roman" w:cs="Times New Roman"/>
-                                <w:color w:val="000000" w:themeColor="text1"/>
-                                <w:sz w:val="28"/>
-                                <w:szCs w:val="20"/>
-                                <w14:shadow w14:blurRad="38100" w14:dist="19050" w14:dir="2700000" w14:sx="100000" w14:sy="100000" w14:kx="0" w14:ky="0" w14:algn="tl">
-                                  <w14:schemeClr w14:val="dk1">
-                                    <w14:alpha w14:val="60000"/>
-                                  </w14:schemeClr>
-                                </w14:shadow>
-                                <w14:textOutline w14:w="0" w14:cap="flat" w14:cmpd="sng" w14:algn="ctr">
-                                  <w14:noFill/>
-                                  <w14:prstDash w14:val="solid"/>
-                                  <w14:round/>
-                                </w14:textOutline>
-                              </w:rPr>
-                              <w:t>hợp</w:t>
-                            </w:r>
-                            <w:proofErr w:type="spellEnd"/>
-                            <w:r>
-                              <w:rPr>
-                                <w:rFonts w:ascii="Times New Roman" w:hAnsi="Times New Roman" w:cs="Times New Roman"/>
-                                <w:color w:val="000000" w:themeColor="text1"/>
-                                <w:sz w:val="28"/>
-                                <w:szCs w:val="20"/>
-                                <w14:shadow w14:blurRad="38100" w14:dist="19050" w14:dir="2700000" w14:sx="100000" w14:sy="100000" w14:kx="0" w14:ky="0" w14:algn="tl">
-                                  <w14:schemeClr w14:val="dk1">
-                                    <w14:alpha w14:val="60000"/>
-                                  </w14:schemeClr>
-                                </w14:shadow>
-                                <w14:textOutline w14:w="0" w14:cap="flat" w14:cmpd="sng" w14:algn="ctr">
-                                  <w14:noFill/>
-                                  <w14:prstDash w14:val="solid"/>
-                                  <w14:round/>
-                                </w14:textOutline>
-                              </w:rPr>
-                              <w:t xml:space="preserve"> AI</w:t>
-                            </w:r>
-                          </w:p>
-                          <w:p>
-                            <w:pPr>
-                              <w:jc w:val="center"/>
-                              <w:rPr>
-                                <w:rFonts w:ascii="Times New Roman" w:hAnsi="Times New Roman" w:cs="Times New Roman"/>
-                                <w:color w:val="000000" w:themeColor="text1"/>
-                                <w:sz w:val="32"/>
-                                <w14:shadow w14:blurRad="38100" w14:dist="19050" w14:dir="2700000" w14:sx="100000" w14:sy="100000" w14:kx="0" w14:ky="0" w14:algn="tl">
-                                  <w14:schemeClr w14:val="dk1">
-                                    <w14:alpha w14:val="60000"/>
-                                  </w14:schemeClr>
-                                </w14:shadow>
-                                <w14:textOutline w14:w="0" w14:cap="flat" w14:cmpd="sng" w14:algn="ctr">
-                                  <w14:noFill/>
-                                  <w14:prstDash w14:val="solid"/>
-                                  <w14:round/>
-                                </w14:textOutline>
-                              </w:rPr>
-                            </w:pPr>
-                          </w:p>
-                          <w:p>
-                            <w:pPr>
-                              <w:jc w:val="center"/>
-                              <w:rPr>
-                                <w:rFonts w:ascii="Times New Roman" w:hAnsi="Times New Roman" w:cs="Times New Roman"/>
-                                <w:color w:val="000000" w:themeColor="text1"/>
-                                <w:sz w:val="32"/>
-                                <w14:shadow w14:blurRad="38100" w14:dist="19050" w14:dir="2700000" w14:sx="100000" w14:sy="100000" w14:kx="0" w14:ky="0" w14:algn="tl">
-                                  <w14:schemeClr w14:val="dk1">
-                                    <w14:alpha w14:val="60000"/>
-                                  </w14:schemeClr>
-                                </w14:shadow>
-                                <w14:textOutline w14:w="0" w14:cap="flat" w14:cmpd="sng" w14:algn="ctr">
-                                  <w14:noFill/>
-                                  <w14:prstDash w14:val="solid"/>
-                                  <w14:round/>
-                                </w14:textOutline>
-                              </w:rPr>
-                            </w:pPr>
-                          </w:p>
-                          <w:p>
-                            <w:pPr>
-                              <w:jc w:val="center"/>
-                              <w:rPr>
-                                <w:rFonts w:ascii="Times New Roman" w:hAnsi="Times New Roman" w:cs="Times New Roman"/>
-                                <w:color w:val="000000" w:themeColor="text1"/>
-                                <w:sz w:val="32"/>
-                                <w14:shadow w14:blurRad="38100" w14:dist="19050" w14:dir="2700000" w14:sx="100000" w14:sy="100000" w14:kx="0" w14:ky="0" w14:algn="tl">
-                                  <w14:schemeClr w14:val="dk1">
-                                    <w14:alpha w14:val="60000"/>
-                                  </w14:schemeClr>
-                                </w14:shadow>
-                                <w14:textOutline w14:w="0" w14:cap="flat" w14:cmpd="sng" w14:algn="ctr">
-                                  <w14:noFill/>
-                                  <w14:prstDash w14:val="solid"/>
-                                  <w14:round/>
-                                </w14:textOutline>
-                              </w:rPr>
-                            </w:pPr>
-                          </w:p>
-                          <w:p>
-                            <w:pPr>
-                              <w:jc w:val="center"/>
-                              <w:rPr>
-                                <w:rFonts w:ascii="Times New Roman" w:hAnsi="Times New Roman" w:cs="Times New Roman"/>
-                                <w:color w:val="000000" w:themeColor="text1"/>
-                                <w:spacing w:val="-4"/>
-                                <w:sz w:val="32"/>
-                                <w14:shadow w14:blurRad="38100" w14:dist="19050" w14:dir="2700000" w14:sx="100000" w14:sy="100000" w14:kx="0" w14:ky="0" w14:algn="tl">
-                                  <w14:schemeClr w14:val="dk1">
-                                    <w14:alpha w14:val="60000"/>
-                                  </w14:schemeClr>
-                                </w14:shadow>
-                                <w14:textOutline w14:w="0" w14:cap="flat" w14:cmpd="sng" w14:algn="ctr">
-                                  <w14:noFill/>
-                                  <w14:prstDash w14:val="solid"/>
-                                  <w14:round/>
-                                </w14:textOutline>
-                              </w:rPr>
-                            </w:pPr>
-                            <w:r>
-                              <w:rPr>
-                                <w:rFonts w:ascii="Times New Roman" w:hAnsi="Times New Roman" w:cs="Times New Roman"/>
-                                <w:color w:val="000000" w:themeColor="text1"/>
-                                <w:spacing w:val="-4"/>
-                                <w:sz w:val="32"/>
-                                <w14:shadow w14:blurRad="38100" w14:dist="19050" w14:dir="2700000" w14:sx="100000" w14:sy="100000" w14:kx="0" w14:ky="0" w14:algn="tl">
-                                  <w14:schemeClr w14:val="dk1">
-                                    <w14:alpha w14:val="60000"/>
-                                  </w14:schemeClr>
-                                </w14:shadow>
-                                <w14:textOutline w14:w="0" w14:cap="flat" w14:cmpd="sng" w14:algn="ctr">
-                                  <w14:noFill/>
-                                  <w14:prstDash w14:val="solid"/>
-                                  <w14:round/>
-                                </w14:textOutline>
-                              </w:rPr>
-                              <w:t xml:space="preserve">Học </w:t>
-                            </w:r>
-                            <w:proofErr w:type="spellStart"/>
-                            <w:r>
-                              <w:rPr>
-                                <w:rFonts w:ascii="Times New Roman" w:hAnsi="Times New Roman" w:cs="Times New Roman"/>
-                                <w:color w:val="000000" w:themeColor="text1"/>
-                                <w:spacing w:val="-4"/>
-                                <w:sz w:val="32"/>
-                                <w14:shadow w14:blurRad="38100" w14:dist="19050" w14:dir="2700000" w14:sx="100000" w14:sy="100000" w14:kx="0" w14:ky="0" w14:algn="tl">
-                                  <w14:schemeClr w14:val="dk1">
-                                    <w14:alpha w14:val="60000"/>
-                                  </w14:schemeClr>
-                                </w14:shadow>
-                                <w14:textOutline w14:w="0" w14:cap="flat" w14:cmpd="sng" w14:algn="ctr">
-                                  <w14:noFill/>
-                                  <w14:prstDash w14:val="solid"/>
-                                  <w14:round/>
-                                </w14:textOutline>
-                              </w:rPr>
-                              <w:t>phần</w:t>
-                            </w:r>
-                            <w:proofErr w:type="spellEnd"/>
-                            <w:r>
-                              <w:rPr>
-                                <w:rFonts w:ascii="Times New Roman" w:hAnsi="Times New Roman" w:cs="Times New Roman"/>
-                                <w:color w:val="000000" w:themeColor="text1"/>
-                                <w:spacing w:val="-4"/>
-                                <w:sz w:val="32"/>
-                                <w14:shadow w14:blurRad="38100" w14:dist="19050" w14:dir="2700000" w14:sx="100000" w14:sy="100000" w14:kx="0" w14:ky="0" w14:algn="tl">
-                                  <w14:schemeClr w14:val="dk1">
-                                    <w14:alpha w14:val="60000"/>
-                                  </w14:schemeClr>
-                                </w14:shadow>
-                                <w14:textOutline w14:w="0" w14:cap="flat" w14:cmpd="sng" w14:algn="ctr">
-                                  <w14:noFill/>
-                                  <w14:prstDash w14:val="solid"/>
-                                  <w14:round/>
-                                </w14:textOutline>
-                              </w:rPr>
-                              <w:t xml:space="preserve">: </w:t>
-                            </w:r>
-                            <w:proofErr w:type="spellStart"/>
-                            <w:r>
-                              <w:rPr>
-                                <w:rFonts w:ascii="Times New Roman" w:hAnsi="Times New Roman" w:cs="Times New Roman"/>
-                                <w:color w:val="000000" w:themeColor="text1"/>
-                                <w:spacing w:val="-4"/>
-                                <w:sz w:val="32"/>
-                                <w14:shadow w14:blurRad="38100" w14:dist="19050" w14:dir="2700000" w14:sx="100000" w14:sy="100000" w14:kx="0" w14:ky="0" w14:algn="tl">
-                                  <w14:schemeClr w14:val="dk1">
-                                    <w14:alpha w14:val="60000"/>
-                                  </w14:schemeClr>
-                                </w14:shadow>
-                                <w14:textOutline w14:w="0" w14:cap="flat" w14:cmpd="sng" w14:algn="ctr">
-                                  <w14:noFill/>
-                                  <w14:prstDash w14:val="solid"/>
-                                  <w14:round/>
-                                </w14:textOutline>
-                              </w:rPr>
-                              <w:t>Ứng</w:t>
-                            </w:r>
-                            <w:proofErr w:type="spellEnd"/>
-                            <w:r>
-                              <w:rPr>
-                                <w:rFonts w:ascii="Times New Roman" w:hAnsi="Times New Roman" w:cs="Times New Roman"/>
-                                <w:color w:val="000000" w:themeColor="text1"/>
-                                <w:spacing w:val="-4"/>
-                                <w:sz w:val="32"/>
-                                <w14:shadow w14:blurRad="38100" w14:dist="19050" w14:dir="2700000" w14:sx="100000" w14:sy="100000" w14:kx="0" w14:ky="0" w14:algn="tl">
-                                  <w14:schemeClr w14:val="dk1">
-                                    <w14:alpha w14:val="60000"/>
-                                  </w14:schemeClr>
-                                </w14:shadow>
-                                <w14:textOutline w14:w="0" w14:cap="flat" w14:cmpd="sng" w14:algn="ctr">
-                                  <w14:noFill/>
-                                  <w14:prstDash w14:val="solid"/>
-                                  <w14:round/>
-                                </w14:textOutline>
-                              </w:rPr>
-                              <w:t xml:space="preserve"> </w:t>
-                            </w:r>
-                            <w:proofErr w:type="spellStart"/>
-                            <w:r>
-                              <w:rPr>
-                                <w:rFonts w:ascii="Times New Roman" w:hAnsi="Times New Roman" w:cs="Times New Roman"/>
-                                <w:color w:val="000000" w:themeColor="text1"/>
-                                <w:spacing w:val="-4"/>
-                                <w:sz w:val="32"/>
-                                <w14:shadow w14:blurRad="38100" w14:dist="19050" w14:dir="2700000" w14:sx="100000" w14:sy="100000" w14:kx="0" w14:ky="0" w14:algn="tl">
-                                  <w14:schemeClr w14:val="dk1">
-                                    <w14:alpha w14:val="60000"/>
-                                  </w14:schemeClr>
-                                </w14:shadow>
-                                <w14:textOutline w14:w="0" w14:cap="flat" w14:cmpd="sng" w14:algn="ctr">
-                                  <w14:noFill/>
-                                  <w14:prstDash w14:val="solid"/>
-                                  <w14:round/>
-                                </w14:textOutline>
-                              </w:rPr>
-                              <w:t>dụng</w:t>
-                            </w:r>
-                            <w:proofErr w:type="spellEnd"/>
-                            <w:r>
-                              <w:rPr>
-                                <w:rFonts w:ascii="Times New Roman" w:hAnsi="Times New Roman" w:cs="Times New Roman"/>
-                                <w:color w:val="000000" w:themeColor="text1"/>
-                                <w:spacing w:val="-4"/>
-                                <w:sz w:val="32"/>
-                                <w14:shadow w14:blurRad="38100" w14:dist="19050" w14:dir="2700000" w14:sx="100000" w14:sy="100000" w14:kx="0" w14:ky="0" w14:algn="tl">
-                                  <w14:schemeClr w14:val="dk1">
-                                    <w14:alpha w14:val="60000"/>
-                                  </w14:schemeClr>
-                                </w14:shadow>
-                                <w14:textOutline w14:w="0" w14:cap="flat" w14:cmpd="sng" w14:algn="ctr">
-                                  <w14:noFill/>
-                                  <w14:prstDash w14:val="solid"/>
-                                  <w14:round/>
-                                </w14:textOutline>
-                              </w:rPr>
-                              <w:t xml:space="preserve"> Trí </w:t>
-                            </w:r>
-                            <w:proofErr w:type="spellStart"/>
-                            <w:r>
-                              <w:rPr>
-                                <w:rFonts w:ascii="Times New Roman" w:hAnsi="Times New Roman" w:cs="Times New Roman"/>
-                                <w:color w:val="000000" w:themeColor="text1"/>
-                                <w:spacing w:val="-4"/>
-                                <w:sz w:val="32"/>
-                                <w14:shadow w14:blurRad="38100" w14:dist="19050" w14:dir="2700000" w14:sx="100000" w14:sy="100000" w14:kx="0" w14:ky="0" w14:algn="tl">
-                                  <w14:schemeClr w14:val="dk1">
-                                    <w14:alpha w14:val="60000"/>
-                                  </w14:schemeClr>
-                                </w14:shadow>
-                                <w14:textOutline w14:w="0" w14:cap="flat" w14:cmpd="sng" w14:algn="ctr">
-                                  <w14:noFill/>
-                                  <w14:prstDash w14:val="solid"/>
-                                  <w14:round/>
-                                </w14:textOutline>
-                              </w:rPr>
-                              <w:t>tuệ</w:t>
-                            </w:r>
-                            <w:proofErr w:type="spellEnd"/>
-                            <w:r>
-                              <w:rPr>
-                                <w:rFonts w:ascii="Times New Roman" w:hAnsi="Times New Roman" w:cs="Times New Roman"/>
-                                <w:color w:val="000000" w:themeColor="text1"/>
-                                <w:spacing w:val="-4"/>
-                                <w:sz w:val="32"/>
-                                <w14:shadow w14:blurRad="38100" w14:dist="19050" w14:dir="2700000" w14:sx="100000" w14:sy="100000" w14:kx="0" w14:ky="0" w14:algn="tl">
-                                  <w14:schemeClr w14:val="dk1">
-                                    <w14:alpha w14:val="60000"/>
-                                  </w14:schemeClr>
-                                </w14:shadow>
-                                <w14:textOutline w14:w="0" w14:cap="flat" w14:cmpd="sng" w14:algn="ctr">
-                                  <w14:noFill/>
-                                  <w14:prstDash w14:val="solid"/>
-                                  <w14:round/>
-                                </w14:textOutline>
-                              </w:rPr>
-                              <w:t xml:space="preserve"> </w:t>
-                            </w:r>
-                            <w:proofErr w:type="spellStart"/>
-                            <w:r>
-                              <w:rPr>
-                                <w:rFonts w:ascii="Times New Roman" w:hAnsi="Times New Roman" w:cs="Times New Roman"/>
-                                <w:color w:val="000000" w:themeColor="text1"/>
-                                <w:spacing w:val="-4"/>
-                                <w:sz w:val="32"/>
-                                <w14:shadow w14:blurRad="38100" w14:dist="19050" w14:dir="2700000" w14:sx="100000" w14:sy="100000" w14:kx="0" w14:ky="0" w14:algn="tl">
-                                  <w14:schemeClr w14:val="dk1">
-                                    <w14:alpha w14:val="60000"/>
-                                  </w14:schemeClr>
-                                </w14:shadow>
-                                <w14:textOutline w14:w="0" w14:cap="flat" w14:cmpd="sng" w14:algn="ctr">
-                                  <w14:noFill/>
-                                  <w14:prstDash w14:val="solid"/>
-                                  <w14:round/>
-                                </w14:textOutline>
-                              </w:rPr>
-                              <w:t>nhân</w:t>
-                            </w:r>
-                            <w:proofErr w:type="spellEnd"/>
-                            <w:r>
-                              <w:rPr>
-                                <w:rFonts w:ascii="Times New Roman" w:hAnsi="Times New Roman" w:cs="Times New Roman"/>
-                                <w:color w:val="000000" w:themeColor="text1"/>
-                                <w:spacing w:val="-4"/>
-                                <w:sz w:val="32"/>
-                                <w14:shadow w14:blurRad="38100" w14:dist="19050" w14:dir="2700000" w14:sx="100000" w14:sy="100000" w14:kx="0" w14:ky="0" w14:algn="tl">
-                                  <w14:schemeClr w14:val="dk1">
-                                    <w14:alpha w14:val="60000"/>
-                                  </w14:schemeClr>
-                                </w14:shadow>
-                                <w14:textOutline w14:w="0" w14:cap="flat" w14:cmpd="sng" w14:algn="ctr">
-                                  <w14:noFill/>
-                                  <w14:prstDash w14:val="solid"/>
-                                  <w14:round/>
-                                </w14:textOutline>
-                              </w:rPr>
-                              <w:t xml:space="preserve"> </w:t>
-                            </w:r>
-                            <w:proofErr w:type="spellStart"/>
-                            <w:r>
-                              <w:rPr>
-                                <w:rFonts w:ascii="Times New Roman" w:hAnsi="Times New Roman" w:cs="Times New Roman"/>
-                                <w:color w:val="000000" w:themeColor="text1"/>
-                                <w:spacing w:val="-4"/>
-                                <w:sz w:val="32"/>
-                                <w14:shadow w14:blurRad="38100" w14:dist="19050" w14:dir="2700000" w14:sx="100000" w14:sy="100000" w14:kx="0" w14:ky="0" w14:algn="tl">
-                                  <w14:schemeClr w14:val="dk1">
-                                    <w14:alpha w14:val="60000"/>
-                                  </w14:schemeClr>
-                                </w14:shadow>
-                                <w14:textOutline w14:w="0" w14:cap="flat" w14:cmpd="sng" w14:algn="ctr">
-                                  <w14:noFill/>
-                                  <w14:prstDash w14:val="solid"/>
-                                  <w14:round/>
-                                </w14:textOutline>
-                              </w:rPr>
-                              <w:t>tạo</w:t>
-                            </w:r>
-                            <w:proofErr w:type="spellEnd"/>
-                          </w:p>
-                          <w:p>
-                            <w:pPr>
-                              <w:jc w:val="center"/>
-                            </w:pPr>
-                            <w:proofErr w:type="spellStart"/>
-                            <w:r>
-                              <w:rPr>
-                                <w:rFonts w:ascii="Times New Roman" w:hAnsi="Times New Roman" w:cs="Times New Roman"/>
-                                <w:color w:val="000000" w:themeColor="text1"/>
-                                <w:sz w:val="32"/>
-                                <w14:shadow w14:blurRad="38100" w14:dist="19050" w14:dir="2700000" w14:sx="100000" w14:sy="100000" w14:kx="0" w14:ky="0" w14:algn="tl">
-                                  <w14:schemeClr w14:val="dk1">
-                                    <w14:alpha w14:val="60000"/>
-                                  </w14:schemeClr>
-                                </w14:shadow>
-                                <w14:textOutline w14:w="0" w14:cap="flat" w14:cmpd="sng" w14:algn="ctr">
-                                  <w14:noFill/>
-                                  <w14:prstDash w14:val="solid"/>
-                                  <w14:round/>
-                                </w14:textOutline>
-                              </w:rPr>
-                              <w:t>Lớp</w:t>
-                            </w:r>
-                            <w:proofErr w:type="spellEnd"/>
-                            <w:r>
-                              <w:rPr>
-                                <w:rFonts w:ascii="Times New Roman" w:hAnsi="Times New Roman" w:cs="Times New Roman"/>
-                                <w:color w:val="000000" w:themeColor="text1"/>
-                                <w:sz w:val="32"/>
-                                <w14:shadow w14:blurRad="38100" w14:dist="19050" w14:dir="2700000" w14:sx="100000" w14:sy="100000" w14:kx="0" w14:ky="0" w14:algn="tl">
-                                  <w14:schemeClr w14:val="dk1">
-                                    <w14:alpha w14:val="60000"/>
-                                  </w14:schemeClr>
-                                </w14:shadow>
-                                <w14:textOutline w14:w="0" w14:cap="flat" w14:cmpd="sng" w14:algn="ctr">
-                                  <w14:noFill/>
-                                  <w14:prstDash w14:val="solid"/>
-                                  <w14:round/>
-                                </w14:textOutline>
-                              </w:rPr>
-                              <w:t>: CNTT K</w:t>
-                            </w:r>
-                            <w:r>
-                              <w:rPr>
-                                <w:rFonts w:ascii="Times New Roman" w:hAnsi="Times New Roman" w:cs="Times New Roman"/>
-                                <w:color w:val="000000" w:themeColor="text1"/>
-                                <w:sz w:val="32"/>
-                                <w14:shadow w14:blurRad="38100" w14:dist="19050" w14:dir="2700000" w14:sx="100000" w14:sy="100000" w14:kx="0" w14:ky="0" w14:algn="tl">
-                                  <w14:schemeClr w14:val="dk1">
-                                    <w14:alpha w14:val="60000"/>
-                                  </w14:schemeClr>
-                                </w14:shadow>
-                                <w14:textOutline w14:w="0" w14:cap="flat" w14:cmpd="sng" w14:algn="ctr">
-                                  <w14:noFill/>
-                                  <w14:prstDash w14:val="solid"/>
-                                  <w14:round/>
-                                </w14:textOutline>
-                              </w:rPr>
-                              <w:t>2</w:t>
-                            </w:r>
-                            <w:r>
-                              <w:rPr>
-                                <w:rFonts w:ascii="Times New Roman" w:hAnsi="Times New Roman" w:cs="Times New Roman"/>
-                                <w:color w:val="000000" w:themeColor="text1"/>
-                                <w:sz w:val="32"/>
-                                <w14:shadow w14:blurRad="38100" w14:dist="19050" w14:dir="2700000" w14:sx="100000" w14:sy="100000" w14:kx="0" w14:ky="0" w14:algn="tl">
-                                  <w14:schemeClr w14:val="dk1">
-                                    <w14:alpha w14:val="60000"/>
-                                  </w14:schemeClr>
-                                </w14:shadow>
-                                <w14:textOutline w14:w="0" w14:cap="flat" w14:cmpd="sng" w14:algn="ctr">
-                                  <w14:noFill/>
-                                  <w14:prstDash w14:val="solid"/>
-                                  <w14:round/>
-                                </w14:textOutline>
-                              </w:rPr>
-                              <w:t>3</w:t>
-                            </w:r>
-                            <w:r>
-                              <w:rPr>
-                                <w:rFonts w:ascii="Times New Roman" w:hAnsi="Times New Roman" w:cs="Times New Roman"/>
-                                <w:color w:val="000000" w:themeColor="text1"/>
-                                <w:sz w:val="32"/>
-                                <w14:shadow w14:blurRad="38100" w14:dist="19050" w14:dir="2700000" w14:sx="100000" w14:sy="100000" w14:kx="0" w14:ky="0" w14:algn="tl">
-                                  <w14:schemeClr w14:val="dk1">
-                                    <w14:alpha w14:val="60000"/>
-                                  </w14:schemeClr>
-                                </w14:shadow>
-                                <w14:textOutline w14:w="0" w14:cap="flat" w14:cmpd="sng" w14:algn="ctr">
-                                  <w14:noFill/>
-                                  <w14:prstDash w14:val="solid"/>
-                                  <w14:round/>
-                                </w14:textOutline>
-                              </w:rPr>
-                              <w:t>D</w:t>
-                            </w:r>
-                          </w:p>
-                        </w:txbxContent>
-                      </wps:txbx>
-                      <wps:bodyPr rot="0" spcFirstLastPara="0" vertOverflow="overflow" horzOverflow="overflow" vert="horz" wrap="square" lIns="0" tIns="0" rIns="0" bIns="45720" numCol="1" spcCol="0" rtlCol="0" fromWordArt="0" anchor="ctr" anchorCtr="0" forceAA="0" compatLnSpc="1">
-                        <a:prstTxWarp prst="textNoShape">
-                          <a:avLst/>
-                        </a:prstTxWarp>
-                        <a:noAutofit/>
-                      </wps:bodyPr>
-                    </wps:wsp>
-                  </a:graphicData>
-                </a:graphic>
-                <wp14:sizeRelH relativeFrom="margin">
-                  <wp14:pctWidth>0</wp14:pctWidth>
-                </wp14:sizeRelH>
-                <wp14:sizeRelV relativeFrom="margin">
-                  <wp14:pctHeight>0</wp14:pctHeight>
-                </wp14:sizeRelV>
-              </wp:anchor>
-            </w:drawing>
-          </mc:Choice>
-          <mc:Fallback>
-            <w:pict>
-              <v:oval w14:anchorId="00A7416A" id="Oval 2" o:spid="_x0000_s1027" style="position:absolute;left:0;text-align:left;margin-left:34.5pt;margin-top:.45pt;width:340.15pt;height:340.15pt;z-index:251661312;visibility:visible;mso-wrap-style:square;mso-width-percent:0;mso-height-percent:0;mso-wrap-distance-left:9pt;mso-wrap-distance-top:0;mso-wrap-distance-right:9pt;mso-wrap-distance-bottom:0;mso-position-horizontal:absolute;mso-position-horizontal-relative:margin;mso-position-vertical:absolute;mso-position-vertical-relative:text;mso-width-percent:0;mso-height-percent:0;mso-width-relative:margin;mso-height-relative:margin;v-text-anchor:middle" o:gfxdata="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" fillcolor="#d9e2f3 [660]" strokecolor="blue" strokeweight="1pt">
-                <v:stroke joinstyle="miter"/>
-                <v:path arrowok="t"/>
-                <o:lock v:ext="edit" aspectratio="t"/>
-                <v:textbox inset="0,0,0">
-                  <w:txbxContent>
-                    <w:p>
-                      <w:pPr>
-                        <w:jc w:val="center"/>
-                        <w:rPr>
-                          <w:rFonts w:ascii="Times New Roman" w:hAnsi="Times New Roman" w:cs="Times New Roman"/>
-                          <w:b/>
-                          <w:color w:val="000000" w:themeColor="text1"/>
-                          <w:sz w:val="32"/>
-                          <w14:shadow w14:blurRad="38100" w14:dist="19050" w14:dir="2700000" w14:sx="100000" w14:sy="100000" w14:kx="0" w14:ky="0" w14:algn="tl">
-                            <w14:schemeClr w14:val="dk1">
-                              <w14:alpha w14:val="60000"/>
-                            </w14:schemeClr>
-                          </w14:shadow>
-                          <w14:textOutline w14:w="0" w14:cap="flat" w14:cmpd="sng" w14:algn="ctr">
-                            <w14:noFill/>
-                            <w14:prstDash w14:val="solid"/>
-                            <w14:round/>
-                          </w14:textOutline>
-                        </w:rPr>
-                      </w:pPr>
-                      <w:r>
-                        <w:rPr>
-                          <w:rFonts w:ascii="Times New Roman" w:hAnsi="Times New Roman" w:cs="Times New Roman"/>
-                          <w:b/>
-                          <w:color w:val="000000" w:themeColor="text1"/>
-                          <w:sz w:val="32"/>
-                          <w14:shadow w14:blurRad="38100" w14:dist="19050" w14:dir="2700000" w14:sx="100000" w14:sy="100000" w14:kx="0" w14:ky="0" w14:algn="tl">
-                            <w14:schemeClr w14:val="dk1">
-                              <w14:alpha w14:val="60000"/>
-                            </w14:schemeClr>
-                          </w14:shadow>
-                          <w14:textOutline w14:w="0" w14:cap="flat" w14:cmpd="sng" w14:algn="ctr">
-                            <w14:noFill/>
-                            <w14:prstDash w14:val="solid"/>
-                            <w14:round/>
-                          </w14:textOutline>
-                        </w:rPr>
-                        <w:t>NHÓM 01</w:t>
-                      </w:r>
-                      <w:r>
-                        <w:rPr>
-                          <w:rFonts w:ascii="Times New Roman" w:hAnsi="Times New Roman" w:cs="Times New Roman"/>
-                          <w:b/>
-                          <w:color w:val="000000" w:themeColor="text1"/>
-                          <w:sz w:val="32"/>
-                          <w14:shadow w14:blurRad="38100" w14:dist="19050" w14:dir="2700000" w14:sx="100000" w14:sy="100000" w14:kx="0" w14:ky="0" w14:algn="tl">
-                            <w14:schemeClr w14:val="dk1">
-                              <w14:alpha w14:val="60000"/>
-                            </w14:schemeClr>
-                          </w14:shadow>
-                          <w14:textOutline w14:w="0" w14:cap="flat" w14:cmpd="sng" w14:algn="ctr">
-                            <w14:noFill/>
-                            <w14:prstDash w14:val="solid"/>
-                            <w14:round/>
-                          </w14:textOutline>
-                        </w:rPr>
-                        <w:t>:</w:t>
-                      </w:r>
-                    </w:p>
-                    <w:p>
-                      <w:pPr>
-                        <w:jc w:val="center"/>
-                        <w:rPr>
-                          <w:rFonts w:ascii="Times New Roman" w:hAnsi="Times New Roman" w:cs="Times New Roman"/>
-                          <w:color w:val="000000" w:themeColor="text1"/>
-                          <w:sz w:val="32"/>
-                          <w14:shadow w14:blurRad="38100" w14:dist="19050" w14:dir="2700000" w14:sx="100000" w14:sy="100000" w14:kx="0" w14:ky="0" w14:algn="tl">
-                            <w14:schemeClr w14:val="dk1">
-                              <w14:alpha w14:val="60000"/>
-                            </w14:schemeClr>
-                          </w14:shadow>
-                          <w14:textOutline w14:w="0" w14:cap="flat" w14:cmpd="sng" w14:algn="ctr">
-                            <w14:noFill/>
-                            <w14:prstDash w14:val="solid"/>
-                            <w14:round/>
-                          </w14:textOutline>
-                        </w:rPr>
-                      </w:pPr>
-                      <w:proofErr w:type="spellStart"/>
-                      <w:r>
-                        <w:rPr>
-                          <w:rFonts w:ascii="Times New Roman" w:hAnsi="Times New Roman" w:cs="Times New Roman"/>
-                          <w:color w:val="000000" w:themeColor="text1"/>
-                          <w:sz w:val="28"/>
-                          <w:szCs w:val="20"/>
-                          <w14:shadow w14:blurRad="38100" w14:dist="19050" w14:dir="2700000" w14:sx="100000" w14:sy="100000" w14:kx="0" w14:ky="0" w14:algn="tl">
-                            <w14:schemeClr w14:val="dk1">
-                              <w14:alpha w14:val="60000"/>
-                            </w14:schemeClr>
-                          </w14:shadow>
-                          <w14:textOutline w14:w="0" w14:cap="flat" w14:cmpd="sng" w14:algn="ctr">
-                            <w14:noFill/>
-                            <w14:prstDash w14:val="solid"/>
-                            <w14:round/>
-                          </w14:textOutline>
-                        </w:rPr>
-                        <w:t>Hệ</w:t>
-                      </w:r>
-                      <w:proofErr w:type="spellEnd"/>
-                      <w:r>
-                        <w:rPr>
-                          <w:rFonts w:ascii="Times New Roman" w:hAnsi="Times New Roman" w:cs="Times New Roman"/>
-                          <w:color w:val="000000" w:themeColor="text1"/>
-                          <w:sz w:val="28"/>
-                          <w:szCs w:val="20"/>
-                          <w14:shadow w14:blurRad="38100" w14:dist="19050" w14:dir="2700000" w14:sx="100000" w14:sy="100000" w14:kx="0" w14:ky="0" w14:algn="tl">
-                            <w14:schemeClr w14:val="dk1">
-                              <w14:alpha w14:val="60000"/>
-                            </w14:schemeClr>
-                          </w14:shadow>
-                          <w14:textOutline w14:w="0" w14:cap="flat" w14:cmpd="sng" w14:algn="ctr">
-                            <w14:noFill/>
-                            <w14:prstDash w14:val="solid"/>
-                            <w14:round/>
-                          </w14:textOutline>
-                        </w:rPr>
-                        <w:t xml:space="preserve"> </w:t>
-                      </w:r>
-                      <w:proofErr w:type="spellStart"/>
-                      <w:r>
-                        <w:rPr>
-                          <w:rFonts w:ascii="Times New Roman" w:hAnsi="Times New Roman" w:cs="Times New Roman"/>
-                          <w:color w:val="000000" w:themeColor="text1"/>
-                          <w:sz w:val="28"/>
-                          <w:szCs w:val="20"/>
-                          <w14:shadow w14:blurRad="38100" w14:dist="19050" w14:dir="2700000" w14:sx="100000" w14:sy="100000" w14:kx="0" w14:ky="0" w14:algn="tl">
-                            <w14:schemeClr w14:val="dk1">
-                              <w14:alpha w14:val="60000"/>
-                            </w14:schemeClr>
-                          </w14:shadow>
-                          <w14:textOutline w14:w="0" w14:cap="flat" w14:cmpd="sng" w14:algn="ctr">
-                            <w14:noFill/>
-                            <w14:prstDash w14:val="solid"/>
-                            <w14:round/>
-                          </w14:textOutline>
-                        </w:rPr>
-                        <w:t>thống</w:t>
-                      </w:r>
-                      <w:proofErr w:type="spellEnd"/>
-                      <w:r>
-                        <w:rPr>
-                          <w:rFonts w:ascii="Times New Roman" w:hAnsi="Times New Roman" w:cs="Times New Roman"/>
-                          <w:color w:val="000000" w:themeColor="text1"/>
-                          <w:sz w:val="28"/>
-                          <w:szCs w:val="20"/>
-                          <w14:shadow w14:blurRad="38100" w14:dist="19050" w14:dir="2700000" w14:sx="100000" w14:sy="100000" w14:kx="0" w14:ky="0" w14:algn="tl">
-                            <w14:schemeClr w14:val="dk1">
-                              <w14:alpha w14:val="60000"/>
-                            </w14:schemeClr>
-                          </w14:shadow>
-                          <w14:textOutline w14:w="0" w14:cap="flat" w14:cmpd="sng" w14:algn="ctr">
-                            <w14:noFill/>
-                            <w14:prstDash w14:val="solid"/>
-                            <w14:round/>
-                          </w14:textOutline>
-                        </w:rPr>
-                        <w:t xml:space="preserve"> </w:t>
-                      </w:r>
-                      <w:proofErr w:type="spellStart"/>
-                      <w:r>
-                        <w:rPr>
-                          <w:rFonts w:ascii="Times New Roman" w:hAnsi="Times New Roman" w:cs="Times New Roman"/>
-                          <w:color w:val="000000" w:themeColor="text1"/>
-                          <w:sz w:val="28"/>
-                          <w:szCs w:val="20"/>
-                          <w14:shadow w14:blurRad="38100" w14:dist="19050" w14:dir="2700000" w14:sx="100000" w14:sy="100000" w14:kx="0" w14:ky="0" w14:algn="tl">
-                            <w14:schemeClr w14:val="dk1">
-                              <w14:alpha w14:val="60000"/>
-                            </w14:schemeClr>
-                          </w14:shadow>
-                          <w14:textOutline w14:w="0" w14:cap="flat" w14:cmpd="sng" w14:algn="ctr">
-                            <w14:noFill/>
-                            <w14:prstDash w14:val="solid"/>
-                            <w14:round/>
-                          </w14:textOutline>
-                        </w:rPr>
-                        <w:t>quản</w:t>
-                      </w:r>
-                      <w:proofErr w:type="spellEnd"/>
-                      <w:r>
-                        <w:rPr>
-                          <w:rFonts w:ascii="Times New Roman" w:hAnsi="Times New Roman" w:cs="Times New Roman"/>
-                          <w:color w:val="000000" w:themeColor="text1"/>
-                          <w:sz w:val="28"/>
-                          <w:szCs w:val="20"/>
-                          <w14:shadow w14:blurRad="38100" w14:dist="19050" w14:dir="2700000" w14:sx="100000" w14:sy="100000" w14:kx="0" w14:ky="0" w14:algn="tl">
-                            <w14:schemeClr w14:val="dk1">
-                              <w14:alpha w14:val="60000"/>
-                            </w14:schemeClr>
-                          </w14:shadow>
-                          <w14:textOutline w14:w="0" w14:cap="flat" w14:cmpd="sng" w14:algn="ctr">
-                            <w14:noFill/>
-                            <w14:prstDash w14:val="solid"/>
-                            <w14:round/>
-                          </w14:textOutline>
-                        </w:rPr>
-                        <w:t xml:space="preserve"> </w:t>
-                      </w:r>
-                      <w:proofErr w:type="spellStart"/>
-                      <w:r>
-                        <w:rPr>
-                          <w:rFonts w:ascii="Times New Roman" w:hAnsi="Times New Roman" w:cs="Times New Roman"/>
-                          <w:color w:val="000000" w:themeColor="text1"/>
-                          <w:sz w:val="28"/>
-                          <w:szCs w:val="20"/>
-                          <w14:shadow w14:blurRad="38100" w14:dist="19050" w14:dir="2700000" w14:sx="100000" w14:sy="100000" w14:kx="0" w14:ky="0" w14:algn="tl">
-                            <w14:schemeClr w14:val="dk1">
-                              <w14:alpha w14:val="60000"/>
-                            </w14:schemeClr>
-                          </w14:shadow>
-                          <w14:textOutline w14:w="0" w14:cap="flat" w14:cmpd="sng" w14:algn="ctr">
-                            <w14:noFill/>
-                            <w14:prstDash w14:val="solid"/>
-                            <w14:round/>
-                          </w14:textOutline>
-                        </w:rPr>
-                        <w:t>lý</w:t>
-                      </w:r>
-                      <w:proofErr w:type="spellEnd"/>
-                      <w:r>
-                        <w:rPr>
-                          <w:rFonts w:ascii="Times New Roman" w:hAnsi="Times New Roman" w:cs="Times New Roman"/>
-                          <w:color w:val="000000" w:themeColor="text1"/>
-                          <w:sz w:val="28"/>
-                          <w:szCs w:val="20"/>
-                          <w14:shadow w14:blurRad="38100" w14:dist="19050" w14:dir="2700000" w14:sx="100000" w14:sy="100000" w14:kx="0" w14:ky="0" w14:algn="tl">
-                            <w14:schemeClr w14:val="dk1">
-                              <w14:alpha w14:val="60000"/>
-                            </w14:schemeClr>
-                          </w14:shadow>
-                          <w14:textOutline w14:w="0" w14:cap="flat" w14:cmpd="sng" w14:algn="ctr">
-                            <w14:noFill/>
-                            <w14:prstDash w14:val="solid"/>
-                            <w14:round/>
-                          </w14:textOutline>
-                        </w:rPr>
-                        <w:t xml:space="preserve"> </w:t>
-                      </w:r>
-                      <w:proofErr w:type="spellStart"/>
-                      <w:r>
-                        <w:rPr>
-                          <w:rFonts w:ascii="Times New Roman" w:hAnsi="Times New Roman" w:cs="Times New Roman"/>
-                          <w:color w:val="000000" w:themeColor="text1"/>
-                          <w:sz w:val="28"/>
-                          <w:szCs w:val="20"/>
-                          <w14:shadow w14:blurRad="38100" w14:dist="19050" w14:dir="2700000" w14:sx="100000" w14:sy="100000" w14:kx="0" w14:ky="0" w14:algn="tl">
-                            <w14:schemeClr w14:val="dk1">
-                              <w14:alpha w14:val="60000"/>
-                            </w14:schemeClr>
-                          </w14:shadow>
-                          <w14:textOutline w14:w="0" w14:cap="flat" w14:cmpd="sng" w14:algn="ctr">
-                            <w14:noFill/>
-                            <w14:prstDash w14:val="solid"/>
-                            <w14:round/>
-                          </w14:textOutline>
-                        </w:rPr>
-                        <w:t>bán</w:t>
-                      </w:r>
-                      <w:proofErr w:type="spellEnd"/>
-                      <w:r>
-                        <w:rPr>
-                          <w:rFonts w:ascii="Times New Roman" w:hAnsi="Times New Roman" w:cs="Times New Roman"/>
-                          <w:color w:val="000000" w:themeColor="text1"/>
-                          <w:sz w:val="28"/>
-                          <w:szCs w:val="20"/>
-                          <w14:shadow w14:blurRad="38100" w14:dist="19050" w14:dir="2700000" w14:sx="100000" w14:sy="100000" w14:kx="0" w14:ky="0" w14:algn="tl">
-                            <w14:schemeClr w14:val="dk1">
-                              <w14:alpha w14:val="60000"/>
-                            </w14:schemeClr>
-                          </w14:shadow>
-                          <w14:textOutline w14:w="0" w14:cap="flat" w14:cmpd="sng" w14:algn="ctr">
-                            <w14:noFill/>
-                            <w14:prstDash w14:val="solid"/>
-                            <w14:round/>
-                          </w14:textOutline>
-                        </w:rPr>
-                        <w:t xml:space="preserve"> </w:t>
-                      </w:r>
-                      <w:proofErr w:type="spellStart"/>
-                      <w:r>
-                        <w:rPr>
-                          <w:rFonts w:ascii="Times New Roman" w:hAnsi="Times New Roman" w:cs="Times New Roman"/>
-                          <w:color w:val="000000" w:themeColor="text1"/>
-                          <w:sz w:val="28"/>
-                          <w:szCs w:val="20"/>
-                          <w14:shadow w14:blurRad="38100" w14:dist="19050" w14:dir="2700000" w14:sx="100000" w14:sy="100000" w14:kx="0" w14:ky="0" w14:algn="tl">
-                            <w14:schemeClr w14:val="dk1">
-                              <w14:alpha w14:val="60000"/>
-                            </w14:schemeClr>
-                          </w14:shadow>
-                          <w14:textOutline w14:w="0" w14:cap="flat" w14:cmpd="sng" w14:algn="ctr">
-                            <w14:noFill/>
-                            <w14:prstDash w14:val="solid"/>
-                            <w14:round/>
-                          </w14:textOutline>
-                        </w:rPr>
-                        <w:t>hàng</w:t>
-                      </w:r>
-                      <w:proofErr w:type="spellEnd"/>
-                      <w:r>
-                        <w:rPr>
-                          <w:rFonts w:ascii="Times New Roman" w:hAnsi="Times New Roman" w:cs="Times New Roman"/>
-                          <w:color w:val="000000" w:themeColor="text1"/>
-                          <w:sz w:val="28"/>
-                          <w:szCs w:val="20"/>
-                          <w14:shadow w14:blurRad="38100" w14:dist="19050" w14:dir="2700000" w14:sx="100000" w14:sy="100000" w14:kx="0" w14:ky="0" w14:algn="tl">
-                            <w14:schemeClr w14:val="dk1">
-                              <w14:alpha w14:val="60000"/>
-                            </w14:schemeClr>
-                          </w14:shadow>
-                          <w14:textOutline w14:w="0" w14:cap="flat" w14:cmpd="sng" w14:algn="ctr">
-                            <w14:noFill/>
-                            <w14:prstDash w14:val="solid"/>
-                            <w14:round/>
-                          </w14:textOutline>
-                        </w:rPr>
-                        <w:t xml:space="preserve"> </w:t>
-                      </w:r>
-                      <w:proofErr w:type="spellStart"/>
-                      <w:r>
-                        <w:rPr>
-                          <w:rFonts w:ascii="Times New Roman" w:hAnsi="Times New Roman" w:cs="Times New Roman"/>
-                          <w:color w:val="000000" w:themeColor="text1"/>
-                          <w:sz w:val="28"/>
-                          <w:szCs w:val="20"/>
-                          <w14:shadow w14:blurRad="38100" w14:dist="19050" w14:dir="2700000" w14:sx="100000" w14:sy="100000" w14:kx="0" w14:ky="0" w14:algn="tl">
-                            <w14:schemeClr w14:val="dk1">
-                              <w14:alpha w14:val="60000"/>
-                            </w14:schemeClr>
-                          </w14:shadow>
-                          <w14:textOutline w14:w="0" w14:cap="flat" w14:cmpd="sng" w14:algn="ctr">
-                            <w14:noFill/>
-                            <w14:prstDash w14:val="solid"/>
-                            <w14:round/>
-                          </w14:textOutline>
-                        </w:rPr>
-                        <w:t>có</w:t>
-                      </w:r>
-                      <w:proofErr w:type="spellEnd"/>
-                      <w:r>
-                        <w:rPr>
-                          <w:rFonts w:ascii="Times New Roman" w:hAnsi="Times New Roman" w:cs="Times New Roman"/>
-                          <w:color w:val="000000" w:themeColor="text1"/>
-                          <w:sz w:val="28"/>
-                          <w:szCs w:val="20"/>
-                          <w14:shadow w14:blurRad="38100" w14:dist="19050" w14:dir="2700000" w14:sx="100000" w14:sy="100000" w14:kx="0" w14:ky="0" w14:algn="tl">
-                            <w14:schemeClr w14:val="dk1">
-                              <w14:alpha w14:val="60000"/>
-                            </w14:schemeClr>
-                          </w14:shadow>
-                          <w14:textOutline w14:w="0" w14:cap="flat" w14:cmpd="sng" w14:algn="ctr">
-                            <w14:noFill/>
-                            <w14:prstDash w14:val="solid"/>
-                            <w14:round/>
-                          </w14:textOutline>
-                        </w:rPr>
-                        <w:t xml:space="preserve"> </w:t>
-                      </w:r>
-                      <w:proofErr w:type="spellStart"/>
-                      <w:r>
-                        <w:rPr>
-                          <w:rFonts w:ascii="Times New Roman" w:hAnsi="Times New Roman" w:cs="Times New Roman"/>
-                          <w:color w:val="000000" w:themeColor="text1"/>
-                          <w:sz w:val="28"/>
-                          <w:szCs w:val="20"/>
-                          <w14:shadow w14:blurRad="38100" w14:dist="19050" w14:dir="2700000" w14:sx="100000" w14:sy="100000" w14:kx="0" w14:ky="0" w14:algn="tl">
-                            <w14:schemeClr w14:val="dk1">
-                              <w14:alpha w14:val="60000"/>
-                            </w14:schemeClr>
-                          </w14:shadow>
-                          <w14:textOutline w14:w="0" w14:cap="flat" w14:cmpd="sng" w14:algn="ctr">
-                            <w14:noFill/>
-                            <w14:prstDash w14:val="solid"/>
-                            <w14:round/>
-                          </w14:textOutline>
-                        </w:rPr>
-                        <w:t>tích</w:t>
-                      </w:r>
-                      <w:proofErr w:type="spellEnd"/>
-                      <w:r>
-                        <w:rPr>
-                          <w:rFonts w:ascii="Times New Roman" w:hAnsi="Times New Roman" w:cs="Times New Roman"/>
-                          <w:color w:val="000000" w:themeColor="text1"/>
-                          <w:sz w:val="28"/>
-                          <w:szCs w:val="20"/>
-                          <w14:shadow w14:blurRad="38100" w14:dist="19050" w14:dir="2700000" w14:sx="100000" w14:sy="100000" w14:kx="0" w14:ky="0" w14:algn="tl">
-                            <w14:schemeClr w14:val="dk1">
-                              <w14:alpha w14:val="60000"/>
-                            </w14:schemeClr>
-                          </w14:shadow>
-                          <w14:textOutline w14:w="0" w14:cap="flat" w14:cmpd="sng" w14:algn="ctr">
-                            <w14:noFill/>
-                            <w14:prstDash w14:val="solid"/>
-                            <w14:round/>
-                          </w14:textOutline>
-                        </w:rPr>
-                        <w:t xml:space="preserve"> </w:t>
-                      </w:r>
-                      <w:proofErr w:type="spellStart"/>
-                      <w:r>
-                        <w:rPr>
-                          <w:rFonts w:ascii="Times New Roman" w:hAnsi="Times New Roman" w:cs="Times New Roman"/>
-                          <w:color w:val="000000" w:themeColor="text1"/>
-                          <w:sz w:val="28"/>
-                          <w:szCs w:val="20"/>
-                          <w14:shadow w14:blurRad="38100" w14:dist="19050" w14:dir="2700000" w14:sx="100000" w14:sy="100000" w14:kx="0" w14:ky="0" w14:algn="tl">
-                            <w14:schemeClr w14:val="dk1">
-                              <w14:alpha w14:val="60000"/>
-                            </w14:schemeClr>
-                          </w14:shadow>
-                          <w14:textOutline w14:w="0" w14:cap="flat" w14:cmpd="sng" w14:algn="ctr">
-                            <w14:noFill/>
-                            <w14:prstDash w14:val="solid"/>
-                            <w14:round/>
-                          </w14:textOutline>
-                        </w:rPr>
-                        <w:t>hợp</w:t>
-                      </w:r>
-                      <w:proofErr w:type="spellEnd"/>
-                      <w:r>
-                        <w:rPr>
-                          <w:rFonts w:ascii="Times New Roman" w:hAnsi="Times New Roman" w:cs="Times New Roman"/>
-                          <w:color w:val="000000" w:themeColor="text1"/>
-                          <w:sz w:val="28"/>
-                          <w:szCs w:val="20"/>
-                          <w14:shadow w14:blurRad="38100" w14:dist="19050" w14:dir="2700000" w14:sx="100000" w14:sy="100000" w14:kx="0" w14:ky="0" w14:algn="tl">
-                            <w14:schemeClr w14:val="dk1">
-                              <w14:alpha w14:val="60000"/>
-                            </w14:schemeClr>
-                          </w14:shadow>
-                          <w14:textOutline w14:w="0" w14:cap="flat" w14:cmpd="sng" w14:algn="ctr">
-                            <w14:noFill/>
-                            <w14:prstDash w14:val="solid"/>
-                            <w14:round/>
-                          </w14:textOutline>
-                        </w:rPr>
-                        <w:t xml:space="preserve"> AI</w:t>
-                      </w:r>
-                    </w:p>
-                    <w:p>
-                      <w:pPr>
-                        <w:jc w:val="center"/>
-                        <w:rPr>
-                          <w:rFonts w:ascii="Times New Roman" w:hAnsi="Times New Roman" w:cs="Times New Roman"/>
-                          <w:color w:val="000000" w:themeColor="text1"/>
-                          <w:sz w:val="32"/>
-                          <w14:shadow w14:blurRad="38100" w14:dist="19050" w14:dir="2700000" w14:sx="100000" w14:sy="100000" w14:kx="0" w14:ky="0" w14:algn="tl">
-                            <w14:schemeClr w14:val="dk1">
-                              <w14:alpha w14:val="60000"/>
-                            </w14:schemeClr>
-                          </w14:shadow>
-                          <w14:textOutline w14:w="0" w14:cap="flat" w14:cmpd="sng" w14:algn="ctr">
-                            <w14:noFill/>
-                            <w14:prstDash w14:val="solid"/>
-                            <w14:round/>
-                          </w14:textOutline>
-                        </w:rPr>
-                      </w:pPr>
-                    </w:p>
-                    <w:p>
-                      <w:pPr>
-                        <w:jc w:val="center"/>
-                        <w:rPr>
-                          <w:rFonts w:ascii="Times New Roman" w:hAnsi="Times New Roman" w:cs="Times New Roman"/>
-                          <w:color w:val="000000" w:themeColor="text1"/>
-                          <w:sz w:val="32"/>
-                          <w14:shadow w14:blurRad="38100" w14:dist="19050" w14:dir="2700000" w14:sx="100000" w14:sy="100000" w14:kx="0" w14:ky="0" w14:algn="tl">
-                            <w14:schemeClr w14:val="dk1">
-                              <w14:alpha w14:val="60000"/>
-                            </w14:schemeClr>
-                          </w14:shadow>
-                          <w14:textOutline w14:w="0" w14:cap="flat" w14:cmpd="sng" w14:algn="ctr">
-                            <w14:noFill/>
-                            <w14:prstDash w14:val="solid"/>
-                            <w14:round/>
-                          </w14:textOutline>
-                        </w:rPr>
-                      </w:pPr>
-                    </w:p>
-                    <w:p>
-                      <w:pPr>
-                        <w:jc w:val="center"/>
-                        <w:rPr>
-                          <w:rFonts w:ascii="Times New Roman" w:hAnsi="Times New Roman" w:cs="Times New Roman"/>
-                          <w:color w:val="000000" w:themeColor="text1"/>
-                          <w:sz w:val="32"/>
-                          <w14:shadow w14:blurRad="38100" w14:dist="19050" w14:dir="2700000" w14:sx="100000" w14:sy="100000" w14:kx="0" w14:ky="0" w14:algn="tl">
-                            <w14:schemeClr w14:val="dk1">
-                              <w14:alpha w14:val="60000"/>
-                            </w14:schemeClr>
-                          </w14:shadow>
-                          <w14:textOutline w14:w="0" w14:cap="flat" w14:cmpd="sng" w14:algn="ctr">
-                            <w14:noFill/>
-                            <w14:prstDash w14:val="solid"/>
-                            <w14:round/>
-                          </w14:textOutline>
-                        </w:rPr>
-                      </w:pPr>
-                    </w:p>
-                    <w:p>
-                      <w:pPr>
-                        <w:jc w:val="center"/>
-                        <w:rPr>
-                          <w:rFonts w:ascii="Times New Roman" w:hAnsi="Times New Roman" w:cs="Times New Roman"/>
-                          <w:color w:val="000000" w:themeColor="text1"/>
-                          <w:spacing w:val="-4"/>
-                          <w:sz w:val="32"/>
-                          <w14:shadow w14:blurRad="38100" w14:dist="19050" w14:dir="2700000" w14:sx="100000" w14:sy="100000" w14:kx="0" w14:ky="0" w14:algn="tl">
-                            <w14:schemeClr w14:val="dk1">
-                              <w14:alpha w14:val="60000"/>
-                            </w14:schemeClr>
-                          </w14:shadow>
-                          <w14:textOutline w14:w="0" w14:cap="flat" w14:cmpd="sng" w14:algn="ctr">
-                            <w14:noFill/>
-                            <w14:prstDash w14:val="solid"/>
-                            <w14:round/>
-                          </w14:textOutline>
-                        </w:rPr>
-                      </w:pPr>
-                      <w:r>
-                        <w:rPr>
-                          <w:rFonts w:ascii="Times New Roman" w:hAnsi="Times New Roman" w:cs="Times New Roman"/>
-                          <w:color w:val="000000" w:themeColor="text1"/>
-                          <w:spacing w:val="-4"/>
-                          <w:sz w:val="32"/>
-                          <w14:shadow w14:blurRad="38100" w14:dist="19050" w14:dir="2700000" w14:sx="100000" w14:sy="100000" w14:kx="0" w14:ky="0" w14:algn="tl">
-                            <w14:schemeClr w14:val="dk1">
-                              <w14:alpha w14:val="60000"/>
-                            </w14:schemeClr>
-                          </w14:shadow>
-                          <w14:textOutline w14:w="0" w14:cap="flat" w14:cmpd="sng" w14:algn="ctr">
-                            <w14:noFill/>
-                            <w14:prstDash w14:val="solid"/>
-                            <w14:round/>
-                          </w14:textOutline>
-                        </w:rPr>
-                        <w:t xml:space="preserve">Học </w:t>
-                      </w:r>
-                      <w:proofErr w:type="spellStart"/>
-                      <w:r>
-                        <w:rPr>
-                          <w:rFonts w:ascii="Times New Roman" w:hAnsi="Times New Roman" w:cs="Times New Roman"/>
-                          <w:color w:val="000000" w:themeColor="text1"/>
-                          <w:spacing w:val="-4"/>
-                          <w:sz w:val="32"/>
-                          <w14:shadow w14:blurRad="38100" w14:dist="19050" w14:dir="2700000" w14:sx="100000" w14:sy="100000" w14:kx="0" w14:ky="0" w14:algn="tl">
-                            <w14:schemeClr w14:val="dk1">
-                              <w14:alpha w14:val="60000"/>
-                            </w14:schemeClr>
-                          </w14:shadow>
-                          <w14:textOutline w14:w="0" w14:cap="flat" w14:cmpd="sng" w14:algn="ctr">
-                            <w14:noFill/>
-                            <w14:prstDash w14:val="solid"/>
-                            <w14:round/>
-                          </w14:textOutline>
-                        </w:rPr>
-                        <w:t>phần</w:t>
-                      </w:r>
-                      <w:proofErr w:type="spellEnd"/>
-                      <w:r>
-                        <w:rPr>
-                          <w:rFonts w:ascii="Times New Roman" w:hAnsi="Times New Roman" w:cs="Times New Roman"/>
-                          <w:color w:val="000000" w:themeColor="text1"/>
-                          <w:spacing w:val="-4"/>
-                          <w:sz w:val="32"/>
-                          <w14:shadow w14:blurRad="38100" w14:dist="19050" w14:dir="2700000" w14:sx="100000" w14:sy="100000" w14:kx="0" w14:ky="0" w14:algn="tl">
-                            <w14:schemeClr w14:val="dk1">
-                              <w14:alpha w14:val="60000"/>
-                            </w14:schemeClr>
-                          </w14:shadow>
-                          <w14:textOutline w14:w="0" w14:cap="flat" w14:cmpd="sng" w14:algn="ctr">
-                            <w14:noFill/>
-                            <w14:prstDash w14:val="solid"/>
-                            <w14:round/>
-                          </w14:textOutline>
-                        </w:rPr>
-                        <w:t xml:space="preserve">: </w:t>
-                      </w:r>
-                      <w:proofErr w:type="spellStart"/>
-                      <w:r>
-                        <w:rPr>
-                          <w:rFonts w:ascii="Times New Roman" w:hAnsi="Times New Roman" w:cs="Times New Roman"/>
-                          <w:color w:val="000000" w:themeColor="text1"/>
-                          <w:spacing w:val="-4"/>
-                          <w:sz w:val="32"/>
-                          <w14:shadow w14:blurRad="38100" w14:dist="19050" w14:dir="2700000" w14:sx="100000" w14:sy="100000" w14:kx="0" w14:ky="0" w14:algn="tl">
-                            <w14:schemeClr w14:val="dk1">
-                              <w14:alpha w14:val="60000"/>
-                            </w14:schemeClr>
-                          </w14:shadow>
-                          <w14:textOutline w14:w="0" w14:cap="flat" w14:cmpd="sng" w14:algn="ctr">
-                            <w14:noFill/>
-                            <w14:prstDash w14:val="solid"/>
-                            <w14:round/>
-                          </w14:textOutline>
-                        </w:rPr>
-                        <w:t>Ứng</w:t>
-                      </w:r>
-                      <w:proofErr w:type="spellEnd"/>
-                      <w:r>
-                        <w:rPr>
-                          <w:rFonts w:ascii="Times New Roman" w:hAnsi="Times New Roman" w:cs="Times New Roman"/>
-                          <w:color w:val="000000" w:themeColor="text1"/>
-                          <w:spacing w:val="-4"/>
-                          <w:sz w:val="32"/>
-                          <w14:shadow w14:blurRad="38100" w14:dist="19050" w14:dir="2700000" w14:sx="100000" w14:sy="100000" w14:kx="0" w14:ky="0" w14:algn="tl">
-                            <w14:schemeClr w14:val="dk1">
-                              <w14:alpha w14:val="60000"/>
-                            </w14:schemeClr>
-                          </w14:shadow>
-                          <w14:textOutline w14:w="0" w14:cap="flat" w14:cmpd="sng" w14:algn="ctr">
-                            <w14:noFill/>
-                            <w14:prstDash w14:val="solid"/>
-                            <w14:round/>
-                          </w14:textOutline>
-                        </w:rPr>
-                        <w:t xml:space="preserve"> </w:t>
-                      </w:r>
-                      <w:proofErr w:type="spellStart"/>
-                      <w:r>
-                        <w:rPr>
-                          <w:rFonts w:ascii="Times New Roman" w:hAnsi="Times New Roman" w:cs="Times New Roman"/>
-                          <w:color w:val="000000" w:themeColor="text1"/>
-                          <w:spacing w:val="-4"/>
-                          <w:sz w:val="32"/>
-                          <w14:shadow w14:blurRad="38100" w14:dist="19050" w14:dir="2700000" w14:sx="100000" w14:sy="100000" w14:kx="0" w14:ky="0" w14:algn="tl">
-                            <w14:schemeClr w14:val="dk1">
-                              <w14:alpha w14:val="60000"/>
-                            </w14:schemeClr>
-                          </w14:shadow>
-                          <w14:textOutline w14:w="0" w14:cap="flat" w14:cmpd="sng" w14:algn="ctr">
-                            <w14:noFill/>
-                            <w14:prstDash w14:val="solid"/>
-                            <w14:round/>
-                          </w14:textOutline>
-                        </w:rPr>
-                        <w:t>dụng</w:t>
-                      </w:r>
-                      <w:proofErr w:type="spellEnd"/>
-                      <w:r>
-                        <w:rPr>
-                          <w:rFonts w:ascii="Times New Roman" w:hAnsi="Times New Roman" w:cs="Times New Roman"/>
-                          <w:color w:val="000000" w:themeColor="text1"/>
-                          <w:spacing w:val="-4"/>
-                          <w:sz w:val="32"/>
-                          <w14:shadow w14:blurRad="38100" w14:dist="19050" w14:dir="2700000" w14:sx="100000" w14:sy="100000" w14:kx="0" w14:ky="0" w14:algn="tl">
-                            <w14:schemeClr w14:val="dk1">
-                              <w14:alpha w14:val="60000"/>
-                            </w14:schemeClr>
-                          </w14:shadow>
-                          <w14:textOutline w14:w="0" w14:cap="flat" w14:cmpd="sng" w14:algn="ctr">
-                            <w14:noFill/>
-                            <w14:prstDash w14:val="solid"/>
-                            <w14:round/>
-                          </w14:textOutline>
-                        </w:rPr>
-                        <w:t xml:space="preserve"> Trí </w:t>
-                      </w:r>
-                      <w:proofErr w:type="spellStart"/>
-                      <w:r>
-                        <w:rPr>
-                          <w:rFonts w:ascii="Times New Roman" w:hAnsi="Times New Roman" w:cs="Times New Roman"/>
-                          <w:color w:val="000000" w:themeColor="text1"/>
-                          <w:spacing w:val="-4"/>
-                          <w:sz w:val="32"/>
-                          <w14:shadow w14:blurRad="38100" w14:dist="19050" w14:dir="2700000" w14:sx="100000" w14:sy="100000" w14:kx="0" w14:ky="0" w14:algn="tl">
-                            <w14:schemeClr w14:val="dk1">
-                              <w14:alpha w14:val="60000"/>
-                            </w14:schemeClr>
-                          </w14:shadow>
-                          <w14:textOutline w14:w="0" w14:cap="flat" w14:cmpd="sng" w14:algn="ctr">
-                            <w14:noFill/>
-                            <w14:prstDash w14:val="solid"/>
-                            <w14:round/>
-                          </w14:textOutline>
-                        </w:rPr>
-                        <w:t>tuệ</w:t>
-                      </w:r>
-                      <w:proofErr w:type="spellEnd"/>
-                      <w:r>
-                        <w:rPr>
-                          <w:rFonts w:ascii="Times New Roman" w:hAnsi="Times New Roman" w:cs="Times New Roman"/>
-                          <w:color w:val="000000" w:themeColor="text1"/>
-                          <w:spacing w:val="-4"/>
-                          <w:sz w:val="32"/>
-                          <w14:shadow w14:blurRad="38100" w14:dist="19050" w14:dir="2700000" w14:sx="100000" w14:sy="100000" w14:kx="0" w14:ky="0" w14:algn="tl">
-                            <w14:schemeClr w14:val="dk1">
-                              <w14:alpha w14:val="60000"/>
-                            </w14:schemeClr>
-                          </w14:shadow>
-                          <w14:textOutline w14:w="0" w14:cap="flat" w14:cmpd="sng" w14:algn="ctr">
-                            <w14:noFill/>
-                            <w14:prstDash w14:val="solid"/>
-                            <w14:round/>
-                          </w14:textOutline>
-                        </w:rPr>
-                        <w:t xml:space="preserve"> </w:t>
-                      </w:r>
-                      <w:proofErr w:type="spellStart"/>
-                      <w:r>
-                        <w:rPr>
-                          <w:rFonts w:ascii="Times New Roman" w:hAnsi="Times New Roman" w:cs="Times New Roman"/>
-                          <w:color w:val="000000" w:themeColor="text1"/>
-                          <w:spacing w:val="-4"/>
-                          <w:sz w:val="32"/>
-                          <w14:shadow w14:blurRad="38100" w14:dist="19050" w14:dir="2700000" w14:sx="100000" w14:sy="100000" w14:kx="0" w14:ky="0" w14:algn="tl">
-                            <w14:schemeClr w14:val="dk1">
-                              <w14:alpha w14:val="60000"/>
-                            </w14:schemeClr>
-                          </w14:shadow>
-                          <w14:textOutline w14:w="0" w14:cap="flat" w14:cmpd="sng" w14:algn="ctr">
-                            <w14:noFill/>
-                            <w14:prstDash w14:val="solid"/>
-                            <w14:round/>
-                          </w14:textOutline>
-                        </w:rPr>
-                        <w:t>nhân</w:t>
-                      </w:r>
-                      <w:proofErr w:type="spellEnd"/>
-                      <w:r>
-                        <w:rPr>
-                          <w:rFonts w:ascii="Times New Roman" w:hAnsi="Times New Roman" w:cs="Times New Roman"/>
-                          <w:color w:val="000000" w:themeColor="text1"/>
-                          <w:spacing w:val="-4"/>
-                          <w:sz w:val="32"/>
-                          <w14:shadow w14:blurRad="38100" w14:dist="19050" w14:dir="2700000" w14:sx="100000" w14:sy="100000" w14:kx="0" w14:ky="0" w14:algn="tl">
-                            <w14:schemeClr w14:val="dk1">
-                              <w14:alpha w14:val="60000"/>
-                            </w14:schemeClr>
-                          </w14:shadow>
-                          <w14:textOutline w14:w="0" w14:cap="flat" w14:cmpd="sng" w14:algn="ctr">
-                            <w14:noFill/>
-                            <w14:prstDash w14:val="solid"/>
-                            <w14:round/>
-                          </w14:textOutline>
-                        </w:rPr>
-                        <w:t xml:space="preserve"> </w:t>
-                      </w:r>
-                      <w:proofErr w:type="spellStart"/>
-                      <w:r>
-                        <w:rPr>
-                          <w:rFonts w:ascii="Times New Roman" w:hAnsi="Times New Roman" w:cs="Times New Roman"/>
-                          <w:color w:val="000000" w:themeColor="text1"/>
-                          <w:spacing w:val="-4"/>
-                          <w:sz w:val="32"/>
-                          <w14:shadow w14:blurRad="38100" w14:dist="19050" w14:dir="2700000" w14:sx="100000" w14:sy="100000" w14:kx="0" w14:ky="0" w14:algn="tl">
-                            <w14:schemeClr w14:val="dk1">
-                              <w14:alpha w14:val="60000"/>
-                            </w14:schemeClr>
-                          </w14:shadow>
-                          <w14:textOutline w14:w="0" w14:cap="flat" w14:cmpd="sng" w14:algn="ctr">
-                            <w14:noFill/>
-                            <w14:prstDash w14:val="solid"/>
-                            <w14:round/>
-                          </w14:textOutline>
-                        </w:rPr>
-                        <w:t>tạo</w:t>
-                      </w:r>
-                      <w:proofErr w:type="spellEnd"/>
-                    </w:p>
-                    <w:p>
-                      <w:pPr>
-                        <w:jc w:val="center"/>
-                      </w:pPr>
-                      <w:proofErr w:type="spellStart"/>
-                      <w:r>
-                        <w:rPr>
-                          <w:rFonts w:ascii="Times New Roman" w:hAnsi="Times New Roman" w:cs="Times New Roman"/>
-                          <w:color w:val="000000" w:themeColor="text1"/>
-                          <w:sz w:val="32"/>
-                          <w14:shadow w14:blurRad="38100" w14:dist="19050" w14:dir="2700000" w14:sx="100000" w14:sy="100000" w14:kx="0" w14:ky="0" w14:algn="tl">
-                            <w14:schemeClr w14:val="dk1">
-                              <w14:alpha w14:val="60000"/>
-                            </w14:schemeClr>
-                          </w14:shadow>
-                          <w14:textOutline w14:w="0" w14:cap="flat" w14:cmpd="sng" w14:algn="ctr">
-                            <w14:noFill/>
-                            <w14:prstDash w14:val="solid"/>
-                            <w14:round/>
-                          </w14:textOutline>
-                        </w:rPr>
-                        <w:t>Lớp</w:t>
-                      </w:r>
-                      <w:proofErr w:type="spellEnd"/>
-                      <w:r>
-                        <w:rPr>
-                          <w:rFonts w:ascii="Times New Roman" w:hAnsi="Times New Roman" w:cs="Times New Roman"/>
-                          <w:color w:val="000000" w:themeColor="text1"/>
-                          <w:sz w:val="32"/>
-                          <w14:shadow w14:blurRad="38100" w14:dist="19050" w14:dir="2700000" w14:sx="100000" w14:sy="100000" w14:kx="0" w14:ky="0" w14:algn="tl">
-                            <w14:schemeClr w14:val="dk1">
-                              <w14:alpha w14:val="60000"/>
-                            </w14:schemeClr>
-                          </w14:shadow>
-                          <w14:textOutline w14:w="0" w14:cap="flat" w14:cmpd="sng" w14:algn="ctr">
-                            <w14:noFill/>
-                            <w14:prstDash w14:val="solid"/>
-                            <w14:round/>
-                          </w14:textOutline>
-                        </w:rPr>
-                        <w:t>: CNTT K</w:t>
-                      </w:r>
-                      <w:r>
-                        <w:rPr>
-                          <w:rFonts w:ascii="Times New Roman" w:hAnsi="Times New Roman" w:cs="Times New Roman"/>
-                          <w:color w:val="000000" w:themeColor="text1"/>
-                          <w:sz w:val="32"/>
-                          <w14:shadow w14:blurRad="38100" w14:dist="19050" w14:dir="2700000" w14:sx="100000" w14:sy="100000" w14:kx="0" w14:ky="0" w14:algn="tl">
-                            <w14:schemeClr w14:val="dk1">
-                              <w14:alpha w14:val="60000"/>
-                            </w14:schemeClr>
-                          </w14:shadow>
-                          <w14:textOutline w14:w="0" w14:cap="flat" w14:cmpd="sng" w14:algn="ctr">
-                            <w14:noFill/>
-                            <w14:prstDash w14:val="solid"/>
-                            <w14:round/>
-                          </w14:textOutline>
-                        </w:rPr>
-                        <w:t>2</w:t>
-                      </w:r>
-                      <w:r>
-                        <w:rPr>
-                          <w:rFonts w:ascii="Times New Roman" w:hAnsi="Times New Roman" w:cs="Times New Roman"/>
-                          <w:color w:val="000000" w:themeColor="text1"/>
-                          <w:sz w:val="32"/>
-                          <w14:shadow w14:blurRad="38100" w14:dist="19050" w14:dir="2700000" w14:sx="100000" w14:sy="100000" w14:kx="0" w14:ky="0" w14:algn="tl">
-                            <w14:schemeClr w14:val="dk1">
-                              <w14:alpha w14:val="60000"/>
-                            </w14:schemeClr>
-                          </w14:shadow>
-                          <w14:textOutline w14:w="0" w14:cap="flat" w14:cmpd="sng" w14:algn="ctr">
-                            <w14:noFill/>
-                            <w14:prstDash w14:val="solid"/>
-                            <w14:round/>
-                          </w14:textOutline>
-                        </w:rPr>
-                        <w:t>3</w:t>
-                      </w:r>
-                      <w:r>
-                        <w:rPr>
-                          <w:rFonts w:ascii="Times New Roman" w:hAnsi="Times New Roman" w:cs="Times New Roman"/>
-                          <w:color w:val="000000" w:themeColor="text1"/>
-                          <w:sz w:val="32"/>
-                          <w14:shadow w14:blurRad="38100" w14:dist="19050" w14:dir="2700000" w14:sx="100000" w14:sy="100000" w14:kx="0" w14:ky="0" w14:algn="tl">
-                            <w14:schemeClr w14:val="dk1">
-                              <w14:alpha w14:val="60000"/>
-                            </w14:schemeClr>
-                          </w14:shadow>
-                          <w14:textOutline w14:w="0" w14:cap="flat" w14:cmpd="sng" w14:algn="ctr">
-                            <w14:noFill/>
-                            <w14:prstDash w14:val="solid"/>
-                            <w14:round/>
-                          </w14:textOutline>
-                        </w:rPr>
-                        <w:t>D</w:t>
-                      </w:r>
-                    </w:p>
-                  </w:txbxContent>
-                </v:textbox>
-                <w10:wrap anchorx="margin"/>
-              </v:oval>
-            </w:pict>
-          </mc:Fallback>
-        </mc:AlternateContent>
-      </w:r>
-    </w:p>
-    <w:p>
-      <w:pPr>
-        <w:pStyle w:val="0TEXTc1"/>
-        <w:ind w:firstLine="0"/>
-        <w:rPr>
-          <w:lang w:val="vi-VN"/>
-        </w:rPr>
-        <w:sectPr>
-          <w:footerReference w:type="default" r:id="rId11"/>
-          <w:pgSz w:w="11907" w:h="16840" w:code="9"/>
-          <w:pgMar w:top="1701" w:right="1134" w:bottom="1701" w:left="1985" w:header="851" w:footer="851" w:gutter="0"/>
-          <w:pgNumType w:fmt="lowerRoman" w:start="1"/>
-          <w:cols w:space="720"/>
-          <w:docGrid w:linePitch="360"/>
-        </w:sectPr>
-      </w:pPr>
-    </w:p>
-    <w:p>
-      <w:pPr>
         <w:pStyle w:val="1Chapterc5"/>
         <w:rPr>
           <w:rFonts w:cs="Times New Roman"/>
@@ -6267,84 +4366,6 @@
     </w:p>
     <w:p>
       <w:pPr>
-        <w:pStyle w:val="21Level2c2"/>
-        <w:rPr>
-          <w:rFonts w:cs="Times New Roman"/>
-          <w:color w:val="FF0000"/>
-        </w:rPr>
-      </w:pPr>
-      <w:r/>
-    </w:p>
-    <w:p>
-      <w:pPr>
-        <w:pStyle w:val="0TEXTc1"/>
-        <w:rPr>
-          <w:color w:val="FF0000"/>
-        </w:rPr>
-      </w:pPr>
-      <w:proofErr w:type="spellStart"/>
-      <w:r>
-        <w:rPr>
-          <w:color w:val="FF0000"/>
-        </w:rPr>
-        <w:t>Thuật</w:t>
-      </w:r>
-      <w:proofErr w:type="spellEnd"/>
-      <w:r>
-        <w:rPr>
-          <w:color w:val="FF0000"/>
-        </w:rPr>
-        <w:t xml:space="preserve"> </w:t>
-      </w:r>
-      <w:proofErr w:type="spellStart"/>
-      <w:r>
-        <w:rPr>
-          <w:color w:val="FF0000"/>
-        </w:rPr>
-        <w:t>ngữ</w:t>
-      </w:r>
-      <w:proofErr w:type="spellEnd"/>
-      <w:r>
-        <w:rPr>
-          <w:color w:val="FF0000"/>
-        </w:rPr>
-        <w:t xml:space="preserve"> </w:t>
-      </w:r>
-      <w:r>
-        <w:rPr>
-          <w:color w:val="FF0000"/>
-        </w:rPr>
-        <w:t>…</w:t>
-      </w:r>
-    </w:p>
-    <w:p>
-      <w:pPr>
-        <w:pStyle w:val="0TEXTc1"/>
-      </w:pPr>
-    </w:p>
-    <w:p>
-      <w:pPr>
-        <w:rPr>
-          <w:rFonts w:ascii="Times New Roman" w:hAnsi="Times New Roman" w:cs="Times New Roman"/>
-          <w:b/>
-          <w:bCs/>
-          <w:sz w:val="32"/>
-          <w:szCs w:val="32"/>
-        </w:rPr>
-      </w:pPr>
-      <w:r>
-        <w:rPr>
-          <w:rFonts w:ascii="Times New Roman" w:hAnsi="Times New Roman" w:cs="Times New Roman"/>
-          <w:b/>
-          <w:bCs/>
-          <w:sz w:val="32"/>
-          <w:szCs w:val="32"/>
-        </w:rPr>
-        <w:br w:type="page"/>
-      </w:r>
-    </w:p>
-    <w:p>
-      <w:pPr>
         <w:pStyle w:val="1Chapterc5"/>
         <w:rPr>
           <w:rFonts w:cs="Times New Roman"/>
@@ -6352,29 +4373,8 @@
           <w:szCs w:val="28"/>
         </w:rPr>
       </w:pPr>
-      <w:bookmarkStart w:id="6" w:name="_Toc116549840"/>
-      <w:r>
-        <w:lastRenderedPageBreak/>
-        <w:t xml:space="preserve">CHƯƠNG </w:t>
-      </w:r>
-      <w:r>
-        <w:t>2.</w:t>
-      </w:r>
-      <w:r>
-        <w:rPr>
-          <w:spacing w:val="100"/>
-        </w:rPr>
-        <w:t xml:space="preserve"> </w:t>
-      </w:r>
-      <w:bookmarkEnd w:id="6"/>
-      <w:r>
-        <w:rPr>
-          <w:rFonts w:cs="Times New Roman"/>
-          <w:color w:val="FF0000"/>
-          <w:sz w:val="28"/>
-          <w:szCs w:val="28"/>
-        </w:rPr>
-        <w:t>THIẾT KẾ HỆ THỐNG</w:t>
+      <w:r>
+        <w:t>CHƯƠNG 2. THIẾT KẾ HỆ THỐNG (BÀI KIỂM TRA 2)</w:t>
       </w:r>
     </w:p>
     <w:p>

</xml_diff>